<commit_message>
Correct novelty claim in report template; cite Verma DOI
The template claimed partial-input auditing was untested on fake news
corpora. Zhou et al. (2021) and Verma (2026) show otherwise; the gap is
now stated as the narrower style-only question.
</commit_message>
<xml_diff>
--- a/report/WSMA_Report.docx
+++ b/report/WSMA_Report.docx
@@ -193,7 +193,7 @@
       <w:r>
         <w:fldChar w:fldCharType="separate"/>
       </w:r>
-      <w:hyperlink w:anchor="_Toc242776641" w:history="1">
+      <w:hyperlink w:anchor="_Toc242778337" w:history="1">
         <w:r>
           <w:rPr>
             <w:rStyle w:val="Hyperlink"/>
@@ -220,7 +220,7 @@
             <w:noProof/>
             <w:webHidden/>
           </w:rPr>
-          <w:instrText xml:space="preserve"> PAGEREF _Toc242776641 \h </w:instrText>
+          <w:instrText xml:space="preserve"> PAGEREF _Toc242778337 \h </w:instrText>
         </w:r>
         <w:r>
           <w:rPr>
@@ -261,7 +261,7 @@
           <w:noProof/>
         </w:rPr>
       </w:pPr>
-      <w:hyperlink w:anchor="_Toc242776642" w:history="1">
+      <w:hyperlink w:anchor="_Toc242778338" w:history="1">
         <w:r>
           <w:rPr>
             <w:rStyle w:val="Hyperlink"/>
@@ -288,7 +288,7 @@
             <w:noProof/>
             <w:webHidden/>
           </w:rPr>
-          <w:instrText xml:space="preserve"> PAGEREF _Toc242776642 \h </w:instrText>
+          <w:instrText xml:space="preserve"> PAGEREF _Toc242778338 \h </w:instrText>
         </w:r>
         <w:r>
           <w:rPr>
@@ -329,7 +329,7 @@
           <w:noProof/>
         </w:rPr>
       </w:pPr>
-      <w:hyperlink w:anchor="_Toc242776643" w:history="1">
+      <w:hyperlink w:anchor="_Toc242778339" w:history="1">
         <w:r>
           <w:rPr>
             <w:rStyle w:val="Hyperlink"/>
@@ -356,7 +356,7 @@
             <w:noProof/>
             <w:webHidden/>
           </w:rPr>
-          <w:instrText xml:space="preserve"> PAGEREF _Toc242776643 \h </w:instrText>
+          <w:instrText xml:space="preserve"> PAGEREF _Toc242778339 \h </w:instrText>
         </w:r>
         <w:r>
           <w:rPr>
@@ -397,7 +397,7 @@
           <w:noProof/>
         </w:rPr>
       </w:pPr>
-      <w:hyperlink w:anchor="_Toc242776644" w:history="1">
+      <w:hyperlink w:anchor="_Toc242778340" w:history="1">
         <w:r>
           <w:rPr>
             <w:rStyle w:val="Hyperlink"/>
@@ -424,7 +424,7 @@
             <w:noProof/>
             <w:webHidden/>
           </w:rPr>
-          <w:instrText xml:space="preserve"> PAGEREF _Toc242776644 \h </w:instrText>
+          <w:instrText xml:space="preserve"> PAGEREF _Toc242778340 \h </w:instrText>
         </w:r>
         <w:r>
           <w:rPr>
@@ -465,7 +465,7 @@
           <w:noProof/>
         </w:rPr>
       </w:pPr>
-      <w:hyperlink w:anchor="_Toc242776645" w:history="1">
+      <w:hyperlink w:anchor="_Toc242778341" w:history="1">
         <w:r>
           <w:rPr>
             <w:rStyle w:val="Hyperlink"/>
@@ -492,7 +492,7 @@
             <w:noProof/>
             <w:webHidden/>
           </w:rPr>
-          <w:instrText xml:space="preserve"> PAGEREF _Toc242776645 \h </w:instrText>
+          <w:instrText xml:space="preserve"> PAGEREF _Toc242778341 \h </w:instrText>
         </w:r>
         <w:r>
           <w:rPr>
@@ -533,7 +533,7 @@
           <w:noProof/>
         </w:rPr>
       </w:pPr>
-      <w:hyperlink w:anchor="_Toc242776646" w:history="1">
+      <w:hyperlink w:anchor="_Toc242778342" w:history="1">
         <w:r>
           <w:rPr>
             <w:rStyle w:val="Hyperlink"/>
@@ -560,7 +560,7 @@
             <w:noProof/>
             <w:webHidden/>
           </w:rPr>
-          <w:instrText xml:space="preserve"> PAGEREF _Toc242776646 \h </w:instrText>
+          <w:instrText xml:space="preserve"> PAGEREF _Toc242778342 \h </w:instrText>
         </w:r>
         <w:r>
           <w:rPr>
@@ -601,7 +601,7 @@
           <w:noProof/>
         </w:rPr>
       </w:pPr>
-      <w:hyperlink w:anchor="_Toc242776647" w:history="1">
+      <w:hyperlink w:anchor="_Toc242778343" w:history="1">
         <w:r>
           <w:rPr>
             <w:rStyle w:val="Hyperlink"/>
@@ -628,7 +628,7 @@
             <w:noProof/>
             <w:webHidden/>
           </w:rPr>
-          <w:instrText xml:space="preserve"> PAGEREF _Toc242776647 \h </w:instrText>
+          <w:instrText xml:space="preserve"> PAGEREF _Toc242778343 \h </w:instrText>
         </w:r>
         <w:r>
           <w:rPr>
@@ -669,7 +669,7 @@
           <w:noProof/>
         </w:rPr>
       </w:pPr>
-      <w:hyperlink w:anchor="_Toc242776648" w:history="1">
+      <w:hyperlink w:anchor="_Toc242778344" w:history="1">
         <w:r>
           <w:rPr>
             <w:rStyle w:val="Hyperlink"/>
@@ -696,7 +696,7 @@
             <w:noProof/>
             <w:webHidden/>
           </w:rPr>
-          <w:instrText xml:space="preserve"> PAGEREF _Toc242776648 \h </w:instrText>
+          <w:instrText xml:space="preserve"> PAGEREF _Toc242778344 \h </w:instrText>
         </w:r>
         <w:r>
           <w:rPr>
@@ -737,7 +737,7 @@
           <w:noProof/>
         </w:rPr>
       </w:pPr>
-      <w:hyperlink w:anchor="_Toc242776649" w:history="1">
+      <w:hyperlink w:anchor="_Toc242778345" w:history="1">
         <w:r>
           <w:rPr>
             <w:rStyle w:val="Hyperlink"/>
@@ -764,7 +764,7 @@
             <w:noProof/>
             <w:webHidden/>
           </w:rPr>
-          <w:instrText xml:space="preserve"> PAGEREF _Toc242776649 \h </w:instrText>
+          <w:instrText xml:space="preserve"> PAGEREF _Toc242778345 \h </w:instrText>
         </w:r>
         <w:r>
           <w:rPr>
@@ -805,7 +805,7 @@
           <w:noProof/>
         </w:rPr>
       </w:pPr>
-      <w:hyperlink w:anchor="_Toc242776650" w:history="1">
+      <w:hyperlink w:anchor="_Toc242778346" w:history="1">
         <w:r>
           <w:rPr>
             <w:rStyle w:val="Hyperlink"/>
@@ -832,7 +832,7 @@
             <w:noProof/>
             <w:webHidden/>
           </w:rPr>
-          <w:instrText xml:space="preserve"> PAGEREF _Toc242776650 \h </w:instrText>
+          <w:instrText xml:space="preserve"> PAGEREF _Toc242778346 \h </w:instrText>
         </w:r>
         <w:r>
           <w:rPr>
@@ -873,7 +873,7 @@
           <w:noProof/>
         </w:rPr>
       </w:pPr>
-      <w:hyperlink w:anchor="_Toc242776651" w:history="1">
+      <w:hyperlink w:anchor="_Toc242778347" w:history="1">
         <w:r>
           <w:rPr>
             <w:rStyle w:val="Hyperlink"/>
@@ -900,7 +900,7 @@
             <w:noProof/>
             <w:webHidden/>
           </w:rPr>
-          <w:instrText xml:space="preserve"> PAGEREF _Toc242776651 \h </w:instrText>
+          <w:instrText xml:space="preserve"> PAGEREF _Toc242778347 \h </w:instrText>
         </w:r>
         <w:r>
           <w:rPr>
@@ -941,7 +941,7 @@
           <w:noProof/>
         </w:rPr>
       </w:pPr>
-      <w:hyperlink w:anchor="_Toc242776652" w:history="1">
+      <w:hyperlink w:anchor="_Toc242778348" w:history="1">
         <w:r>
           <w:rPr>
             <w:rStyle w:val="Hyperlink"/>
@@ -968,7 +968,7 @@
             <w:noProof/>
             <w:webHidden/>
           </w:rPr>
-          <w:instrText xml:space="preserve"> PAGEREF _Toc242776652 \h </w:instrText>
+          <w:instrText xml:space="preserve"> PAGEREF _Toc242778348 \h </w:instrText>
         </w:r>
         <w:r>
           <w:rPr>
@@ -1009,7 +1009,7 @@
           <w:noProof/>
         </w:rPr>
       </w:pPr>
-      <w:hyperlink w:anchor="_Toc242776653" w:history="1">
+      <w:hyperlink w:anchor="_Toc242778349" w:history="1">
         <w:r>
           <w:rPr>
             <w:rStyle w:val="Hyperlink"/>
@@ -1036,7 +1036,7 @@
             <w:noProof/>
             <w:webHidden/>
           </w:rPr>
-          <w:instrText xml:space="preserve"> PAGEREF _Toc242776653 \h </w:instrText>
+          <w:instrText xml:space="preserve"> PAGEREF _Toc242778349 \h </w:instrText>
         </w:r>
         <w:r>
           <w:rPr>
@@ -1077,7 +1077,7 @@
           <w:noProof/>
         </w:rPr>
       </w:pPr>
-      <w:hyperlink w:anchor="_Toc242776654" w:history="1">
+      <w:hyperlink w:anchor="_Toc242778350" w:history="1">
         <w:r>
           <w:rPr>
             <w:rStyle w:val="Hyperlink"/>
@@ -1104,7 +1104,7 @@
             <w:noProof/>
             <w:webHidden/>
           </w:rPr>
-          <w:instrText xml:space="preserve"> PAGEREF _Toc242776654 \h </w:instrText>
+          <w:instrText xml:space="preserve"> PAGEREF _Toc242778350 \h </w:instrText>
         </w:r>
         <w:r>
           <w:rPr>
@@ -1145,7 +1145,7 @@
           <w:noProof/>
         </w:rPr>
       </w:pPr>
-      <w:hyperlink w:anchor="_Toc242776655" w:history="1">
+      <w:hyperlink w:anchor="_Toc242778351" w:history="1">
         <w:r>
           <w:rPr>
             <w:rStyle w:val="Hyperlink"/>
@@ -1172,7 +1172,7 @@
             <w:noProof/>
             <w:webHidden/>
           </w:rPr>
-          <w:instrText xml:space="preserve"> PAGEREF _Toc242776655 \h </w:instrText>
+          <w:instrText xml:space="preserve"> PAGEREF _Toc242778351 \h </w:instrText>
         </w:r>
         <w:r>
           <w:rPr>
@@ -1213,7 +1213,7 @@
           <w:noProof/>
         </w:rPr>
       </w:pPr>
-      <w:hyperlink w:anchor="_Toc242776656" w:history="1">
+      <w:hyperlink w:anchor="_Toc242778352" w:history="1">
         <w:r>
           <w:rPr>
             <w:rStyle w:val="Hyperlink"/>
@@ -1240,7 +1240,7 @@
             <w:noProof/>
             <w:webHidden/>
           </w:rPr>
-          <w:instrText xml:space="preserve"> PAGEREF _Toc242776656 \h </w:instrText>
+          <w:instrText xml:space="preserve"> PAGEREF _Toc242778352 \h </w:instrText>
         </w:r>
         <w:r>
           <w:rPr>
@@ -1281,7 +1281,7 @@
           <w:noProof/>
         </w:rPr>
       </w:pPr>
-      <w:hyperlink w:anchor="_Toc242776657" w:history="1">
+      <w:hyperlink w:anchor="_Toc242778353" w:history="1">
         <w:r>
           <w:rPr>
             <w:rStyle w:val="Hyperlink"/>
@@ -1308,7 +1308,7 @@
             <w:noProof/>
             <w:webHidden/>
           </w:rPr>
-          <w:instrText xml:space="preserve"> PAGEREF _Toc242776657 \h </w:instrText>
+          <w:instrText xml:space="preserve"> PAGEREF _Toc242778353 \h </w:instrText>
         </w:r>
         <w:r>
           <w:rPr>
@@ -1349,7 +1349,7 @@
           <w:noProof/>
         </w:rPr>
       </w:pPr>
-      <w:hyperlink w:anchor="_Toc242776658" w:history="1">
+      <w:hyperlink w:anchor="_Toc242778354" w:history="1">
         <w:r>
           <w:rPr>
             <w:rStyle w:val="Hyperlink"/>
@@ -1376,7 +1376,7 @@
             <w:noProof/>
             <w:webHidden/>
           </w:rPr>
-          <w:instrText xml:space="preserve"> PAGEREF _Toc242776658 \h </w:instrText>
+          <w:instrText xml:space="preserve"> PAGEREF _Toc242778354 \h </w:instrText>
         </w:r>
         <w:r>
           <w:rPr>
@@ -1417,7 +1417,7 @@
           <w:noProof/>
         </w:rPr>
       </w:pPr>
-      <w:hyperlink w:anchor="_Toc242776659" w:history="1">
+      <w:hyperlink w:anchor="_Toc242778355" w:history="1">
         <w:r>
           <w:rPr>
             <w:rStyle w:val="Hyperlink"/>
@@ -1444,7 +1444,7 @@
             <w:noProof/>
             <w:webHidden/>
           </w:rPr>
-          <w:instrText xml:space="preserve"> PAGEREF _Toc242776659 \h </w:instrText>
+          <w:instrText xml:space="preserve"> PAGEREF _Toc242778355 \h </w:instrText>
         </w:r>
         <w:r>
           <w:rPr>
@@ -1485,7 +1485,7 @@
           <w:noProof/>
         </w:rPr>
       </w:pPr>
-      <w:hyperlink w:anchor="_Toc242776660" w:history="1">
+      <w:hyperlink w:anchor="_Toc242778356" w:history="1">
         <w:r>
           <w:rPr>
             <w:rStyle w:val="Hyperlink"/>
@@ -1512,7 +1512,7 @@
             <w:noProof/>
             <w:webHidden/>
           </w:rPr>
-          <w:instrText xml:space="preserve"> PAGEREF _Toc242776660 \h </w:instrText>
+          <w:instrText xml:space="preserve"> PAGEREF _Toc242778356 \h </w:instrText>
         </w:r>
         <w:r>
           <w:rPr>
@@ -1553,7 +1553,7 @@
           <w:noProof/>
         </w:rPr>
       </w:pPr>
-      <w:hyperlink w:anchor="_Toc242776661" w:history="1">
+      <w:hyperlink w:anchor="_Toc242778357" w:history="1">
         <w:r>
           <w:rPr>
             <w:rStyle w:val="Hyperlink"/>
@@ -1580,7 +1580,7 @@
             <w:noProof/>
             <w:webHidden/>
           </w:rPr>
-          <w:instrText xml:space="preserve"> PAGEREF _Toc242776661 \h </w:instrText>
+          <w:instrText xml:space="preserve"> PAGEREF _Toc242778357 \h </w:instrText>
         </w:r>
         <w:r>
           <w:rPr>
@@ -1621,7 +1621,7 @@
           <w:noProof/>
         </w:rPr>
       </w:pPr>
-      <w:hyperlink w:anchor="_Toc242776662" w:history="1">
+      <w:hyperlink w:anchor="_Toc242778358" w:history="1">
         <w:r>
           <w:rPr>
             <w:rStyle w:val="Hyperlink"/>
@@ -1648,7 +1648,7 @@
             <w:noProof/>
             <w:webHidden/>
           </w:rPr>
-          <w:instrText xml:space="preserve"> PAGEREF _Toc242776662 \h </w:instrText>
+          <w:instrText xml:space="preserve"> PAGEREF _Toc242778358 \h </w:instrText>
         </w:r>
         <w:r>
           <w:rPr>
@@ -1689,7 +1689,7 @@
           <w:noProof/>
         </w:rPr>
       </w:pPr>
-      <w:hyperlink w:anchor="_Toc242776663" w:history="1">
+      <w:hyperlink w:anchor="_Toc242778359" w:history="1">
         <w:r>
           <w:rPr>
             <w:rStyle w:val="Hyperlink"/>
@@ -1716,7 +1716,7 @@
             <w:noProof/>
             <w:webHidden/>
           </w:rPr>
-          <w:instrText xml:space="preserve"> PAGEREF _Toc242776663 \h </w:instrText>
+          <w:instrText xml:space="preserve"> PAGEREF _Toc242778359 \h </w:instrText>
         </w:r>
         <w:r>
           <w:rPr>
@@ -1757,7 +1757,7 @@
           <w:noProof/>
         </w:rPr>
       </w:pPr>
-      <w:hyperlink w:anchor="_Toc242776664" w:history="1">
+      <w:hyperlink w:anchor="_Toc242778360" w:history="1">
         <w:r>
           <w:rPr>
             <w:rStyle w:val="Hyperlink"/>
@@ -1784,7 +1784,7 @@
             <w:noProof/>
             <w:webHidden/>
           </w:rPr>
-          <w:instrText xml:space="preserve"> PAGEREF _Toc242776664 \h </w:instrText>
+          <w:instrText xml:space="preserve"> PAGEREF _Toc242778360 \h </w:instrText>
         </w:r>
         <w:r>
           <w:rPr>
@@ -1825,7 +1825,7 @@
           <w:noProof/>
         </w:rPr>
       </w:pPr>
-      <w:hyperlink w:anchor="_Toc242776665" w:history="1">
+      <w:hyperlink w:anchor="_Toc242778361" w:history="1">
         <w:r>
           <w:rPr>
             <w:rStyle w:val="Hyperlink"/>
@@ -1852,7 +1852,7 @@
             <w:noProof/>
             <w:webHidden/>
           </w:rPr>
-          <w:instrText xml:space="preserve"> PAGEREF _Toc242776665 \h </w:instrText>
+          <w:instrText xml:space="preserve"> PAGEREF _Toc242778361 \h </w:instrText>
         </w:r>
         <w:r>
           <w:rPr>
@@ -1893,7 +1893,7 @@
           <w:noProof/>
         </w:rPr>
       </w:pPr>
-      <w:hyperlink w:anchor="_Toc242776666" w:history="1">
+      <w:hyperlink w:anchor="_Toc242778362" w:history="1">
         <w:r>
           <w:rPr>
             <w:rStyle w:val="Hyperlink"/>
@@ -1920,7 +1920,7 @@
             <w:noProof/>
             <w:webHidden/>
           </w:rPr>
-          <w:instrText xml:space="preserve"> PAGEREF _Toc242776666 \h </w:instrText>
+          <w:instrText xml:space="preserve"> PAGEREF _Toc242778362 \h </w:instrText>
         </w:r>
         <w:r>
           <w:rPr>
@@ -1961,7 +1961,7 @@
           <w:noProof/>
         </w:rPr>
       </w:pPr>
-      <w:hyperlink w:anchor="_Toc242776667" w:history="1">
+      <w:hyperlink w:anchor="_Toc242778363" w:history="1">
         <w:r>
           <w:rPr>
             <w:rStyle w:val="Hyperlink"/>
@@ -1988,7 +1988,7 @@
             <w:noProof/>
             <w:webHidden/>
           </w:rPr>
-          <w:instrText xml:space="preserve"> PAGEREF _Toc242776667 \h </w:instrText>
+          <w:instrText xml:space="preserve"> PAGEREF _Toc242778363 \h </w:instrText>
         </w:r>
         <w:r>
           <w:rPr>
@@ -2029,7 +2029,7 @@
           <w:noProof/>
         </w:rPr>
       </w:pPr>
-      <w:hyperlink w:anchor="_Toc242776668" w:history="1">
+      <w:hyperlink w:anchor="_Toc242778364" w:history="1">
         <w:r>
           <w:rPr>
             <w:rStyle w:val="Hyperlink"/>
@@ -2056,7 +2056,7 @@
             <w:noProof/>
             <w:webHidden/>
           </w:rPr>
-          <w:instrText xml:space="preserve"> PAGEREF _Toc242776668 \h </w:instrText>
+          <w:instrText xml:space="preserve"> PAGEREF _Toc242778364 \h </w:instrText>
         </w:r>
         <w:r>
           <w:rPr>
@@ -2097,7 +2097,7 @@
           <w:noProof/>
         </w:rPr>
       </w:pPr>
-      <w:hyperlink w:anchor="_Toc242776669" w:history="1">
+      <w:hyperlink w:anchor="_Toc242778365" w:history="1">
         <w:r>
           <w:rPr>
             <w:rStyle w:val="Hyperlink"/>
@@ -2124,7 +2124,7 @@
             <w:noProof/>
             <w:webHidden/>
           </w:rPr>
-          <w:instrText xml:space="preserve"> PAGEREF _Toc242776669 \h </w:instrText>
+          <w:instrText xml:space="preserve"> PAGEREF _Toc242778365 \h </w:instrText>
         </w:r>
         <w:r>
           <w:rPr>
@@ -2169,7 +2169,7 @@
       <w:pPr>
         <w:pStyle w:val="Heading1"/>
       </w:pPr>
-      <w:bookmarkStart w:id="0" w:name="_Toc242776641"/>
+      <w:bookmarkStart w:id="0" w:name="_Toc242778337"/>
       <w:r>
         <w:lastRenderedPageBreak/>
         <w:t>Abstract</w:t>
@@ -2208,7 +2208,7 @@
       <w:pPr>
         <w:pStyle w:val="Heading1"/>
       </w:pPr>
-      <w:bookmarkStart w:id="1" w:name="_Toc242776642"/>
+      <w:bookmarkStart w:id="1" w:name="_Toc242778338"/>
       <w:r>
         <w:t>1. Introduction</w:t>
       </w:r>
@@ -2313,7 +2313,7 @@
       <w:pPr>
         <w:pStyle w:val="Heading1"/>
       </w:pPr>
-      <w:bookmarkStart w:id="2" w:name="_Toc242776643"/>
+      <w:bookmarkStart w:id="2" w:name="_Toc242778339"/>
       <w:r>
         <w:t>2. Literature Survey</w:t>
       </w:r>
@@ -2323,7 +2323,7 @@
       <w:pPr>
         <w:pStyle w:val="Heading2"/>
       </w:pPr>
-      <w:bookmarkStart w:id="3" w:name="_Toc242776644"/>
+      <w:bookmarkStart w:id="3" w:name="_Toc242778340"/>
       <w:r>
         <w:t>2.1 Fake news detection and its benchmarks</w:t>
       </w:r>
@@ -2344,7 +2344,7 @@
       <w:pPr>
         <w:pStyle w:val="Heading2"/>
       </w:pPr>
-      <w:bookmarkStart w:id="4" w:name="_Toc242776645"/>
+      <w:bookmarkStart w:id="4" w:name="_Toc242778341"/>
       <w:r>
         <w:t>2.2 Dataset artifacts and partial-input baselines</w:t>
       </w:r>
@@ -2369,7 +2369,7 @@
       <w:pPr>
         <w:pStyle w:val="Heading2"/>
       </w:pPr>
-      <w:bookmarkStart w:id="5" w:name="_Toc242776646"/>
+      <w:bookmarkStart w:id="5" w:name="_Toc242778342"/>
       <w:r>
         <w:t>2.3 Shortcut learning</w:t>
       </w:r>
@@ -2387,7 +2387,7 @@
       <w:pPr>
         <w:pStyle w:val="Heading2"/>
       </w:pPr>
-      <w:bookmarkStart w:id="6" w:name="_Toc242776647"/>
+      <w:bookmarkStart w:id="6" w:name="_Toc242778343"/>
       <w:r>
         <w:t>2.4 Artifacts in fake news datasets</w:t>
       </w:r>
@@ -2408,7 +2408,7 @@
       <w:pPr>
         <w:pStyle w:val="Heading2"/>
       </w:pPr>
-      <w:bookmarkStart w:id="7" w:name="_Toc242776648"/>
+      <w:bookmarkStart w:id="7" w:name="_Toc242778344"/>
       <w:r>
         <w:t>2.5 Remedies</w:t>
       </w:r>
@@ -3120,7 +3120,7 @@
       <w:pPr>
         <w:pStyle w:val="Heading1"/>
       </w:pPr>
-      <w:bookmarkStart w:id="8" w:name="_Toc242776649"/>
+      <w:bookmarkStart w:id="8" w:name="_Toc242778345"/>
       <w:r>
         <w:t>3. Problem Statement</w:t>
       </w:r>
@@ -3229,7 +3229,7 @@
       <w:pPr>
         <w:pStyle w:val="Heading1"/>
       </w:pPr>
-      <w:bookmarkStart w:id="9" w:name="_Toc242776650"/>
+      <w:bookmarkStart w:id="9" w:name="_Toc242778346"/>
       <w:r>
         <w:t>4. Proposed System</w:t>
       </w:r>
@@ -3239,7 +3239,7 @@
       <w:pPr>
         <w:pStyle w:val="Heading2"/>
       </w:pPr>
-      <w:bookmarkStart w:id="10" w:name="_Toc242776651"/>
+      <w:bookmarkStart w:id="10" w:name="_Toc242778347"/>
       <w:r>
         <w:t>4.1 Objectives</w:t>
       </w:r>
@@ -3333,7 +3333,7 @@
       <w:pPr>
         <w:pStyle w:val="Heading2"/>
       </w:pPr>
-      <w:bookmarkStart w:id="11" w:name="_Toc242776652"/>
+      <w:bookmarkStart w:id="11" w:name="_Toc242778348"/>
       <w:r>
         <w:t>4.2 System architecture</w:t>
       </w:r>
@@ -3361,7 +3361,7 @@
           <w:noProof/>
         </w:rPr>
         <w:drawing>
-          <wp:inline distT="0" distB="0" distL="0" distR="0" wp14:anchorId="6B469792" wp14:editId="0E31A82A">
+          <wp:inline distT="0" distB="0" distL="0" distR="0" wp14:anchorId="5713EA2F" wp14:editId="320BECC2">
             <wp:extent cx="5760000" cy="3383381"/>
             <wp:effectExtent l="0" t="0" r="0" b="0"/>
             <wp:docPr id="1" name="Picture 1"/>
@@ -3409,7 +3409,7 @@
       <w:pPr>
         <w:pStyle w:val="Heading1"/>
       </w:pPr>
-      <w:bookmarkStart w:id="12" w:name="_Toc242776653"/>
+      <w:bookmarkStart w:id="12" w:name="_Toc242778349"/>
       <w:r>
         <w:t>5. Methodology</w:t>
       </w:r>
@@ -3419,7 +3419,7 @@
       <w:pPr>
         <w:pStyle w:val="Heading2"/>
       </w:pPr>
-      <w:bookmarkStart w:id="13" w:name="_Toc242776654"/>
+      <w:bookmarkStart w:id="13" w:name="_Toc242778350"/>
       <w:r>
         <w:t>5.1 Data and cleaning</w:t>
       </w:r>
@@ -3520,7 +3520,7 @@
       <w:pPr>
         <w:pStyle w:val="Heading2"/>
       </w:pPr>
-      <w:bookmarkStart w:id="14" w:name="_Toc242776655"/>
+      <w:bookmarkStart w:id="14" w:name="_Toc242778351"/>
       <w:r>
         <w:lastRenderedPageBreak/>
         <w:t>5.2 Shared evaluation protocol</w:t>
@@ -3558,7 +3558,7 @@
       <w:pPr>
         <w:pStyle w:val="Heading2"/>
       </w:pPr>
-      <w:bookmarkStart w:id="15" w:name="_Toc242776656"/>
+      <w:bookmarkStart w:id="15" w:name="_Toc242778352"/>
       <w:r>
         <w:t>5.3 Experimental conditions</w:t>
       </w:r>
@@ -3678,7 +3678,7 @@
       <w:pPr>
         <w:pStyle w:val="Heading2"/>
       </w:pPr>
-      <w:bookmarkStart w:id="16" w:name="_Toc242776657"/>
+      <w:bookmarkStart w:id="16" w:name="_Toc242778353"/>
       <w:r>
         <w:t>5.4 Leakage-token analysis</w:t>
       </w:r>
@@ -3696,7 +3696,7 @@
       <w:pPr>
         <w:pStyle w:val="Heading2"/>
       </w:pPr>
-      <w:bookmarkStart w:id="17" w:name="_Toc242776658"/>
+      <w:bookmarkStart w:id="17" w:name="_Toc242778354"/>
       <w:r>
         <w:t>5.5 Implementation</w:t>
       </w:r>
@@ -3714,7 +3714,7 @@
       <w:pPr>
         <w:pStyle w:val="Heading1"/>
       </w:pPr>
-      <w:bookmarkStart w:id="18" w:name="_Toc242776659"/>
+      <w:bookmarkStart w:id="18" w:name="_Toc242778355"/>
       <w:r>
         <w:t>6. Results and Discussion</w:t>
       </w:r>
@@ -3724,7 +3724,7 @@
       <w:pPr>
         <w:pStyle w:val="Heading2"/>
       </w:pPr>
-      <w:bookmarkStart w:id="19" w:name="_Toc242776660"/>
+      <w:bookmarkStart w:id="19" w:name="_Toc242778356"/>
       <w:r>
         <w:t>6.1 Overview</w:t>
       </w:r>
@@ -4601,7 +4601,7 @@
           <w:noProof/>
         </w:rPr>
         <w:drawing>
-          <wp:inline distT="0" distB="0" distL="0" distR="0" wp14:anchorId="220D0AEF" wp14:editId="696924B9">
+          <wp:inline distT="0" distB="0" distL="0" distR="0" wp14:anchorId="0E86A698" wp14:editId="5EB1E012">
             <wp:extent cx="5580000" cy="3370199"/>
             <wp:effectExtent l="0" t="0" r="0" b="0"/>
             <wp:docPr id="2" name="Picture 2"/>
@@ -4649,7 +4649,7 @@
       <w:pPr>
         <w:pStyle w:val="Heading2"/>
       </w:pPr>
-      <w:bookmarkStart w:id="20" w:name="_Toc242776661"/>
+      <w:bookmarkStart w:id="20" w:name="_Toc242778357"/>
       <w:r>
         <w:t>6.2 Partial-input probes (RQ1)</w:t>
       </w:r>
@@ -4731,7 +4731,7 @@
       <w:pPr>
         <w:pStyle w:val="Heading2"/>
       </w:pPr>
-      <w:bookmarkStart w:id="21" w:name="_Toc242776662"/>
+      <w:bookmarkStart w:id="21" w:name="_Toc242778358"/>
       <w:r>
         <w:t>6.3 What the full-text model learns</w:t>
       </w:r>
@@ -4758,7 +4758,7 @@
           <w:noProof/>
         </w:rPr>
         <w:drawing>
-          <wp:inline distT="0" distB="0" distL="0" distR="0" wp14:anchorId="01B2CC5D" wp14:editId="4356C8A1">
+          <wp:inline distT="0" distB="0" distL="0" distR="0" wp14:anchorId="68EDFDFC" wp14:editId="0D359886">
             <wp:extent cx="5580000" cy="3119638"/>
             <wp:effectExtent l="0" t="0" r="0" b="0"/>
             <wp:docPr id="3" name="Picture 3"/>
@@ -6672,7 +6672,7 @@
       <w:pPr>
         <w:pStyle w:val="Heading2"/>
       </w:pPr>
-      <w:bookmarkStart w:id="22" w:name="_Toc242776663"/>
+      <w:bookmarkStart w:id="22" w:name="_Toc242778359"/>
       <w:r>
         <w:t>6.4 Artifact removal (RQ2)</w:t>
       </w:r>
@@ -6708,7 +6708,7 @@
         </w:rPr>
         <w:lastRenderedPageBreak/>
         <w:drawing>
-          <wp:inline distT="0" distB="0" distL="0" distR="0" wp14:anchorId="735B8ED8" wp14:editId="1A83FAD1">
+          <wp:inline distT="0" distB="0" distL="0" distR="0" wp14:anchorId="5C28F657" wp14:editId="2A7F4125">
             <wp:extent cx="5940000" cy="1881121"/>
             <wp:effectExtent l="0" t="0" r="0" b="0"/>
             <wp:docPr id="4" name="Picture 4"/>
@@ -6756,7 +6756,7 @@
       <w:pPr>
         <w:pStyle w:val="Heading2"/>
       </w:pPr>
-      <w:bookmarkStart w:id="23" w:name="_Toc242776664"/>
+      <w:bookmarkStart w:id="23" w:name="_Toc242778360"/>
       <w:r>
         <w:t>6.5 Cross-corpus transfer (RQ3)</w:t>
       </w:r>
@@ -6777,7 +6777,7 @@
       <w:pPr>
         <w:pStyle w:val="Heading2"/>
       </w:pPr>
-      <w:bookmarkStart w:id="24" w:name="_Toc242776665"/>
+      <w:bookmarkStart w:id="24" w:name="_Toc242778361"/>
       <w:r>
         <w:t>6.6 Accuracy as information is removed</w:t>
       </w:r>
@@ -6801,7 +6801,7 @@
           <w:noProof/>
         </w:rPr>
         <w:drawing>
-          <wp:inline distT="0" distB="0" distL="0" distR="0" wp14:anchorId="5439F1A0" wp14:editId="4DF76ED3">
+          <wp:inline distT="0" distB="0" distL="0" distR="0" wp14:anchorId="6EF3049A" wp14:editId="7C0471D1">
             <wp:extent cx="5040000" cy="3178836"/>
             <wp:effectExtent l="0" t="0" r="0" b="0"/>
             <wp:docPr id="5" name="Picture 5"/>
@@ -6849,7 +6849,7 @@
       <w:pPr>
         <w:pStyle w:val="Heading2"/>
       </w:pPr>
-      <w:bookmarkStart w:id="25" w:name="_Toc242776666"/>
+      <w:bookmarkStart w:id="25" w:name="_Toc242778362"/>
       <w:r>
         <w:lastRenderedPageBreak/>
         <w:t>6.7 Threats to validity</w:t>
@@ -6939,7 +6939,7 @@
       <w:pPr>
         <w:pStyle w:val="Heading1"/>
       </w:pPr>
-      <w:bookmarkStart w:id="26" w:name="_Toc242776667"/>
+      <w:bookmarkStart w:id="26" w:name="_Toc242778363"/>
       <w:r>
         <w:t>7. Conclusion</w:t>
       </w:r>
@@ -6979,7 +6979,7 @@
       <w:pPr>
         <w:pStyle w:val="Heading1"/>
       </w:pPr>
-      <w:bookmarkStart w:id="27" w:name="_Toc242776668"/>
+      <w:bookmarkStart w:id="27" w:name="_Toc242778364"/>
       <w:r>
         <w:t>8. Future Work</w:t>
       </w:r>
@@ -7060,7 +7060,7 @@
       <w:pPr>
         <w:pStyle w:val="Heading1"/>
       </w:pPr>
-      <w:bookmarkStart w:id="28" w:name="_Toc242776669"/>
+      <w:bookmarkStart w:id="28" w:name="_Toc242778365"/>
       <w:r>
         <w:t>References</w:t>
       </w:r>
@@ -7242,7 +7242,7 @@
         <w:ind w:left="567" w:hanging="567"/>
       </w:pPr>
       <w:r>
-        <w:t>Verma, Y. (2026). What does 99% accuracy measure? A reproducible audit of shortcut learning in a widely used fake news corpus. arXiv preprint arXiv:2609.25006.</w:t>
+        <w:t>Verma, Y. (2026). What does 99% accuracy measure? A reproducible audit of shortcut learning in a widely used fake news corpus. arXiv preprint arXiv:2609.25006. https://doi.org/10.48550/arXiv.2609.25006</w:t>
       </w:r>
     </w:p>
     <w:p>
@@ -7542,31 +7542,31 @@
       </w:rPr>
     </w:lvl>
   </w:abstractNum>
-  <w:num w:numId="1" w16cid:durableId="1485469305">
+  <w:num w:numId="1" w16cid:durableId="501167920">
     <w:abstractNumId w:val="8"/>
   </w:num>
-  <w:num w:numId="2" w16cid:durableId="210116884">
+  <w:num w:numId="2" w16cid:durableId="1268543204">
     <w:abstractNumId w:val="6"/>
   </w:num>
-  <w:num w:numId="3" w16cid:durableId="2089496517">
+  <w:num w:numId="3" w16cid:durableId="2095583865">
     <w:abstractNumId w:val="5"/>
   </w:num>
-  <w:num w:numId="4" w16cid:durableId="182280516">
+  <w:num w:numId="4" w16cid:durableId="134566222">
     <w:abstractNumId w:val="4"/>
   </w:num>
-  <w:num w:numId="5" w16cid:durableId="1805000269">
+  <w:num w:numId="5" w16cid:durableId="1082065163">
     <w:abstractNumId w:val="7"/>
   </w:num>
-  <w:num w:numId="6" w16cid:durableId="1440641096">
+  <w:num w:numId="6" w16cid:durableId="551117641">
     <w:abstractNumId w:val="3"/>
   </w:num>
-  <w:num w:numId="7" w16cid:durableId="1896968858">
+  <w:num w:numId="7" w16cid:durableId="1850557102">
     <w:abstractNumId w:val="2"/>
   </w:num>
-  <w:num w:numId="8" w16cid:durableId="1496648634">
+  <w:num w:numId="8" w16cid:durableId="864097418">
     <w:abstractNumId w:val="1"/>
   </w:num>
-  <w:num w:numId="9" w16cid:durableId="1388991723">
+  <w:num w:numId="9" w16cid:durableId="138311044">
     <w:abstractNumId w:val="0"/>
   </w:num>
 </w:numbering>
@@ -18965,7 +18965,7 @@
     <w:autoRedefine/>
     <w:uiPriority w:val="39"/>
     <w:unhideWhenUsed/>
-    <w:rsid w:val="007730D5"/>
+    <w:rsid w:val="0014160F"/>
     <w:pPr>
       <w:spacing w:after="100"/>
     </w:pPr>
@@ -18977,7 +18977,7 @@
     <w:autoRedefine/>
     <w:uiPriority w:val="39"/>
     <w:unhideWhenUsed/>
-    <w:rsid w:val="007730D5"/>
+    <w:rsid w:val="0014160F"/>
     <w:pPr>
       <w:spacing w:after="100"/>
       <w:ind w:left="240"/>
@@ -18988,7 +18988,7 @@
     <w:basedOn w:val="DefaultParagraphFont"/>
     <w:uiPriority w:val="99"/>
     <w:unhideWhenUsed/>
-    <w:rsid w:val="007730D5"/>
+    <w:rsid w:val="0014160F"/>
     <w:rPr>
       <w:color w:val="0000FF" w:themeColor="hyperlink"/>
       <w:u w:val="single"/>

</xml_diff>

<commit_message>
Add confound checks, sentiment/NER probes and SVM check
- transforms.py: shared input views and caching (moved from 02/03)
- 05_more_probes: E2d sentiment, E2e named entities, E3c stripped
  function words, linear-SVM repeat of E1/E2a/E2b/E3b
- 06_confounds: E5a-d on US-politics-only subset (topic control)
- 04: LIAR transfer without half-true (label-mapping check)
- E3b typography rule now removes all apostrophes/quotes in both
  classes; the fake scrape had lost them. Pre-fix results kept in
  results/before_quote_fix/
- figures renumbered to step 7; new fig5 (topic) and fig6 (SVM)
- report rebuilt (20 pages) with the agreed framing
</commit_message>
<xml_diff>
--- a/report/WSMA_Report.docx
+++ b/report/WSMA_Report.docx
@@ -193,7 +193,7 @@
       <w:r>
         <w:fldChar w:fldCharType="separate"/>
       </w:r>
-      <w:hyperlink w:anchor="_Toc242778337" w:history="1">
+      <w:hyperlink w:anchor="_Toc242785647" w:history="1">
         <w:r>
           <w:rPr>
             <w:rStyle w:val="Hyperlink"/>
@@ -220,7 +220,7 @@
             <w:noProof/>
             <w:webHidden/>
           </w:rPr>
-          <w:instrText xml:space="preserve"> PAGEREF _Toc242778337 \h </w:instrText>
+          <w:instrText xml:space="preserve"> PAGEREF _Toc242785647 \h </w:instrText>
         </w:r>
         <w:r>
           <w:rPr>
@@ -261,7 +261,7 @@
           <w:noProof/>
         </w:rPr>
       </w:pPr>
-      <w:hyperlink w:anchor="_Toc242778338" w:history="1">
+      <w:hyperlink w:anchor="_Toc242785648" w:history="1">
         <w:r>
           <w:rPr>
             <w:rStyle w:val="Hyperlink"/>
@@ -288,7 +288,7 @@
             <w:noProof/>
             <w:webHidden/>
           </w:rPr>
-          <w:instrText xml:space="preserve"> PAGEREF _Toc242778338 \h </w:instrText>
+          <w:instrText xml:space="preserve"> PAGEREF _Toc242785648 \h </w:instrText>
         </w:r>
         <w:r>
           <w:rPr>
@@ -329,7 +329,7 @@
           <w:noProof/>
         </w:rPr>
       </w:pPr>
-      <w:hyperlink w:anchor="_Toc242778339" w:history="1">
+      <w:hyperlink w:anchor="_Toc242785649" w:history="1">
         <w:r>
           <w:rPr>
             <w:rStyle w:val="Hyperlink"/>
@@ -356,7 +356,7 @@
             <w:noProof/>
             <w:webHidden/>
           </w:rPr>
-          <w:instrText xml:space="preserve"> PAGEREF _Toc242778339 \h </w:instrText>
+          <w:instrText xml:space="preserve"> PAGEREF _Toc242785649 \h </w:instrText>
         </w:r>
         <w:r>
           <w:rPr>
@@ -397,7 +397,7 @@
           <w:noProof/>
         </w:rPr>
       </w:pPr>
-      <w:hyperlink w:anchor="_Toc242778340" w:history="1">
+      <w:hyperlink w:anchor="_Toc242785650" w:history="1">
         <w:r>
           <w:rPr>
             <w:rStyle w:val="Hyperlink"/>
@@ -424,7 +424,7 @@
             <w:noProof/>
             <w:webHidden/>
           </w:rPr>
-          <w:instrText xml:space="preserve"> PAGEREF _Toc242778340 \h </w:instrText>
+          <w:instrText xml:space="preserve"> PAGEREF _Toc242785650 \h </w:instrText>
         </w:r>
         <w:r>
           <w:rPr>
@@ -465,7 +465,7 @@
           <w:noProof/>
         </w:rPr>
       </w:pPr>
-      <w:hyperlink w:anchor="_Toc242778341" w:history="1">
+      <w:hyperlink w:anchor="_Toc242785651" w:history="1">
         <w:r>
           <w:rPr>
             <w:rStyle w:val="Hyperlink"/>
@@ -492,7 +492,7 @@
             <w:noProof/>
             <w:webHidden/>
           </w:rPr>
-          <w:instrText xml:space="preserve"> PAGEREF _Toc242778341 \h </w:instrText>
+          <w:instrText xml:space="preserve"> PAGEREF _Toc242785651 \h </w:instrText>
         </w:r>
         <w:r>
           <w:rPr>
@@ -512,7 +512,7 @@
             <w:noProof/>
             <w:webHidden/>
           </w:rPr>
-          <w:t>4</w:t>
+          <w:t>5</w:t>
         </w:r>
         <w:r>
           <w:rPr>
@@ -533,7 +533,7 @@
           <w:noProof/>
         </w:rPr>
       </w:pPr>
-      <w:hyperlink w:anchor="_Toc242778342" w:history="1">
+      <w:hyperlink w:anchor="_Toc242785652" w:history="1">
         <w:r>
           <w:rPr>
             <w:rStyle w:val="Hyperlink"/>
@@ -560,7 +560,7 @@
             <w:noProof/>
             <w:webHidden/>
           </w:rPr>
-          <w:instrText xml:space="preserve"> PAGEREF _Toc242778342 \h </w:instrText>
+          <w:instrText xml:space="preserve"> PAGEREF _Toc242785652 \h </w:instrText>
         </w:r>
         <w:r>
           <w:rPr>
@@ -601,7 +601,7 @@
           <w:noProof/>
         </w:rPr>
       </w:pPr>
-      <w:hyperlink w:anchor="_Toc242778343" w:history="1">
+      <w:hyperlink w:anchor="_Toc242785653" w:history="1">
         <w:r>
           <w:rPr>
             <w:rStyle w:val="Hyperlink"/>
@@ -628,7 +628,7 @@
             <w:noProof/>
             <w:webHidden/>
           </w:rPr>
-          <w:instrText xml:space="preserve"> PAGEREF _Toc242778343 \h </w:instrText>
+          <w:instrText xml:space="preserve"> PAGEREF _Toc242785653 \h </w:instrText>
         </w:r>
         <w:r>
           <w:rPr>
@@ -669,7 +669,7 @@
           <w:noProof/>
         </w:rPr>
       </w:pPr>
-      <w:hyperlink w:anchor="_Toc242778344" w:history="1">
+      <w:hyperlink w:anchor="_Toc242785654" w:history="1">
         <w:r>
           <w:rPr>
             <w:rStyle w:val="Hyperlink"/>
@@ -696,7 +696,7 @@
             <w:noProof/>
             <w:webHidden/>
           </w:rPr>
-          <w:instrText xml:space="preserve"> PAGEREF _Toc242778344 \h </w:instrText>
+          <w:instrText xml:space="preserve"> PAGEREF _Toc242785654 \h </w:instrText>
         </w:r>
         <w:r>
           <w:rPr>
@@ -737,7 +737,7 @@
           <w:noProof/>
         </w:rPr>
       </w:pPr>
-      <w:hyperlink w:anchor="_Toc242778345" w:history="1">
+      <w:hyperlink w:anchor="_Toc242785655" w:history="1">
         <w:r>
           <w:rPr>
             <w:rStyle w:val="Hyperlink"/>
@@ -764,7 +764,7 @@
             <w:noProof/>
             <w:webHidden/>
           </w:rPr>
-          <w:instrText xml:space="preserve"> PAGEREF _Toc242778345 \h </w:instrText>
+          <w:instrText xml:space="preserve"> PAGEREF _Toc242785655 \h </w:instrText>
         </w:r>
         <w:r>
           <w:rPr>
@@ -805,7 +805,7 @@
           <w:noProof/>
         </w:rPr>
       </w:pPr>
-      <w:hyperlink w:anchor="_Toc242778346" w:history="1">
+      <w:hyperlink w:anchor="_Toc242785656" w:history="1">
         <w:r>
           <w:rPr>
             <w:rStyle w:val="Hyperlink"/>
@@ -832,7 +832,7 @@
             <w:noProof/>
             <w:webHidden/>
           </w:rPr>
-          <w:instrText xml:space="preserve"> PAGEREF _Toc242778346 \h </w:instrText>
+          <w:instrText xml:space="preserve"> PAGEREF _Toc242785656 \h </w:instrText>
         </w:r>
         <w:r>
           <w:rPr>
@@ -852,7 +852,7 @@
             <w:noProof/>
             <w:webHidden/>
           </w:rPr>
-          <w:t>6</w:t>
+          <w:t>7</w:t>
         </w:r>
         <w:r>
           <w:rPr>
@@ -873,7 +873,7 @@
           <w:noProof/>
         </w:rPr>
       </w:pPr>
-      <w:hyperlink w:anchor="_Toc242778347" w:history="1">
+      <w:hyperlink w:anchor="_Toc242785657" w:history="1">
         <w:r>
           <w:rPr>
             <w:rStyle w:val="Hyperlink"/>
@@ -900,7 +900,7 @@
             <w:noProof/>
             <w:webHidden/>
           </w:rPr>
-          <w:instrText xml:space="preserve"> PAGEREF _Toc242778347 \h </w:instrText>
+          <w:instrText xml:space="preserve"> PAGEREF _Toc242785657 \h </w:instrText>
         </w:r>
         <w:r>
           <w:rPr>
@@ -920,7 +920,7 @@
             <w:noProof/>
             <w:webHidden/>
           </w:rPr>
-          <w:t>6</w:t>
+          <w:t>7</w:t>
         </w:r>
         <w:r>
           <w:rPr>
@@ -941,7 +941,7 @@
           <w:noProof/>
         </w:rPr>
       </w:pPr>
-      <w:hyperlink w:anchor="_Toc242778348" w:history="1">
+      <w:hyperlink w:anchor="_Toc242785658" w:history="1">
         <w:r>
           <w:rPr>
             <w:rStyle w:val="Hyperlink"/>
@@ -968,7 +968,7 @@
             <w:noProof/>
             <w:webHidden/>
           </w:rPr>
-          <w:instrText xml:space="preserve"> PAGEREF _Toc242778348 \h </w:instrText>
+          <w:instrText xml:space="preserve"> PAGEREF _Toc242785658 \h </w:instrText>
         </w:r>
         <w:r>
           <w:rPr>
@@ -988,7 +988,7 @@
             <w:noProof/>
             <w:webHidden/>
           </w:rPr>
-          <w:t>6</w:t>
+          <w:t>7</w:t>
         </w:r>
         <w:r>
           <w:rPr>
@@ -1009,7 +1009,7 @@
           <w:noProof/>
         </w:rPr>
       </w:pPr>
-      <w:hyperlink w:anchor="_Toc242778349" w:history="1">
+      <w:hyperlink w:anchor="_Toc242785659" w:history="1">
         <w:r>
           <w:rPr>
             <w:rStyle w:val="Hyperlink"/>
@@ -1036,7 +1036,7 @@
             <w:noProof/>
             <w:webHidden/>
           </w:rPr>
-          <w:instrText xml:space="preserve"> PAGEREF _Toc242778349 \h </w:instrText>
+          <w:instrText xml:space="preserve"> PAGEREF _Toc242785659 \h </w:instrText>
         </w:r>
         <w:r>
           <w:rPr>
@@ -1056,7 +1056,7 @@
             <w:noProof/>
             <w:webHidden/>
           </w:rPr>
-          <w:t>7</w:t>
+          <w:t>8</w:t>
         </w:r>
         <w:r>
           <w:rPr>
@@ -1077,7 +1077,7 @@
           <w:noProof/>
         </w:rPr>
       </w:pPr>
-      <w:hyperlink w:anchor="_Toc242778350" w:history="1">
+      <w:hyperlink w:anchor="_Toc242785660" w:history="1">
         <w:r>
           <w:rPr>
             <w:rStyle w:val="Hyperlink"/>
@@ -1104,7 +1104,7 @@
             <w:noProof/>
             <w:webHidden/>
           </w:rPr>
-          <w:instrText xml:space="preserve"> PAGEREF _Toc242778350 \h </w:instrText>
+          <w:instrText xml:space="preserve"> PAGEREF _Toc242785660 \h </w:instrText>
         </w:r>
         <w:r>
           <w:rPr>
@@ -1124,7 +1124,7 @@
             <w:noProof/>
             <w:webHidden/>
           </w:rPr>
-          <w:t>7</w:t>
+          <w:t>8</w:t>
         </w:r>
         <w:r>
           <w:rPr>
@@ -1145,7 +1145,7 @@
           <w:noProof/>
         </w:rPr>
       </w:pPr>
-      <w:hyperlink w:anchor="_Toc242778351" w:history="1">
+      <w:hyperlink w:anchor="_Toc242785661" w:history="1">
         <w:r>
           <w:rPr>
             <w:rStyle w:val="Hyperlink"/>
@@ -1172,7 +1172,7 @@
             <w:noProof/>
             <w:webHidden/>
           </w:rPr>
-          <w:instrText xml:space="preserve"> PAGEREF _Toc242778351 \h </w:instrText>
+          <w:instrText xml:space="preserve"> PAGEREF _Toc242785661 \h </w:instrText>
         </w:r>
         <w:r>
           <w:rPr>
@@ -1213,7 +1213,7 @@
           <w:noProof/>
         </w:rPr>
       </w:pPr>
-      <w:hyperlink w:anchor="_Toc242778352" w:history="1">
+      <w:hyperlink w:anchor="_Toc242785662" w:history="1">
         <w:r>
           <w:rPr>
             <w:rStyle w:val="Hyperlink"/>
@@ -1240,7 +1240,7 @@
             <w:noProof/>
             <w:webHidden/>
           </w:rPr>
-          <w:instrText xml:space="preserve"> PAGEREF _Toc242778352 \h </w:instrText>
+          <w:instrText xml:space="preserve"> PAGEREF _Toc242785662 \h </w:instrText>
         </w:r>
         <w:r>
           <w:rPr>
@@ -1260,7 +1260,7 @@
             <w:noProof/>
             <w:webHidden/>
           </w:rPr>
-          <w:t>8</w:t>
+          <w:t>9</w:t>
         </w:r>
         <w:r>
           <w:rPr>
@@ -1281,7 +1281,7 @@
           <w:noProof/>
         </w:rPr>
       </w:pPr>
-      <w:hyperlink w:anchor="_Toc242778353" w:history="1">
+      <w:hyperlink w:anchor="_Toc242785663" w:history="1">
         <w:r>
           <w:rPr>
             <w:rStyle w:val="Hyperlink"/>
@@ -1308,7 +1308,7 @@
             <w:noProof/>
             <w:webHidden/>
           </w:rPr>
-          <w:instrText xml:space="preserve"> PAGEREF _Toc242778353 \h </w:instrText>
+          <w:instrText xml:space="preserve"> PAGEREF _Toc242785663 \h </w:instrText>
         </w:r>
         <w:r>
           <w:rPr>
@@ -1328,7 +1328,7 @@
             <w:noProof/>
             <w:webHidden/>
           </w:rPr>
-          <w:t>9</w:t>
+          <w:t>10</w:t>
         </w:r>
         <w:r>
           <w:rPr>
@@ -1349,7 +1349,7 @@
           <w:noProof/>
         </w:rPr>
       </w:pPr>
-      <w:hyperlink w:anchor="_Toc242778354" w:history="1">
+      <w:hyperlink w:anchor="_Toc242785664" w:history="1">
         <w:r>
           <w:rPr>
             <w:rStyle w:val="Hyperlink"/>
@@ -1376,7 +1376,7 @@
             <w:noProof/>
             <w:webHidden/>
           </w:rPr>
-          <w:instrText xml:space="preserve"> PAGEREF _Toc242778354 \h </w:instrText>
+          <w:instrText xml:space="preserve"> PAGEREF _Toc242785664 \h </w:instrText>
         </w:r>
         <w:r>
           <w:rPr>
@@ -1396,7 +1396,7 @@
             <w:noProof/>
             <w:webHidden/>
           </w:rPr>
-          <w:t>9</w:t>
+          <w:t>10</w:t>
         </w:r>
         <w:r>
           <w:rPr>
@@ -1417,7 +1417,7 @@
           <w:noProof/>
         </w:rPr>
       </w:pPr>
-      <w:hyperlink w:anchor="_Toc242778355" w:history="1">
+      <w:hyperlink w:anchor="_Toc242785665" w:history="1">
         <w:r>
           <w:rPr>
             <w:rStyle w:val="Hyperlink"/>
@@ -1444,7 +1444,7 @@
             <w:noProof/>
             <w:webHidden/>
           </w:rPr>
-          <w:instrText xml:space="preserve"> PAGEREF _Toc242778355 \h </w:instrText>
+          <w:instrText xml:space="preserve"> PAGEREF _Toc242785665 \h </w:instrText>
         </w:r>
         <w:r>
           <w:rPr>
@@ -1464,7 +1464,7 @@
             <w:noProof/>
             <w:webHidden/>
           </w:rPr>
-          <w:t>9</w:t>
+          <w:t>11</w:t>
         </w:r>
         <w:r>
           <w:rPr>
@@ -1485,7 +1485,7 @@
           <w:noProof/>
         </w:rPr>
       </w:pPr>
-      <w:hyperlink w:anchor="_Toc242778356" w:history="1">
+      <w:hyperlink w:anchor="_Toc242785666" w:history="1">
         <w:r>
           <w:rPr>
             <w:rStyle w:val="Hyperlink"/>
@@ -1512,7 +1512,7 @@
             <w:noProof/>
             <w:webHidden/>
           </w:rPr>
-          <w:instrText xml:space="preserve"> PAGEREF _Toc242778356 \h </w:instrText>
+          <w:instrText xml:space="preserve"> PAGEREF _Toc242785666 \h </w:instrText>
         </w:r>
         <w:r>
           <w:rPr>
@@ -1532,7 +1532,7 @@
             <w:noProof/>
             <w:webHidden/>
           </w:rPr>
-          <w:t>9</w:t>
+          <w:t>11</w:t>
         </w:r>
         <w:r>
           <w:rPr>
@@ -1553,7 +1553,7 @@
           <w:noProof/>
         </w:rPr>
       </w:pPr>
-      <w:hyperlink w:anchor="_Toc242778357" w:history="1">
+      <w:hyperlink w:anchor="_Toc242785667" w:history="1">
         <w:r>
           <w:rPr>
             <w:rStyle w:val="Hyperlink"/>
@@ -1580,7 +1580,7 @@
             <w:noProof/>
             <w:webHidden/>
           </w:rPr>
-          <w:instrText xml:space="preserve"> PAGEREF _Toc242778357 \h </w:instrText>
+          <w:instrText xml:space="preserve"> PAGEREF _Toc242785667 \h </w:instrText>
         </w:r>
         <w:r>
           <w:rPr>
@@ -1600,7 +1600,7 @@
             <w:noProof/>
             <w:webHidden/>
           </w:rPr>
-          <w:t>10</w:t>
+          <w:t>12</w:t>
         </w:r>
         <w:r>
           <w:rPr>
@@ -1621,7 +1621,7 @@
           <w:noProof/>
         </w:rPr>
       </w:pPr>
-      <w:hyperlink w:anchor="_Toc242778358" w:history="1">
+      <w:hyperlink w:anchor="_Toc242785668" w:history="1">
         <w:r>
           <w:rPr>
             <w:rStyle w:val="Hyperlink"/>
@@ -1648,7 +1648,7 @@
             <w:noProof/>
             <w:webHidden/>
           </w:rPr>
-          <w:instrText xml:space="preserve"> PAGEREF _Toc242778358 \h </w:instrText>
+          <w:instrText xml:space="preserve"> PAGEREF _Toc242785668 \h </w:instrText>
         </w:r>
         <w:r>
           <w:rPr>
@@ -1668,7 +1668,7 @@
             <w:noProof/>
             <w:webHidden/>
           </w:rPr>
-          <w:t>11</w:t>
+          <w:t>13</w:t>
         </w:r>
         <w:r>
           <w:rPr>
@@ -1689,7 +1689,7 @@
           <w:noProof/>
         </w:rPr>
       </w:pPr>
-      <w:hyperlink w:anchor="_Toc242778359" w:history="1">
+      <w:hyperlink w:anchor="_Toc242785669" w:history="1">
         <w:r>
           <w:rPr>
             <w:rStyle w:val="Hyperlink"/>
@@ -1716,7 +1716,7 @@
             <w:noProof/>
             <w:webHidden/>
           </w:rPr>
-          <w:instrText xml:space="preserve"> PAGEREF _Toc242778359 \h </w:instrText>
+          <w:instrText xml:space="preserve"> PAGEREF _Toc242785669 \h </w:instrText>
         </w:r>
         <w:r>
           <w:rPr>
@@ -1736,7 +1736,7 @@
             <w:noProof/>
             <w:webHidden/>
           </w:rPr>
-          <w:t>12</w:t>
+          <w:t>14</w:t>
         </w:r>
         <w:r>
           <w:rPr>
@@ -1757,7 +1757,7 @@
           <w:noProof/>
         </w:rPr>
       </w:pPr>
-      <w:hyperlink w:anchor="_Toc242778360" w:history="1">
+      <w:hyperlink w:anchor="_Toc242785670" w:history="1">
         <w:r>
           <w:rPr>
             <w:rStyle w:val="Hyperlink"/>
@@ -1784,7 +1784,7 @@
             <w:noProof/>
             <w:webHidden/>
           </w:rPr>
-          <w:instrText xml:space="preserve"> PAGEREF _Toc242778360 \h </w:instrText>
+          <w:instrText xml:space="preserve"> PAGEREF _Toc242785670 \h </w:instrText>
         </w:r>
         <w:r>
           <w:rPr>
@@ -1804,7 +1804,7 @@
             <w:noProof/>
             <w:webHidden/>
           </w:rPr>
-          <w:t>13</w:t>
+          <w:t>15</w:t>
         </w:r>
         <w:r>
           <w:rPr>
@@ -1825,13 +1825,13 @@
           <w:noProof/>
         </w:rPr>
       </w:pPr>
-      <w:hyperlink w:anchor="_Toc242778361" w:history="1">
+      <w:hyperlink w:anchor="_Toc242785671" w:history="1">
         <w:r>
           <w:rPr>
             <w:rStyle w:val="Hyperlink"/>
             <w:noProof/>
           </w:rPr>
-          <w:t>6.6 Accuracy as information is removed</w:t>
+          <w:t>6.6 Is it style, topic or the classifier? (RQ4)</w:t>
         </w:r>
         <w:r>
           <w:rPr>
@@ -1852,7 +1852,7 @@
             <w:noProof/>
             <w:webHidden/>
           </w:rPr>
-          <w:instrText xml:space="preserve"> PAGEREF _Toc242778361 \h </w:instrText>
+          <w:instrText xml:space="preserve"> PAGEREF _Toc242785671 \h </w:instrText>
         </w:r>
         <w:r>
           <w:rPr>
@@ -1872,7 +1872,7 @@
             <w:noProof/>
             <w:webHidden/>
           </w:rPr>
-          <w:t>13</w:t>
+          <w:t>15</w:t>
         </w:r>
         <w:r>
           <w:rPr>
@@ -1893,13 +1893,13 @@
           <w:noProof/>
         </w:rPr>
       </w:pPr>
-      <w:hyperlink w:anchor="_Toc242778362" w:history="1">
+      <w:hyperlink w:anchor="_Toc242785672" w:history="1">
         <w:r>
           <w:rPr>
             <w:rStyle w:val="Hyperlink"/>
             <w:noProof/>
           </w:rPr>
-          <w:t>6.7 Threats to validity</w:t>
+          <w:t>6.7 Accuracy as information is removed</w:t>
         </w:r>
         <w:r>
           <w:rPr>
@@ -1920,7 +1920,7 @@
             <w:noProof/>
             <w:webHidden/>
           </w:rPr>
-          <w:instrText xml:space="preserve"> PAGEREF _Toc242778362 \h </w:instrText>
+          <w:instrText xml:space="preserve"> PAGEREF _Toc242785672 \h </w:instrText>
         </w:r>
         <w:r>
           <w:rPr>
@@ -1940,7 +1940,75 @@
             <w:noProof/>
             <w:webHidden/>
           </w:rPr>
-          <w:t>14</w:t>
+          <w:t>17</w:t>
+        </w:r>
+        <w:r>
+          <w:rPr>
+            <w:noProof/>
+            <w:webHidden/>
+          </w:rPr>
+          <w:fldChar w:fldCharType="end"/>
+        </w:r>
+      </w:hyperlink>
+    </w:p>
+    <w:p>
+      <w:pPr>
+        <w:pStyle w:val="TOC2"/>
+        <w:tabs>
+          <w:tab w:val="right" w:leader="dot" w:pos="9016"/>
+        </w:tabs>
+        <w:rPr>
+          <w:noProof/>
+        </w:rPr>
+      </w:pPr>
+      <w:hyperlink w:anchor="_Toc242785673" w:history="1">
+        <w:r>
+          <w:rPr>
+            <w:rStyle w:val="Hyperlink"/>
+            <w:noProof/>
+          </w:rPr>
+          <w:t>6.8 Threats to validity</w:t>
+        </w:r>
+        <w:r>
+          <w:rPr>
+            <w:noProof/>
+            <w:webHidden/>
+          </w:rPr>
+          <w:tab/>
+        </w:r>
+        <w:r>
+          <w:rPr>
+            <w:noProof/>
+            <w:webHidden/>
+          </w:rPr>
+          <w:fldChar w:fldCharType="begin"/>
+        </w:r>
+        <w:r>
+          <w:rPr>
+            <w:noProof/>
+            <w:webHidden/>
+          </w:rPr>
+          <w:instrText xml:space="preserve"> PAGEREF _Toc242785673 \h </w:instrText>
+        </w:r>
+        <w:r>
+          <w:rPr>
+            <w:noProof/>
+            <w:webHidden/>
+          </w:rPr>
+        </w:r>
+        <w:r>
+          <w:rPr>
+            <w:noProof/>
+            <w:webHidden/>
+          </w:rPr>
+          <w:fldChar w:fldCharType="separate"/>
+        </w:r>
+        <w:r>
+          <w:rPr>
+            <w:noProof/>
+            <w:webHidden/>
+          </w:rPr>
+          <w:t>17</w:t>
         </w:r>
         <w:r>
           <w:rPr>
@@ -1961,7 +2029,7 @@
           <w:noProof/>
         </w:rPr>
       </w:pPr>
-      <w:hyperlink w:anchor="_Toc242778363" w:history="1">
+      <w:hyperlink w:anchor="_Toc242785674" w:history="1">
         <w:r>
           <w:rPr>
             <w:rStyle w:val="Hyperlink"/>
@@ -1988,7 +2056,7 @@
             <w:noProof/>
             <w:webHidden/>
           </w:rPr>
-          <w:instrText xml:space="preserve"> PAGEREF _Toc242778363 \h </w:instrText>
+          <w:instrText xml:space="preserve"> PAGEREF _Toc242785674 \h </w:instrText>
         </w:r>
         <w:r>
           <w:rPr>
@@ -2008,7 +2076,7 @@
             <w:noProof/>
             <w:webHidden/>
           </w:rPr>
-          <w:t>14</w:t>
+          <w:t>18</w:t>
         </w:r>
         <w:r>
           <w:rPr>
@@ -2029,7 +2097,7 @@
           <w:noProof/>
         </w:rPr>
       </w:pPr>
-      <w:hyperlink w:anchor="_Toc242778364" w:history="1">
+      <w:hyperlink w:anchor="_Toc242785675" w:history="1">
         <w:r>
           <w:rPr>
             <w:rStyle w:val="Hyperlink"/>
@@ -2056,7 +2124,7 @@
             <w:noProof/>
             <w:webHidden/>
           </w:rPr>
-          <w:instrText xml:space="preserve"> PAGEREF _Toc242778364 \h </w:instrText>
+          <w:instrText xml:space="preserve"> PAGEREF _Toc242785675 \h </w:instrText>
         </w:r>
         <w:r>
           <w:rPr>
@@ -2076,7 +2144,7 @@
             <w:noProof/>
             <w:webHidden/>
           </w:rPr>
-          <w:t>14</w:t>
+          <w:t>18</w:t>
         </w:r>
         <w:r>
           <w:rPr>
@@ -2097,7 +2165,7 @@
           <w:noProof/>
         </w:rPr>
       </w:pPr>
-      <w:hyperlink w:anchor="_Toc242778365" w:history="1">
+      <w:hyperlink w:anchor="_Toc242785676" w:history="1">
         <w:r>
           <w:rPr>
             <w:rStyle w:val="Hyperlink"/>
@@ -2124,7 +2192,7 @@
             <w:noProof/>
             <w:webHidden/>
           </w:rPr>
-          <w:instrText xml:space="preserve"> PAGEREF _Toc242778365 \h </w:instrText>
+          <w:instrText xml:space="preserve"> PAGEREF _Toc242785676 \h </w:instrText>
         </w:r>
         <w:r>
           <w:rPr>
@@ -2144,7 +2212,7 @@
             <w:noProof/>
             <w:webHidden/>
           </w:rPr>
-          <w:t>15</w:t>
+          <w:t>19</w:t>
         </w:r>
         <w:r>
           <w:rPr>
@@ -2169,7 +2237,7 @@
       <w:pPr>
         <w:pStyle w:val="Heading1"/>
       </w:pPr>
-      <w:bookmarkStart w:id="0" w:name="_Toc242778337"/>
+      <w:bookmarkStart w:id="0" w:name="_Toc242785647"/>
       <w:r>
         <w:lastRenderedPageBreak/>
         <w:t>Abstract</w:t>
@@ -2187,7 +2255,10 @@
         <w:t>require. On a cleaned, deduplicated version of ISOT (38,644 articles), a TF-IDF and logistic regression baseline reaches 98.4% accuracy. A model shown only the first sentence of each article reaches 99.1%; a model shown only function words and punctuation reaches 96.8%; and a random forest given eight surface statistics and no words at all reaches 86.2%, against a majority-class baseline of 54.8%. Removing source markers from both classes lowers accuracy only to 97.3%, because the remaining signal is the wr</w:t>
       </w:r>
       <w:r>
-        <w:t>iting register of the two publishing pipelines. Finally, a headline model that scores 94.6% within ISOT falls to 45.5% on the LIAR fact-checking corpus, below that corpus's majority-class rate of 55.8%. We conclude that high accuracy on ISOT reflects source and genre separability rather than any ability to detect false content.</w:t>
+        <w:t>iting register of the two publishing pipelines. The signal is not topic: restricted to US politics in both classes, with every marker stripped, function words alone still give 90.3% against a chance level of 60.9%, and a linear SVM reproduces every result. Finally, a headline model that scores 94.6% within ISOT falls to 45.5% on the LIAR fact-checking corpus, below that corpus's majority-class rate of 55.8%. We conclude that high accuracy on ISOT reflects source and genre separability rather than any abilit</w:t>
+      </w:r>
+      <w:r>
+        <w:t>y to detect false content.</w:t>
       </w:r>
     </w:p>
     <w:p>
@@ -2208,7 +2279,7 @@
       <w:pPr>
         <w:pStyle w:val="Heading1"/>
       </w:pPr>
-      <w:bookmarkStart w:id="1" w:name="_Toc242778338"/>
+      <w:bookmarkStart w:id="1" w:name="_Toc242785648"/>
       <w:r>
         <w:t>1. Introduction</w:t>
       </w:r>
@@ -2246,11 +2317,11 @@
         <w:jc w:val="both"/>
       </w:pPr>
       <w:r>
-        <w:t xml:space="preserve">This project does not build a better fake news detector. It audits the benchmark. The approach is to build deliberately handicapped models, each denied the information that real veracity assessment would need, and to measure how well they still perform. If a model that cannot see an article's content still separates real from fake, the labels are recoverable from </w:t>
+        <w:t xml:space="preserve">This project builds a standard fake news detector, obtains the familiar 98% accuracy, and then tests whether that accuracy is real. The detector is the object under test. The approach is </w:t>
       </w:r>
       <w:r>
         <w:lastRenderedPageBreak/>
-        <w:t>something other than content, and the benchmark's headline accuracy is not measuring deception detection.</w:t>
+        <w:t>to build deliberately handicapped versions of it, each denied the information that real veracity assessment would need, and to measure how well they still perform. If a model that cannot see an article's content still separates real from fake, the labels are recoverable from something other than content, and the detector's accuracy is not measuring deception detection.</w:t>
       </w:r>
     </w:p>
     <w:p>
@@ -2274,7 +2345,7 @@
         <w:pStyle w:val="ListBullet"/>
       </w:pPr>
       <w:r>
-        <w:t>three content-free partial-input probes (first sentence only, function words only, and eight surface statistics) applied to the same fixed train/test split;</w:t>
+        <w:t>five content-free partial-input probes (first sentence, function words, eight surface statistics, sentiment scores and named-entity counts) applied to the same fixed train/test split;</w:t>
       </w:r>
     </w:p>
     <w:p>
@@ -2290,7 +2361,7 @@
         <w:pStyle w:val="ListBullet"/>
       </w:pPr>
       <w:r>
-        <w:t>a cross-corpus test on LIAR, with an in-domain control that separates the effect of crossing datasets from the effect of using headlines only;</w:t>
+        <w:t>a cross-corpus test on LIAR, with an in-domain control that separates the effect of crossing datasets from the effect of using headlines only, and a check of the label mapping;</w:t>
       </w:r>
     </w:p>
     <w:p>
@@ -2298,22 +2369,30 @@
         <w:pStyle w:val="ListBullet"/>
       </w:pPr>
       <w:r>
-        <w:t>an inspection of model coefficients that identifies specific leakage tokens, including two artifacts of the data collection process (typography and empty articles).</w:t>
+        <w:t>confound checks showing that the results are not explained by topic (a US-politics-only subset) or by the choice of classifier (a linear SVM);</w:t>
       </w:r>
     </w:p>
     <w:p>
       <w:pPr>
-        <w:jc w:val="both"/>
-      </w:pPr>
-      <w:r>
-        <w:t>Section 2 reviews related work. Section 3 states the problem and research questions, Section 4 describes the proposed system and Section 5 the methodology. Section 6 presents and discusses the results, and Sections 7 and 8 give conclusions and directions for future work.</w:t>
+        <w:pStyle w:val="ListBullet"/>
+      </w:pPr>
+      <w:r>
+        <w:t>an inspection of model coefficients that identifies specific leakage tokens, including three artifacts of the data collection process (lost quotation marks and apostrophes, curly-quote typography and empty articles).</w:t>
       </w:r>
     </w:p>
     <w:p>
       <w:pPr>
+        <w:jc w:val="both"/>
+      </w:pPr>
+      <w:r>
+        <w:t>Section 2 reviews related work. Section 3 states the problem and research questions, Section 4 describes the proposed system and Section 5 the methodology. Section 6 presents and discusses the results, and Sections 7 and 8 give conclusions and directions for future work.</w:t>
+      </w:r>
+    </w:p>
+    <w:p>
+      <w:pPr>
         <w:pStyle w:val="Heading1"/>
       </w:pPr>
-      <w:bookmarkStart w:id="2" w:name="_Toc242778339"/>
+      <w:bookmarkStart w:id="2" w:name="_Toc242785649"/>
       <w:r>
         <w:t>2. Literature Survey</w:t>
       </w:r>
@@ -2323,7 +2402,7 @@
       <w:pPr>
         <w:pStyle w:val="Heading2"/>
       </w:pPr>
-      <w:bookmarkStart w:id="3" w:name="_Toc242778340"/>
+      <w:bookmarkStart w:id="3" w:name="_Toc242785650"/>
       <w:r>
         <w:t>2.1 Fake news detection and its benchmarks</w:t>
       </w:r>
@@ -2344,8 +2423,9 @@
       <w:pPr>
         <w:pStyle w:val="Heading2"/>
       </w:pPr>
-      <w:bookmarkStart w:id="4" w:name="_Toc242778341"/>
-      <w:r>
+      <w:bookmarkStart w:id="4" w:name="_Toc242785651"/>
+      <w:r>
+        <w:lastRenderedPageBreak/>
         <w:t>2.2 Dataset artifacts and partial-input baselines</w:t>
       </w:r>
       <w:bookmarkEnd w:id="4"/>
@@ -2358,18 +2438,14 @@
         <w:t>Gururangan et al. (2018) showed that natural language inference (NLI) datasets contain annotation artifacts: a classifier that sees only the hypothesis, never the premise it should be compared against, reaches about 67% accuracy on SNLI and 53% on MultiNLI, well above chance for three classes. This partial-input method is the core technique of the present project. Poliak et al. (2018) generalised it to ten NLI datasets and found hypothesis-only baselines beating the majority class on many of them. McCoy, Pa</w:t>
       </w:r>
       <w:r>
-        <w:t xml:space="preserve">vlick and Linzen (2019) built the HANS evaluation set and showed that strong NLI models rely on shallow syntactic heuristics such as lexical overlap. Niven and Kao (2019) showed that BERT's high score on an argument reasoning task came from spurious statistical cues; on an adversarial version that </w:t>
-      </w:r>
-      <w:r>
-        <w:lastRenderedPageBreak/>
-        <w:t>removed them, performance fell to chance. Schuster et al. (2019) applied the same reasoning to fact verification, showing that claim-only models perform well on the FEVER dataset without consulting any evidence.</w:t>
+        <w:t>vlick and Linzen (2019) built the HANS evaluation set and showed that strong NLI models rely on shallow syntactic heuristics such as lexical overlap. Niven and Kao (2019) showed that BERT's high score on an argument reasoning task came from spurious statistical cues; on an adversarial version that removed them, performance fell to chance. Schuster et al. (2019) applied the same reasoning to fact verification, showing that claim-only models perform well on the FEVER dataset without consulting any evidence.</w:t>
       </w:r>
     </w:p>
     <w:p>
       <w:pPr>
         <w:pStyle w:val="Heading2"/>
       </w:pPr>
-      <w:bookmarkStart w:id="5" w:name="_Toc242778342"/>
+      <w:bookmarkStart w:id="5" w:name="_Toc242785652"/>
       <w:r>
         <w:t>2.3 Shortcut learning</w:t>
       </w:r>
@@ -2387,7 +2463,7 @@
       <w:pPr>
         <w:pStyle w:val="Heading2"/>
       </w:pPr>
-      <w:bookmarkStart w:id="6" w:name="_Toc242778343"/>
+      <w:bookmarkStart w:id="6" w:name="_Toc242785653"/>
       <w:r>
         <w:t>2.4 Artifacts in fake news datasets</w:t>
       </w:r>
@@ -2408,7 +2484,7 @@
       <w:pPr>
         <w:pStyle w:val="Heading2"/>
       </w:pPr>
-      <w:bookmarkStart w:id="7" w:name="_Toc242778344"/>
+      <w:bookmarkStart w:id="7" w:name="_Toc242785654"/>
       <w:r>
         <w:t>2.5 Remedies</w:t>
       </w:r>
@@ -2428,6 +2504,7 @@
         <w:keepNext/>
       </w:pPr>
       <w:r>
+        <w:lastRenderedPageBreak/>
         <w:t>Table 1. Summary of the most closely related work.</w:t>
       </w:r>
     </w:p>
@@ -3120,7 +3197,7 @@
       <w:pPr>
         <w:pStyle w:val="Heading1"/>
       </w:pPr>
-      <w:bookmarkStart w:id="8" w:name="_Toc242778345"/>
+      <w:bookmarkStart w:id="8" w:name="_Toc242785655"/>
       <w:r>
         <w:t>3. Problem Statement</w:t>
       </w:r>
@@ -3227,10 +3304,25 @@
     </w:p>
     <w:p>
       <w:pPr>
+        <w:pStyle w:val="ListNumber"/>
+      </w:pPr>
+      <w:r>
+        <w:rPr>
+          <w:b/>
+        </w:rPr>
+        <w:t>RQ4.</w:t>
+      </w:r>
+      <w:r>
+        <w:t xml:space="preserve"> Is the remaining signal writing style, or is it explained by topic or by the choice of classifier?</w:t>
+      </w:r>
+    </w:p>
+    <w:p>
+      <w:pPr>
         <w:pStyle w:val="Heading1"/>
       </w:pPr>
-      <w:bookmarkStart w:id="9" w:name="_Toc242778346"/>
-      <w:r>
+      <w:bookmarkStart w:id="9" w:name="_Toc242785656"/>
+      <w:r>
+        <w:lastRenderedPageBreak/>
         <w:t>4. Proposed System</w:t>
       </w:r>
       <w:bookmarkEnd w:id="9"/>
@@ -3239,7 +3331,7 @@
       <w:pPr>
         <w:pStyle w:val="Heading2"/>
       </w:pPr>
-      <w:bookmarkStart w:id="10" w:name="_Toc242778347"/>
+      <w:bookmarkStart w:id="10" w:name="_Toc242785657"/>
       <w:r>
         <w:t>4.1 Objectives</w:t>
       </w:r>
@@ -3270,7 +3362,7 @@
         <w:t>O2.</w:t>
       </w:r>
       <w:r>
-        <w:t xml:space="preserve"> Measure the accuracy of three content-free partial-input probes against a measured chance level.</w:t>
+        <w:t xml:space="preserve"> Measure the accuracy of content-free partial-input probes against a measured chance level.</w:t>
       </w:r>
     </w:p>
     <w:p>
@@ -3326,14 +3418,28 @@
         <w:t>O6.</w:t>
       </w:r>
       <w:r>
-        <w:t xml:space="preserve"> Draw recommendations for how fake news classifiers should be evaluated.</w:t>
+        <w:t xml:space="preserve"> Rule out topic and classifier choice as explanations for the results.</w:t>
       </w:r>
     </w:p>
     <w:p>
       <w:pPr>
+        <w:pStyle w:val="ListBullet"/>
+      </w:pPr>
+      <w:r>
+        <w:rPr>
+          <w:b/>
+        </w:rPr>
+        <w:t>O7.</w:t>
+      </w:r>
+      <w:r>
+        <w:t xml:space="preserve"> Draw recommendations for how fake news classifiers should be evaluated.</w:t>
+      </w:r>
+    </w:p>
+    <w:p>
+      <w:pPr>
         <w:pStyle w:val="Heading2"/>
       </w:pPr>
-      <w:bookmarkStart w:id="11" w:name="_Toc242778348"/>
+      <w:bookmarkStart w:id="11" w:name="_Toc242785658"/>
       <w:r>
         <w:t>4.2 System architecture</w:t>
       </w:r>
@@ -3344,11 +3450,10 @@
         <w:jc w:val="both"/>
       </w:pPr>
       <w:r>
-        <w:t xml:space="preserve">Figure 1 shows the pipeline. Both ISOT files are loaded and cleaned once. Each experimental condition then transforms the cleaned articles into a different input — full text, a fragment of the text, a stylistic reduction of the text, or a vector of numbers — and passes it to one shared </w:t>
-      </w:r>
-      <w:r>
-        <w:lastRenderedPageBreak/>
-        <w:t>evaluation function. That function applies the same stratified train/test split, the same classifier and the same metrics to every condition, so differences in accuracy can be attributed to the input alone. LIAR is used only as an external test set. All metrics are written to disk, and the figures and tables in this report are generated from those files.</w:t>
+        <w:t xml:space="preserve">Figure 1 shows the pipeline. Both ISOT files are loaded and cleaned once. Each experimental condition then transforms the cleaned articles into a different input — full text, a fragment of the text, a stylistic reduction of the text, or a vector of numbers — and passes it to one shared evaluation function. That function applies the same stratified train/test split, the same classifier and the same metrics to every condition, so differences in accuracy can be attributed to the input alone. LIAR is used only </w:t>
+      </w:r>
+      <w:r>
+        <w:t>as an external test set. All metrics are written to disk, and the figures and tables in this report are generated from those files.</w:t>
       </w:r>
     </w:p>
     <w:p>
@@ -3361,7 +3466,7 @@
           <w:noProof/>
         </w:rPr>
         <w:drawing>
-          <wp:inline distT="0" distB="0" distL="0" distR="0" wp14:anchorId="5713EA2F" wp14:editId="320BECC2">
+          <wp:inline distT="0" distB="0" distL="0" distR="0" wp14:anchorId="4B73454F" wp14:editId="2036C450">
             <wp:extent cx="5760000" cy="3383381"/>
             <wp:effectExtent l="0" t="0" r="0" b="0"/>
             <wp:docPr id="1" name="Picture 1"/>
@@ -3409,8 +3514,9 @@
       <w:pPr>
         <w:pStyle w:val="Heading1"/>
       </w:pPr>
-      <w:bookmarkStart w:id="12" w:name="_Toc242778349"/>
-      <w:r>
+      <w:bookmarkStart w:id="12" w:name="_Toc242785659"/>
+      <w:r>
+        <w:lastRenderedPageBreak/>
         <w:t>5. Methodology</w:t>
       </w:r>
       <w:bookmarkEnd w:id="12"/>
@@ -3419,7 +3525,7 @@
       <w:pPr>
         <w:pStyle w:val="Heading2"/>
       </w:pPr>
-      <w:bookmarkStart w:id="13" w:name="_Toc242778350"/>
+      <w:bookmarkStart w:id="13" w:name="_Toc242785660"/>
       <w:r>
         <w:t>5.1 Data and cleaning</w:t>
       </w:r>
@@ -3442,7 +3548,7 @@
         <w:t>38,644 articles: 21,191 real and 17,453 fake</w:t>
       </w:r>
       <w:r>
-        <w:t>. The subject field was never used as input, because its values do not overlap between the classes and would give away the label directly.</w:t>
+        <w:t>. The subject field was never used as model input, because its values do not overlap between the classes and would give away the label directly. It was used only to select rows for the topic-matched check (E5).</w:t>
       </w:r>
     </w:p>
     <w:p>
@@ -3513,16 +3619,24 @@
         <w:t>half-true</w:t>
       </w:r>
       <w:r>
-        <w:t xml:space="preserve"> on the real side is a judgement call and is noted as a limitation.</w:t>
+        <w:t xml:space="preserve"> on the real side is a judgement call and is tested by repeating the transfer without the </w:t>
+      </w:r>
+      <w:r>
+        <w:rPr>
+          <w:i/>
+        </w:rPr>
+        <w:t>half-true</w:t>
+      </w:r>
+      <w:r>
+        <w:t xml:space="preserve"> statements.</w:t>
       </w:r>
     </w:p>
     <w:p>
       <w:pPr>
         <w:pStyle w:val="Heading2"/>
       </w:pPr>
-      <w:bookmarkStart w:id="14" w:name="_Toc242778351"/>
-      <w:r>
-        <w:lastRenderedPageBreak/>
+      <w:bookmarkStart w:id="14" w:name="_Toc242785661"/>
+      <w:r>
         <w:t>5.2 Shared evaluation protocol</w:t>
       </w:r>
       <w:bookmarkEnd w:id="14"/>
@@ -3543,7 +3657,7 @@
         <w:jc w:val="both"/>
       </w:pPr>
       <w:r>
-        <w:t>Logistic regression was chosen deliberately. Each word receives one weight, and the sign of the weight shows which class the word pushes towards, so the features a model relies on can be read directly. A linear model also strengthens the conclusions: if a simple model can separate the classes from stylistic input alone, the signal must be shallow and easy to find.</w:t>
+        <w:t>Logistic regression was chosen deliberately. Each word receives one weight, and the sign of the weight shows which class the word pushes towards, so the features a model relies on can be read directly. A linear model also strengthens the conclusions: if a simple model can separate the classes from stylistic input alone, the signal must be shallow and easy to find. To check that no result depends on this choice, the main text conditions were repeated with a linear support vector machine (SVM).</w:t>
       </w:r>
     </w:p>
     <w:p>
@@ -3558,8 +3672,9 @@
       <w:pPr>
         <w:pStyle w:val="Heading2"/>
       </w:pPr>
-      <w:bookmarkStart w:id="15" w:name="_Toc242778352"/>
-      <w:r>
+      <w:bookmarkStart w:id="15" w:name="_Toc242785662"/>
+      <w:r>
+        <w:lastRenderedPageBreak/>
         <w:t>5.3 Experimental conditions</w:t>
       </w:r>
       <w:bookmarkEnd w:id="15"/>
@@ -3628,6 +3743,34 @@
         <w:rPr>
           <w:b/>
         </w:rPr>
+        <w:t>E2d — Sentiment only.</w:t>
+      </w:r>
+      <w:r>
+        <w:t xml:space="preserve"> Each article, after the stripping described under E3b below, is reduced to eight VADER sentiment scores (negative, neutral, positive and compound, for the title and the body separately), classified with a random forest.</w:t>
+      </w:r>
+    </w:p>
+    <w:p>
+      <w:pPr>
+        <w:jc w:val="both"/>
+      </w:pPr>
+      <w:r>
+        <w:rPr>
+          <w:b/>
+        </w:rPr>
+        <w:t>E2e — Named entities only.</w:t>
+      </w:r>
+      <w:r>
+        <w:t xml:space="preserve"> spaCy's named-entity recogniser is run on each article after E3b stripping and the count of each entity type (people, places, organisations, dates and so on) per 100 words is kept, classified with a random forest. No entity names reach the model, only how many of each type occur.</w:t>
+      </w:r>
+    </w:p>
+    <w:p>
+      <w:pPr>
+        <w:jc w:val="both"/>
+      </w:pPr>
+      <w:r>
+        <w:rPr>
+          <w:b/>
+        </w:rPr>
         <w:t>E3 — Source markers stripped.</w:t>
       </w:r>
       <w:r>
@@ -3645,11 +3788,42 @@
         <w:t>E3b — Page clutter stripped from both classes.</w:t>
       </w:r>
       <w:r>
-        <w:t xml:space="preserve"> In addition to E3, text that is not article prose is removed from both classes: image and media credits (for example "Featured image </w:t>
-      </w:r>
-      <w:r>
-        <w:lastRenderedPageBreak/>
-        <w:t>via … Getty Images" or "Video via YouTube"), URLs, Twitter handles and media tags such as "[Video]" and "WATCH:". Curly quotation marks, ellipsis characters and dashes are converted to their plain forms. The removal rules were written after one inspection of the data and were not adjusted afterwards, so that the rules were not tuned towards a particular result.</w:t>
+        <w:t xml:space="preserve"> In addition to E3, text that is not article prose is removed from both classes: image and media credits (for example "Featured image via … Getty Images" or "Video via YouTube"), URLs, Twitter handles and media tags such as "[Video]" and "WATCH:". Every apostrophe and quotation mark, curly or straight, is replaced by a space, and ellipsis characters and dashes are converted to plain forms. This last rule exists because the fake articles lost these characters during scraping: "Trump's" appears as "Trump s" a</w:t>
+      </w:r>
+      <w:r>
+        <w:t xml:space="preserve">nd "couldn't" as "couldn t" (a word followed by a lone </w:t>
+      </w:r>
+      <w:r>
+        <w:rPr>
+          <w:i/>
+        </w:rPr>
+        <w:t>s</w:t>
+      </w:r>
+      <w:r>
+        <w:t xml:space="preserve"> or </w:t>
+      </w:r>
+      <w:r>
+        <w:rPr>
+          <w:i/>
+        </w:rPr>
+        <w:t>t</w:t>
+      </w:r>
+      <w:r>
+        <w:t xml:space="preserve"> occurs in 91.6% of fake articles against 38.8% of real ones), so removing them from both classes makes the two equal. The removal rules were written after one inspection of the data and changed only once afterwards: the straight-quote case was added when the coefficients of E5c exposed it. Results from before that change are reported in Section 6.6 so that its effect is visible.</w:t>
+      </w:r>
+    </w:p>
+    <w:p>
+      <w:pPr>
+        <w:jc w:val="both"/>
+      </w:pPr>
+      <w:r>
+        <w:rPr>
+          <w:b/>
+        </w:rPr>
+        <w:t>E3c — Stripped, function words only.</w:t>
+      </w:r>
+      <w:r>
+        <w:t xml:space="preserve"> The E3b text is reduced to function words as in E2b. This probe has neither content words nor any of the markers removed in E3 and E3b.</w:t>
       </w:r>
     </w:p>
     <w:p>
@@ -3663,7 +3837,11 @@
         <w:t>E4 — Cross-corpus transfer.</w:t>
       </w:r>
       <w:r>
-        <w:t xml:space="preserve"> Because LIAR has no article bodies, this experiment uses headlines. A model is trained on all ISOT titles and tested on all 12,836 LIAR statements. As an in-domain control, the same headline-only model is also evaluated on the standard ISOT split. The control shows how much accuracy headlines support within ISOT, so that any drop on LIAR can be attributed to crossing datasets.</w:t>
+        <w:t xml:space="preserve"> Because LIAR has no article bodies, this experiment uses headlines. A model is trained on all ISOT titles and tested on all 12,836 LIAR statements. As </w:t>
+      </w:r>
+      <w:r>
+        <w:lastRenderedPageBreak/>
+        <w:t>an in-domain control, the same headline-only model is also evaluated on the standard ISOT split. The control shows how much accuracy headlines support within ISOT, so that any drop on LIAR can be attributed to crossing datasets.</w:t>
       </w:r>
     </w:p>
     <w:p>
@@ -3671,14 +3849,28 @@
         <w:jc w:val="both"/>
       </w:pPr>
       <w:r>
-        <w:t>A body-only condition (E1 without the title) was also run to complete the degradation curve in Section 6.</w:t>
+        <w:rPr>
+          <w:b/>
+        </w:rPr>
+        <w:t>E5 — Topic-matched check.</w:t>
+      </w:r>
+      <w:r>
+        <w:t xml:space="preserve"> Real ISOT articles are 53% US politics and 47% world news, while the fake articles are all US politics and US news, so topic alone could separate part of the data. E5 keeps only the real US-politics articles and all fake articles (28,666 in total), and repeats the strictest conditions: full text (E5a), fully stripped text (E5b), stripped function words (E5c) and stripped metadata (E5d). On this subset fake articles are the majority, so chance rises to 60.9%.</w:t>
       </w:r>
     </w:p>
     <w:p>
       <w:pPr>
+        <w:jc w:val="both"/>
+      </w:pPr>
+      <w:r>
+        <w:t>A body-only condition (E1 without the title) was also run to complete the degradation curve in Section 6.</w:t>
+      </w:r>
+    </w:p>
+    <w:p>
+      <w:pPr>
         <w:pStyle w:val="Heading2"/>
       </w:pPr>
-      <w:bookmarkStart w:id="16" w:name="_Toc242778353"/>
+      <w:bookmarkStart w:id="16" w:name="_Toc242785663"/>
       <w:r>
         <w:t>5.4 Leakage-token analysis</w:t>
       </w:r>
@@ -3696,7 +3888,7 @@
       <w:pPr>
         <w:pStyle w:val="Heading2"/>
       </w:pPr>
-      <w:bookmarkStart w:id="17" w:name="_Toc242778354"/>
+      <w:bookmarkStart w:id="17" w:name="_Toc242785664"/>
       <w:r>
         <w:t>5.5 Implementation</w:t>
       </w:r>
@@ -3707,15 +3899,16 @@
         <w:jc w:val="both"/>
       </w:pPr>
       <w:r>
-        <w:t>The system is implemented in Python 3.10 with pandas 2.3, scikit-learn 1.7, spaCy 3.8 and matplotlib 3.10. Part-of-speech tagging of the full corpus takes about 25 minutes and is cached to disk. All experiments, figures and tables are reproduced by a single command in about ten minutes.</w:t>
+        <w:t>The system is implemented in Python 3.10 with pandas 2.3, scikit-learn 1.7, spaCy 3.8, NLTK 3.10 (VADER) and matplotlib 3.10. Part-of-speech and entity tagging of the corpus take about an hour in total and are cached to disk. All experiments, figures and tables are then reproduced by a single command in about fifteen minutes.</w:t>
       </w:r>
     </w:p>
     <w:p>
       <w:pPr>
         <w:pStyle w:val="Heading1"/>
       </w:pPr>
-      <w:bookmarkStart w:id="18" w:name="_Toc242778355"/>
-      <w:r>
+      <w:bookmarkStart w:id="18" w:name="_Toc242785665"/>
+      <w:r>
+        <w:lastRenderedPageBreak/>
         <w:t>6. Results and Discussion</w:t>
       </w:r>
       <w:bookmarkEnd w:id="18"/>
@@ -3724,7 +3917,7 @@
       <w:pPr>
         <w:pStyle w:val="Heading2"/>
       </w:pPr>
-      <w:bookmarkStart w:id="19" w:name="_Toc242778356"/>
+      <w:bookmarkStart w:id="19" w:name="_Toc242785666"/>
       <w:r>
         <w:t>6.1 Overview</w:t>
       </w:r>
@@ -3736,7 +3929,7 @@
         <w:keepNext/>
       </w:pPr>
       <w:r>
-        <w:t>Table 2. Accuracy of every condition. Chance is the majority-class rate.</w:t>
+        <w:t>Table 2. Accuracy of every condition (logistic regression, or random forest for numeric features). Chance is the majority-class rate of each test set.</w:t>
       </w:r>
     </w:p>
     <w:tbl>
@@ -3747,11 +3940,11 @@
         <w:tblLook w:val="04A0" w:firstRow="1" w:lastRow="0" w:firstColumn="1" w:lastColumn="0" w:noHBand="0" w:noVBand="1"/>
       </w:tblPr>
       <w:tblGrid>
-        <w:gridCol w:w="3288"/>
-        <w:gridCol w:w="1304"/>
-        <w:gridCol w:w="2041"/>
-        <w:gridCol w:w="1247"/>
+        <w:gridCol w:w="3628"/>
+        <w:gridCol w:w="1191"/>
+        <w:gridCol w:w="1984"/>
         <w:gridCol w:w="1134"/>
+        <w:gridCol w:w="1020"/>
       </w:tblGrid>
       <w:tr>
         <w:trPr>
@@ -3760,7 +3953,7 @@
         </w:trPr>
         <w:tc>
           <w:tcPr>
-            <w:tcW w:w="3288" w:type="dxa"/>
+            <w:tcW w:w="3628" w:type="dxa"/>
             <w:shd w:val="clear" w:color="auto" w:fill="E6F0FB"/>
           </w:tcPr>
           <w:p>
@@ -3779,7 +3972,7 @@
         </w:tc>
         <w:tc>
           <w:tcPr>
-            <w:tcW w:w="1304" w:type="dxa"/>
+            <w:tcW w:w="1191" w:type="dxa"/>
             <w:shd w:val="clear" w:color="auto" w:fill="E6F0FB"/>
           </w:tcPr>
           <w:p>
@@ -3798,7 +3991,7 @@
         </w:tc>
         <w:tc>
           <w:tcPr>
-            <w:tcW w:w="2041" w:type="dxa"/>
+            <w:tcW w:w="1984" w:type="dxa"/>
             <w:shd w:val="clear" w:color="auto" w:fill="E6F0FB"/>
           </w:tcPr>
           <w:p>
@@ -3817,7 +4010,7 @@
         </w:tc>
         <w:tc>
           <w:tcPr>
-            <w:tcW w:w="1247" w:type="dxa"/>
+            <w:tcW w:w="1134" w:type="dxa"/>
             <w:shd w:val="clear" w:color="auto" w:fill="E6F0FB"/>
           </w:tcPr>
           <w:p>
@@ -3836,7 +4029,7 @@
         </w:tc>
         <w:tc>
           <w:tcPr>
-            <w:tcW w:w="1134" w:type="dxa"/>
+            <w:tcW w:w="1020" w:type="dxa"/>
             <w:shd w:val="clear" w:color="auto" w:fill="E6F0FB"/>
           </w:tcPr>
           <w:p>
@@ -3861,7 +4054,7 @@
         </w:trPr>
         <w:tc>
           <w:tcPr>
-            <w:tcW w:w="3288" w:type="dxa"/>
+            <w:tcW w:w="3628" w:type="dxa"/>
           </w:tcPr>
           <w:p>
             <w:pPr>
@@ -3878,7 +4071,7 @@
         </w:tc>
         <w:tc>
           <w:tcPr>
-            <w:tcW w:w="1304" w:type="dxa"/>
+            <w:tcW w:w="1191" w:type="dxa"/>
           </w:tcPr>
           <w:p>
             <w:pPr>
@@ -3895,7 +4088,7 @@
         </w:tc>
         <w:tc>
           <w:tcPr>
-            <w:tcW w:w="2041" w:type="dxa"/>
+            <w:tcW w:w="1984" w:type="dxa"/>
           </w:tcPr>
           <w:p>
             <w:pPr>
@@ -3912,7 +4105,7 @@
         </w:tc>
         <w:tc>
           <w:tcPr>
-            <w:tcW w:w="1247" w:type="dxa"/>
+            <w:tcW w:w="1134" w:type="dxa"/>
           </w:tcPr>
           <w:p>
             <w:pPr>
@@ -3929,7 +4122,7 @@
         </w:tc>
         <w:tc>
           <w:tcPr>
-            <w:tcW w:w="1134" w:type="dxa"/>
+            <w:tcW w:w="1020" w:type="dxa"/>
           </w:tcPr>
           <w:p>
             <w:pPr>
@@ -3952,7 +4145,7 @@
         </w:trPr>
         <w:tc>
           <w:tcPr>
-            <w:tcW w:w="3288" w:type="dxa"/>
+            <w:tcW w:w="3628" w:type="dxa"/>
           </w:tcPr>
           <w:p>
             <w:pPr>
@@ -3969,7 +4162,7 @@
         </w:tc>
         <w:tc>
           <w:tcPr>
-            <w:tcW w:w="1304" w:type="dxa"/>
+            <w:tcW w:w="1191" w:type="dxa"/>
           </w:tcPr>
           <w:p>
             <w:pPr>
@@ -3986,7 +4179,7 @@
         </w:tc>
         <w:tc>
           <w:tcPr>
-            <w:tcW w:w="2041" w:type="dxa"/>
+            <w:tcW w:w="1984" w:type="dxa"/>
           </w:tcPr>
           <w:p>
             <w:pPr>
@@ -4003,7 +4196,7 @@
         </w:tc>
         <w:tc>
           <w:tcPr>
-            <w:tcW w:w="1247" w:type="dxa"/>
+            <w:tcW w:w="1134" w:type="dxa"/>
           </w:tcPr>
           <w:p>
             <w:pPr>
@@ -4020,7 +4213,7 @@
         </w:tc>
         <w:tc>
           <w:tcPr>
-            <w:tcW w:w="1134" w:type="dxa"/>
+            <w:tcW w:w="1020" w:type="dxa"/>
           </w:tcPr>
           <w:p>
             <w:pPr>
@@ -4043,7 +4236,7 @@
         </w:trPr>
         <w:tc>
           <w:tcPr>
-            <w:tcW w:w="3288" w:type="dxa"/>
+            <w:tcW w:w="3628" w:type="dxa"/>
           </w:tcPr>
           <w:p>
             <w:pPr>
@@ -4060,7 +4253,7 @@
         </w:tc>
         <w:tc>
           <w:tcPr>
-            <w:tcW w:w="1304" w:type="dxa"/>
+            <w:tcW w:w="1191" w:type="dxa"/>
           </w:tcPr>
           <w:p>
             <w:pPr>
@@ -4077,7 +4270,7 @@
         </w:tc>
         <w:tc>
           <w:tcPr>
-            <w:tcW w:w="2041" w:type="dxa"/>
+            <w:tcW w:w="1984" w:type="dxa"/>
           </w:tcPr>
           <w:p>
             <w:pPr>
@@ -4094,7 +4287,7 @@
         </w:tc>
         <w:tc>
           <w:tcPr>
-            <w:tcW w:w="1247" w:type="dxa"/>
+            <w:tcW w:w="1134" w:type="dxa"/>
           </w:tcPr>
           <w:p>
             <w:pPr>
@@ -4111,7 +4304,7 @@
         </w:tc>
         <w:tc>
           <w:tcPr>
-            <w:tcW w:w="1134" w:type="dxa"/>
+            <w:tcW w:w="1020" w:type="dxa"/>
           </w:tcPr>
           <w:p>
             <w:pPr>
@@ -4134,7 +4327,7 @@
         </w:trPr>
         <w:tc>
           <w:tcPr>
-            <w:tcW w:w="3288" w:type="dxa"/>
+            <w:tcW w:w="3628" w:type="dxa"/>
           </w:tcPr>
           <w:p>
             <w:pPr>
@@ -4151,7 +4344,7 @@
         </w:tc>
         <w:tc>
           <w:tcPr>
-            <w:tcW w:w="1304" w:type="dxa"/>
+            <w:tcW w:w="1191" w:type="dxa"/>
           </w:tcPr>
           <w:p>
             <w:pPr>
@@ -4168,7 +4361,7 @@
         </w:tc>
         <w:tc>
           <w:tcPr>
-            <w:tcW w:w="2041" w:type="dxa"/>
+            <w:tcW w:w="1984" w:type="dxa"/>
           </w:tcPr>
           <w:p>
             <w:pPr>
@@ -4185,7 +4378,7 @@
         </w:tc>
         <w:tc>
           <w:tcPr>
-            <w:tcW w:w="1247" w:type="dxa"/>
+            <w:tcW w:w="1134" w:type="dxa"/>
           </w:tcPr>
           <w:p>
             <w:pPr>
@@ -4202,7 +4395,7 @@
         </w:tc>
         <w:tc>
           <w:tcPr>
-            <w:tcW w:w="1134" w:type="dxa"/>
+            <w:tcW w:w="1020" w:type="dxa"/>
           </w:tcPr>
           <w:p>
             <w:pPr>
@@ -4225,75 +4418,75 @@
         </w:trPr>
         <w:tc>
           <w:tcPr>
-            <w:tcW w:w="3288" w:type="dxa"/>
-          </w:tcPr>
-          <w:p>
-            <w:pPr>
-              <w:keepNext/>
-              <w:spacing w:before="20" w:after="20" w:line="240" w:lineRule="auto"/>
-            </w:pPr>
-            <w:r>
-              <w:rPr>
-                <w:sz w:val="20"/>
-              </w:rPr>
-              <w:t>E3  Source markers stripped</w:t>
-            </w:r>
-          </w:p>
-        </w:tc>
-        <w:tc>
-          <w:tcPr>
-            <w:tcW w:w="1304" w:type="dxa"/>
-          </w:tcPr>
-          <w:p>
-            <w:pPr>
-              <w:keepNext/>
-              <w:spacing w:before="20" w:after="20" w:line="240" w:lineRule="auto"/>
-            </w:pPr>
-            <w:r>
-              <w:rPr>
-                <w:sz w:val="20"/>
-              </w:rPr>
-              <w:t>97.7%</w:t>
-            </w:r>
-          </w:p>
-        </w:tc>
-        <w:tc>
-          <w:tcPr>
-            <w:tcW w:w="2041" w:type="dxa"/>
-          </w:tcPr>
-          <w:p>
-            <w:pPr>
-              <w:keepNext/>
-              <w:spacing w:before="20" w:after="20" w:line="240" w:lineRule="auto"/>
-            </w:pPr>
-            <w:r>
-              <w:rPr>
-                <w:sz w:val="20"/>
-              </w:rPr>
-              <w:t>97.7% ± 0.2%</w:t>
-            </w:r>
-          </w:p>
-        </w:tc>
-        <w:tc>
-          <w:tcPr>
-            <w:tcW w:w="1247" w:type="dxa"/>
-          </w:tcPr>
-          <w:p>
-            <w:pPr>
-              <w:keepNext/>
-              <w:spacing w:before="20" w:after="20" w:line="240" w:lineRule="auto"/>
-            </w:pPr>
-            <w:r>
-              <w:rPr>
-                <w:sz w:val="20"/>
-              </w:rPr>
-              <w:t>0.975</w:t>
+            <w:tcW w:w="3628" w:type="dxa"/>
+          </w:tcPr>
+          <w:p>
+            <w:pPr>
+              <w:keepNext/>
+              <w:spacing w:before="20" w:after="20" w:line="240" w:lineRule="auto"/>
+            </w:pPr>
+            <w:r>
+              <w:rPr>
+                <w:sz w:val="20"/>
+              </w:rPr>
+              <w:t>E2d  Sentiment only</w:t>
+            </w:r>
+          </w:p>
+        </w:tc>
+        <w:tc>
+          <w:tcPr>
+            <w:tcW w:w="1191" w:type="dxa"/>
+          </w:tcPr>
+          <w:p>
+            <w:pPr>
+              <w:keepNext/>
+              <w:spacing w:before="20" w:after="20" w:line="240" w:lineRule="auto"/>
+            </w:pPr>
+            <w:r>
+              <w:rPr>
+                <w:sz w:val="20"/>
+              </w:rPr>
+              <w:t>73.8%</w:t>
+            </w:r>
+          </w:p>
+        </w:tc>
+        <w:tc>
+          <w:tcPr>
+            <w:tcW w:w="1984" w:type="dxa"/>
+          </w:tcPr>
+          <w:p>
+            <w:pPr>
+              <w:keepNext/>
+              <w:spacing w:before="20" w:after="20" w:line="240" w:lineRule="auto"/>
+            </w:pPr>
+            <w:r>
+              <w:rPr>
+                <w:sz w:val="20"/>
+              </w:rPr>
+              <w:t>74.1% ± 0.5%</w:t>
             </w:r>
           </w:p>
         </w:tc>
         <w:tc>
           <w:tcPr>
             <w:tcW w:w="1134" w:type="dxa"/>
+          </w:tcPr>
+          <w:p>
+            <w:pPr>
+              <w:keepNext/>
+              <w:spacing w:before="20" w:after="20" w:line="240" w:lineRule="auto"/>
+            </w:pPr>
+            <w:r>
+              <w:rPr>
+                <w:sz w:val="20"/>
+              </w:rPr>
+              <w:t>0.696</w:t>
+            </w:r>
+          </w:p>
+        </w:tc>
+        <w:tc>
+          <w:tcPr>
+            <w:tcW w:w="1020" w:type="dxa"/>
           </w:tcPr>
           <w:p>
             <w:pPr>
@@ -4316,75 +4509,75 @@
         </w:trPr>
         <w:tc>
           <w:tcPr>
-            <w:tcW w:w="3288" w:type="dxa"/>
-          </w:tcPr>
-          <w:p>
-            <w:pPr>
-              <w:keepNext/>
-              <w:spacing w:before="20" w:after="20" w:line="240" w:lineRule="auto"/>
-            </w:pPr>
-            <w:r>
-              <w:rPr>
-                <w:sz w:val="20"/>
-              </w:rPr>
-              <w:t>E3b  Page clutter stripped</w:t>
-            </w:r>
-          </w:p>
-        </w:tc>
-        <w:tc>
-          <w:tcPr>
-            <w:tcW w:w="1304" w:type="dxa"/>
-          </w:tcPr>
-          <w:p>
-            <w:pPr>
-              <w:keepNext/>
-              <w:spacing w:before="20" w:after="20" w:line="240" w:lineRule="auto"/>
-            </w:pPr>
-            <w:r>
-              <w:rPr>
-                <w:sz w:val="20"/>
-              </w:rPr>
-              <w:t>97.3%</w:t>
-            </w:r>
-          </w:p>
-        </w:tc>
-        <w:tc>
-          <w:tcPr>
-            <w:tcW w:w="2041" w:type="dxa"/>
-          </w:tcPr>
-          <w:p>
-            <w:pPr>
-              <w:keepNext/>
-              <w:spacing w:before="20" w:after="20" w:line="240" w:lineRule="auto"/>
-            </w:pPr>
-            <w:r>
-              <w:rPr>
-                <w:sz w:val="20"/>
-              </w:rPr>
-              <w:t>97.3% ± 0.1%</w:t>
-            </w:r>
-          </w:p>
-        </w:tc>
-        <w:tc>
-          <w:tcPr>
-            <w:tcW w:w="1247" w:type="dxa"/>
-          </w:tcPr>
-          <w:p>
-            <w:pPr>
-              <w:keepNext/>
-              <w:spacing w:before="20" w:after="20" w:line="240" w:lineRule="auto"/>
-            </w:pPr>
-            <w:r>
-              <w:rPr>
-                <w:sz w:val="20"/>
-              </w:rPr>
-              <w:t>0.970</w:t>
+            <w:tcW w:w="3628" w:type="dxa"/>
+          </w:tcPr>
+          <w:p>
+            <w:pPr>
+              <w:keepNext/>
+              <w:spacing w:before="20" w:after="20" w:line="240" w:lineRule="auto"/>
+            </w:pPr>
+            <w:r>
+              <w:rPr>
+                <w:sz w:val="20"/>
+              </w:rPr>
+              <w:t>E2e  Named entities only</w:t>
+            </w:r>
+          </w:p>
+        </w:tc>
+        <w:tc>
+          <w:tcPr>
+            <w:tcW w:w="1191" w:type="dxa"/>
+          </w:tcPr>
+          <w:p>
+            <w:pPr>
+              <w:keepNext/>
+              <w:spacing w:before="20" w:after="20" w:line="240" w:lineRule="auto"/>
+            </w:pPr>
+            <w:r>
+              <w:rPr>
+                <w:sz w:val="20"/>
+              </w:rPr>
+              <w:t>81.1%</w:t>
+            </w:r>
+          </w:p>
+        </w:tc>
+        <w:tc>
+          <w:tcPr>
+            <w:tcW w:w="1984" w:type="dxa"/>
+          </w:tcPr>
+          <w:p>
+            <w:pPr>
+              <w:keepNext/>
+              <w:spacing w:before="20" w:after="20" w:line="240" w:lineRule="auto"/>
+            </w:pPr>
+            <w:r>
+              <w:rPr>
+                <w:sz w:val="20"/>
+              </w:rPr>
+              <w:t>81.6% ± 0.4%</w:t>
             </w:r>
           </w:p>
         </w:tc>
         <w:tc>
           <w:tcPr>
             <w:tcW w:w="1134" w:type="dxa"/>
+          </w:tcPr>
+          <w:p>
+            <w:pPr>
+              <w:keepNext/>
+              <w:spacing w:before="20" w:after="20" w:line="240" w:lineRule="auto"/>
+            </w:pPr>
+            <w:r>
+              <w:rPr>
+                <w:sz w:val="20"/>
+              </w:rPr>
+              <w:t>0.782</w:t>
+            </w:r>
+          </w:p>
+        </w:tc>
+        <w:tc>
+          <w:tcPr>
+            <w:tcW w:w="1020" w:type="dxa"/>
           </w:tcPr>
           <w:p>
             <w:pPr>
@@ -4407,75 +4600,75 @@
         </w:trPr>
         <w:tc>
           <w:tcPr>
-            <w:tcW w:w="3288" w:type="dxa"/>
-          </w:tcPr>
-          <w:p>
-            <w:pPr>
-              <w:keepNext/>
-              <w:spacing w:before="20" w:after="20" w:line="240" w:lineRule="auto"/>
-            </w:pPr>
-            <w:r>
-              <w:rPr>
-                <w:sz w:val="20"/>
-              </w:rPr>
-              <w:t>E4 control  ISOT headlines</w:t>
-            </w:r>
-          </w:p>
-        </w:tc>
-        <w:tc>
-          <w:tcPr>
-            <w:tcW w:w="1304" w:type="dxa"/>
-          </w:tcPr>
-          <w:p>
-            <w:pPr>
-              <w:keepNext/>
-              <w:spacing w:before="20" w:after="20" w:line="240" w:lineRule="auto"/>
-            </w:pPr>
-            <w:r>
-              <w:rPr>
-                <w:sz w:val="20"/>
-              </w:rPr>
-              <w:t>94.6%</w:t>
-            </w:r>
-          </w:p>
-        </w:tc>
-        <w:tc>
-          <w:tcPr>
-            <w:tcW w:w="2041" w:type="dxa"/>
-          </w:tcPr>
-          <w:p>
-            <w:pPr>
-              <w:keepNext/>
-              <w:spacing w:before="20" w:after="20" w:line="240" w:lineRule="auto"/>
-            </w:pPr>
-            <w:r>
-              <w:rPr>
-                <w:sz w:val="20"/>
-              </w:rPr>
-              <w:t>94.7% ± 0.4%</w:t>
-            </w:r>
-          </w:p>
-        </w:tc>
-        <w:tc>
-          <w:tcPr>
-            <w:tcW w:w="1247" w:type="dxa"/>
-          </w:tcPr>
-          <w:p>
-            <w:pPr>
-              <w:keepNext/>
-              <w:spacing w:before="20" w:after="20" w:line="240" w:lineRule="auto"/>
-            </w:pPr>
-            <w:r>
-              <w:rPr>
-                <w:sz w:val="20"/>
-              </w:rPr>
-              <w:t>0.939</w:t>
+            <w:tcW w:w="3628" w:type="dxa"/>
+          </w:tcPr>
+          <w:p>
+            <w:pPr>
+              <w:keepNext/>
+              <w:spacing w:before="20" w:after="20" w:line="240" w:lineRule="auto"/>
+            </w:pPr>
+            <w:r>
+              <w:rPr>
+                <w:sz w:val="20"/>
+              </w:rPr>
+              <w:t>E3  Source markers stripped</w:t>
+            </w:r>
+          </w:p>
+        </w:tc>
+        <w:tc>
+          <w:tcPr>
+            <w:tcW w:w="1191" w:type="dxa"/>
+          </w:tcPr>
+          <w:p>
+            <w:pPr>
+              <w:keepNext/>
+              <w:spacing w:before="20" w:after="20" w:line="240" w:lineRule="auto"/>
+            </w:pPr>
+            <w:r>
+              <w:rPr>
+                <w:sz w:val="20"/>
+              </w:rPr>
+              <w:t>97.7%</w:t>
+            </w:r>
+          </w:p>
+        </w:tc>
+        <w:tc>
+          <w:tcPr>
+            <w:tcW w:w="1984" w:type="dxa"/>
+          </w:tcPr>
+          <w:p>
+            <w:pPr>
+              <w:keepNext/>
+              <w:spacing w:before="20" w:after="20" w:line="240" w:lineRule="auto"/>
+            </w:pPr>
+            <w:r>
+              <w:rPr>
+                <w:sz w:val="20"/>
+              </w:rPr>
+              <w:t>97.7% ± 0.2%</w:t>
             </w:r>
           </w:p>
         </w:tc>
         <w:tc>
           <w:tcPr>
             <w:tcW w:w="1134" w:type="dxa"/>
+          </w:tcPr>
+          <w:p>
+            <w:pPr>
+              <w:keepNext/>
+              <w:spacing w:before="20" w:after="20" w:line="240" w:lineRule="auto"/>
+            </w:pPr>
+            <w:r>
+              <w:rPr>
+                <w:sz w:val="20"/>
+              </w:rPr>
+              <w:t>0.975</w:t>
+            </w:r>
+          </w:p>
+        </w:tc>
+        <w:tc>
+          <w:tcPr>
+            <w:tcW w:w="1020" w:type="dxa"/>
           </w:tcPr>
           <w:p>
             <w:pPr>
@@ -4498,10 +4691,284 @@
         </w:trPr>
         <w:tc>
           <w:tcPr>
-            <w:tcW w:w="3288" w:type="dxa"/>
-          </w:tcPr>
-          <w:p>
-            <w:pPr>
+            <w:tcW w:w="3628" w:type="dxa"/>
+          </w:tcPr>
+          <w:p>
+            <w:pPr>
+              <w:keepNext/>
+              <w:spacing w:before="20" w:after="20" w:line="240" w:lineRule="auto"/>
+            </w:pPr>
+            <w:r>
+              <w:rPr>
+                <w:sz w:val="20"/>
+              </w:rPr>
+              <w:t>E3b  Page clutter stripped</w:t>
+            </w:r>
+          </w:p>
+        </w:tc>
+        <w:tc>
+          <w:tcPr>
+            <w:tcW w:w="1191" w:type="dxa"/>
+          </w:tcPr>
+          <w:p>
+            <w:pPr>
+              <w:keepNext/>
+              <w:spacing w:before="20" w:after="20" w:line="240" w:lineRule="auto"/>
+            </w:pPr>
+            <w:r>
+              <w:rPr>
+                <w:sz w:val="20"/>
+              </w:rPr>
+              <w:t>97.3%</w:t>
+            </w:r>
+          </w:p>
+        </w:tc>
+        <w:tc>
+          <w:tcPr>
+            <w:tcW w:w="1984" w:type="dxa"/>
+          </w:tcPr>
+          <w:p>
+            <w:pPr>
+              <w:keepNext/>
+              <w:spacing w:before="20" w:after="20" w:line="240" w:lineRule="auto"/>
+            </w:pPr>
+            <w:r>
+              <w:rPr>
+                <w:sz w:val="20"/>
+              </w:rPr>
+              <w:t>97.3% ± 0.1%</w:t>
+            </w:r>
+          </w:p>
+        </w:tc>
+        <w:tc>
+          <w:tcPr>
+            <w:tcW w:w="1134" w:type="dxa"/>
+          </w:tcPr>
+          <w:p>
+            <w:pPr>
+              <w:keepNext/>
+              <w:spacing w:before="20" w:after="20" w:line="240" w:lineRule="auto"/>
+            </w:pPr>
+            <w:r>
+              <w:rPr>
+                <w:sz w:val="20"/>
+              </w:rPr>
+              <w:t>0.970</w:t>
+            </w:r>
+          </w:p>
+        </w:tc>
+        <w:tc>
+          <w:tcPr>
+            <w:tcW w:w="1020" w:type="dxa"/>
+          </w:tcPr>
+          <w:p>
+            <w:pPr>
+              <w:keepNext/>
+              <w:spacing w:before="20" w:after="20" w:line="240" w:lineRule="auto"/>
+            </w:pPr>
+            <w:r>
+              <w:rPr>
+                <w:sz w:val="20"/>
+              </w:rPr>
+              <w:t>54.8%</w:t>
+            </w:r>
+          </w:p>
+        </w:tc>
+      </w:tr>
+      <w:tr>
+        <w:trPr>
+          <w:cantSplit/>
+          <w:jc w:val="center"/>
+        </w:trPr>
+        <w:tc>
+          <w:tcPr>
+            <w:tcW w:w="3628" w:type="dxa"/>
+          </w:tcPr>
+          <w:p>
+            <w:pPr>
+              <w:keepNext/>
+              <w:spacing w:before="20" w:after="20" w:line="240" w:lineRule="auto"/>
+            </w:pPr>
+            <w:r>
+              <w:rPr>
+                <w:sz w:val="20"/>
+              </w:rPr>
+              <w:t>E3c  Stripped, function words</w:t>
+            </w:r>
+          </w:p>
+        </w:tc>
+        <w:tc>
+          <w:tcPr>
+            <w:tcW w:w="1191" w:type="dxa"/>
+          </w:tcPr>
+          <w:p>
+            <w:pPr>
+              <w:keepNext/>
+              <w:spacing w:before="20" w:after="20" w:line="240" w:lineRule="auto"/>
+            </w:pPr>
+            <w:r>
+              <w:rPr>
+                <w:sz w:val="20"/>
+              </w:rPr>
+              <w:t>90.7%</w:t>
+            </w:r>
+          </w:p>
+        </w:tc>
+        <w:tc>
+          <w:tcPr>
+            <w:tcW w:w="1984" w:type="dxa"/>
+          </w:tcPr>
+          <w:p>
+            <w:pPr>
+              <w:keepNext/>
+              <w:spacing w:before="20" w:after="20" w:line="240" w:lineRule="auto"/>
+            </w:pPr>
+            <w:r>
+              <w:rPr>
+                <w:sz w:val="20"/>
+              </w:rPr>
+              <w:t>90.8% ± 0.1%</w:t>
+            </w:r>
+          </w:p>
+        </w:tc>
+        <w:tc>
+          <w:tcPr>
+            <w:tcW w:w="1134" w:type="dxa"/>
+          </w:tcPr>
+          <w:p>
+            <w:pPr>
+              <w:keepNext/>
+              <w:spacing w:before="20" w:after="20" w:line="240" w:lineRule="auto"/>
+            </w:pPr>
+            <w:r>
+              <w:rPr>
+                <w:sz w:val="20"/>
+              </w:rPr>
+              <w:t>0.895</w:t>
+            </w:r>
+          </w:p>
+        </w:tc>
+        <w:tc>
+          <w:tcPr>
+            <w:tcW w:w="1020" w:type="dxa"/>
+          </w:tcPr>
+          <w:p>
+            <w:pPr>
+              <w:keepNext/>
+              <w:spacing w:before="20" w:after="20" w:line="240" w:lineRule="auto"/>
+            </w:pPr>
+            <w:r>
+              <w:rPr>
+                <w:sz w:val="20"/>
+              </w:rPr>
+              <w:t>54.8%</w:t>
+            </w:r>
+          </w:p>
+        </w:tc>
+      </w:tr>
+      <w:tr>
+        <w:trPr>
+          <w:cantSplit/>
+          <w:jc w:val="center"/>
+        </w:trPr>
+        <w:tc>
+          <w:tcPr>
+            <w:tcW w:w="3628" w:type="dxa"/>
+          </w:tcPr>
+          <w:p>
+            <w:pPr>
+              <w:keepNext/>
+              <w:spacing w:before="20" w:after="20" w:line="240" w:lineRule="auto"/>
+            </w:pPr>
+            <w:r>
+              <w:rPr>
+                <w:sz w:val="20"/>
+              </w:rPr>
+              <w:t>E4 control  ISOT headlines</w:t>
+            </w:r>
+          </w:p>
+        </w:tc>
+        <w:tc>
+          <w:tcPr>
+            <w:tcW w:w="1191" w:type="dxa"/>
+          </w:tcPr>
+          <w:p>
+            <w:pPr>
+              <w:keepNext/>
+              <w:spacing w:before="20" w:after="20" w:line="240" w:lineRule="auto"/>
+            </w:pPr>
+            <w:r>
+              <w:rPr>
+                <w:sz w:val="20"/>
+              </w:rPr>
+              <w:t>94.6%</w:t>
+            </w:r>
+          </w:p>
+        </w:tc>
+        <w:tc>
+          <w:tcPr>
+            <w:tcW w:w="1984" w:type="dxa"/>
+          </w:tcPr>
+          <w:p>
+            <w:pPr>
+              <w:keepNext/>
+              <w:spacing w:before="20" w:after="20" w:line="240" w:lineRule="auto"/>
+            </w:pPr>
+            <w:r>
+              <w:rPr>
+                <w:sz w:val="20"/>
+              </w:rPr>
+              <w:t>94.7% ± 0.4%</w:t>
+            </w:r>
+          </w:p>
+        </w:tc>
+        <w:tc>
+          <w:tcPr>
+            <w:tcW w:w="1134" w:type="dxa"/>
+          </w:tcPr>
+          <w:p>
+            <w:pPr>
+              <w:keepNext/>
+              <w:spacing w:before="20" w:after="20" w:line="240" w:lineRule="auto"/>
+            </w:pPr>
+            <w:r>
+              <w:rPr>
+                <w:sz w:val="20"/>
+              </w:rPr>
+              <w:t>0.939</w:t>
+            </w:r>
+          </w:p>
+        </w:tc>
+        <w:tc>
+          <w:tcPr>
+            <w:tcW w:w="1020" w:type="dxa"/>
+          </w:tcPr>
+          <w:p>
+            <w:pPr>
+              <w:keepNext/>
+              <w:spacing w:before="20" w:after="20" w:line="240" w:lineRule="auto"/>
+            </w:pPr>
+            <w:r>
+              <w:rPr>
+                <w:sz w:val="20"/>
+              </w:rPr>
+              <w:t>54.8%</w:t>
+            </w:r>
+          </w:p>
+        </w:tc>
+      </w:tr>
+      <w:tr>
+        <w:trPr>
+          <w:cantSplit/>
+          <w:jc w:val="center"/>
+        </w:trPr>
+        <w:tc>
+          <w:tcPr>
+            <w:tcW w:w="3628" w:type="dxa"/>
+          </w:tcPr>
+          <w:p>
+            <w:pPr>
+              <w:keepNext/>
               <w:spacing w:before="20" w:after="20" w:line="240" w:lineRule="auto"/>
             </w:pPr>
             <w:r>
@@ -4514,10 +4981,11 @@
         </w:tc>
         <w:tc>
           <w:tcPr>
-            <w:tcW w:w="1304" w:type="dxa"/>
-          </w:tcPr>
-          <w:p>
-            <w:pPr>
+            <w:tcW w:w="1191" w:type="dxa"/>
+          </w:tcPr>
+          <w:p>
+            <w:pPr>
+              <w:keepNext/>
               <w:spacing w:before="20" w:after="20" w:line="240" w:lineRule="auto"/>
             </w:pPr>
             <w:r>
@@ -4530,10 +4998,11 @@
         </w:tc>
         <w:tc>
           <w:tcPr>
-            <w:tcW w:w="2041" w:type="dxa"/>
-          </w:tcPr>
-          <w:p>
-            <w:pPr>
+            <w:tcW w:w="1984" w:type="dxa"/>
+          </w:tcPr>
+          <w:p>
+            <w:pPr>
+              <w:keepNext/>
               <w:spacing w:before="20" w:after="20" w:line="240" w:lineRule="auto"/>
             </w:pPr>
             <w:r>
@@ -4546,10 +5015,11 @@
         </w:tc>
         <w:tc>
           <w:tcPr>
-            <w:tcW w:w="1247" w:type="dxa"/>
-          </w:tcPr>
-          <w:p>
-            <w:pPr>
+            <w:tcW w:w="1134" w:type="dxa"/>
+          </w:tcPr>
+          <w:p>
+            <w:pPr>
+              <w:keepNext/>
               <w:spacing w:before="20" w:after="20" w:line="240" w:lineRule="auto"/>
             </w:pPr>
             <w:r>
@@ -4562,17 +5032,468 @@
         </w:tc>
         <w:tc>
           <w:tcPr>
+            <w:tcW w:w="1020" w:type="dxa"/>
+          </w:tcPr>
+          <w:p>
+            <w:pPr>
+              <w:keepNext/>
+              <w:spacing w:before="20" w:after="20" w:line="240" w:lineRule="auto"/>
+            </w:pPr>
+            <w:r>
+              <w:rPr>
+                <w:sz w:val="20"/>
+              </w:rPr>
+              <w:t>55.8%</w:t>
+            </w:r>
+          </w:p>
+        </w:tc>
+      </w:tr>
+      <w:tr>
+        <w:trPr>
+          <w:cantSplit/>
+          <w:jc w:val="center"/>
+        </w:trPr>
+        <w:tc>
+          <w:tcPr>
+            <w:tcW w:w="3628" w:type="dxa"/>
+          </w:tcPr>
+          <w:p>
+            <w:pPr>
+              <w:keepNext/>
+              <w:spacing w:before="20" w:after="20" w:line="240" w:lineRule="auto"/>
+            </w:pPr>
+            <w:r>
+              <w:rPr>
+                <w:sz w:val="20"/>
+              </w:rPr>
+              <w:t>E4  ISOT → LIAR, no half-true</w:t>
+            </w:r>
+          </w:p>
+        </w:tc>
+        <w:tc>
+          <w:tcPr>
+            <w:tcW w:w="1191" w:type="dxa"/>
+          </w:tcPr>
+          <w:p>
+            <w:pPr>
+              <w:keepNext/>
+              <w:spacing w:before="20" w:after="20" w:line="240" w:lineRule="auto"/>
+            </w:pPr>
+            <w:r>
+              <w:rPr>
+                <w:sz w:val="20"/>
+              </w:rPr>
+              <w:t>51.1%</w:t>
+            </w:r>
+          </w:p>
+        </w:tc>
+        <w:tc>
+          <w:tcPr>
+            <w:tcW w:w="1984" w:type="dxa"/>
+          </w:tcPr>
+          <w:p>
+            <w:pPr>
+              <w:keepNext/>
+              <w:spacing w:before="20" w:after="20" w:line="240" w:lineRule="auto"/>
+            </w:pPr>
+            <w:r>
+              <w:rPr>
+                <w:sz w:val="20"/>
+              </w:rPr>
+              <w:t>—</w:t>
+            </w:r>
+          </w:p>
+        </w:tc>
+        <w:tc>
+          <w:tcPr>
             <w:tcW w:w="1134" w:type="dxa"/>
           </w:tcPr>
           <w:p>
             <w:pPr>
-              <w:spacing w:before="20" w:after="20" w:line="240" w:lineRule="auto"/>
-            </w:pPr>
-            <w:r>
-              <w:rPr>
-                <w:sz w:val="20"/>
-              </w:rPr>
-              <w:t>55.8%</w:t>
+              <w:keepNext/>
+              <w:spacing w:before="20" w:after="20" w:line="240" w:lineRule="auto"/>
+            </w:pPr>
+            <w:r>
+              <w:rPr>
+                <w:sz w:val="20"/>
+              </w:rPr>
+              <w:t>0.631</w:t>
+            </w:r>
+          </w:p>
+        </w:tc>
+        <w:tc>
+          <w:tcPr>
+            <w:tcW w:w="1020" w:type="dxa"/>
+          </w:tcPr>
+          <w:p>
+            <w:pPr>
+              <w:keepNext/>
+              <w:spacing w:before="20" w:after="20" w:line="240" w:lineRule="auto"/>
+            </w:pPr>
+            <w:r>
+              <w:rPr>
+                <w:sz w:val="20"/>
+              </w:rPr>
+              <w:t>55.6%</w:t>
+            </w:r>
+          </w:p>
+        </w:tc>
+      </w:tr>
+      <w:tr>
+        <w:trPr>
+          <w:cantSplit/>
+          <w:jc w:val="center"/>
+        </w:trPr>
+        <w:tc>
+          <w:tcPr>
+            <w:tcW w:w="3628" w:type="dxa"/>
+          </w:tcPr>
+          <w:p>
+            <w:pPr>
+              <w:keepNext/>
+              <w:spacing w:before="20" w:after="20" w:line="240" w:lineRule="auto"/>
+            </w:pPr>
+            <w:r>
+              <w:rPr>
+                <w:sz w:val="20"/>
+              </w:rPr>
+              <w:t>E5a  US politics: full text</w:t>
+            </w:r>
+          </w:p>
+        </w:tc>
+        <w:tc>
+          <w:tcPr>
+            <w:tcW w:w="1191" w:type="dxa"/>
+          </w:tcPr>
+          <w:p>
+            <w:pPr>
+              <w:keepNext/>
+              <w:spacing w:before="20" w:after="20" w:line="240" w:lineRule="auto"/>
+            </w:pPr>
+            <w:r>
+              <w:rPr>
+                <w:sz w:val="20"/>
+              </w:rPr>
+              <w:t>98.3%</w:t>
+            </w:r>
+          </w:p>
+        </w:tc>
+        <w:tc>
+          <w:tcPr>
+            <w:tcW w:w="1984" w:type="dxa"/>
+          </w:tcPr>
+          <w:p>
+            <w:pPr>
+              <w:keepNext/>
+              <w:spacing w:before="20" w:after="20" w:line="240" w:lineRule="auto"/>
+            </w:pPr>
+            <w:r>
+              <w:rPr>
+                <w:sz w:val="20"/>
+              </w:rPr>
+              <w:t>98.5% ± 0.1%</w:t>
+            </w:r>
+          </w:p>
+        </w:tc>
+        <w:tc>
+          <w:tcPr>
+            <w:tcW w:w="1134" w:type="dxa"/>
+          </w:tcPr>
+          <w:p>
+            <w:pPr>
+              <w:keepNext/>
+              <w:spacing w:before="20" w:after="20" w:line="240" w:lineRule="auto"/>
+            </w:pPr>
+            <w:r>
+              <w:rPr>
+                <w:sz w:val="20"/>
+              </w:rPr>
+              <w:t>0.986</w:t>
+            </w:r>
+          </w:p>
+        </w:tc>
+        <w:tc>
+          <w:tcPr>
+            <w:tcW w:w="1020" w:type="dxa"/>
+          </w:tcPr>
+          <w:p>
+            <w:pPr>
+              <w:keepNext/>
+              <w:spacing w:before="20" w:after="20" w:line="240" w:lineRule="auto"/>
+            </w:pPr>
+            <w:r>
+              <w:rPr>
+                <w:sz w:val="20"/>
+              </w:rPr>
+              <w:t>60.9%</w:t>
+            </w:r>
+          </w:p>
+        </w:tc>
+      </w:tr>
+      <w:tr>
+        <w:trPr>
+          <w:cantSplit/>
+          <w:jc w:val="center"/>
+        </w:trPr>
+        <w:tc>
+          <w:tcPr>
+            <w:tcW w:w="3628" w:type="dxa"/>
+          </w:tcPr>
+          <w:p>
+            <w:pPr>
+              <w:keepNext/>
+              <w:spacing w:before="20" w:after="20" w:line="240" w:lineRule="auto"/>
+            </w:pPr>
+            <w:r>
+              <w:rPr>
+                <w:sz w:val="20"/>
+              </w:rPr>
+              <w:t>E5b  US politics: stripped</w:t>
+            </w:r>
+          </w:p>
+        </w:tc>
+        <w:tc>
+          <w:tcPr>
+            <w:tcW w:w="1191" w:type="dxa"/>
+          </w:tcPr>
+          <w:p>
+            <w:pPr>
+              <w:keepNext/>
+              <w:spacing w:before="20" w:after="20" w:line="240" w:lineRule="auto"/>
+            </w:pPr>
+            <w:r>
+              <w:rPr>
+                <w:sz w:val="20"/>
+              </w:rPr>
+              <w:t>96.7%</w:t>
+            </w:r>
+          </w:p>
+        </w:tc>
+        <w:tc>
+          <w:tcPr>
+            <w:tcW w:w="1984" w:type="dxa"/>
+          </w:tcPr>
+          <w:p>
+            <w:pPr>
+              <w:keepNext/>
+              <w:spacing w:before="20" w:after="20" w:line="240" w:lineRule="auto"/>
+            </w:pPr>
+            <w:r>
+              <w:rPr>
+                <w:sz w:val="20"/>
+              </w:rPr>
+              <w:t>97.0% ± 0.2%</w:t>
+            </w:r>
+          </w:p>
+        </w:tc>
+        <w:tc>
+          <w:tcPr>
+            <w:tcW w:w="1134" w:type="dxa"/>
+          </w:tcPr>
+          <w:p>
+            <w:pPr>
+              <w:keepNext/>
+              <w:spacing w:before="20" w:after="20" w:line="240" w:lineRule="auto"/>
+            </w:pPr>
+            <w:r>
+              <w:rPr>
+                <w:sz w:val="20"/>
+              </w:rPr>
+              <w:t>0.973</w:t>
+            </w:r>
+          </w:p>
+        </w:tc>
+        <w:tc>
+          <w:tcPr>
+            <w:tcW w:w="1020" w:type="dxa"/>
+          </w:tcPr>
+          <w:p>
+            <w:pPr>
+              <w:keepNext/>
+              <w:spacing w:before="20" w:after="20" w:line="240" w:lineRule="auto"/>
+            </w:pPr>
+            <w:r>
+              <w:rPr>
+                <w:sz w:val="20"/>
+              </w:rPr>
+              <w:t>60.9%</w:t>
+            </w:r>
+          </w:p>
+        </w:tc>
+      </w:tr>
+      <w:tr>
+        <w:trPr>
+          <w:cantSplit/>
+          <w:jc w:val="center"/>
+        </w:trPr>
+        <w:tc>
+          <w:tcPr>
+            <w:tcW w:w="3628" w:type="dxa"/>
+          </w:tcPr>
+          <w:p>
+            <w:pPr>
+              <w:keepNext/>
+              <w:spacing w:before="20" w:after="20" w:line="240" w:lineRule="auto"/>
+            </w:pPr>
+            <w:r>
+              <w:rPr>
+                <w:sz w:val="20"/>
+              </w:rPr>
+              <w:t>E5c  US politics: stripped function words</w:t>
+            </w:r>
+          </w:p>
+        </w:tc>
+        <w:tc>
+          <w:tcPr>
+            <w:tcW w:w="1191" w:type="dxa"/>
+          </w:tcPr>
+          <w:p>
+            <w:pPr>
+              <w:keepNext/>
+              <w:spacing w:before="20" w:after="20" w:line="240" w:lineRule="auto"/>
+            </w:pPr>
+            <w:r>
+              <w:rPr>
+                <w:sz w:val="20"/>
+              </w:rPr>
+              <w:t>90.3%</w:t>
+            </w:r>
+          </w:p>
+        </w:tc>
+        <w:tc>
+          <w:tcPr>
+            <w:tcW w:w="1984" w:type="dxa"/>
+          </w:tcPr>
+          <w:p>
+            <w:pPr>
+              <w:keepNext/>
+              <w:spacing w:before="20" w:after="20" w:line="240" w:lineRule="auto"/>
+            </w:pPr>
+            <w:r>
+              <w:rPr>
+                <w:sz w:val="20"/>
+              </w:rPr>
+              <w:t>90.5% ± 0.2%</w:t>
+            </w:r>
+          </w:p>
+        </w:tc>
+        <w:tc>
+          <w:tcPr>
+            <w:tcW w:w="1134" w:type="dxa"/>
+          </w:tcPr>
+          <w:p>
+            <w:pPr>
+              <w:keepNext/>
+              <w:spacing w:before="20" w:after="20" w:line="240" w:lineRule="auto"/>
+            </w:pPr>
+            <w:r>
+              <w:rPr>
+                <w:sz w:val="20"/>
+              </w:rPr>
+              <w:t>0.920</w:t>
+            </w:r>
+          </w:p>
+        </w:tc>
+        <w:tc>
+          <w:tcPr>
+            <w:tcW w:w="1020" w:type="dxa"/>
+          </w:tcPr>
+          <w:p>
+            <w:pPr>
+              <w:keepNext/>
+              <w:spacing w:before="20" w:after="20" w:line="240" w:lineRule="auto"/>
+            </w:pPr>
+            <w:r>
+              <w:rPr>
+                <w:sz w:val="20"/>
+              </w:rPr>
+              <w:t>60.9%</w:t>
+            </w:r>
+          </w:p>
+        </w:tc>
+      </w:tr>
+      <w:tr>
+        <w:trPr>
+          <w:cantSplit/>
+          <w:jc w:val="center"/>
+        </w:trPr>
+        <w:tc>
+          <w:tcPr>
+            <w:tcW w:w="3628" w:type="dxa"/>
+          </w:tcPr>
+          <w:p>
+            <w:pPr>
+              <w:spacing w:before="20" w:after="20" w:line="240" w:lineRule="auto"/>
+            </w:pPr>
+            <w:r>
+              <w:rPr>
+                <w:sz w:val="20"/>
+              </w:rPr>
+              <w:t>E5d  US politics: stripped metadata</w:t>
+            </w:r>
+          </w:p>
+        </w:tc>
+        <w:tc>
+          <w:tcPr>
+            <w:tcW w:w="1191" w:type="dxa"/>
+          </w:tcPr>
+          <w:p>
+            <w:pPr>
+              <w:spacing w:before="20" w:after="20" w:line="240" w:lineRule="auto"/>
+            </w:pPr>
+            <w:r>
+              <w:rPr>
+                <w:sz w:val="20"/>
+              </w:rPr>
+              <w:t>85.8%</w:t>
+            </w:r>
+          </w:p>
+        </w:tc>
+        <w:tc>
+          <w:tcPr>
+            <w:tcW w:w="1984" w:type="dxa"/>
+          </w:tcPr>
+          <w:p>
+            <w:pPr>
+              <w:spacing w:before="20" w:after="20" w:line="240" w:lineRule="auto"/>
+            </w:pPr>
+            <w:r>
+              <w:rPr>
+                <w:sz w:val="20"/>
+              </w:rPr>
+              <w:t>85.6% ± 0.3%</w:t>
+            </w:r>
+          </w:p>
+        </w:tc>
+        <w:tc>
+          <w:tcPr>
+            <w:tcW w:w="1134" w:type="dxa"/>
+          </w:tcPr>
+          <w:p>
+            <w:pPr>
+              <w:spacing w:before="20" w:after="20" w:line="240" w:lineRule="auto"/>
+            </w:pPr>
+            <w:r>
+              <w:rPr>
+                <w:sz w:val="20"/>
+              </w:rPr>
+              <w:t>0.884</w:t>
+            </w:r>
+          </w:p>
+        </w:tc>
+        <w:tc>
+          <w:tcPr>
+            <w:tcW w:w="1020" w:type="dxa"/>
+          </w:tcPr>
+          <w:p>
+            <w:pPr>
+              <w:spacing w:before="20" w:after="20" w:line="240" w:lineRule="auto"/>
+            </w:pPr>
+            <w:r>
+              <w:rPr>
+                <w:sz w:val="20"/>
+              </w:rPr>
+              <w:t>60.9%</w:t>
             </w:r>
           </w:p>
         </w:tc>
@@ -4584,11 +5505,7 @@
         <w:jc w:val="both"/>
       </w:pPr>
       <w:r>
-        <w:t xml:space="preserve">Table 2 and Figure 2 summarise the results. Every condition trained and tested on ISOT is far above chance, including those that never see an article's content. Results are stable across random splits: no standard deviation exceeds 0.4%, so differences of a few points between </w:t>
-      </w:r>
-      <w:r>
-        <w:lastRenderedPageBreak/>
-        <w:t>conditions are not split noise. The only condition near or below chance is the cross-corpus test.</w:t>
+        <w:t>Table 2 and Figure 2 summarise the results. Every condition trained and tested on ISOT is far above chance, including those that never see an article's content. Results are stable across random splits: no standard deviation exceeds 0.5%, so differences of a few points between conditions are not split noise. The only conditions near or below chance are the cross-corpus tests.</w:t>
       </w:r>
     </w:p>
     <w:p>
@@ -4600,9 +5517,10 @@
         <w:rPr>
           <w:noProof/>
         </w:rPr>
+        <w:lastRenderedPageBreak/>
         <w:drawing>
-          <wp:inline distT="0" distB="0" distL="0" distR="0" wp14:anchorId="0E86A698" wp14:editId="5EB1E012">
-            <wp:extent cx="5580000" cy="3370199"/>
+          <wp:inline distT="0" distB="0" distL="0" distR="0" wp14:anchorId="7015F804" wp14:editId="15D8B22F">
+            <wp:extent cx="5580000" cy="4035273"/>
             <wp:effectExtent l="0" t="0" r="0" b="0"/>
             <wp:docPr id="2" name="Picture 2"/>
             <wp:cNvGraphicFramePr>
@@ -4624,7 +5542,7 @@
                   <pic:spPr>
                     <a:xfrm>
                       <a:off x="0" y="0"/>
-                      <a:ext cx="5580000" cy="3370199"/>
+                      <a:ext cx="5580000" cy="4035273"/>
                     </a:xfrm>
                     <a:prstGeom prst="rect">
                       <a:avLst/>
@@ -4649,7 +5567,7 @@
       <w:pPr>
         <w:pStyle w:val="Heading2"/>
       </w:pPr>
-      <w:bookmarkStart w:id="20" w:name="_Toc242778357"/>
+      <w:bookmarkStart w:id="20" w:name="_Toc242785667"/>
       <w:r>
         <w:t>6.2 Partial-input probes (RQ1)</w:t>
       </w:r>
@@ -4724,14 +5642,31 @@
         <w:jc w:val="both"/>
       </w:pPr>
       <w:r>
-        <w:t>The answer to RQ1 is that very little of ISOT's accuracy depends on content: the class can be recovered from the first line, from the grammatical skeleton of the text, or from punctuation counts.</w:t>
+        <w:rPr>
+          <w:b/>
+        </w:rPr>
+        <w:t>Sentiment and named entities.</w:t>
+      </w:r>
+      <w:r>
+        <w:t xml:space="preserve"> Run on the stripped text, eight sentiment scores give 73.8% and entity-type counts give 81.1%. Fake articles are more negative: the average compound score of their titles is −0.17 against −0.07 for real titles, and of their bodies −0.08 against +0.06. Real articles mention almost three times as many places per 100 words (2.97 against 1.06) and more dates (1.85 against 1.08), which matches wire copy's habit of locating and dating every event; fake articles mention more people (3.08 against 2.46). Neither pr</w:t>
+      </w:r>
+      <w:r>
+        <w:t>obe sees a single word of the article, yet both are far above chance.</w:t>
       </w:r>
     </w:p>
     <w:p>
       <w:pPr>
+        <w:jc w:val="both"/>
+      </w:pPr>
+      <w:r>
+        <w:t>The answer to RQ1 is that very little of ISOT's accuracy depends on content: the class can be recovered from the first line, from the grammatical skeleton of the text, from punctuation counts, from tone, or from how often places and dates are mentioned.</w:t>
+      </w:r>
+    </w:p>
+    <w:p>
+      <w:pPr>
         <w:pStyle w:val="Heading2"/>
       </w:pPr>
-      <w:bookmarkStart w:id="21" w:name="_Toc242778358"/>
+      <w:bookmarkStart w:id="21" w:name="_Toc242785668"/>
       <w:r>
         <w:t>6.3 What the full-text model learns</w:t>
       </w:r>
@@ -4758,7 +5693,7 @@
           <w:noProof/>
         </w:rPr>
         <w:drawing>
-          <wp:inline distT="0" distB="0" distL="0" distR="0" wp14:anchorId="68EDFDFC" wp14:editId="0D359886">
+          <wp:inline distT="0" distB="0" distL="0" distR="0" wp14:anchorId="35386AF3" wp14:editId="506BB6C1">
             <wp:extent cx="5580000" cy="3119638"/>
             <wp:effectExtent l="0" t="0" r="0" b="0"/>
             <wp:docPr id="3" name="Picture 3"/>
@@ -6672,7 +7607,7 @@
       <w:pPr>
         <w:pStyle w:val="Heading2"/>
       </w:pPr>
-      <w:bookmarkStart w:id="22" w:name="_Toc242778359"/>
+      <w:bookmarkStart w:id="22" w:name="_Toc242785669"/>
       <w:r>
         <w:t>6.4 Artifact removal (RQ2)</w:t>
       </w:r>
@@ -6699,6 +7634,18 @@
     </w:p>
     <w:p>
       <w:pPr>
+        <w:jc w:val="both"/>
+      </w:pPr>
+      <w:r>
+        <w:t xml:space="preserve">E3c makes the same point without any content words. Reduced to function words after all stripping, the text still gives 90.7%. The strongest fake features are "!", ":", "?", "like", "this", "why" and "you" — exclamation, rhetorical questions and direct address. The strongest real </w:t>
+      </w:r>
+      <w:r>
+        <w:lastRenderedPageBreak/>
+        <w:t>features are "on", "--", "had", "would", "could", "whether" and "amid" — the hedged, conditional phrasing of wire reporting.</w:t>
+      </w:r>
+    </w:p>
+    <w:p>
+      <w:pPr>
         <w:keepNext/>
         <w:jc w:val="center"/>
       </w:pPr>
@@ -6706,9 +7653,8 @@
         <w:rPr>
           <w:noProof/>
         </w:rPr>
-        <w:lastRenderedPageBreak/>
         <w:drawing>
-          <wp:inline distT="0" distB="0" distL="0" distR="0" wp14:anchorId="5C28F657" wp14:editId="2A7F4125">
+          <wp:inline distT="0" distB="0" distL="0" distR="0" wp14:anchorId="4F4EF915" wp14:editId="23B674D8">
             <wp:extent cx="5940000" cy="1881121"/>
             <wp:effectExtent l="0" t="0" r="0" b="0"/>
             <wp:docPr id="4" name="Picture 4"/>
@@ -6756,7 +7702,7 @@
       <w:pPr>
         <w:pStyle w:val="Heading2"/>
       </w:pPr>
-      <w:bookmarkStart w:id="23" w:name="_Toc242778360"/>
+      <w:bookmarkStart w:id="23" w:name="_Toc242785670"/>
       <w:r>
         <w:t>6.5 Cross-corpus transfer (RQ3)</w:t>
       </w:r>
@@ -6767,19 +7713,28 @@
         <w:jc w:val="both"/>
       </w:pPr>
       <w:r>
-        <w:t>Within ISOT, a model trained on headlines alone reaches 94.6%, so headlines carry plenty of class signal. The same model applied to LIAR reaches 45.5%, below the majority-class rate of 55.8%. It labels 77% of LIAR statements as fake, although only 44% are. This is the behaviour expected of a model that has learned "not written like Reuters means fake": LIAR's statements, short claims quoted from politicians, are not written like wire copy, so most are labelled fake regardless of whether they are true. The a</w:t>
-      </w:r>
-      <w:r>
-        <w:t>nswer to RQ3 is that nothing the model learns on ISOT transfers to independently fact-checked claims.</w:t>
+        <w:t>Within ISOT, a model trained on headlines alone reaches 94.6%, so headlines carry plenty of class signal. The same model applied to LIAR reaches 45.5%, below the majority-class rate of 55.8%. It labels 77% of LIAR statements as fake, although only 44% are. This is the behaviour expected of a model that has learned "not written like Reuters means fake": LIAR's statements, short claims quoted from politicians, are not written like wire copy, so most are labelled fake regardless of whether they are true. Remov</w:t>
+      </w:r>
+      <w:r>
+        <w:t xml:space="preserve">ing the </w:t>
+      </w:r>
+      <w:r>
+        <w:rPr>
+          <w:i/>
+        </w:rPr>
+        <w:t>half-true</w:t>
+      </w:r>
+      <w:r>
+        <w:t xml:space="preserve"> statements, the one ambiguous label, gives 51.1% against a chance level of 55.6%, so the result does not depend on the label mapping. The answer to RQ3 is that nothing the model learns on ISOT transfers to independently fact-checked claims.</w:t>
       </w:r>
     </w:p>
     <w:p>
       <w:pPr>
         <w:pStyle w:val="Heading2"/>
       </w:pPr>
-      <w:bookmarkStart w:id="24" w:name="_Toc242778361"/>
-      <w:r>
-        <w:t>6.6 Accuracy as information is removed</w:t>
+      <w:bookmarkStart w:id="24" w:name="_Toc242785671"/>
+      <w:r>
+        <w:t>6.6 Is it style, topic or the classifier? (RQ4)</w:t>
       </w:r>
       <w:bookmarkEnd w:id="24"/>
     </w:p>
@@ -6788,7 +7743,105 @@
         <w:jc w:val="both"/>
       </w:pPr>
       <w:r>
-        <w:t>Figure 5 orders the conditions by how much information they leave the model. Removing the title changes nothing, and removing every content word costs under two points. Only when the text is reduced to eight numbers does accuracy fall substantially, and even then it remains more than 30 points above chance.</w:t>
+        <w:rPr>
+          <w:b/>
+        </w:rPr>
+        <w:t>Topic.</w:t>
+      </w:r>
+      <w:r>
+        <w:t xml:space="preserve"> Figure 5 repeats the strictest conditions on US politics only. Full text gives 98.3%, fully stripped text 96.7%, stripped function words 90.3% and eight stripped surface statistics 85.8%, against a chance level of 60.9%. Removing the world-news articles changes almost nothing, so topic does not explain the results.</w:t>
+      </w:r>
+    </w:p>
+    <w:p>
+      <w:pPr>
+        <w:keepNext/>
+        <w:jc w:val="center"/>
+      </w:pPr>
+      <w:r>
+        <w:rPr>
+          <w:noProof/>
+        </w:rPr>
+        <w:lastRenderedPageBreak/>
+        <w:drawing>
+          <wp:inline distT="0" distB="0" distL="0" distR="0" wp14:anchorId="29AD509F" wp14:editId="78FAA88B">
+            <wp:extent cx="5580000" cy="2400428"/>
+            <wp:effectExtent l="0" t="0" r="0" b="0"/>
+            <wp:docPr id="5" name="Picture 5"/>
+            <wp:cNvGraphicFramePr>
+              <a:graphicFrameLocks xmlns:a="http://schemas.openxmlformats.org/drawingml/2006/main" noChangeAspect="1"/>
+            </wp:cNvGraphicFramePr>
+            <a:graphic xmlns:a="http://schemas.openxmlformats.org/drawingml/2006/main">
+              <a:graphicData uri="http://schemas.openxmlformats.org/drawingml/2006/picture">
+                <pic:pic xmlns:pic="http://schemas.openxmlformats.org/drawingml/2006/picture">
+                  <pic:nvPicPr>
+                    <pic:cNvPr id="0" name="fig5_topic_matched.png"/>
+                    <pic:cNvPicPr/>
+                  </pic:nvPicPr>
+                  <pic:blipFill>
+                    <a:blip r:embed="rId12"/>
+                    <a:stretch>
+                      <a:fillRect/>
+                    </a:stretch>
+                  </pic:blipFill>
+                  <pic:spPr>
+                    <a:xfrm>
+                      <a:off x="0" y="0"/>
+                      <a:ext cx="5580000" cy="2400428"/>
+                    </a:xfrm>
+                    <a:prstGeom prst="rect">
+                      <a:avLst/>
+                    </a:prstGeom>
+                  </pic:spPr>
+                </pic:pic>
+              </a:graphicData>
+            </a:graphic>
+          </wp:inline>
+        </w:drawing>
+      </w:r>
+    </w:p>
+    <w:p>
+      <w:pPr>
+        <w:pStyle w:val="CaptionText"/>
+      </w:pPr>
+      <w:r>
+        <w:t>Figure 5. The strictest probes on the US-politics-only subset. The dashed line is the majority-class rate on this subset.</w:t>
+      </w:r>
+    </w:p>
+    <w:p>
+      <w:pPr>
+        <w:jc w:val="both"/>
+      </w:pPr>
+      <w:r>
+        <w:rPr>
+          <w:b/>
+        </w:rPr>
+        <w:t>A scraping artifact found on the way.</w:t>
+      </w:r>
+      <w:r>
+        <w:t xml:space="preserve"> Before the straight-quote rule was added to E3b, E5c reached 98.0%, and its strongest fake feature was a bare "s" — the remains of apostrophes lost in the fake scrape. Removing apostrophes and quotation marks from both classes lowered E5c to 90.3% and E3c from 93.4% to 90.7%. About eight points of the style probes' accuracy were therefore an encoding artifact; the remaining accuracy is carried by genuine stylistic features.</w:t>
+      </w:r>
+    </w:p>
+    <w:p>
+      <w:pPr>
+        <w:jc w:val="both"/>
+      </w:pPr>
+      <w:r>
+        <w:rPr>
+          <w:b/>
+        </w:rPr>
+        <w:t>Classifier.</w:t>
+      </w:r>
+      <w:r>
+        <w:t xml:space="preserve"> Figure 6 repeats four conditions with a linear SVM. The SVM is slightly </w:t>
+      </w:r>
+      <w:r>
+        <w:rPr>
+          <w:i/>
+        </w:rPr>
+        <w:t>more</w:t>
+      </w:r>
+      <w:r>
+        <w:t xml:space="preserve"> accurate in every case: 99.3% on full text, 99.7% on the first sentence, 97.5% on function words and 98.1% on stripped text. A stronger classifier exploits the same signal more effectively; it does not make the problem go away.</w:t>
       </w:r>
     </w:p>
     <w:p>
@@ -6801,10 +7854,91 @@
           <w:noProof/>
         </w:rPr>
         <w:drawing>
-          <wp:inline distT="0" distB="0" distL="0" distR="0" wp14:anchorId="6EF3049A" wp14:editId="7C0471D1">
+          <wp:inline distT="0" distB="0" distL="0" distR="0" wp14:anchorId="4320D2F5" wp14:editId="5D49E196">
+            <wp:extent cx="5040000" cy="2697081"/>
+            <wp:effectExtent l="0" t="0" r="0" b="0"/>
+            <wp:docPr id="6" name="Picture 6"/>
+            <wp:cNvGraphicFramePr>
+              <a:graphicFrameLocks xmlns:a="http://schemas.openxmlformats.org/drawingml/2006/main" noChangeAspect="1"/>
+            </wp:cNvGraphicFramePr>
+            <a:graphic xmlns:a="http://schemas.openxmlformats.org/drawingml/2006/main">
+              <a:graphicData uri="http://schemas.openxmlformats.org/drawingml/2006/picture">
+                <pic:pic xmlns:pic="http://schemas.openxmlformats.org/drawingml/2006/picture">
+                  <pic:nvPicPr>
+                    <pic:cNvPr id="0" name="fig6_svm_check.png"/>
+                    <pic:cNvPicPr/>
+                  </pic:nvPicPr>
+                  <pic:blipFill>
+                    <a:blip r:embed="rId13"/>
+                    <a:stretch>
+                      <a:fillRect/>
+                    </a:stretch>
+                  </pic:blipFill>
+                  <pic:spPr>
+                    <a:xfrm>
+                      <a:off x="0" y="0"/>
+                      <a:ext cx="5040000" cy="2697081"/>
+                    </a:xfrm>
+                    <a:prstGeom prst="rect">
+                      <a:avLst/>
+                    </a:prstGeom>
+                  </pic:spPr>
+                </pic:pic>
+              </a:graphicData>
+            </a:graphic>
+          </wp:inline>
+        </w:drawing>
+      </w:r>
+    </w:p>
+    <w:p>
+      <w:pPr>
+        <w:pStyle w:val="CaptionText"/>
+      </w:pPr>
+      <w:r>
+        <w:t>Figure 6. Accuracy with logistic regression and a linear SVM on the same inputs.</w:t>
+      </w:r>
+    </w:p>
+    <w:p>
+      <w:pPr>
+        <w:jc w:val="both"/>
+      </w:pPr>
+      <w:r>
+        <w:t>The answer to RQ4 is that the signal is writing style. It survives the removal of topic differences, all identified markers and all content words, and it does not depend on the classifier.</w:t>
+      </w:r>
+    </w:p>
+    <w:p>
+      <w:pPr>
+        <w:pStyle w:val="Heading2"/>
+      </w:pPr>
+      <w:bookmarkStart w:id="25" w:name="_Toc242785672"/>
+      <w:r>
+        <w:lastRenderedPageBreak/>
+        <w:t>6.7 Accuracy as information is removed</w:t>
+      </w:r>
+      <w:bookmarkEnd w:id="25"/>
+    </w:p>
+    <w:p>
+      <w:pPr>
+        <w:jc w:val="both"/>
+      </w:pPr>
+      <w:r>
+        <w:t>Figure 7 orders the conditions by how much information they leave the model. Removing the title changes nothing, and removing every content word costs under two points. Only when the text is reduced to eight numbers does accuracy fall substantially, and even then it remains more than 30 points above chance.</w:t>
+      </w:r>
+    </w:p>
+    <w:p>
+      <w:pPr>
+        <w:keepNext/>
+        <w:jc w:val="center"/>
+      </w:pPr>
+      <w:r>
+        <w:rPr>
+          <w:noProof/>
+        </w:rPr>
+        <w:drawing>
+          <wp:inline distT="0" distB="0" distL="0" distR="0" wp14:anchorId="76601680" wp14:editId="5F4C12A0">
             <wp:extent cx="5040000" cy="3178836"/>
             <wp:effectExtent l="0" t="0" r="0" b="0"/>
-            <wp:docPr id="5" name="Picture 5"/>
+            <wp:docPr id="7" name="Picture 7"/>
             <wp:cNvGraphicFramePr>
               <a:graphicFrameLocks xmlns:a="http://schemas.openxmlformats.org/drawingml/2006/main" noChangeAspect="1"/>
             </wp:cNvGraphicFramePr>
@@ -6816,7 +7950,7 @@
                     <pic:cNvPicPr/>
                   </pic:nvPicPr>
                   <pic:blipFill>
-                    <a:blip r:embed="rId12"/>
+                    <a:blip r:embed="rId14"/>
                     <a:stretch>
                       <a:fillRect/>
                     </a:stretch>
@@ -6842,19 +7976,35 @@
         <w:pStyle w:val="CaptionText"/>
       </w:pPr>
       <w:r>
-        <w:t>Figure 5. Accuracy as content is removed.</w:t>
+        <w:t>Figure 7. Accuracy as content is removed.</w:t>
       </w:r>
     </w:p>
     <w:p>
       <w:pPr>
         <w:pStyle w:val="Heading2"/>
       </w:pPr>
-      <w:bookmarkStart w:id="25" w:name="_Toc242778362"/>
-      <w:r>
-        <w:lastRenderedPageBreak/>
-        <w:t>6.7 Threats to validity</w:t>
-      </w:r>
-      <w:bookmarkEnd w:id="25"/>
+      <w:bookmarkStart w:id="26" w:name="_Toc242785673"/>
+      <w:r>
+        <w:t>6.8 Threats to validity</w:t>
+      </w:r>
+      <w:bookmarkEnd w:id="26"/>
+    </w:p>
+    <w:p>
+      <w:pPr>
+        <w:jc w:val="both"/>
+      </w:pPr>
+      <w:r>
+        <w:t xml:space="preserve">Three threats were tested directly and ruled out: topic (E5), the choice of classifier (SVM check) and the LIAR label mapping (transfer without </w:t>
+      </w:r>
+      <w:r>
+        <w:rPr>
+          <w:i/>
+        </w:rPr>
+        <w:t>half-true</w:t>
+      </w:r>
+      <w:r>
+        <w:t>). The following remain.</w:t>
+      </w:r>
     </w:p>
     <w:p>
       <w:pPr>
@@ -6878,29 +8028,6 @@
         <w:rPr>
           <w:b/>
         </w:rPr>
-        <w:t>LIAR label mapping.</w:t>
-      </w:r>
-      <w:r>
-        <w:t xml:space="preserve"> Treating </w:t>
-      </w:r>
-      <w:r>
-        <w:rPr>
-          <w:i/>
-        </w:rPr>
-        <w:t>half-true</w:t>
-      </w:r>
-      <w:r>
-        <w:t xml:space="preserve"> as real is a judgement call. A different mapping would change the chance level and the exact transfer accuracy.</w:t>
-      </w:r>
-    </w:p>
-    <w:p>
-      <w:pPr>
-        <w:pStyle w:val="ListBullet"/>
-      </w:pPr>
-      <w:r>
-        <w:rPr>
-          <w:b/>
-        </w:rPr>
         <w:t>Single corpus.</w:t>
       </w:r>
       <w:r>
@@ -6918,7 +8045,7 @@
         <w:t>Classical models only.</w:t>
       </w:r>
       <w:r>
-        <w:t xml:space="preserve"> Larger neural models were not tested. They would be expected to exploit the same artifacts at least as effectively, but this was not measured.</w:t>
+        <w:t xml:space="preserve"> Transformer models were not tested. The SVM result suggests that stronger models exploit the same signal at least as effectively, but this was not measured for transformers.</w:t>
       </w:r>
     </w:p>
     <w:p>
@@ -6932,25 +8059,29 @@
         <w:t>Hand-written removal rules.</w:t>
       </w:r>
       <w:r>
-        <w:t xml:space="preserve"> E3b's rules cover the clutter found on inspection; some site-specific markers, such as sign-offs naming the publishing website, remain.</w:t>
+        <w:t xml:space="preserve"> E3b's rules cover the clutter found on inspection and were extended once (Section 6.6). Some site-specific markers, such as sign-offs naming the publishing website, may remain. The style probes reduce, but cannot eliminate, the chance that an unfound artifact contributes to their accuracy.</w:t>
       </w:r>
     </w:p>
     <w:p>
       <w:pPr>
         <w:pStyle w:val="Heading1"/>
       </w:pPr>
-      <w:bookmarkStart w:id="26" w:name="_Toc242778363"/>
-      <w:r>
+      <w:bookmarkStart w:id="27" w:name="_Toc242785674"/>
+      <w:r>
+        <w:lastRenderedPageBreak/>
         <w:t>7. Conclusion</w:t>
       </w:r>
-      <w:bookmarkEnd w:id="26"/>
+      <w:bookmarkEnd w:id="27"/>
     </w:p>
     <w:p>
       <w:pPr>
         <w:jc w:val="both"/>
       </w:pPr>
       <w:r>
-        <w:t>This project audited the ISOT fake news benchmark with partial-input baselines. A standard classifier reaches 98.4% accuracy, but so do models that are denied the information needed to judge truthfulness: 99.1% from the first sentence, 96.8% from function words and punctuation, and 86.2% from eight surface statistics, against a chance level of 54.8%. Removing source markers from both classes leaves 97.3%, and a model that scores 94.6% on ISOT headlines scores below chance on LIAR.</w:t>
+        <w:t>This project built a standard fake news detector on the ISOT benchmark and tested it with partial-input baselines. The detector reaches 98.4% accuracy, but so do models that are denied the information needed to judge truthfulness: 99.1% from the first sentence, 96.8% from function words and punctuation, and 86.2% from eight surface statistics, against a chance level of 54.8%. Removing source markers from both classes leaves 97.3%; restricting both classes to US politics and keeping only function words still</w:t>
+      </w:r>
+      <w:r>
+        <w:t xml:space="preserve"> leaves 90.3% against a chance level of 60.9%; and a model that scores 94.6% on ISOT headlines scores below chance on LIAR.</w:t>
       </w:r>
     </w:p>
     <w:p>
@@ -6958,10 +8089,10 @@
         <w:jc w:val="both"/>
       </w:pPr>
       <w:r>
-        <w:t>The evidence points to one explanation. ISOT's labels coincide with two publishing pipelines, and models learn to recognise the pipeline. Because the difference is one of genre — wire reporting versus partisan commentary — it cannot be removed by deleting tags. Accuracy on ISOT should therefore be read as a measure of source and style separability, not of fake news detection. These findings agree with the source-memorisation results of Zhou et al. (2021) and with Verma's (2026) audit of the same corpus, and</w:t>
-      </w:r>
-      <w:r>
-        <w:t xml:space="preserve"> extend them by showing that the signal survives even when the model sees no content words at all. In the terms of Geirhos et al. (2020), ISOT rewards a shortcut, and published accuracies on it measure how well models take it.</w:t>
+        <w:t>In short: we built a fake news detector, obtained 98% accuracy, and showed that the 98% does not measure fake news detection. The evidence points to one explanation. ISOT's labels coincide with two publishing pipelines, and models learn to recognise the pipeline. Because the difference is one of genre — wire reporting versus partisan commentary — it cannot be removed by deleting tags. Accuracy on ISOT should therefore be read as a measure of source and style separability, not of fake news detection. These f</w:t>
+      </w:r>
+      <w:r>
+        <w:t>indings agree with the source-memorisation results of Zhou et al. (2021) and with Verma's (2026) audit of the same corpus, and extend them by showing that the signal survives even when the model sees no content words at all. In the terms of Geirhos et al. (2020), ISOT rewards a shortcut, and published accuracies on it measure how well models take it.</w:t>
       </w:r>
     </w:p>
     <w:p>
@@ -6979,11 +8110,11 @@
       <w:pPr>
         <w:pStyle w:val="Heading1"/>
       </w:pPr>
-      <w:bookmarkStart w:id="27" w:name="_Toc242778364"/>
+      <w:bookmarkStart w:id="28" w:name="_Toc242785675"/>
       <w:r>
         <w:t>8. Future Work</w:t>
       </w:r>
-      <w:bookmarkEnd w:id="27"/>
+      <w:bookmarkEnd w:id="28"/>
     </w:p>
     <w:p>
       <w:pPr>
@@ -7007,7 +8138,6 @@
         <w:rPr>
           <w:b/>
         </w:rPr>
-        <w:lastRenderedPageBreak/>
         <w:t>Matched sources.</w:t>
       </w:r>
       <w:r>
@@ -7060,11 +8190,12 @@
       <w:pPr>
         <w:pStyle w:val="Heading1"/>
       </w:pPr>
-      <w:bookmarkStart w:id="28" w:name="_Toc242778365"/>
-      <w:r>
+      <w:bookmarkStart w:id="29" w:name="_Toc242785676"/>
+      <w:r>
+        <w:lastRenderedPageBreak/>
         <w:t>References</w:t>
       </w:r>
-      <w:bookmarkEnd w:id="28"/>
+      <w:bookmarkEnd w:id="29"/>
     </w:p>
     <w:p>
       <w:pPr>
@@ -7207,7 +8338,6 @@
         <w:ind w:left="567" w:hanging="567"/>
       </w:pPr>
       <w:r>
-        <w:lastRenderedPageBreak/>
         <w:t xml:space="preserve">Schuster, T., Shah, D., Yeo, Y. J. S., Filizzola Ortiz, D. R., Santus, E., &amp; Barzilay, R. (2019). Towards debiasing fact verification models. In </w:t>
       </w:r>
       <w:r>
@@ -7250,6 +8380,7 @@
         <w:ind w:left="567" w:hanging="567"/>
       </w:pPr>
       <w:r>
+        <w:lastRenderedPageBreak/>
         <w:t xml:space="preserve">Wang, W. Y. (2017). "Liar, liar pants on fire": A new benchmark dataset for fake news detection. In </w:t>
       </w:r>
       <w:r>
@@ -7280,7 +8411,7 @@
       </w:r>
     </w:p>
     <w:sectPr>
-      <w:footerReference w:type="default" r:id="rId13"/>
+      <w:footerReference w:type="default" r:id="rId15"/>
       <w:pgSz w:w="11906" w:h="16838"/>
       <w:pgMar w:top="1440" w:right="1440" w:bottom="1440" w:left="1440" w:header="720" w:footer="720" w:gutter="0"/>
       <w:cols w:space="720"/>
@@ -7542,31 +8673,31 @@
       </w:rPr>
     </w:lvl>
   </w:abstractNum>
-  <w:num w:numId="1" w16cid:durableId="501167920">
+  <w:num w:numId="1" w16cid:durableId="150869672">
     <w:abstractNumId w:val="8"/>
   </w:num>
-  <w:num w:numId="2" w16cid:durableId="1268543204">
+  <w:num w:numId="2" w16cid:durableId="1181238142">
     <w:abstractNumId w:val="6"/>
   </w:num>
-  <w:num w:numId="3" w16cid:durableId="2095583865">
+  <w:num w:numId="3" w16cid:durableId="1537233377">
     <w:abstractNumId w:val="5"/>
   </w:num>
-  <w:num w:numId="4" w16cid:durableId="134566222">
+  <w:num w:numId="4" w16cid:durableId="1337686836">
     <w:abstractNumId w:val="4"/>
   </w:num>
-  <w:num w:numId="5" w16cid:durableId="1082065163">
+  <w:num w:numId="5" w16cid:durableId="1389302509">
     <w:abstractNumId w:val="7"/>
   </w:num>
-  <w:num w:numId="6" w16cid:durableId="551117641">
+  <w:num w:numId="6" w16cid:durableId="1678656025">
     <w:abstractNumId w:val="3"/>
   </w:num>
-  <w:num w:numId="7" w16cid:durableId="1850557102">
+  <w:num w:numId="7" w16cid:durableId="400638982">
     <w:abstractNumId w:val="2"/>
   </w:num>
-  <w:num w:numId="8" w16cid:durableId="864097418">
+  <w:num w:numId="8" w16cid:durableId="780997371">
     <w:abstractNumId w:val="1"/>
   </w:num>
-  <w:num w:numId="9" w16cid:durableId="138311044">
+  <w:num w:numId="9" w16cid:durableId="1548956004">
     <w:abstractNumId w:val="0"/>
   </w:num>
 </w:numbering>
@@ -18965,7 +20096,7 @@
     <w:autoRedefine/>
     <w:uiPriority w:val="39"/>
     <w:unhideWhenUsed/>
-    <w:rsid w:val="0014160F"/>
+    <w:rsid w:val="00DD53CA"/>
     <w:pPr>
       <w:spacing w:after="100"/>
     </w:pPr>
@@ -18977,7 +20108,7 @@
     <w:autoRedefine/>
     <w:uiPriority w:val="39"/>
     <w:unhideWhenUsed/>
-    <w:rsid w:val="0014160F"/>
+    <w:rsid w:val="00DD53CA"/>
     <w:pPr>
       <w:spacing w:after="100"/>
       <w:ind w:left="240"/>
@@ -18988,7 +20119,7 @@
     <w:basedOn w:val="DefaultParagraphFont"/>
     <w:uiPriority w:val="99"/>
     <w:unhideWhenUsed/>
-    <w:rsid w:val="0014160F"/>
+    <w:rsid w:val="00DD53CA"/>
     <w:rPr>
       <w:color w:val="0000FF" w:themeColor="hyperlink"/>
       <w:u w:val="single"/>

</xml_diff>

<commit_message>
Add full-article cross-corpus test on McIntire (E4b)
ISOT-trained detector: 98.4% in-domain, 61.2% on McIntire full
articles (chance 50.7%); McIntire control 91.9%, reverse 65.0%.
Closes the headline-only limitation of the LIAR test. New fig7,
report and context updated. Dataset itself is gitignored.
</commit_message>
<xml_diff>
--- a/report/WSMA_Report.docx
+++ b/report/WSMA_Report.docx
@@ -193,7 +193,7 @@
       <w:r>
         <w:fldChar w:fldCharType="separate"/>
       </w:r>
-      <w:hyperlink w:anchor="_Toc242785647" w:history="1">
+      <w:hyperlink w:anchor="_Toc242804670" w:history="1">
         <w:r>
           <w:rPr>
             <w:rStyle w:val="Hyperlink"/>
@@ -220,7 +220,7 @@
             <w:noProof/>
             <w:webHidden/>
           </w:rPr>
-          <w:instrText xml:space="preserve"> PAGEREF _Toc242785647 \h </w:instrText>
+          <w:instrText xml:space="preserve"> PAGEREF _Toc242804670 \h </w:instrText>
         </w:r>
         <w:r>
           <w:rPr>
@@ -261,7 +261,7 @@
           <w:noProof/>
         </w:rPr>
       </w:pPr>
-      <w:hyperlink w:anchor="_Toc242785648" w:history="1">
+      <w:hyperlink w:anchor="_Toc242804671" w:history="1">
         <w:r>
           <w:rPr>
             <w:rStyle w:val="Hyperlink"/>
@@ -288,7 +288,7 @@
             <w:noProof/>
             <w:webHidden/>
           </w:rPr>
-          <w:instrText xml:space="preserve"> PAGEREF _Toc242785648 \h </w:instrText>
+          <w:instrText xml:space="preserve"> PAGEREF _Toc242804671 \h </w:instrText>
         </w:r>
         <w:r>
           <w:rPr>
@@ -329,7 +329,7 @@
           <w:noProof/>
         </w:rPr>
       </w:pPr>
-      <w:hyperlink w:anchor="_Toc242785649" w:history="1">
+      <w:hyperlink w:anchor="_Toc242804672" w:history="1">
         <w:r>
           <w:rPr>
             <w:rStyle w:val="Hyperlink"/>
@@ -356,7 +356,7 @@
             <w:noProof/>
             <w:webHidden/>
           </w:rPr>
-          <w:instrText xml:space="preserve"> PAGEREF _Toc242785649 \h </w:instrText>
+          <w:instrText xml:space="preserve"> PAGEREF _Toc242804672 \h </w:instrText>
         </w:r>
         <w:r>
           <w:rPr>
@@ -397,7 +397,7 @@
           <w:noProof/>
         </w:rPr>
       </w:pPr>
-      <w:hyperlink w:anchor="_Toc242785650" w:history="1">
+      <w:hyperlink w:anchor="_Toc242804673" w:history="1">
         <w:r>
           <w:rPr>
             <w:rStyle w:val="Hyperlink"/>
@@ -424,7 +424,7 @@
             <w:noProof/>
             <w:webHidden/>
           </w:rPr>
-          <w:instrText xml:space="preserve"> PAGEREF _Toc242785650 \h </w:instrText>
+          <w:instrText xml:space="preserve"> PAGEREF _Toc242804673 \h </w:instrText>
         </w:r>
         <w:r>
           <w:rPr>
@@ -465,7 +465,7 @@
           <w:noProof/>
         </w:rPr>
       </w:pPr>
-      <w:hyperlink w:anchor="_Toc242785651" w:history="1">
+      <w:hyperlink w:anchor="_Toc242804674" w:history="1">
         <w:r>
           <w:rPr>
             <w:rStyle w:val="Hyperlink"/>
@@ -492,7 +492,7 @@
             <w:noProof/>
             <w:webHidden/>
           </w:rPr>
-          <w:instrText xml:space="preserve"> PAGEREF _Toc242785651 \h </w:instrText>
+          <w:instrText xml:space="preserve"> PAGEREF _Toc242804674 \h </w:instrText>
         </w:r>
         <w:r>
           <w:rPr>
@@ -533,7 +533,7 @@
           <w:noProof/>
         </w:rPr>
       </w:pPr>
-      <w:hyperlink w:anchor="_Toc242785652" w:history="1">
+      <w:hyperlink w:anchor="_Toc242804675" w:history="1">
         <w:r>
           <w:rPr>
             <w:rStyle w:val="Hyperlink"/>
@@ -560,7 +560,7 @@
             <w:noProof/>
             <w:webHidden/>
           </w:rPr>
-          <w:instrText xml:space="preserve"> PAGEREF _Toc242785652 \h </w:instrText>
+          <w:instrText xml:space="preserve"> PAGEREF _Toc242804675 \h </w:instrText>
         </w:r>
         <w:r>
           <w:rPr>
@@ -601,7 +601,7 @@
           <w:noProof/>
         </w:rPr>
       </w:pPr>
-      <w:hyperlink w:anchor="_Toc242785653" w:history="1">
+      <w:hyperlink w:anchor="_Toc242804676" w:history="1">
         <w:r>
           <w:rPr>
             <w:rStyle w:val="Hyperlink"/>
@@ -628,7 +628,7 @@
             <w:noProof/>
             <w:webHidden/>
           </w:rPr>
-          <w:instrText xml:space="preserve"> PAGEREF _Toc242785653 \h </w:instrText>
+          <w:instrText xml:space="preserve"> PAGEREF _Toc242804676 \h </w:instrText>
         </w:r>
         <w:r>
           <w:rPr>
@@ -669,7 +669,7 @@
           <w:noProof/>
         </w:rPr>
       </w:pPr>
-      <w:hyperlink w:anchor="_Toc242785654" w:history="1">
+      <w:hyperlink w:anchor="_Toc242804677" w:history="1">
         <w:r>
           <w:rPr>
             <w:rStyle w:val="Hyperlink"/>
@@ -696,7 +696,7 @@
             <w:noProof/>
             <w:webHidden/>
           </w:rPr>
-          <w:instrText xml:space="preserve"> PAGEREF _Toc242785654 \h </w:instrText>
+          <w:instrText xml:space="preserve"> PAGEREF _Toc242804677 \h </w:instrText>
         </w:r>
         <w:r>
           <w:rPr>
@@ -737,7 +737,7 @@
           <w:noProof/>
         </w:rPr>
       </w:pPr>
-      <w:hyperlink w:anchor="_Toc242785655" w:history="1">
+      <w:hyperlink w:anchor="_Toc242804678" w:history="1">
         <w:r>
           <w:rPr>
             <w:rStyle w:val="Hyperlink"/>
@@ -764,7 +764,7 @@
             <w:noProof/>
             <w:webHidden/>
           </w:rPr>
-          <w:instrText xml:space="preserve"> PAGEREF _Toc242785655 \h </w:instrText>
+          <w:instrText xml:space="preserve"> PAGEREF _Toc242804678 \h </w:instrText>
         </w:r>
         <w:r>
           <w:rPr>
@@ -805,7 +805,7 @@
           <w:noProof/>
         </w:rPr>
       </w:pPr>
-      <w:hyperlink w:anchor="_Toc242785656" w:history="1">
+      <w:hyperlink w:anchor="_Toc242804679" w:history="1">
         <w:r>
           <w:rPr>
             <w:rStyle w:val="Hyperlink"/>
@@ -832,7 +832,7 @@
             <w:noProof/>
             <w:webHidden/>
           </w:rPr>
-          <w:instrText xml:space="preserve"> PAGEREF _Toc242785656 \h </w:instrText>
+          <w:instrText xml:space="preserve"> PAGEREF _Toc242804679 \h </w:instrText>
         </w:r>
         <w:r>
           <w:rPr>
@@ -873,7 +873,7 @@
           <w:noProof/>
         </w:rPr>
       </w:pPr>
-      <w:hyperlink w:anchor="_Toc242785657" w:history="1">
+      <w:hyperlink w:anchor="_Toc242804680" w:history="1">
         <w:r>
           <w:rPr>
             <w:rStyle w:val="Hyperlink"/>
@@ -900,7 +900,7 @@
             <w:noProof/>
             <w:webHidden/>
           </w:rPr>
-          <w:instrText xml:space="preserve"> PAGEREF _Toc242785657 \h </w:instrText>
+          <w:instrText xml:space="preserve"> PAGEREF _Toc242804680 \h </w:instrText>
         </w:r>
         <w:r>
           <w:rPr>
@@ -941,7 +941,7 @@
           <w:noProof/>
         </w:rPr>
       </w:pPr>
-      <w:hyperlink w:anchor="_Toc242785658" w:history="1">
+      <w:hyperlink w:anchor="_Toc242804681" w:history="1">
         <w:r>
           <w:rPr>
             <w:rStyle w:val="Hyperlink"/>
@@ -968,7 +968,7 @@
             <w:noProof/>
             <w:webHidden/>
           </w:rPr>
-          <w:instrText xml:space="preserve"> PAGEREF _Toc242785658 \h </w:instrText>
+          <w:instrText xml:space="preserve"> PAGEREF _Toc242804681 \h </w:instrText>
         </w:r>
         <w:r>
           <w:rPr>
@@ -1009,7 +1009,7 @@
           <w:noProof/>
         </w:rPr>
       </w:pPr>
-      <w:hyperlink w:anchor="_Toc242785659" w:history="1">
+      <w:hyperlink w:anchor="_Toc242804682" w:history="1">
         <w:r>
           <w:rPr>
             <w:rStyle w:val="Hyperlink"/>
@@ -1036,7 +1036,7 @@
             <w:noProof/>
             <w:webHidden/>
           </w:rPr>
-          <w:instrText xml:space="preserve"> PAGEREF _Toc242785659 \h </w:instrText>
+          <w:instrText xml:space="preserve"> PAGEREF _Toc242804682 \h </w:instrText>
         </w:r>
         <w:r>
           <w:rPr>
@@ -1077,7 +1077,7 @@
           <w:noProof/>
         </w:rPr>
       </w:pPr>
-      <w:hyperlink w:anchor="_Toc242785660" w:history="1">
+      <w:hyperlink w:anchor="_Toc242804683" w:history="1">
         <w:r>
           <w:rPr>
             <w:rStyle w:val="Hyperlink"/>
@@ -1104,7 +1104,7 @@
             <w:noProof/>
             <w:webHidden/>
           </w:rPr>
-          <w:instrText xml:space="preserve"> PAGEREF _Toc242785660 \h </w:instrText>
+          <w:instrText xml:space="preserve"> PAGEREF _Toc242804683 \h </w:instrText>
         </w:r>
         <w:r>
           <w:rPr>
@@ -1145,7 +1145,7 @@
           <w:noProof/>
         </w:rPr>
       </w:pPr>
-      <w:hyperlink w:anchor="_Toc242785661" w:history="1">
+      <w:hyperlink w:anchor="_Toc242804684" w:history="1">
         <w:r>
           <w:rPr>
             <w:rStyle w:val="Hyperlink"/>
@@ -1172,7 +1172,7 @@
             <w:noProof/>
             <w:webHidden/>
           </w:rPr>
-          <w:instrText xml:space="preserve"> PAGEREF _Toc242785661 \h </w:instrText>
+          <w:instrText xml:space="preserve"> PAGEREF _Toc242804684 \h </w:instrText>
         </w:r>
         <w:r>
           <w:rPr>
@@ -1213,7 +1213,7 @@
           <w:noProof/>
         </w:rPr>
       </w:pPr>
-      <w:hyperlink w:anchor="_Toc242785662" w:history="1">
+      <w:hyperlink w:anchor="_Toc242804685" w:history="1">
         <w:r>
           <w:rPr>
             <w:rStyle w:val="Hyperlink"/>
@@ -1240,7 +1240,7 @@
             <w:noProof/>
             <w:webHidden/>
           </w:rPr>
-          <w:instrText xml:space="preserve"> PAGEREF _Toc242785662 \h </w:instrText>
+          <w:instrText xml:space="preserve"> PAGEREF _Toc242804685 \h </w:instrText>
         </w:r>
         <w:r>
           <w:rPr>
@@ -1281,7 +1281,7 @@
           <w:noProof/>
         </w:rPr>
       </w:pPr>
-      <w:hyperlink w:anchor="_Toc242785663" w:history="1">
+      <w:hyperlink w:anchor="_Toc242804686" w:history="1">
         <w:r>
           <w:rPr>
             <w:rStyle w:val="Hyperlink"/>
@@ -1308,7 +1308,7 @@
             <w:noProof/>
             <w:webHidden/>
           </w:rPr>
-          <w:instrText xml:space="preserve"> PAGEREF _Toc242785663 \h </w:instrText>
+          <w:instrText xml:space="preserve"> PAGEREF _Toc242804686 \h </w:instrText>
         </w:r>
         <w:r>
           <w:rPr>
@@ -1349,7 +1349,7 @@
           <w:noProof/>
         </w:rPr>
       </w:pPr>
-      <w:hyperlink w:anchor="_Toc242785664" w:history="1">
+      <w:hyperlink w:anchor="_Toc242804687" w:history="1">
         <w:r>
           <w:rPr>
             <w:rStyle w:val="Hyperlink"/>
@@ -1376,7 +1376,7 @@
             <w:noProof/>
             <w:webHidden/>
           </w:rPr>
-          <w:instrText xml:space="preserve"> PAGEREF _Toc242785664 \h </w:instrText>
+          <w:instrText xml:space="preserve"> PAGEREF _Toc242804687 \h </w:instrText>
         </w:r>
         <w:r>
           <w:rPr>
@@ -1417,7 +1417,7 @@
           <w:noProof/>
         </w:rPr>
       </w:pPr>
-      <w:hyperlink w:anchor="_Toc242785665" w:history="1">
+      <w:hyperlink w:anchor="_Toc242804688" w:history="1">
         <w:r>
           <w:rPr>
             <w:rStyle w:val="Hyperlink"/>
@@ -1444,7 +1444,7 @@
             <w:noProof/>
             <w:webHidden/>
           </w:rPr>
-          <w:instrText xml:space="preserve"> PAGEREF _Toc242785665 \h </w:instrText>
+          <w:instrText xml:space="preserve"> PAGEREF _Toc242804688 \h </w:instrText>
         </w:r>
         <w:r>
           <w:rPr>
@@ -1485,7 +1485,7 @@
           <w:noProof/>
         </w:rPr>
       </w:pPr>
-      <w:hyperlink w:anchor="_Toc242785666" w:history="1">
+      <w:hyperlink w:anchor="_Toc242804689" w:history="1">
         <w:r>
           <w:rPr>
             <w:rStyle w:val="Hyperlink"/>
@@ -1512,7 +1512,7 @@
             <w:noProof/>
             <w:webHidden/>
           </w:rPr>
-          <w:instrText xml:space="preserve"> PAGEREF _Toc242785666 \h </w:instrText>
+          <w:instrText xml:space="preserve"> PAGEREF _Toc242804689 \h </w:instrText>
         </w:r>
         <w:r>
           <w:rPr>
@@ -1553,7 +1553,7 @@
           <w:noProof/>
         </w:rPr>
       </w:pPr>
-      <w:hyperlink w:anchor="_Toc242785667" w:history="1">
+      <w:hyperlink w:anchor="_Toc242804690" w:history="1">
         <w:r>
           <w:rPr>
             <w:rStyle w:val="Hyperlink"/>
@@ -1580,7 +1580,7 @@
             <w:noProof/>
             <w:webHidden/>
           </w:rPr>
-          <w:instrText xml:space="preserve"> PAGEREF _Toc242785667 \h </w:instrText>
+          <w:instrText xml:space="preserve"> PAGEREF _Toc242804690 \h </w:instrText>
         </w:r>
         <w:r>
           <w:rPr>
@@ -1621,7 +1621,7 @@
           <w:noProof/>
         </w:rPr>
       </w:pPr>
-      <w:hyperlink w:anchor="_Toc242785668" w:history="1">
+      <w:hyperlink w:anchor="_Toc242804691" w:history="1">
         <w:r>
           <w:rPr>
             <w:rStyle w:val="Hyperlink"/>
@@ -1648,7 +1648,7 @@
             <w:noProof/>
             <w:webHidden/>
           </w:rPr>
-          <w:instrText xml:space="preserve"> PAGEREF _Toc242785668 \h </w:instrText>
+          <w:instrText xml:space="preserve"> PAGEREF _Toc242804691 \h </w:instrText>
         </w:r>
         <w:r>
           <w:rPr>
@@ -1689,7 +1689,7 @@
           <w:noProof/>
         </w:rPr>
       </w:pPr>
-      <w:hyperlink w:anchor="_Toc242785669" w:history="1">
+      <w:hyperlink w:anchor="_Toc242804692" w:history="1">
         <w:r>
           <w:rPr>
             <w:rStyle w:val="Hyperlink"/>
@@ -1716,7 +1716,7 @@
             <w:noProof/>
             <w:webHidden/>
           </w:rPr>
-          <w:instrText xml:space="preserve"> PAGEREF _Toc242785669 \h </w:instrText>
+          <w:instrText xml:space="preserve"> PAGEREF _Toc242804692 \h </w:instrText>
         </w:r>
         <w:r>
           <w:rPr>
@@ -1757,7 +1757,7 @@
           <w:noProof/>
         </w:rPr>
       </w:pPr>
-      <w:hyperlink w:anchor="_Toc242785670" w:history="1">
+      <w:hyperlink w:anchor="_Toc242804693" w:history="1">
         <w:r>
           <w:rPr>
             <w:rStyle w:val="Hyperlink"/>
@@ -1784,7 +1784,7 @@
             <w:noProof/>
             <w:webHidden/>
           </w:rPr>
-          <w:instrText xml:space="preserve"> PAGEREF _Toc242785670 \h </w:instrText>
+          <w:instrText xml:space="preserve"> PAGEREF _Toc242804693 \h </w:instrText>
         </w:r>
         <w:r>
           <w:rPr>
@@ -1825,7 +1825,7 @@
           <w:noProof/>
         </w:rPr>
       </w:pPr>
-      <w:hyperlink w:anchor="_Toc242785671" w:history="1">
+      <w:hyperlink w:anchor="_Toc242804694" w:history="1">
         <w:r>
           <w:rPr>
             <w:rStyle w:val="Hyperlink"/>
@@ -1852,7 +1852,7 @@
             <w:noProof/>
             <w:webHidden/>
           </w:rPr>
-          <w:instrText xml:space="preserve"> PAGEREF _Toc242785671 \h </w:instrText>
+          <w:instrText xml:space="preserve"> PAGEREF _Toc242804694 \h </w:instrText>
         </w:r>
         <w:r>
           <w:rPr>
@@ -1872,7 +1872,7 @@
             <w:noProof/>
             <w:webHidden/>
           </w:rPr>
-          <w:t>15</w:t>
+          <w:t>16</w:t>
         </w:r>
         <w:r>
           <w:rPr>
@@ -1893,7 +1893,7 @@
           <w:noProof/>
         </w:rPr>
       </w:pPr>
-      <w:hyperlink w:anchor="_Toc242785672" w:history="1">
+      <w:hyperlink w:anchor="_Toc242804695" w:history="1">
         <w:r>
           <w:rPr>
             <w:rStyle w:val="Hyperlink"/>
@@ -1920,7 +1920,7 @@
             <w:noProof/>
             <w:webHidden/>
           </w:rPr>
-          <w:instrText xml:space="preserve"> PAGEREF _Toc242785672 \h </w:instrText>
+          <w:instrText xml:space="preserve"> PAGEREF _Toc242804695 \h </w:instrText>
         </w:r>
         <w:r>
           <w:rPr>
@@ -1961,7 +1961,7 @@
           <w:noProof/>
         </w:rPr>
       </w:pPr>
-      <w:hyperlink w:anchor="_Toc242785673" w:history="1">
+      <w:hyperlink w:anchor="_Toc242804696" w:history="1">
         <w:r>
           <w:rPr>
             <w:rStyle w:val="Hyperlink"/>
@@ -1988,7 +1988,7 @@
             <w:noProof/>
             <w:webHidden/>
           </w:rPr>
-          <w:instrText xml:space="preserve"> PAGEREF _Toc242785673 \h </w:instrText>
+          <w:instrText xml:space="preserve"> PAGEREF _Toc242804696 \h </w:instrText>
         </w:r>
         <w:r>
           <w:rPr>
@@ -2008,7 +2008,7 @@
             <w:noProof/>
             <w:webHidden/>
           </w:rPr>
-          <w:t>17</w:t>
+          <w:t>18</w:t>
         </w:r>
         <w:r>
           <w:rPr>
@@ -2029,7 +2029,7 @@
           <w:noProof/>
         </w:rPr>
       </w:pPr>
-      <w:hyperlink w:anchor="_Toc242785674" w:history="1">
+      <w:hyperlink w:anchor="_Toc242804697" w:history="1">
         <w:r>
           <w:rPr>
             <w:rStyle w:val="Hyperlink"/>
@@ -2056,7 +2056,7 @@
             <w:noProof/>
             <w:webHidden/>
           </w:rPr>
-          <w:instrText xml:space="preserve"> PAGEREF _Toc242785674 \h </w:instrText>
+          <w:instrText xml:space="preserve"> PAGEREF _Toc242804697 \h </w:instrText>
         </w:r>
         <w:r>
           <w:rPr>
@@ -2097,7 +2097,7 @@
           <w:noProof/>
         </w:rPr>
       </w:pPr>
-      <w:hyperlink w:anchor="_Toc242785675" w:history="1">
+      <w:hyperlink w:anchor="_Toc242804698" w:history="1">
         <w:r>
           <w:rPr>
             <w:rStyle w:val="Hyperlink"/>
@@ -2124,7 +2124,7 @@
             <w:noProof/>
             <w:webHidden/>
           </w:rPr>
-          <w:instrText xml:space="preserve"> PAGEREF _Toc242785675 \h </w:instrText>
+          <w:instrText xml:space="preserve"> PAGEREF _Toc242804698 \h </w:instrText>
         </w:r>
         <w:r>
           <w:rPr>
@@ -2144,7 +2144,7 @@
             <w:noProof/>
             <w:webHidden/>
           </w:rPr>
-          <w:t>18</w:t>
+          <w:t>19</w:t>
         </w:r>
         <w:r>
           <w:rPr>
@@ -2165,7 +2165,7 @@
           <w:noProof/>
         </w:rPr>
       </w:pPr>
-      <w:hyperlink w:anchor="_Toc242785676" w:history="1">
+      <w:hyperlink w:anchor="_Toc242804699" w:history="1">
         <w:r>
           <w:rPr>
             <w:rStyle w:val="Hyperlink"/>
@@ -2192,7 +2192,7 @@
             <w:noProof/>
             <w:webHidden/>
           </w:rPr>
-          <w:instrText xml:space="preserve"> PAGEREF _Toc242785676 \h </w:instrText>
+          <w:instrText xml:space="preserve"> PAGEREF _Toc242804699 \h </w:instrText>
         </w:r>
         <w:r>
           <w:rPr>
@@ -2237,7 +2237,7 @@
       <w:pPr>
         <w:pStyle w:val="Heading1"/>
       </w:pPr>
-      <w:bookmarkStart w:id="0" w:name="_Toc242785647"/>
+      <w:bookmarkStart w:id="0" w:name="_Toc242804670"/>
       <w:r>
         <w:lastRenderedPageBreak/>
         <w:t>Abstract</w:t>
@@ -2255,10 +2255,10 @@
         <w:t>require. On a cleaned, deduplicated version of ISOT (38,644 articles), a TF-IDF and logistic regression baseline reaches 98.4% accuracy. A model shown only the first sentence of each article reaches 99.1%; a model shown only function words and punctuation reaches 96.8%; and a random forest given eight surface statistics and no words at all reaches 86.2%, against a majority-class baseline of 54.8%. Removing source markers from both classes lowers accuracy only to 97.3%, because the remaining signal is the wr</w:t>
       </w:r>
       <w:r>
-        <w:t>iting register of the two publishing pipelines. The signal is not topic: restricted to US politics in both classes, with every marker stripped, function words alone still give 90.3% against a chance level of 60.9%, and a linear SVM reproduces every result. Finally, a headline model that scores 94.6% within ISOT falls to 45.5% on the LIAR fact-checking corpus, below that corpus's majority-class rate of 55.8%. We conclude that high accuracy on ISOT reflects source and genre separability rather than any abilit</w:t>
-      </w:r>
-      <w:r>
-        <w:t>y to detect false content.</w:t>
+        <w:t xml:space="preserve">iting register of the two publishing pipelines. The signal is not topic: restricted to US politics in both classes, with every marker stripped, function words alone still give 90.3% against a chance level of 60.9%, and a linear SVM reproduces every result. Finally, a headline model that scores 94.6% within ISOT falls to 45.5% on the LIAR fact-checking corpus, below that corpus's majority-class rate of 55.8%, and the full-text detector falls from 98.4% to 61.2% on a second corpus of full articles whose real </w:t>
+      </w:r>
+      <w:r>
+        <w:t>news does not come from Reuters. We conclude that high accuracy on ISOT reflects source and genre separability rather than any ability to detect false content.</w:t>
       </w:r>
     </w:p>
     <w:p>
@@ -2279,7 +2279,7 @@
       <w:pPr>
         <w:pStyle w:val="Heading1"/>
       </w:pPr>
-      <w:bookmarkStart w:id="1" w:name="_Toc242785648"/>
+      <w:bookmarkStart w:id="1" w:name="_Toc242804671"/>
       <w:r>
         <w:t>1. Introduction</w:t>
       </w:r>
@@ -2317,11 +2317,11 @@
         <w:jc w:val="both"/>
       </w:pPr>
       <w:r>
-        <w:t xml:space="preserve">This project builds a standard fake news detector, obtains the familiar 98% accuracy, and then tests whether that accuracy is real. The detector is the object under test. The approach is </w:t>
-      </w:r>
-      <w:r>
         <w:lastRenderedPageBreak/>
-        <w:t>to build deliberately handicapped versions of it, each denied the information that real veracity assessment would need, and to measure how well they still perform. If a model that cannot see an article's content still separates real from fake, the labels are recoverable from something other than content, and the detector's accuracy is not measuring deception detection.</w:t>
+        <w:t xml:space="preserve">This project builds a standard fake news detector, obtains the familiar 98% accuracy, and then tests whether that accuracy is real. The detector is the object under test. The approach is to build deliberately handicapped versions of it, each denied the information that real veracity assessment would need, and to measure how well they still perform. If a model that cannot see an article's content still separates real from fake, the labels are recoverable from something other than content, and the detector's </w:t>
+      </w:r>
+      <w:r>
+        <w:t>accuracy is not measuring deception detection.</w:t>
       </w:r>
     </w:p>
     <w:p>
@@ -2361,7 +2361,7 @@
         <w:pStyle w:val="ListBullet"/>
       </w:pPr>
       <w:r>
-        <w:t>a cross-corpus test on LIAR, with an in-domain control that separates the effect of crossing datasets from the effect of using headlines only, and a check of the label mapping;</w:t>
+        <w:t>cross-corpus tests on LIAR (headlines) and on a second corpus of full articles, each with an in-domain control that separates the effect of crossing datasets from other differences;</w:t>
       </w:r>
     </w:p>
     <w:p>
@@ -2392,7 +2392,7 @@
       <w:pPr>
         <w:pStyle w:val="Heading1"/>
       </w:pPr>
-      <w:bookmarkStart w:id="2" w:name="_Toc242785649"/>
+      <w:bookmarkStart w:id="2" w:name="_Toc242804672"/>
       <w:r>
         <w:t>2. Literature Survey</w:t>
       </w:r>
@@ -2402,7 +2402,7 @@
       <w:pPr>
         <w:pStyle w:val="Heading2"/>
       </w:pPr>
-      <w:bookmarkStart w:id="3" w:name="_Toc242785650"/>
+      <w:bookmarkStart w:id="3" w:name="_Toc242804673"/>
       <w:r>
         <w:t>2.1 Fake news detection and its benchmarks</w:t>
       </w:r>
@@ -2416,14 +2416,17 @@
         <w:t xml:space="preserve">Shu et al. (2017) survey fake news detection on social media from a data mining perspective. They separate content-based approaches, which use the text of an article, from context-based approaches, which use social signals such as who shares it, and they argue that fake news is written deliberately to mislead, so content alone is often insufficient. Ahmed, Traore and Saad (2017) introduced the ISOT dataset used here, pairing Reuters articles with articles from sites flagged by PolitiFact and Wikipedia, and </w:t>
       </w:r>
       <w:r>
-        <w:t>reported high accuracy with n-gram features and linear classifiers. Wang (2017) introduced LIAR, about 12,800 short political statements labelled on a six-point truthfulness scale by PolitiFact editors. Because LIAR labels individual claims by fact-checking rather than by publisher, it provides a useful external test of whether a model trained on ISOT has learned anything about truthfulness.</w:t>
+        <w:t xml:space="preserve">reported high accuracy with n-gram features and linear classifiers. Wang (2017) introduced LIAR, about 12,800 short political statements labelled on a six-point truthfulness scale by PolitiFact editors. Because LIAR labels individual claims by fact-checking rather than by publisher, it provides a useful external test of whether a model trained on ISOT has learned anything about truthfulness. McIntire's (2017) fake-or-real news corpus pairs fake articles from flagged websites with real articles from a range </w:t>
+      </w:r>
+      <w:r>
+        <w:t>of mainstream outlets, which makes it a natural full-article counterpart.</w:t>
       </w:r>
     </w:p>
     <w:p>
       <w:pPr>
         <w:pStyle w:val="Heading2"/>
       </w:pPr>
-      <w:bookmarkStart w:id="4" w:name="_Toc242785651"/>
+      <w:bookmarkStart w:id="4" w:name="_Toc242804674"/>
       <w:r>
         <w:lastRenderedPageBreak/>
         <w:t>2.2 Dataset artifacts and partial-input baselines</w:t>
@@ -2445,7 +2448,7 @@
       <w:pPr>
         <w:pStyle w:val="Heading2"/>
       </w:pPr>
-      <w:bookmarkStart w:id="5" w:name="_Toc242785652"/>
+      <w:bookmarkStart w:id="5" w:name="_Toc242804675"/>
       <w:r>
         <w:t>2.3 Shortcut learning</w:t>
       </w:r>
@@ -2463,7 +2466,7 @@
       <w:pPr>
         <w:pStyle w:val="Heading2"/>
       </w:pPr>
-      <w:bookmarkStart w:id="6" w:name="_Toc242785653"/>
+      <w:bookmarkStart w:id="6" w:name="_Toc242804676"/>
       <w:r>
         <w:t>2.4 Artifacts in fake news datasets</w:t>
       </w:r>
@@ -2484,7 +2487,7 @@
       <w:pPr>
         <w:pStyle w:val="Heading2"/>
       </w:pPr>
-      <w:bookmarkStart w:id="7" w:name="_Toc242785654"/>
+      <w:bookmarkStart w:id="7" w:name="_Toc242804677"/>
       <w:r>
         <w:t>2.5 Remedies</w:t>
       </w:r>
@@ -3197,7 +3200,7 @@
       <w:pPr>
         <w:pStyle w:val="Heading1"/>
       </w:pPr>
-      <w:bookmarkStart w:id="8" w:name="_Toc242785655"/>
+      <w:bookmarkStart w:id="8" w:name="_Toc242804678"/>
       <w:r>
         <w:t>3. Problem Statement</w:t>
       </w:r>
@@ -3320,7 +3323,7 @@
       <w:pPr>
         <w:pStyle w:val="Heading1"/>
       </w:pPr>
-      <w:bookmarkStart w:id="9" w:name="_Toc242785656"/>
+      <w:bookmarkStart w:id="9" w:name="_Toc242804679"/>
       <w:r>
         <w:lastRenderedPageBreak/>
         <w:t>4. Proposed System</w:t>
@@ -3331,7 +3334,7 @@
       <w:pPr>
         <w:pStyle w:val="Heading2"/>
       </w:pPr>
-      <w:bookmarkStart w:id="10" w:name="_Toc242785657"/>
+      <w:bookmarkStart w:id="10" w:name="_Toc242804680"/>
       <w:r>
         <w:t>4.1 Objectives</w:t>
       </w:r>
@@ -3439,7 +3442,7 @@
       <w:pPr>
         <w:pStyle w:val="Heading2"/>
       </w:pPr>
-      <w:bookmarkStart w:id="11" w:name="_Toc242785658"/>
+      <w:bookmarkStart w:id="11" w:name="_Toc242804681"/>
       <w:r>
         <w:t>4.2 System architecture</w:t>
       </w:r>
@@ -3466,7 +3469,7 @@
           <w:noProof/>
         </w:rPr>
         <w:drawing>
-          <wp:inline distT="0" distB="0" distL="0" distR="0" wp14:anchorId="4B73454F" wp14:editId="2036C450">
+          <wp:inline distT="0" distB="0" distL="0" distR="0" wp14:anchorId="1F3C6ADE" wp14:editId="6BDC94A5">
             <wp:extent cx="5760000" cy="3383381"/>
             <wp:effectExtent l="0" t="0" r="0" b="0"/>
             <wp:docPr id="1" name="Picture 1"/>
@@ -3514,7 +3517,7 @@
       <w:pPr>
         <w:pStyle w:val="Heading1"/>
       </w:pPr>
-      <w:bookmarkStart w:id="12" w:name="_Toc242785659"/>
+      <w:bookmarkStart w:id="12" w:name="_Toc242804682"/>
       <w:r>
         <w:lastRenderedPageBreak/>
         <w:t>5. Methodology</w:t>
@@ -3525,7 +3528,7 @@
       <w:pPr>
         <w:pStyle w:val="Heading2"/>
       </w:pPr>
-      <w:bookmarkStart w:id="13" w:name="_Toc242785660"/>
+      <w:bookmarkStart w:id="13" w:name="_Toc242804683"/>
       <w:r>
         <w:t>5.1 Data and cleaning</w:t>
       </w:r>
@@ -3556,6 +3559,23 @@
         <w:jc w:val="both"/>
       </w:pPr>
       <w:r>
+        <w:t xml:space="preserve">The McIntire corpus contains 6,335 full news articles labelled real or fake. Its fake articles come from websites flagged as unreliable, and its real articles from mainstream outlets such as the New York Times and NPR; the Reuters dateline appears in only 0.3% of its real articles. It shares no article body with ISOT. It was cleaned in the same way as ISOT (36 empty and 240 duplicate bodies removed), leaving </w:t>
+      </w:r>
+      <w:r>
+        <w:rPr>
+          <w:b/>
+        </w:rPr>
+        <w:t>6,059 articles: 2,989 real and 3,070 fake</w:t>
+      </w:r>
+      <w:r>
+        <w:t>.</w:t>
+      </w:r>
+    </w:p>
+    <w:p>
+      <w:pPr>
+        <w:jc w:val="both"/>
+      </w:pPr>
+      <w:r>
         <w:t xml:space="preserve">LIAR contains 12,836 statements (10,269 train, 1,284 validation, 1,283 test). Its six labels were collapsed to two: </w:t>
       </w:r>
       <w:r>
@@ -3635,7 +3655,7 @@
       <w:pPr>
         <w:pStyle w:val="Heading2"/>
       </w:pPr>
-      <w:bookmarkStart w:id="14" w:name="_Toc242785661"/>
+      <w:bookmarkStart w:id="14" w:name="_Toc242804684"/>
       <w:r>
         <w:t>5.2 Shared evaluation protocol</w:t>
       </w:r>
@@ -3665,16 +3685,19 @@
         <w:jc w:val="both"/>
       </w:pPr>
       <w:r>
-        <w:t>Reported metrics are accuracy, and precision, recall and F1 for the fake class, together with the confusion matrix. Chance is defined as the accuracy of always predicting the larger class in the test set, which is 54.8% for ISOT and 55.8% for LIAR. To check that results do not depend on a particular split, every split-based condition was repeated on five different random stratified splits, and the mean and standard deviation of accuracy are reported alongside the fixed-split result.</w:t>
+        <w:t xml:space="preserve">Reported metrics are accuracy, and precision, recall and F1 for the fake class, together with the confusion matrix. Chance is defined as the accuracy of always predicting the larger class </w:t>
+      </w:r>
+      <w:r>
+        <w:lastRenderedPageBreak/>
+        <w:t>in the test set, which is 54.8% for ISOT and 55.8% for LIAR. To check that results do not depend on a particular split, every split-based condition was repeated on five different random stratified splits, and the mean and standard deviation of accuracy are reported alongside the fixed-split result.</w:t>
       </w:r>
     </w:p>
     <w:p>
       <w:pPr>
         <w:pStyle w:val="Heading2"/>
       </w:pPr>
-      <w:bookmarkStart w:id="15" w:name="_Toc242785662"/>
-      <w:r>
-        <w:lastRenderedPageBreak/>
+      <w:bookmarkStart w:id="15" w:name="_Toc242804685"/>
+      <w:r>
         <w:t>5.3 Experimental conditions</w:t>
       </w:r>
       <w:bookmarkEnd w:id="15"/>
@@ -3820,6 +3843,7 @@
         <w:rPr>
           <w:b/>
         </w:rPr>
+        <w:lastRenderedPageBreak/>
         <w:t>E3c — Stripped, function words only.</w:t>
       </w:r>
       <w:r>
@@ -3837,11 +3861,21 @@
         <w:t>E4 — Cross-corpus transfer.</w:t>
       </w:r>
       <w:r>
-        <w:t xml:space="preserve"> Because LIAR has no article bodies, this experiment uses headlines. A model is trained on all ISOT titles and tested on all 12,836 LIAR statements. As </w:t>
-      </w:r>
-      <w:r>
-        <w:lastRenderedPageBreak/>
-        <w:t>an in-domain control, the same headline-only model is also evaluated on the standard ISOT split. The control shows how much accuracy headlines support within ISOT, so that any drop on LIAR can be attributed to crossing datasets.</w:t>
+        <w:t xml:space="preserve"> Because LIAR has no article bodies, this experiment uses headlines. A model is trained on all ISOT titles and tested on all 12,836 LIAR statements. As an in-domain control, the same headline-only model is also evaluated on the standard ISOT split. The control shows how much accuracy headlines support within ISOT, so that any drop on LIAR can be attributed to crossing datasets.</w:t>
+      </w:r>
+    </w:p>
+    <w:p>
+      <w:pPr>
+        <w:jc w:val="both"/>
+      </w:pPr>
+      <w:r>
+        <w:rPr>
+          <w:b/>
+        </w:rPr>
+        <w:t>E4b — Cross-corpus transfer, full articles.</w:t>
+      </w:r>
+      <w:r>
+        <w:t xml:space="preserve"> The full-text detector is trained on all of ISOT and tested on all of McIntire, using full text, fully stripped text (E3 and E3b rules on both corpora) and stripped function words. As a control, McIntire is also evaluated on its own 80/20 split, and the transfer is repeated in the reverse direction (trained on McIntire, tested on ISOT).</w:t>
       </w:r>
     </w:p>
     <w:p>
@@ -3870,7 +3904,7 @@
       <w:pPr>
         <w:pStyle w:val="Heading2"/>
       </w:pPr>
-      <w:bookmarkStart w:id="16" w:name="_Toc242785663"/>
+      <w:bookmarkStart w:id="16" w:name="_Toc242804686"/>
       <w:r>
         <w:t>5.4 Leakage-token analysis</w:t>
       </w:r>
@@ -3888,7 +3922,7 @@
       <w:pPr>
         <w:pStyle w:val="Heading2"/>
       </w:pPr>
-      <w:bookmarkStart w:id="17" w:name="_Toc242785664"/>
+      <w:bookmarkStart w:id="17" w:name="_Toc242804687"/>
       <w:r>
         <w:t>5.5 Implementation</w:t>
       </w:r>
@@ -3906,7 +3940,7 @@
       <w:pPr>
         <w:pStyle w:val="Heading1"/>
       </w:pPr>
-      <w:bookmarkStart w:id="18" w:name="_Toc242785665"/>
+      <w:bookmarkStart w:id="18" w:name="_Toc242804688"/>
       <w:r>
         <w:lastRenderedPageBreak/>
         <w:t>6. Results and Discussion</w:t>
@@ -3917,7 +3951,7 @@
       <w:pPr>
         <w:pStyle w:val="Heading2"/>
       </w:pPr>
-      <w:bookmarkStart w:id="19" w:name="_Toc242785666"/>
+      <w:bookmarkStart w:id="19" w:name="_Toc242804689"/>
       <w:r>
         <w:t>6.1 Overview</w:t>
       </w:r>
@@ -5157,7 +5191,7 @@
               <w:rPr>
                 <w:sz w:val="20"/>
               </w:rPr>
-              <w:t>E5a  US politics: full text</w:t>
+              <w:t>E4b control  McIntire in-domain</w:t>
             </w:r>
           </w:p>
         </w:tc>
@@ -5174,7 +5208,7 @@
               <w:rPr>
                 <w:sz w:val="20"/>
               </w:rPr>
-              <w:t>98.3%</w:t>
+              <w:t>91.9%</w:t>
             </w:r>
           </w:p>
         </w:tc>
@@ -5191,7 +5225,7 @@
               <w:rPr>
                 <w:sz w:val="20"/>
               </w:rPr>
-              <w:t>98.5% ± 0.1%</w:t>
+              <w:t>91.2% ± 0.5%</w:t>
             </w:r>
           </w:p>
         </w:tc>
@@ -5208,7 +5242,7 @@
               <w:rPr>
                 <w:sz w:val="20"/>
               </w:rPr>
-              <w:t>0.986</w:t>
+              <w:t>0.921</w:t>
             </w:r>
           </w:p>
         </w:tc>
@@ -5225,7 +5259,7 @@
               <w:rPr>
                 <w:sz w:val="20"/>
               </w:rPr>
-              <w:t>60.9%</w:t>
+              <w:t>50.7%</w:t>
             </w:r>
           </w:p>
         </w:tc>
@@ -5248,7 +5282,7 @@
               <w:rPr>
                 <w:sz w:val="20"/>
               </w:rPr>
-              <w:t>E5b  US politics: stripped</w:t>
+              <w:t>E4b  ISOT → McIntire, full text</w:t>
             </w:r>
           </w:p>
         </w:tc>
@@ -5265,7 +5299,7 @@
               <w:rPr>
                 <w:sz w:val="20"/>
               </w:rPr>
-              <w:t>96.7%</w:t>
+              <w:t>61.2%</w:t>
             </w:r>
           </w:p>
         </w:tc>
@@ -5282,7 +5316,7 @@
               <w:rPr>
                 <w:sz w:val="20"/>
               </w:rPr>
-              <w:t>97.0% ± 0.2%</w:t>
+              <w:t>—</w:t>
             </w:r>
           </w:p>
         </w:tc>
@@ -5299,7 +5333,7 @@
               <w:rPr>
                 <w:sz w:val="20"/>
               </w:rPr>
-              <w:t>0.973</w:t>
+              <w:t>0.700</w:t>
             </w:r>
           </w:p>
         </w:tc>
@@ -5316,7 +5350,7 @@
               <w:rPr>
                 <w:sz w:val="20"/>
               </w:rPr>
-              <w:t>60.9%</w:t>
+              <w:t>50.7%</w:t>
             </w:r>
           </w:p>
         </w:tc>
@@ -5339,7 +5373,7 @@
               <w:rPr>
                 <w:sz w:val="20"/>
               </w:rPr>
-              <w:t>E5c  US politics: stripped function words</w:t>
+              <w:t>E4b  ISOT → McIntire, stripped</w:t>
             </w:r>
           </w:p>
         </w:tc>
@@ -5356,7 +5390,7 @@
               <w:rPr>
                 <w:sz w:val="20"/>
               </w:rPr>
-              <w:t>90.3%</w:t>
+              <w:t>59.8%</w:t>
             </w:r>
           </w:p>
         </w:tc>
@@ -5373,7 +5407,7 @@
               <w:rPr>
                 <w:sz w:val="20"/>
               </w:rPr>
-              <w:t>90.5% ± 0.2%</w:t>
+              <w:t>—</w:t>
             </w:r>
           </w:p>
         </w:tc>
@@ -5390,7 +5424,7 @@
               <w:rPr>
                 <w:sz w:val="20"/>
               </w:rPr>
-              <w:t>0.920</w:t>
+              <w:t>0.687</w:t>
             </w:r>
           </w:p>
         </w:tc>
@@ -5407,7 +5441,7 @@
               <w:rPr>
                 <w:sz w:val="20"/>
               </w:rPr>
-              <w:t>60.9%</w:t>
+              <w:t>50.7%</w:t>
             </w:r>
           </w:p>
         </w:tc>
@@ -5423,6 +5457,461 @@
           </w:tcPr>
           <w:p>
             <w:pPr>
+              <w:keepNext/>
+              <w:spacing w:before="20" w:after="20" w:line="240" w:lineRule="auto"/>
+            </w:pPr>
+            <w:r>
+              <w:rPr>
+                <w:sz w:val="20"/>
+              </w:rPr>
+              <w:t>E4b  ISOT → McIntire, function words</w:t>
+            </w:r>
+          </w:p>
+        </w:tc>
+        <w:tc>
+          <w:tcPr>
+            <w:tcW w:w="1191" w:type="dxa"/>
+          </w:tcPr>
+          <w:p>
+            <w:pPr>
+              <w:keepNext/>
+              <w:spacing w:before="20" w:after="20" w:line="240" w:lineRule="auto"/>
+            </w:pPr>
+            <w:r>
+              <w:rPr>
+                <w:sz w:val="20"/>
+              </w:rPr>
+              <w:t>63.9%</w:t>
+            </w:r>
+          </w:p>
+        </w:tc>
+        <w:tc>
+          <w:tcPr>
+            <w:tcW w:w="1984" w:type="dxa"/>
+          </w:tcPr>
+          <w:p>
+            <w:pPr>
+              <w:keepNext/>
+              <w:spacing w:before="20" w:after="20" w:line="240" w:lineRule="auto"/>
+            </w:pPr>
+            <w:r>
+              <w:rPr>
+                <w:sz w:val="20"/>
+              </w:rPr>
+              <w:t>—</w:t>
+            </w:r>
+          </w:p>
+        </w:tc>
+        <w:tc>
+          <w:tcPr>
+            <w:tcW w:w="1134" w:type="dxa"/>
+          </w:tcPr>
+          <w:p>
+            <w:pPr>
+              <w:keepNext/>
+              <w:spacing w:before="20" w:after="20" w:line="240" w:lineRule="auto"/>
+            </w:pPr>
+            <w:r>
+              <w:rPr>
+                <w:sz w:val="20"/>
+              </w:rPr>
+              <w:t>0.671</w:t>
+            </w:r>
+          </w:p>
+        </w:tc>
+        <w:tc>
+          <w:tcPr>
+            <w:tcW w:w="1020" w:type="dxa"/>
+          </w:tcPr>
+          <w:p>
+            <w:pPr>
+              <w:keepNext/>
+              <w:spacing w:before="20" w:after="20" w:line="240" w:lineRule="auto"/>
+            </w:pPr>
+            <w:r>
+              <w:rPr>
+                <w:sz w:val="20"/>
+              </w:rPr>
+              <w:t>50.7%</w:t>
+            </w:r>
+          </w:p>
+        </w:tc>
+      </w:tr>
+      <w:tr>
+        <w:trPr>
+          <w:cantSplit/>
+          <w:jc w:val="center"/>
+        </w:trPr>
+        <w:tc>
+          <w:tcPr>
+            <w:tcW w:w="3628" w:type="dxa"/>
+          </w:tcPr>
+          <w:p>
+            <w:pPr>
+              <w:keepNext/>
+              <w:spacing w:before="20" w:after="20" w:line="240" w:lineRule="auto"/>
+            </w:pPr>
+            <w:r>
+              <w:rPr>
+                <w:sz w:val="20"/>
+              </w:rPr>
+              <w:t>E4b  McIntire → ISOT</w:t>
+            </w:r>
+          </w:p>
+        </w:tc>
+        <w:tc>
+          <w:tcPr>
+            <w:tcW w:w="1191" w:type="dxa"/>
+          </w:tcPr>
+          <w:p>
+            <w:pPr>
+              <w:keepNext/>
+              <w:spacing w:before="20" w:after="20" w:line="240" w:lineRule="auto"/>
+            </w:pPr>
+            <w:r>
+              <w:rPr>
+                <w:sz w:val="20"/>
+              </w:rPr>
+              <w:t>65.0%</w:t>
+            </w:r>
+          </w:p>
+        </w:tc>
+        <w:tc>
+          <w:tcPr>
+            <w:tcW w:w="1984" w:type="dxa"/>
+          </w:tcPr>
+          <w:p>
+            <w:pPr>
+              <w:keepNext/>
+              <w:spacing w:before="20" w:after="20" w:line="240" w:lineRule="auto"/>
+            </w:pPr>
+            <w:r>
+              <w:rPr>
+                <w:sz w:val="20"/>
+              </w:rPr>
+              <w:t>—</w:t>
+            </w:r>
+          </w:p>
+        </w:tc>
+        <w:tc>
+          <w:tcPr>
+            <w:tcW w:w="1134" w:type="dxa"/>
+          </w:tcPr>
+          <w:p>
+            <w:pPr>
+              <w:keepNext/>
+              <w:spacing w:before="20" w:after="20" w:line="240" w:lineRule="auto"/>
+            </w:pPr>
+            <w:r>
+              <w:rPr>
+                <w:sz w:val="20"/>
+              </w:rPr>
+              <w:t>0.648</w:t>
+            </w:r>
+          </w:p>
+        </w:tc>
+        <w:tc>
+          <w:tcPr>
+            <w:tcW w:w="1020" w:type="dxa"/>
+          </w:tcPr>
+          <w:p>
+            <w:pPr>
+              <w:keepNext/>
+              <w:spacing w:before="20" w:after="20" w:line="240" w:lineRule="auto"/>
+            </w:pPr>
+            <w:r>
+              <w:rPr>
+                <w:sz w:val="20"/>
+              </w:rPr>
+              <w:t>54.8%</w:t>
+            </w:r>
+          </w:p>
+        </w:tc>
+      </w:tr>
+      <w:tr>
+        <w:trPr>
+          <w:cantSplit/>
+          <w:jc w:val="center"/>
+        </w:trPr>
+        <w:tc>
+          <w:tcPr>
+            <w:tcW w:w="3628" w:type="dxa"/>
+          </w:tcPr>
+          <w:p>
+            <w:pPr>
+              <w:keepNext/>
+              <w:spacing w:before="20" w:after="20" w:line="240" w:lineRule="auto"/>
+            </w:pPr>
+            <w:r>
+              <w:rPr>
+                <w:sz w:val="20"/>
+              </w:rPr>
+              <w:t>E5a  US politics: full text</w:t>
+            </w:r>
+          </w:p>
+        </w:tc>
+        <w:tc>
+          <w:tcPr>
+            <w:tcW w:w="1191" w:type="dxa"/>
+          </w:tcPr>
+          <w:p>
+            <w:pPr>
+              <w:keepNext/>
+              <w:spacing w:before="20" w:after="20" w:line="240" w:lineRule="auto"/>
+            </w:pPr>
+            <w:r>
+              <w:rPr>
+                <w:sz w:val="20"/>
+              </w:rPr>
+              <w:t>98.3%</w:t>
+            </w:r>
+          </w:p>
+        </w:tc>
+        <w:tc>
+          <w:tcPr>
+            <w:tcW w:w="1984" w:type="dxa"/>
+          </w:tcPr>
+          <w:p>
+            <w:pPr>
+              <w:keepNext/>
+              <w:spacing w:before="20" w:after="20" w:line="240" w:lineRule="auto"/>
+            </w:pPr>
+            <w:r>
+              <w:rPr>
+                <w:sz w:val="20"/>
+              </w:rPr>
+              <w:t>98.5% ± 0.1%</w:t>
+            </w:r>
+          </w:p>
+        </w:tc>
+        <w:tc>
+          <w:tcPr>
+            <w:tcW w:w="1134" w:type="dxa"/>
+          </w:tcPr>
+          <w:p>
+            <w:pPr>
+              <w:keepNext/>
+              <w:spacing w:before="20" w:after="20" w:line="240" w:lineRule="auto"/>
+            </w:pPr>
+            <w:r>
+              <w:rPr>
+                <w:sz w:val="20"/>
+              </w:rPr>
+              <w:t>0.986</w:t>
+            </w:r>
+          </w:p>
+        </w:tc>
+        <w:tc>
+          <w:tcPr>
+            <w:tcW w:w="1020" w:type="dxa"/>
+          </w:tcPr>
+          <w:p>
+            <w:pPr>
+              <w:keepNext/>
+              <w:spacing w:before="20" w:after="20" w:line="240" w:lineRule="auto"/>
+            </w:pPr>
+            <w:r>
+              <w:rPr>
+                <w:sz w:val="20"/>
+              </w:rPr>
+              <w:t>60.9%</w:t>
+            </w:r>
+          </w:p>
+        </w:tc>
+      </w:tr>
+      <w:tr>
+        <w:trPr>
+          <w:cantSplit/>
+          <w:jc w:val="center"/>
+        </w:trPr>
+        <w:tc>
+          <w:tcPr>
+            <w:tcW w:w="3628" w:type="dxa"/>
+          </w:tcPr>
+          <w:p>
+            <w:pPr>
+              <w:keepNext/>
+              <w:spacing w:before="20" w:after="20" w:line="240" w:lineRule="auto"/>
+            </w:pPr>
+            <w:r>
+              <w:rPr>
+                <w:sz w:val="20"/>
+              </w:rPr>
+              <w:t>E5b  US politics: stripped</w:t>
+            </w:r>
+          </w:p>
+        </w:tc>
+        <w:tc>
+          <w:tcPr>
+            <w:tcW w:w="1191" w:type="dxa"/>
+          </w:tcPr>
+          <w:p>
+            <w:pPr>
+              <w:keepNext/>
+              <w:spacing w:before="20" w:after="20" w:line="240" w:lineRule="auto"/>
+            </w:pPr>
+            <w:r>
+              <w:rPr>
+                <w:sz w:val="20"/>
+              </w:rPr>
+              <w:t>96.7%</w:t>
+            </w:r>
+          </w:p>
+        </w:tc>
+        <w:tc>
+          <w:tcPr>
+            <w:tcW w:w="1984" w:type="dxa"/>
+          </w:tcPr>
+          <w:p>
+            <w:pPr>
+              <w:keepNext/>
+              <w:spacing w:before="20" w:after="20" w:line="240" w:lineRule="auto"/>
+            </w:pPr>
+            <w:r>
+              <w:rPr>
+                <w:sz w:val="20"/>
+              </w:rPr>
+              <w:t>97.0% ± 0.2%</w:t>
+            </w:r>
+          </w:p>
+        </w:tc>
+        <w:tc>
+          <w:tcPr>
+            <w:tcW w:w="1134" w:type="dxa"/>
+          </w:tcPr>
+          <w:p>
+            <w:pPr>
+              <w:keepNext/>
+              <w:spacing w:before="20" w:after="20" w:line="240" w:lineRule="auto"/>
+            </w:pPr>
+            <w:r>
+              <w:rPr>
+                <w:sz w:val="20"/>
+              </w:rPr>
+              <w:t>0.973</w:t>
+            </w:r>
+          </w:p>
+        </w:tc>
+        <w:tc>
+          <w:tcPr>
+            <w:tcW w:w="1020" w:type="dxa"/>
+          </w:tcPr>
+          <w:p>
+            <w:pPr>
+              <w:keepNext/>
+              <w:spacing w:before="20" w:after="20" w:line="240" w:lineRule="auto"/>
+            </w:pPr>
+            <w:r>
+              <w:rPr>
+                <w:sz w:val="20"/>
+              </w:rPr>
+              <w:t>60.9%</w:t>
+            </w:r>
+          </w:p>
+        </w:tc>
+      </w:tr>
+      <w:tr>
+        <w:trPr>
+          <w:cantSplit/>
+          <w:jc w:val="center"/>
+        </w:trPr>
+        <w:tc>
+          <w:tcPr>
+            <w:tcW w:w="3628" w:type="dxa"/>
+          </w:tcPr>
+          <w:p>
+            <w:pPr>
+              <w:keepNext/>
+              <w:spacing w:before="20" w:after="20" w:line="240" w:lineRule="auto"/>
+            </w:pPr>
+            <w:r>
+              <w:rPr>
+                <w:sz w:val="20"/>
+              </w:rPr>
+              <w:t>E5c  US politics: stripped function words</w:t>
+            </w:r>
+          </w:p>
+        </w:tc>
+        <w:tc>
+          <w:tcPr>
+            <w:tcW w:w="1191" w:type="dxa"/>
+          </w:tcPr>
+          <w:p>
+            <w:pPr>
+              <w:keepNext/>
+              <w:spacing w:before="20" w:after="20" w:line="240" w:lineRule="auto"/>
+            </w:pPr>
+            <w:r>
+              <w:rPr>
+                <w:sz w:val="20"/>
+              </w:rPr>
+              <w:t>90.3%</w:t>
+            </w:r>
+          </w:p>
+        </w:tc>
+        <w:tc>
+          <w:tcPr>
+            <w:tcW w:w="1984" w:type="dxa"/>
+          </w:tcPr>
+          <w:p>
+            <w:pPr>
+              <w:keepNext/>
+              <w:spacing w:before="20" w:after="20" w:line="240" w:lineRule="auto"/>
+            </w:pPr>
+            <w:r>
+              <w:rPr>
+                <w:sz w:val="20"/>
+              </w:rPr>
+              <w:t>90.5% ± 0.2%</w:t>
+            </w:r>
+          </w:p>
+        </w:tc>
+        <w:tc>
+          <w:tcPr>
+            <w:tcW w:w="1134" w:type="dxa"/>
+          </w:tcPr>
+          <w:p>
+            <w:pPr>
+              <w:keepNext/>
+              <w:spacing w:before="20" w:after="20" w:line="240" w:lineRule="auto"/>
+            </w:pPr>
+            <w:r>
+              <w:rPr>
+                <w:sz w:val="20"/>
+              </w:rPr>
+              <w:t>0.920</w:t>
+            </w:r>
+          </w:p>
+        </w:tc>
+        <w:tc>
+          <w:tcPr>
+            <w:tcW w:w="1020" w:type="dxa"/>
+          </w:tcPr>
+          <w:p>
+            <w:pPr>
+              <w:keepNext/>
+              <w:spacing w:before="20" w:after="20" w:line="240" w:lineRule="auto"/>
+            </w:pPr>
+            <w:r>
+              <w:rPr>
+                <w:sz w:val="20"/>
+              </w:rPr>
+              <w:t>60.9%</w:t>
+            </w:r>
+          </w:p>
+        </w:tc>
+      </w:tr>
+      <w:tr>
+        <w:trPr>
+          <w:cantSplit/>
+          <w:jc w:val="center"/>
+        </w:trPr>
+        <w:tc>
+          <w:tcPr>
+            <w:tcW w:w="3628" w:type="dxa"/>
+          </w:tcPr>
+          <w:p>
+            <w:pPr>
               <w:spacing w:before="20" w:after="20" w:line="240" w:lineRule="auto"/>
             </w:pPr>
             <w:r>
@@ -5519,7 +6008,7 @@
         </w:rPr>
         <w:lastRenderedPageBreak/>
         <w:drawing>
-          <wp:inline distT="0" distB="0" distL="0" distR="0" wp14:anchorId="7015F804" wp14:editId="15D8B22F">
+          <wp:inline distT="0" distB="0" distL="0" distR="0" wp14:anchorId="083F8185" wp14:editId="07587D4C">
             <wp:extent cx="5580000" cy="4035273"/>
             <wp:effectExtent l="0" t="0" r="0" b="0"/>
             <wp:docPr id="2" name="Picture 2"/>
@@ -5567,7 +6056,7 @@
       <w:pPr>
         <w:pStyle w:val="Heading2"/>
       </w:pPr>
-      <w:bookmarkStart w:id="20" w:name="_Toc242785667"/>
+      <w:bookmarkStart w:id="20" w:name="_Toc242804690"/>
       <w:r>
         <w:t>6.2 Partial-input probes (RQ1)</w:t>
       </w:r>
@@ -5666,7 +6155,7 @@
       <w:pPr>
         <w:pStyle w:val="Heading2"/>
       </w:pPr>
-      <w:bookmarkStart w:id="21" w:name="_Toc242785668"/>
+      <w:bookmarkStart w:id="21" w:name="_Toc242804691"/>
       <w:r>
         <w:t>6.3 What the full-text model learns</w:t>
       </w:r>
@@ -5693,7 +6182,7 @@
           <w:noProof/>
         </w:rPr>
         <w:drawing>
-          <wp:inline distT="0" distB="0" distL="0" distR="0" wp14:anchorId="35386AF3" wp14:editId="506BB6C1">
+          <wp:inline distT="0" distB="0" distL="0" distR="0" wp14:anchorId="68CB8601" wp14:editId="62E0B372">
             <wp:extent cx="5580000" cy="3119638"/>
             <wp:effectExtent l="0" t="0" r="0" b="0"/>
             <wp:docPr id="3" name="Picture 3"/>
@@ -7607,7 +8096,7 @@
       <w:pPr>
         <w:pStyle w:val="Heading2"/>
       </w:pPr>
-      <w:bookmarkStart w:id="22" w:name="_Toc242785669"/>
+      <w:bookmarkStart w:id="22" w:name="_Toc242804692"/>
       <w:r>
         <w:t>6.4 Artifact removal (RQ2)</w:t>
       </w:r>
@@ -7654,7 +8143,7 @@
           <w:noProof/>
         </w:rPr>
         <w:drawing>
-          <wp:inline distT="0" distB="0" distL="0" distR="0" wp14:anchorId="4F4EF915" wp14:editId="23B674D8">
+          <wp:inline distT="0" distB="0" distL="0" distR="0" wp14:anchorId="61510982" wp14:editId="7CE6AC0C">
             <wp:extent cx="5940000" cy="1881121"/>
             <wp:effectExtent l="0" t="0" r="0" b="0"/>
             <wp:docPr id="4" name="Picture 4"/>
@@ -7702,7 +8191,7 @@
       <w:pPr>
         <w:pStyle w:val="Heading2"/>
       </w:pPr>
-      <w:bookmarkStart w:id="23" w:name="_Toc242785670"/>
+      <w:bookmarkStart w:id="23" w:name="_Toc242804693"/>
       <w:r>
         <w:t>6.5 Cross-corpus transfer (RQ3)</w:t>
       </w:r>
@@ -7725,18 +8214,8 @@
         <w:t>half-true</w:t>
       </w:r>
       <w:r>
-        <w:t xml:space="preserve"> statements, the one ambiguous label, gives 51.1% against a chance level of 55.6%, so the result does not depend on the label mapping. The answer to RQ3 is that nothing the model learns on ISOT transfers to independently fact-checked claims.</w:t>
-      </w:r>
-    </w:p>
-    <w:p>
-      <w:pPr>
-        <w:pStyle w:val="Heading2"/>
-      </w:pPr>
-      <w:bookmarkStart w:id="24" w:name="_Toc242785671"/>
-      <w:r>
-        <w:t>6.6 Is it style, topic or the classifier? (RQ4)</w:t>
-      </w:r>
-      <w:bookmarkEnd w:id="24"/>
+        <w:t xml:space="preserve"> statements, the one ambiguous label, gives 51.1% against a chance level of 55.6%, so the result does not depend on the label mapping.</w:t>
+      </w:r>
     </w:p>
     <w:p>
       <w:pPr>
@@ -7746,10 +8225,13 @@
         <w:rPr>
           <w:b/>
         </w:rPr>
-        <w:t>Topic.</w:t>
-      </w:r>
-      <w:r>
-        <w:t xml:space="preserve"> Figure 5 repeats the strictest conditions on US politics only. Full text gives 98.3%, fully stripped text 96.7%, stripped function words 90.3% and eight stripped surface statistics 85.8%, against a chance level of 60.9%. Removing the world-news articles changes almost nothing, so topic does not explain the results.</w:t>
+        <w:t>Full articles.</w:t>
+      </w:r>
+      <w:r>
+        <w:t xml:space="preserve"> Because LIAR contains only short statements, the test was repeated on the McIntire corpus of full articles. McIntire itself is learnable: trained and tested on its own split, the same pipeline reaches 91.9%. The ISOT detector, however, reaches only 61.2% on it against a chance level of 50.7%. It labels 68% of McIntire's real articles — mainstream journalism that is not written in Reuters house style — as fake. Stripping both corpora does not help (59.8%), and stripped function words give 63.9%. The reverse</w:t>
+      </w:r>
+      <w:r>
+        <w:t xml:space="preserve"> direction fails in the same way: trained on McIntire, the model reaches 65.0% on ISOT against a chance level of 54.8%. Some signal does transfer, about ten points above chance, but almost all of the within-corpus accuracy is lost (Figure 5).</w:t>
       </w:r>
     </w:p>
     <w:p>
@@ -7763,10 +8245,96 @@
         </w:rPr>
         <w:lastRenderedPageBreak/>
         <w:drawing>
-          <wp:inline distT="0" distB="0" distL="0" distR="0" wp14:anchorId="29AD509F" wp14:editId="78FAA88B">
+          <wp:inline distT="0" distB="0" distL="0" distR="0" wp14:anchorId="386330CF" wp14:editId="50545721">
+            <wp:extent cx="5400000" cy="3246835"/>
+            <wp:effectExtent l="0" t="0" r="0" b="0"/>
+            <wp:docPr id="5" name="Picture 5"/>
+            <wp:cNvGraphicFramePr>
+              <a:graphicFrameLocks xmlns:a="http://schemas.openxmlformats.org/drawingml/2006/main" noChangeAspect="1"/>
+            </wp:cNvGraphicFramePr>
+            <a:graphic xmlns:a="http://schemas.openxmlformats.org/drawingml/2006/main">
+              <a:graphicData uri="http://schemas.openxmlformats.org/drawingml/2006/picture">
+                <pic:pic xmlns:pic="http://schemas.openxmlformats.org/drawingml/2006/picture">
+                  <pic:nvPicPr>
+                    <pic:cNvPr id="0" name="fig7_cross_corpus.png"/>
+                    <pic:cNvPicPr/>
+                  </pic:nvPicPr>
+                  <pic:blipFill>
+                    <a:blip r:embed="rId12"/>
+                    <a:stretch>
+                      <a:fillRect/>
+                    </a:stretch>
+                  </pic:blipFill>
+                  <pic:spPr>
+                    <a:xfrm>
+                      <a:off x="0" y="0"/>
+                      <a:ext cx="5400000" cy="3246835"/>
+                    </a:xfrm>
+                    <a:prstGeom prst="rect">
+                      <a:avLst/>
+                    </a:prstGeom>
+                  </pic:spPr>
+                </pic:pic>
+              </a:graphicData>
+            </a:graphic>
+          </wp:inline>
+        </w:drawing>
+      </w:r>
+    </w:p>
+    <w:p>
+      <w:pPr>
+        <w:pStyle w:val="CaptionText"/>
+      </w:pPr>
+      <w:r>
+        <w:t>Figure 5. Accuracy within each dataset and on the other dataset. Dashed ticks mark chance on the dataset tested.</w:t>
+      </w:r>
+    </w:p>
+    <w:p>
+      <w:pPr>
+        <w:jc w:val="both"/>
+      </w:pPr>
+      <w:r>
+        <w:t>The answer to RQ3 is that what the detector learns on ISOT does not transfer, neither to independently fact-checked claims nor to full articles from other publishers.</w:t>
+      </w:r>
+    </w:p>
+    <w:p>
+      <w:pPr>
+        <w:pStyle w:val="Heading2"/>
+      </w:pPr>
+      <w:bookmarkStart w:id="24" w:name="_Toc242804694"/>
+      <w:r>
+        <w:t>6.6 Is it style, topic or the classifier? (RQ4)</w:t>
+      </w:r>
+      <w:bookmarkEnd w:id="24"/>
+    </w:p>
+    <w:p>
+      <w:pPr>
+        <w:jc w:val="both"/>
+      </w:pPr>
+      <w:r>
+        <w:rPr>
+          <w:b/>
+        </w:rPr>
+        <w:t>Topic.</w:t>
+      </w:r>
+      <w:r>
+        <w:t xml:space="preserve"> Figure 6 repeats the strictest conditions on US politics only. Full text gives 98.3%, fully stripped text 96.7%, stripped function words 90.3% and eight stripped surface statistics 85.8%, against a chance level of 60.9%. Removing the world-news articles changes almost nothing, so topic does not explain the results.</w:t>
+      </w:r>
+    </w:p>
+    <w:p>
+      <w:pPr>
+        <w:keepNext/>
+        <w:jc w:val="center"/>
+      </w:pPr>
+      <w:r>
+        <w:rPr>
+          <w:noProof/>
+        </w:rPr>
+        <w:drawing>
+          <wp:inline distT="0" distB="0" distL="0" distR="0" wp14:anchorId="4E9F7656" wp14:editId="568BA9EA">
             <wp:extent cx="5580000" cy="2400428"/>
             <wp:effectExtent l="0" t="0" r="0" b="0"/>
-            <wp:docPr id="5" name="Picture 5"/>
+            <wp:docPr id="6" name="Picture 6"/>
             <wp:cNvGraphicFramePr>
               <a:graphicFrameLocks xmlns:a="http://schemas.openxmlformats.org/drawingml/2006/main" noChangeAspect="1"/>
             </wp:cNvGraphicFramePr>
@@ -7778,7 +8346,7 @@
                     <pic:cNvPicPr/>
                   </pic:nvPicPr>
                   <pic:blipFill>
-                    <a:blip r:embed="rId12"/>
+                    <a:blip r:embed="rId13"/>
                     <a:stretch>
                       <a:fillRect/>
                     </a:stretch>
@@ -7804,7 +8372,7 @@
         <w:pStyle w:val="CaptionText"/>
       </w:pPr>
       <w:r>
-        <w:t>Figure 5. The strictest probes on the US-politics-only subset. The dashed line is the majority-class rate on this subset.</w:t>
+        <w:t>Figure 6. The strictest probes on the US-politics-only subset. The dashed line is the majority-class rate on this subset.</w:t>
       </w:r>
     </w:p>
     <w:p>
@@ -7815,6 +8383,7 @@
         <w:rPr>
           <w:b/>
         </w:rPr>
+        <w:lastRenderedPageBreak/>
         <w:t>A scraping artifact found on the way.</w:t>
       </w:r>
       <w:r>
@@ -7832,7 +8401,7 @@
         <w:t>Classifier.</w:t>
       </w:r>
       <w:r>
-        <w:t xml:space="preserve"> Figure 6 repeats four conditions with a linear SVM. The SVM is slightly </w:t>
+        <w:t xml:space="preserve"> Figure 7 repeats four conditions with a linear SVM. The SVM is slightly </w:t>
       </w:r>
       <w:r>
         <w:rPr>
@@ -7854,10 +8423,10 @@
           <w:noProof/>
         </w:rPr>
         <w:drawing>
-          <wp:inline distT="0" distB="0" distL="0" distR="0" wp14:anchorId="4320D2F5" wp14:editId="5D49E196">
+          <wp:inline distT="0" distB="0" distL="0" distR="0" wp14:anchorId="47026CB2" wp14:editId="4310B7B7">
             <wp:extent cx="5040000" cy="2697081"/>
             <wp:effectExtent l="0" t="0" r="0" b="0"/>
-            <wp:docPr id="6" name="Picture 6"/>
+            <wp:docPr id="7" name="Picture 7"/>
             <wp:cNvGraphicFramePr>
               <a:graphicFrameLocks xmlns:a="http://schemas.openxmlformats.org/drawingml/2006/main" noChangeAspect="1"/>
             </wp:cNvGraphicFramePr>
@@ -7869,7 +8438,7 @@
                     <pic:cNvPicPr/>
                   </pic:nvPicPr>
                   <pic:blipFill>
-                    <a:blip r:embed="rId13"/>
+                    <a:blip r:embed="rId14"/>
                     <a:stretch>
                       <a:fillRect/>
                     </a:stretch>
@@ -7895,7 +8464,7 @@
         <w:pStyle w:val="CaptionText"/>
       </w:pPr>
       <w:r>
-        <w:t>Figure 6. Accuracy with logistic regression and a linear SVM on the same inputs.</w:t>
+        <w:t>Figure 7. Accuracy with logistic regression and a linear SVM on the same inputs.</w:t>
       </w:r>
     </w:p>
     <w:p>
@@ -7910,9 +8479,8 @@
       <w:pPr>
         <w:pStyle w:val="Heading2"/>
       </w:pPr>
-      <w:bookmarkStart w:id="25" w:name="_Toc242785672"/>
-      <w:r>
-        <w:lastRenderedPageBreak/>
+      <w:bookmarkStart w:id="25" w:name="_Toc242804695"/>
+      <w:r>
         <w:t>6.7 Accuracy as information is removed</w:t>
       </w:r>
       <w:bookmarkEnd w:id="25"/>
@@ -7922,7 +8490,7 @@
         <w:jc w:val="both"/>
       </w:pPr>
       <w:r>
-        <w:t>Figure 7 orders the conditions by how much information they leave the model. Removing the title changes nothing, and removing every content word costs under two points. Only when the text is reduced to eight numbers does accuracy fall substantially, and even then it remains more than 30 points above chance.</w:t>
+        <w:t>Figure 8 orders the conditions by how much information they leave the model. Removing the title changes nothing, and removing every content word costs under two points. Only when the text is reduced to eight numbers does accuracy fall substantially, and even then it remains more than 30 points above chance.</w:t>
       </w:r>
     </w:p>
     <w:p>
@@ -7934,11 +8502,12 @@
         <w:rPr>
           <w:noProof/>
         </w:rPr>
+        <w:lastRenderedPageBreak/>
         <w:drawing>
-          <wp:inline distT="0" distB="0" distL="0" distR="0" wp14:anchorId="76601680" wp14:editId="5F4C12A0">
+          <wp:inline distT="0" distB="0" distL="0" distR="0" wp14:anchorId="7364B328" wp14:editId="7939F0E6">
             <wp:extent cx="5040000" cy="3178836"/>
             <wp:effectExtent l="0" t="0" r="0" b="0"/>
-            <wp:docPr id="7" name="Picture 7"/>
+            <wp:docPr id="8" name="Picture 8"/>
             <wp:cNvGraphicFramePr>
               <a:graphicFrameLocks xmlns:a="http://schemas.openxmlformats.org/drawingml/2006/main" noChangeAspect="1"/>
             </wp:cNvGraphicFramePr>
@@ -7950,7 +8519,7 @@
                     <pic:cNvPicPr/>
                   </pic:nvPicPr>
                   <pic:blipFill>
-                    <a:blip r:embed="rId14"/>
+                    <a:blip r:embed="rId15"/>
                     <a:stretch>
                       <a:fillRect/>
                     </a:stretch>
@@ -7976,14 +8545,14 @@
         <w:pStyle w:val="CaptionText"/>
       </w:pPr>
       <w:r>
-        <w:t>Figure 7. Accuracy as content is removed.</w:t>
+        <w:t>Figure 8. Accuracy as content is removed.</w:t>
       </w:r>
     </w:p>
     <w:p>
       <w:pPr>
         <w:pStyle w:val="Heading2"/>
       </w:pPr>
-      <w:bookmarkStart w:id="26" w:name="_Toc242785673"/>
+      <w:bookmarkStart w:id="26" w:name="_Toc242804696"/>
       <w:r>
         <w:t>6.8 Threats to validity</w:t>
       </w:r>
@@ -7994,7 +8563,7 @@
         <w:jc w:val="both"/>
       </w:pPr>
       <w:r>
-        <w:t xml:space="preserve">Three threats were tested directly and ruled out: topic (E5), the choice of classifier (SVM check) and the LIAR label mapping (transfer without </w:t>
+        <w:t xml:space="preserve">Four threats were tested directly and ruled out: topic (E5), the choice of classifier (SVM check), the LIAR label mapping (transfer without </w:t>
       </w:r>
       <w:r>
         <w:rPr>
@@ -8003,7 +8572,7 @@
         <w:t>half-true</w:t>
       </w:r>
       <w:r>
-        <w:t>). The following remain.</w:t>
+        <w:t>) and the headline-only nature of LIAR (full-article transfer to McIntire, E4b). The following remain.</w:t>
       </w:r>
     </w:p>
     <w:p>
@@ -8014,24 +8583,10 @@
         <w:rPr>
           <w:b/>
         </w:rPr>
-        <w:t>Headline-level transfer.</w:t>
-      </w:r>
-      <w:r>
-        <w:t xml:space="preserve"> LIAR has no article bodies, so E4 compares headlines with short claims. Part of the failure may be caused by this difference in text type rather than by artifacts; the in-domain headline control limits, but does not remove, this concern.</w:t>
-      </w:r>
-    </w:p>
-    <w:p>
-      <w:pPr>
-        <w:pStyle w:val="ListBullet"/>
-      </w:pPr>
-      <w:r>
-        <w:rPr>
-          <w:b/>
-        </w:rPr>
-        <w:t>Single corpus.</w:t>
-      </w:r>
-      <w:r>
-        <w:t xml:space="preserve"> Conclusions apply to ISOT. Other fake news datasets may be built differently.</w:t>
+        <w:t>Corpus scope.</w:t>
+      </w:r>
+      <w:r>
+        <w:t xml:space="preserve"> The probes were applied in depth to ISOT only; McIntire was used for transfer. McIntire's labels, like ISOT's, are assigned by source rather than by fact-checking each article, so it shows that the detector does not generalise across sources, not what it would score on individually verified articles.</w:t>
       </w:r>
     </w:p>
     <w:p>
@@ -8066,9 +8621,8 @@
       <w:pPr>
         <w:pStyle w:val="Heading1"/>
       </w:pPr>
-      <w:bookmarkStart w:id="27" w:name="_Toc242785674"/>
-      <w:r>
-        <w:lastRenderedPageBreak/>
+      <w:bookmarkStart w:id="27" w:name="_Toc242804697"/>
+      <w:r>
         <w:t>7. Conclusion</w:t>
       </w:r>
       <w:bookmarkEnd w:id="27"/>
@@ -8081,7 +8635,11 @@
         <w:t>This project built a standard fake news detector on the ISOT benchmark and tested it with partial-input baselines. The detector reaches 98.4% accuracy, but so do models that are denied the information needed to judge truthfulness: 99.1% from the first sentence, 96.8% from function words and punctuation, and 86.2% from eight surface statistics, against a chance level of 54.8%. Removing source markers from both classes leaves 97.3%; restricting both classes to US politics and keeping only function words still</w:t>
       </w:r>
       <w:r>
-        <w:t xml:space="preserve"> leaves 90.3% against a chance level of 60.9%; and a model that scores 94.6% on ISOT headlines scores below chance on LIAR.</w:t>
+        <w:t xml:space="preserve"> leaves 90.3% against a chance level of 60.9%; a model that scores 94.6% on ISOT headlines scores below chance on </w:t>
+      </w:r>
+      <w:r>
+        <w:lastRenderedPageBreak/>
+        <w:t>LIAR; and the full-text detector falls to 61.2% on a second corpus of full articles, labelling most genuine mainstream news as fake.</w:t>
       </w:r>
     </w:p>
     <w:p>
@@ -8110,7 +8668,7 @@
       <w:pPr>
         <w:pStyle w:val="Heading1"/>
       </w:pPr>
-      <w:bookmarkStart w:id="28" w:name="_Toc242785675"/>
+      <w:bookmarkStart w:id="28" w:name="_Toc242804698"/>
       <w:r>
         <w:t>8. Future Work</w:t>
       </w:r>
@@ -8190,9 +8748,8 @@
       <w:pPr>
         <w:pStyle w:val="Heading1"/>
       </w:pPr>
-      <w:bookmarkStart w:id="29" w:name="_Toc242785676"/>
-      <w:r>
-        <w:lastRenderedPageBreak/>
+      <w:bookmarkStart w:id="29" w:name="_Toc242804699"/>
+      <w:r>
         <w:t>References</w:t>
       </w:r>
       <w:bookmarkEnd w:id="29"/>
@@ -8219,6 +8776,7 @@
         <w:ind w:left="567" w:hanging="567"/>
       </w:pPr>
       <w:r>
+        <w:lastRenderedPageBreak/>
         <w:t xml:space="preserve">Gardner, M., et al. (2020). Evaluating models' local decision boundaries via contrast sets. In </w:t>
       </w:r>
       <w:r>
@@ -8304,6 +8862,14 @@
         <w:ind w:left="567" w:hanging="567"/>
       </w:pPr>
       <w:r>
+        <w:t>McIntire, G. (2017). Fake or real news dataset [Data set]. GitHub. https://github.com/joolsa/fake_real_news_dataset</w:t>
+      </w:r>
+    </w:p>
+    <w:p>
+      <w:pPr>
+        <w:ind w:left="567" w:hanging="567"/>
+      </w:pPr>
+      <w:r>
         <w:t xml:space="preserve">Niven, T., &amp; Kao, H.-Y. (2019). Probing neural network comprehension of natural language arguments. In </w:t>
       </w:r>
       <w:r>
@@ -8380,7 +8946,6 @@
         <w:ind w:left="567" w:hanging="567"/>
       </w:pPr>
       <w:r>
-        <w:lastRenderedPageBreak/>
         <w:t xml:space="preserve">Wang, W. Y. (2017). "Liar, liar pants on fire": A new benchmark dataset for fake news detection. In </w:t>
       </w:r>
       <w:r>
@@ -8398,6 +8963,7 @@
         <w:ind w:left="567" w:hanging="567"/>
       </w:pPr>
       <w:r>
+        <w:lastRenderedPageBreak/>
         <w:t xml:space="preserve">Zhou, X., Elfardy, H., Christodoulopoulos, C., Butler, T., &amp; Bansal, M. (2021). Hidden biases in unreliable news detection datasets. In </w:t>
       </w:r>
       <w:r>
@@ -8411,7 +8977,7 @@
       </w:r>
     </w:p>
     <w:sectPr>
-      <w:footerReference w:type="default" r:id="rId15"/>
+      <w:footerReference w:type="default" r:id="rId16"/>
       <w:pgSz w:w="11906" w:h="16838"/>
       <w:pgMar w:top="1440" w:right="1440" w:bottom="1440" w:left="1440" w:header="720" w:footer="720" w:gutter="0"/>
       <w:cols w:space="720"/>
@@ -8673,31 +9239,31 @@
       </w:rPr>
     </w:lvl>
   </w:abstractNum>
-  <w:num w:numId="1" w16cid:durableId="150869672">
+  <w:num w:numId="1" w16cid:durableId="2106536104">
     <w:abstractNumId w:val="8"/>
   </w:num>
-  <w:num w:numId="2" w16cid:durableId="1181238142">
+  <w:num w:numId="2" w16cid:durableId="1427191799">
     <w:abstractNumId w:val="6"/>
   </w:num>
-  <w:num w:numId="3" w16cid:durableId="1537233377">
+  <w:num w:numId="3" w16cid:durableId="1590430343">
     <w:abstractNumId w:val="5"/>
   </w:num>
-  <w:num w:numId="4" w16cid:durableId="1337686836">
+  <w:num w:numId="4" w16cid:durableId="756487988">
     <w:abstractNumId w:val="4"/>
   </w:num>
-  <w:num w:numId="5" w16cid:durableId="1389302509">
+  <w:num w:numId="5" w16cid:durableId="1558585243">
     <w:abstractNumId w:val="7"/>
   </w:num>
-  <w:num w:numId="6" w16cid:durableId="1678656025">
+  <w:num w:numId="6" w16cid:durableId="850995703">
     <w:abstractNumId w:val="3"/>
   </w:num>
-  <w:num w:numId="7" w16cid:durableId="400638982">
+  <w:num w:numId="7" w16cid:durableId="1542204518">
     <w:abstractNumId w:val="2"/>
   </w:num>
-  <w:num w:numId="8" w16cid:durableId="780997371">
+  <w:num w:numId="8" w16cid:durableId="1509445511">
     <w:abstractNumId w:val="1"/>
   </w:num>
-  <w:num w:numId="9" w16cid:durableId="1548956004">
+  <w:num w:numId="9" w16cid:durableId="1906643174">
     <w:abstractNumId w:val="0"/>
   </w:num>
 </w:numbering>
@@ -20096,7 +20662,7 @@
     <w:autoRedefine/>
     <w:uiPriority w:val="39"/>
     <w:unhideWhenUsed/>
-    <w:rsid w:val="00DD53CA"/>
+    <w:rsid w:val="008B4689"/>
     <w:pPr>
       <w:spacing w:after="100"/>
     </w:pPr>
@@ -20108,7 +20674,7 @@
     <w:autoRedefine/>
     <w:uiPriority w:val="39"/>
     <w:unhideWhenUsed/>
-    <w:rsid w:val="00DD53CA"/>
+    <w:rsid w:val="008B4689"/>
     <w:pPr>
       <w:spacing w:after="100"/>
       <w:ind w:left="240"/>
@@ -20119,7 +20685,7 @@
     <w:basedOn w:val="DefaultParagraphFont"/>
     <w:uiPriority w:val="99"/>
     <w:unhideWhenUsed/>
-    <w:rsid w:val="00DD53CA"/>
+    <w:rsid w:val="008B4689"/>
     <w:rPr>
       <w:color w:val="0000FF" w:themeColor="hyperlink"/>
       <w:u w:val="single"/>

</xml_diff>

<commit_message>
Bring report in line with final pipeline
Architecture diagram and section 4.2 now include McIntire as an
external corpus; section 5.5 reflects the five-minute reproducible run.
</commit_message>
<xml_diff>
--- a/report/WSMA_Report.docx
+++ b/report/WSMA_Report.docx
@@ -193,7 +193,7 @@
       <w:r>
         <w:fldChar w:fldCharType="separate"/>
       </w:r>
-      <w:hyperlink w:anchor="_Toc242804670" w:history="1">
+      <w:hyperlink w:anchor="_Toc242856689" w:history="1">
         <w:r>
           <w:rPr>
             <w:rStyle w:val="Hyperlink"/>
@@ -220,7 +220,7 @@
             <w:noProof/>
             <w:webHidden/>
           </w:rPr>
-          <w:instrText xml:space="preserve"> PAGEREF _Toc242804670 \h </w:instrText>
+          <w:instrText xml:space="preserve"> PAGEREF _Toc242856689 \h </w:instrText>
         </w:r>
         <w:r>
           <w:rPr>
@@ -261,7 +261,7 @@
           <w:noProof/>
         </w:rPr>
       </w:pPr>
-      <w:hyperlink w:anchor="_Toc242804671" w:history="1">
+      <w:hyperlink w:anchor="_Toc242856690" w:history="1">
         <w:r>
           <w:rPr>
             <w:rStyle w:val="Hyperlink"/>
@@ -288,7 +288,7 @@
             <w:noProof/>
             <w:webHidden/>
           </w:rPr>
-          <w:instrText xml:space="preserve"> PAGEREF _Toc242804671 \h </w:instrText>
+          <w:instrText xml:space="preserve"> PAGEREF _Toc242856690 \h </w:instrText>
         </w:r>
         <w:r>
           <w:rPr>
@@ -329,7 +329,7 @@
           <w:noProof/>
         </w:rPr>
       </w:pPr>
-      <w:hyperlink w:anchor="_Toc242804672" w:history="1">
+      <w:hyperlink w:anchor="_Toc242856691" w:history="1">
         <w:r>
           <w:rPr>
             <w:rStyle w:val="Hyperlink"/>
@@ -356,7 +356,7 @@
             <w:noProof/>
             <w:webHidden/>
           </w:rPr>
-          <w:instrText xml:space="preserve"> PAGEREF _Toc242804672 \h </w:instrText>
+          <w:instrText xml:space="preserve"> PAGEREF _Toc242856691 \h </w:instrText>
         </w:r>
         <w:r>
           <w:rPr>
@@ -397,7 +397,7 @@
           <w:noProof/>
         </w:rPr>
       </w:pPr>
-      <w:hyperlink w:anchor="_Toc242804673" w:history="1">
+      <w:hyperlink w:anchor="_Toc242856692" w:history="1">
         <w:r>
           <w:rPr>
             <w:rStyle w:val="Hyperlink"/>
@@ -424,7 +424,7 @@
             <w:noProof/>
             <w:webHidden/>
           </w:rPr>
-          <w:instrText xml:space="preserve"> PAGEREF _Toc242804673 \h </w:instrText>
+          <w:instrText xml:space="preserve"> PAGEREF _Toc242856692 \h </w:instrText>
         </w:r>
         <w:r>
           <w:rPr>
@@ -465,7 +465,7 @@
           <w:noProof/>
         </w:rPr>
       </w:pPr>
-      <w:hyperlink w:anchor="_Toc242804674" w:history="1">
+      <w:hyperlink w:anchor="_Toc242856693" w:history="1">
         <w:r>
           <w:rPr>
             <w:rStyle w:val="Hyperlink"/>
@@ -492,7 +492,7 @@
             <w:noProof/>
             <w:webHidden/>
           </w:rPr>
-          <w:instrText xml:space="preserve"> PAGEREF _Toc242804674 \h </w:instrText>
+          <w:instrText xml:space="preserve"> PAGEREF _Toc242856693 \h </w:instrText>
         </w:r>
         <w:r>
           <w:rPr>
@@ -533,7 +533,7 @@
           <w:noProof/>
         </w:rPr>
       </w:pPr>
-      <w:hyperlink w:anchor="_Toc242804675" w:history="1">
+      <w:hyperlink w:anchor="_Toc242856694" w:history="1">
         <w:r>
           <w:rPr>
             <w:rStyle w:val="Hyperlink"/>
@@ -560,7 +560,7 @@
             <w:noProof/>
             <w:webHidden/>
           </w:rPr>
-          <w:instrText xml:space="preserve"> PAGEREF _Toc242804675 \h </w:instrText>
+          <w:instrText xml:space="preserve"> PAGEREF _Toc242856694 \h </w:instrText>
         </w:r>
         <w:r>
           <w:rPr>
@@ -601,7 +601,7 @@
           <w:noProof/>
         </w:rPr>
       </w:pPr>
-      <w:hyperlink w:anchor="_Toc242804676" w:history="1">
+      <w:hyperlink w:anchor="_Toc242856695" w:history="1">
         <w:r>
           <w:rPr>
             <w:rStyle w:val="Hyperlink"/>
@@ -628,7 +628,7 @@
             <w:noProof/>
             <w:webHidden/>
           </w:rPr>
-          <w:instrText xml:space="preserve"> PAGEREF _Toc242804676 \h </w:instrText>
+          <w:instrText xml:space="preserve"> PAGEREF _Toc242856695 \h </w:instrText>
         </w:r>
         <w:r>
           <w:rPr>
@@ -669,7 +669,7 @@
           <w:noProof/>
         </w:rPr>
       </w:pPr>
-      <w:hyperlink w:anchor="_Toc242804677" w:history="1">
+      <w:hyperlink w:anchor="_Toc242856696" w:history="1">
         <w:r>
           <w:rPr>
             <w:rStyle w:val="Hyperlink"/>
@@ -696,7 +696,7 @@
             <w:noProof/>
             <w:webHidden/>
           </w:rPr>
-          <w:instrText xml:space="preserve"> PAGEREF _Toc242804677 \h </w:instrText>
+          <w:instrText xml:space="preserve"> PAGEREF _Toc242856696 \h </w:instrText>
         </w:r>
         <w:r>
           <w:rPr>
@@ -737,7 +737,7 @@
           <w:noProof/>
         </w:rPr>
       </w:pPr>
-      <w:hyperlink w:anchor="_Toc242804678" w:history="1">
+      <w:hyperlink w:anchor="_Toc242856697" w:history="1">
         <w:r>
           <w:rPr>
             <w:rStyle w:val="Hyperlink"/>
@@ -764,7 +764,7 @@
             <w:noProof/>
             <w:webHidden/>
           </w:rPr>
-          <w:instrText xml:space="preserve"> PAGEREF _Toc242804678 \h </w:instrText>
+          <w:instrText xml:space="preserve"> PAGEREF _Toc242856697 \h </w:instrText>
         </w:r>
         <w:r>
           <w:rPr>
@@ -805,7 +805,7 @@
           <w:noProof/>
         </w:rPr>
       </w:pPr>
-      <w:hyperlink w:anchor="_Toc242804679" w:history="1">
+      <w:hyperlink w:anchor="_Toc242856698" w:history="1">
         <w:r>
           <w:rPr>
             <w:rStyle w:val="Hyperlink"/>
@@ -832,7 +832,7 @@
             <w:noProof/>
             <w:webHidden/>
           </w:rPr>
-          <w:instrText xml:space="preserve"> PAGEREF _Toc242804679 \h </w:instrText>
+          <w:instrText xml:space="preserve"> PAGEREF _Toc242856698 \h </w:instrText>
         </w:r>
         <w:r>
           <w:rPr>
@@ -873,7 +873,7 @@
           <w:noProof/>
         </w:rPr>
       </w:pPr>
-      <w:hyperlink w:anchor="_Toc242804680" w:history="1">
+      <w:hyperlink w:anchor="_Toc242856699" w:history="1">
         <w:r>
           <w:rPr>
             <w:rStyle w:val="Hyperlink"/>
@@ -900,7 +900,7 @@
             <w:noProof/>
             <w:webHidden/>
           </w:rPr>
-          <w:instrText xml:space="preserve"> PAGEREF _Toc242804680 \h </w:instrText>
+          <w:instrText xml:space="preserve"> PAGEREF _Toc242856699 \h </w:instrText>
         </w:r>
         <w:r>
           <w:rPr>
@@ -941,7 +941,7 @@
           <w:noProof/>
         </w:rPr>
       </w:pPr>
-      <w:hyperlink w:anchor="_Toc242804681" w:history="1">
+      <w:hyperlink w:anchor="_Toc242856700" w:history="1">
         <w:r>
           <w:rPr>
             <w:rStyle w:val="Hyperlink"/>
@@ -968,7 +968,7 @@
             <w:noProof/>
             <w:webHidden/>
           </w:rPr>
-          <w:instrText xml:space="preserve"> PAGEREF _Toc242804681 \h </w:instrText>
+          <w:instrText xml:space="preserve"> PAGEREF _Toc242856700 \h </w:instrText>
         </w:r>
         <w:r>
           <w:rPr>
@@ -1009,7 +1009,7 @@
           <w:noProof/>
         </w:rPr>
       </w:pPr>
-      <w:hyperlink w:anchor="_Toc242804682" w:history="1">
+      <w:hyperlink w:anchor="_Toc242856701" w:history="1">
         <w:r>
           <w:rPr>
             <w:rStyle w:val="Hyperlink"/>
@@ -1036,7 +1036,7 @@
             <w:noProof/>
             <w:webHidden/>
           </w:rPr>
-          <w:instrText xml:space="preserve"> PAGEREF _Toc242804682 \h </w:instrText>
+          <w:instrText xml:space="preserve"> PAGEREF _Toc242856701 \h </w:instrText>
         </w:r>
         <w:r>
           <w:rPr>
@@ -1077,7 +1077,7 @@
           <w:noProof/>
         </w:rPr>
       </w:pPr>
-      <w:hyperlink w:anchor="_Toc242804683" w:history="1">
+      <w:hyperlink w:anchor="_Toc242856702" w:history="1">
         <w:r>
           <w:rPr>
             <w:rStyle w:val="Hyperlink"/>
@@ -1104,7 +1104,7 @@
             <w:noProof/>
             <w:webHidden/>
           </w:rPr>
-          <w:instrText xml:space="preserve"> PAGEREF _Toc242804683 \h </w:instrText>
+          <w:instrText xml:space="preserve"> PAGEREF _Toc242856702 \h </w:instrText>
         </w:r>
         <w:r>
           <w:rPr>
@@ -1145,7 +1145,7 @@
           <w:noProof/>
         </w:rPr>
       </w:pPr>
-      <w:hyperlink w:anchor="_Toc242804684" w:history="1">
+      <w:hyperlink w:anchor="_Toc242856703" w:history="1">
         <w:r>
           <w:rPr>
             <w:rStyle w:val="Hyperlink"/>
@@ -1172,7 +1172,7 @@
             <w:noProof/>
             <w:webHidden/>
           </w:rPr>
-          <w:instrText xml:space="preserve"> PAGEREF _Toc242804684 \h </w:instrText>
+          <w:instrText xml:space="preserve"> PAGEREF _Toc242856703 \h </w:instrText>
         </w:r>
         <w:r>
           <w:rPr>
@@ -1213,7 +1213,7 @@
           <w:noProof/>
         </w:rPr>
       </w:pPr>
-      <w:hyperlink w:anchor="_Toc242804685" w:history="1">
+      <w:hyperlink w:anchor="_Toc242856704" w:history="1">
         <w:r>
           <w:rPr>
             <w:rStyle w:val="Hyperlink"/>
@@ -1240,7 +1240,7 @@
             <w:noProof/>
             <w:webHidden/>
           </w:rPr>
-          <w:instrText xml:space="preserve"> PAGEREF _Toc242804685 \h </w:instrText>
+          <w:instrText xml:space="preserve"> PAGEREF _Toc242856704 \h </w:instrText>
         </w:r>
         <w:r>
           <w:rPr>
@@ -1281,7 +1281,7 @@
           <w:noProof/>
         </w:rPr>
       </w:pPr>
-      <w:hyperlink w:anchor="_Toc242804686" w:history="1">
+      <w:hyperlink w:anchor="_Toc242856705" w:history="1">
         <w:r>
           <w:rPr>
             <w:rStyle w:val="Hyperlink"/>
@@ -1308,7 +1308,7 @@
             <w:noProof/>
             <w:webHidden/>
           </w:rPr>
-          <w:instrText xml:space="preserve"> PAGEREF _Toc242804686 \h </w:instrText>
+          <w:instrText xml:space="preserve"> PAGEREF _Toc242856705 \h </w:instrText>
         </w:r>
         <w:r>
           <w:rPr>
@@ -1349,7 +1349,7 @@
           <w:noProof/>
         </w:rPr>
       </w:pPr>
-      <w:hyperlink w:anchor="_Toc242804687" w:history="1">
+      <w:hyperlink w:anchor="_Toc242856706" w:history="1">
         <w:r>
           <w:rPr>
             <w:rStyle w:val="Hyperlink"/>
@@ -1376,7 +1376,7 @@
             <w:noProof/>
             <w:webHidden/>
           </w:rPr>
-          <w:instrText xml:space="preserve"> PAGEREF _Toc242804687 \h </w:instrText>
+          <w:instrText xml:space="preserve"> PAGEREF _Toc242856706 \h </w:instrText>
         </w:r>
         <w:r>
           <w:rPr>
@@ -1417,7 +1417,7 @@
           <w:noProof/>
         </w:rPr>
       </w:pPr>
-      <w:hyperlink w:anchor="_Toc242804688" w:history="1">
+      <w:hyperlink w:anchor="_Toc242856707" w:history="1">
         <w:r>
           <w:rPr>
             <w:rStyle w:val="Hyperlink"/>
@@ -1444,7 +1444,7 @@
             <w:noProof/>
             <w:webHidden/>
           </w:rPr>
-          <w:instrText xml:space="preserve"> PAGEREF _Toc242804688 \h </w:instrText>
+          <w:instrText xml:space="preserve"> PAGEREF _Toc242856707 \h </w:instrText>
         </w:r>
         <w:r>
           <w:rPr>
@@ -1485,7 +1485,7 @@
           <w:noProof/>
         </w:rPr>
       </w:pPr>
-      <w:hyperlink w:anchor="_Toc242804689" w:history="1">
+      <w:hyperlink w:anchor="_Toc242856708" w:history="1">
         <w:r>
           <w:rPr>
             <w:rStyle w:val="Hyperlink"/>
@@ -1512,7 +1512,7 @@
             <w:noProof/>
             <w:webHidden/>
           </w:rPr>
-          <w:instrText xml:space="preserve"> PAGEREF _Toc242804689 \h </w:instrText>
+          <w:instrText xml:space="preserve"> PAGEREF _Toc242856708 \h </w:instrText>
         </w:r>
         <w:r>
           <w:rPr>
@@ -1553,7 +1553,7 @@
           <w:noProof/>
         </w:rPr>
       </w:pPr>
-      <w:hyperlink w:anchor="_Toc242804690" w:history="1">
+      <w:hyperlink w:anchor="_Toc242856709" w:history="1">
         <w:r>
           <w:rPr>
             <w:rStyle w:val="Hyperlink"/>
@@ -1580,7 +1580,7 @@
             <w:noProof/>
             <w:webHidden/>
           </w:rPr>
-          <w:instrText xml:space="preserve"> PAGEREF _Toc242804690 \h </w:instrText>
+          <w:instrText xml:space="preserve"> PAGEREF _Toc242856709 \h </w:instrText>
         </w:r>
         <w:r>
           <w:rPr>
@@ -1621,7 +1621,7 @@
           <w:noProof/>
         </w:rPr>
       </w:pPr>
-      <w:hyperlink w:anchor="_Toc242804691" w:history="1">
+      <w:hyperlink w:anchor="_Toc242856710" w:history="1">
         <w:r>
           <w:rPr>
             <w:rStyle w:val="Hyperlink"/>
@@ -1648,7 +1648,7 @@
             <w:noProof/>
             <w:webHidden/>
           </w:rPr>
-          <w:instrText xml:space="preserve"> PAGEREF _Toc242804691 \h </w:instrText>
+          <w:instrText xml:space="preserve"> PAGEREF _Toc242856710 \h </w:instrText>
         </w:r>
         <w:r>
           <w:rPr>
@@ -1689,7 +1689,7 @@
           <w:noProof/>
         </w:rPr>
       </w:pPr>
-      <w:hyperlink w:anchor="_Toc242804692" w:history="1">
+      <w:hyperlink w:anchor="_Toc242856711" w:history="1">
         <w:r>
           <w:rPr>
             <w:rStyle w:val="Hyperlink"/>
@@ -1716,7 +1716,7 @@
             <w:noProof/>
             <w:webHidden/>
           </w:rPr>
-          <w:instrText xml:space="preserve"> PAGEREF _Toc242804692 \h </w:instrText>
+          <w:instrText xml:space="preserve"> PAGEREF _Toc242856711 \h </w:instrText>
         </w:r>
         <w:r>
           <w:rPr>
@@ -1757,7 +1757,7 @@
           <w:noProof/>
         </w:rPr>
       </w:pPr>
-      <w:hyperlink w:anchor="_Toc242804693" w:history="1">
+      <w:hyperlink w:anchor="_Toc242856712" w:history="1">
         <w:r>
           <w:rPr>
             <w:rStyle w:val="Hyperlink"/>
@@ -1784,7 +1784,7 @@
             <w:noProof/>
             <w:webHidden/>
           </w:rPr>
-          <w:instrText xml:space="preserve"> PAGEREF _Toc242804693 \h </w:instrText>
+          <w:instrText xml:space="preserve"> PAGEREF _Toc242856712 \h </w:instrText>
         </w:r>
         <w:r>
           <w:rPr>
@@ -1825,7 +1825,7 @@
           <w:noProof/>
         </w:rPr>
       </w:pPr>
-      <w:hyperlink w:anchor="_Toc242804694" w:history="1">
+      <w:hyperlink w:anchor="_Toc242856713" w:history="1">
         <w:r>
           <w:rPr>
             <w:rStyle w:val="Hyperlink"/>
@@ -1852,7 +1852,7 @@
             <w:noProof/>
             <w:webHidden/>
           </w:rPr>
-          <w:instrText xml:space="preserve"> PAGEREF _Toc242804694 \h </w:instrText>
+          <w:instrText xml:space="preserve"> PAGEREF _Toc242856713 \h </w:instrText>
         </w:r>
         <w:r>
           <w:rPr>
@@ -1893,7 +1893,7 @@
           <w:noProof/>
         </w:rPr>
       </w:pPr>
-      <w:hyperlink w:anchor="_Toc242804695" w:history="1">
+      <w:hyperlink w:anchor="_Toc242856714" w:history="1">
         <w:r>
           <w:rPr>
             <w:rStyle w:val="Hyperlink"/>
@@ -1920,7 +1920,7 @@
             <w:noProof/>
             <w:webHidden/>
           </w:rPr>
-          <w:instrText xml:space="preserve"> PAGEREF _Toc242804695 \h </w:instrText>
+          <w:instrText xml:space="preserve"> PAGEREF _Toc242856714 \h </w:instrText>
         </w:r>
         <w:r>
           <w:rPr>
@@ -1961,7 +1961,7 @@
           <w:noProof/>
         </w:rPr>
       </w:pPr>
-      <w:hyperlink w:anchor="_Toc242804696" w:history="1">
+      <w:hyperlink w:anchor="_Toc242856715" w:history="1">
         <w:r>
           <w:rPr>
             <w:rStyle w:val="Hyperlink"/>
@@ -1988,7 +1988,7 @@
             <w:noProof/>
             <w:webHidden/>
           </w:rPr>
-          <w:instrText xml:space="preserve"> PAGEREF _Toc242804696 \h </w:instrText>
+          <w:instrText xml:space="preserve"> PAGEREF _Toc242856715 \h </w:instrText>
         </w:r>
         <w:r>
           <w:rPr>
@@ -2029,7 +2029,7 @@
           <w:noProof/>
         </w:rPr>
       </w:pPr>
-      <w:hyperlink w:anchor="_Toc242804697" w:history="1">
+      <w:hyperlink w:anchor="_Toc242856716" w:history="1">
         <w:r>
           <w:rPr>
             <w:rStyle w:val="Hyperlink"/>
@@ -2056,7 +2056,7 @@
             <w:noProof/>
             <w:webHidden/>
           </w:rPr>
-          <w:instrText xml:space="preserve"> PAGEREF _Toc242804697 \h </w:instrText>
+          <w:instrText xml:space="preserve"> PAGEREF _Toc242856716 \h </w:instrText>
         </w:r>
         <w:r>
           <w:rPr>
@@ -2097,7 +2097,7 @@
           <w:noProof/>
         </w:rPr>
       </w:pPr>
-      <w:hyperlink w:anchor="_Toc242804698" w:history="1">
+      <w:hyperlink w:anchor="_Toc242856717" w:history="1">
         <w:r>
           <w:rPr>
             <w:rStyle w:val="Hyperlink"/>
@@ -2124,7 +2124,7 @@
             <w:noProof/>
             <w:webHidden/>
           </w:rPr>
-          <w:instrText xml:space="preserve"> PAGEREF _Toc242804698 \h </w:instrText>
+          <w:instrText xml:space="preserve"> PAGEREF _Toc242856717 \h </w:instrText>
         </w:r>
         <w:r>
           <w:rPr>
@@ -2165,7 +2165,7 @@
           <w:noProof/>
         </w:rPr>
       </w:pPr>
-      <w:hyperlink w:anchor="_Toc242804699" w:history="1">
+      <w:hyperlink w:anchor="_Toc242856718" w:history="1">
         <w:r>
           <w:rPr>
             <w:rStyle w:val="Hyperlink"/>
@@ -2192,7 +2192,7 @@
             <w:noProof/>
             <w:webHidden/>
           </w:rPr>
-          <w:instrText xml:space="preserve"> PAGEREF _Toc242804699 \h </w:instrText>
+          <w:instrText xml:space="preserve"> PAGEREF _Toc242856718 \h </w:instrText>
         </w:r>
         <w:r>
           <w:rPr>
@@ -2237,7 +2237,7 @@
       <w:pPr>
         <w:pStyle w:val="Heading1"/>
       </w:pPr>
-      <w:bookmarkStart w:id="0" w:name="_Toc242804670"/>
+      <w:bookmarkStart w:id="0" w:name="_Toc242856689"/>
       <w:r>
         <w:lastRenderedPageBreak/>
         <w:t>Abstract</w:t>
@@ -2279,7 +2279,7 @@
       <w:pPr>
         <w:pStyle w:val="Heading1"/>
       </w:pPr>
-      <w:bookmarkStart w:id="1" w:name="_Toc242804671"/>
+      <w:bookmarkStart w:id="1" w:name="_Toc242856690"/>
       <w:r>
         <w:t>1. Introduction</w:t>
       </w:r>
@@ -2392,7 +2392,7 @@
       <w:pPr>
         <w:pStyle w:val="Heading1"/>
       </w:pPr>
-      <w:bookmarkStart w:id="2" w:name="_Toc242804672"/>
+      <w:bookmarkStart w:id="2" w:name="_Toc242856691"/>
       <w:r>
         <w:t>2. Literature Survey</w:t>
       </w:r>
@@ -2402,7 +2402,7 @@
       <w:pPr>
         <w:pStyle w:val="Heading2"/>
       </w:pPr>
-      <w:bookmarkStart w:id="3" w:name="_Toc242804673"/>
+      <w:bookmarkStart w:id="3" w:name="_Toc242856692"/>
       <w:r>
         <w:t>2.1 Fake news detection and its benchmarks</w:t>
       </w:r>
@@ -2426,7 +2426,7 @@
       <w:pPr>
         <w:pStyle w:val="Heading2"/>
       </w:pPr>
-      <w:bookmarkStart w:id="4" w:name="_Toc242804674"/>
+      <w:bookmarkStart w:id="4" w:name="_Toc242856693"/>
       <w:r>
         <w:lastRenderedPageBreak/>
         <w:t>2.2 Dataset artifacts and partial-input baselines</w:t>
@@ -2448,7 +2448,7 @@
       <w:pPr>
         <w:pStyle w:val="Heading2"/>
       </w:pPr>
-      <w:bookmarkStart w:id="5" w:name="_Toc242804675"/>
+      <w:bookmarkStart w:id="5" w:name="_Toc242856694"/>
       <w:r>
         <w:t>2.3 Shortcut learning</w:t>
       </w:r>
@@ -2466,7 +2466,7 @@
       <w:pPr>
         <w:pStyle w:val="Heading2"/>
       </w:pPr>
-      <w:bookmarkStart w:id="6" w:name="_Toc242804676"/>
+      <w:bookmarkStart w:id="6" w:name="_Toc242856695"/>
       <w:r>
         <w:t>2.4 Artifacts in fake news datasets</w:t>
       </w:r>
@@ -2487,7 +2487,7 @@
       <w:pPr>
         <w:pStyle w:val="Heading2"/>
       </w:pPr>
-      <w:bookmarkStart w:id="7" w:name="_Toc242804677"/>
+      <w:bookmarkStart w:id="7" w:name="_Toc242856696"/>
       <w:r>
         <w:t>2.5 Remedies</w:t>
       </w:r>
@@ -3200,7 +3200,7 @@
       <w:pPr>
         <w:pStyle w:val="Heading1"/>
       </w:pPr>
-      <w:bookmarkStart w:id="8" w:name="_Toc242804678"/>
+      <w:bookmarkStart w:id="8" w:name="_Toc242856697"/>
       <w:r>
         <w:t>3. Problem Statement</w:t>
       </w:r>
@@ -3323,7 +3323,7 @@
       <w:pPr>
         <w:pStyle w:val="Heading1"/>
       </w:pPr>
-      <w:bookmarkStart w:id="9" w:name="_Toc242804679"/>
+      <w:bookmarkStart w:id="9" w:name="_Toc242856698"/>
       <w:r>
         <w:lastRenderedPageBreak/>
         <w:t>4. Proposed System</w:t>
@@ -3334,7 +3334,7 @@
       <w:pPr>
         <w:pStyle w:val="Heading2"/>
       </w:pPr>
-      <w:bookmarkStart w:id="10" w:name="_Toc242804680"/>
+      <w:bookmarkStart w:id="10" w:name="_Toc242856699"/>
       <w:r>
         <w:t>4.1 Objectives</w:t>
       </w:r>
@@ -3442,7 +3442,7 @@
       <w:pPr>
         <w:pStyle w:val="Heading2"/>
       </w:pPr>
-      <w:bookmarkStart w:id="11" w:name="_Toc242804681"/>
+      <w:bookmarkStart w:id="11" w:name="_Toc242856700"/>
       <w:r>
         <w:t>4.2 System architecture</w:t>
       </w:r>
@@ -3453,10 +3453,10 @@
         <w:jc w:val="both"/>
       </w:pPr>
       <w:r>
-        <w:t xml:space="preserve">Figure 1 shows the pipeline. Both ISOT files are loaded and cleaned once. Each experimental condition then transforms the cleaned articles into a different input — full text, a fragment of the text, a stylistic reduction of the text, or a vector of numbers — and passes it to one shared evaluation function. That function applies the same stratified train/test split, the same classifier and the same metrics to every condition, so differences in accuracy can be attributed to the input alone. LIAR is used only </w:t>
-      </w:r>
-      <w:r>
-        <w:t>as an external test set. All metrics are written to disk, and the figures and tables in this report are generated from those files.</w:t>
+        <w:t>Figure 1 shows the pipeline. Both ISOT files are loaded and cleaned once. Each experimental condition then transforms the cleaned articles into a different input — full text, a fragment of the text, a stylistic reduction of the text, or a vector of numbers — and passes it to one shared evaluation function. That function applies the same stratified train/test split, the same classifier and the same metrics to every condition, so differences in accuracy can be attributed to the input alone. LIAR and the McInt</w:t>
+      </w:r>
+      <w:r>
+        <w:t>ire corpus are used as external test sets. All metrics are written to disk, and the figures and tables in this report are generated from those files.</w:t>
       </w:r>
     </w:p>
     <w:p>
@@ -3469,7 +3469,7 @@
           <w:noProof/>
         </w:rPr>
         <w:drawing>
-          <wp:inline distT="0" distB="0" distL="0" distR="0" wp14:anchorId="1F3C6ADE" wp14:editId="6BDC94A5">
+          <wp:inline distT="0" distB="0" distL="0" distR="0" wp14:anchorId="6604DBFB" wp14:editId="6378074B">
             <wp:extent cx="5760000" cy="3383381"/>
             <wp:effectExtent l="0" t="0" r="0" b="0"/>
             <wp:docPr id="1" name="Picture 1"/>
@@ -3517,7 +3517,7 @@
       <w:pPr>
         <w:pStyle w:val="Heading1"/>
       </w:pPr>
-      <w:bookmarkStart w:id="12" w:name="_Toc242804682"/>
+      <w:bookmarkStart w:id="12" w:name="_Toc242856701"/>
       <w:r>
         <w:lastRenderedPageBreak/>
         <w:t>5. Methodology</w:t>
@@ -3528,7 +3528,7 @@
       <w:pPr>
         <w:pStyle w:val="Heading2"/>
       </w:pPr>
-      <w:bookmarkStart w:id="13" w:name="_Toc242804683"/>
+      <w:bookmarkStart w:id="13" w:name="_Toc242856702"/>
       <w:r>
         <w:t>5.1 Data and cleaning</w:t>
       </w:r>
@@ -3655,7 +3655,7 @@
       <w:pPr>
         <w:pStyle w:val="Heading2"/>
       </w:pPr>
-      <w:bookmarkStart w:id="14" w:name="_Toc242804684"/>
+      <w:bookmarkStart w:id="14" w:name="_Toc242856703"/>
       <w:r>
         <w:t>5.2 Shared evaluation protocol</w:t>
       </w:r>
@@ -3696,7 +3696,7 @@
       <w:pPr>
         <w:pStyle w:val="Heading2"/>
       </w:pPr>
-      <w:bookmarkStart w:id="15" w:name="_Toc242804685"/>
+      <w:bookmarkStart w:id="15" w:name="_Toc242856704"/>
       <w:r>
         <w:t>5.3 Experimental conditions</w:t>
       </w:r>
@@ -3904,7 +3904,7 @@
       <w:pPr>
         <w:pStyle w:val="Heading2"/>
       </w:pPr>
-      <w:bookmarkStart w:id="16" w:name="_Toc242804686"/>
+      <w:bookmarkStart w:id="16" w:name="_Toc242856705"/>
       <w:r>
         <w:t>5.4 Leakage-token analysis</w:t>
       </w:r>
@@ -3922,7 +3922,7 @@
       <w:pPr>
         <w:pStyle w:val="Heading2"/>
       </w:pPr>
-      <w:bookmarkStart w:id="17" w:name="_Toc242804687"/>
+      <w:bookmarkStart w:id="17" w:name="_Toc242856706"/>
       <w:r>
         <w:t>5.5 Implementation</w:t>
       </w:r>
@@ -3933,14 +3933,17 @@
         <w:jc w:val="both"/>
       </w:pPr>
       <w:r>
-        <w:t>The system is implemented in Python 3.10 with pandas 2.3, scikit-learn 1.7, spaCy 3.8, NLTK 3.10 (VADER) and matplotlib 3.10. Part-of-speech and entity tagging of the corpus take about an hour in total and are cached to disk. All experiments, figures and tables are then reproduced by a single command in about fifteen minutes.</w:t>
+        <w:t>The system is implemented in Python 3.10 with pandas 2.3, scikit-learn 1.7, spaCy 3.8, NLTK 3.10 (VADER) and matplotlib 3.10. Part-of-speech and entity tagging of the corpora take about 1.5 hours and are cached to disk. The repeated splits of each experiment are fitted in parallel, and independent experiments run concurrently. The datasets and cached tagging output are distributed with the code, so all experiments, figures and tables are reproduced by a single command in about five minutes, and a checksum t</w:t>
+      </w:r>
+      <w:r>
+        <w:t>est confirms that the data is identical to the copy used here.</w:t>
       </w:r>
     </w:p>
     <w:p>
       <w:pPr>
         <w:pStyle w:val="Heading1"/>
       </w:pPr>
-      <w:bookmarkStart w:id="18" w:name="_Toc242804688"/>
+      <w:bookmarkStart w:id="18" w:name="_Toc242856707"/>
       <w:r>
         <w:lastRenderedPageBreak/>
         <w:t>6. Results and Discussion</w:t>
@@ -3951,7 +3954,7 @@
       <w:pPr>
         <w:pStyle w:val="Heading2"/>
       </w:pPr>
-      <w:bookmarkStart w:id="19" w:name="_Toc242804689"/>
+      <w:bookmarkStart w:id="19" w:name="_Toc242856708"/>
       <w:r>
         <w:t>6.1 Overview</w:t>
       </w:r>
@@ -6008,7 +6011,7 @@
         </w:rPr>
         <w:lastRenderedPageBreak/>
         <w:drawing>
-          <wp:inline distT="0" distB="0" distL="0" distR="0" wp14:anchorId="083F8185" wp14:editId="07587D4C">
+          <wp:inline distT="0" distB="0" distL="0" distR="0" wp14:anchorId="0EBCC3A8" wp14:editId="7AAABDB9">
             <wp:extent cx="5580000" cy="4035273"/>
             <wp:effectExtent l="0" t="0" r="0" b="0"/>
             <wp:docPr id="2" name="Picture 2"/>
@@ -6056,7 +6059,7 @@
       <w:pPr>
         <w:pStyle w:val="Heading2"/>
       </w:pPr>
-      <w:bookmarkStart w:id="20" w:name="_Toc242804690"/>
+      <w:bookmarkStart w:id="20" w:name="_Toc242856709"/>
       <w:r>
         <w:t>6.2 Partial-input probes (RQ1)</w:t>
       </w:r>
@@ -6155,7 +6158,7 @@
       <w:pPr>
         <w:pStyle w:val="Heading2"/>
       </w:pPr>
-      <w:bookmarkStart w:id="21" w:name="_Toc242804691"/>
+      <w:bookmarkStart w:id="21" w:name="_Toc242856710"/>
       <w:r>
         <w:t>6.3 What the full-text model learns</w:t>
       </w:r>
@@ -6182,7 +6185,7 @@
           <w:noProof/>
         </w:rPr>
         <w:drawing>
-          <wp:inline distT="0" distB="0" distL="0" distR="0" wp14:anchorId="68CB8601" wp14:editId="62E0B372">
+          <wp:inline distT="0" distB="0" distL="0" distR="0" wp14:anchorId="033D5D2B" wp14:editId="642BF0F1">
             <wp:extent cx="5580000" cy="3119638"/>
             <wp:effectExtent l="0" t="0" r="0" b="0"/>
             <wp:docPr id="3" name="Picture 3"/>
@@ -8096,7 +8099,7 @@
       <w:pPr>
         <w:pStyle w:val="Heading2"/>
       </w:pPr>
-      <w:bookmarkStart w:id="22" w:name="_Toc242804692"/>
+      <w:bookmarkStart w:id="22" w:name="_Toc242856711"/>
       <w:r>
         <w:t>6.4 Artifact removal (RQ2)</w:t>
       </w:r>
@@ -8143,7 +8146,7 @@
           <w:noProof/>
         </w:rPr>
         <w:drawing>
-          <wp:inline distT="0" distB="0" distL="0" distR="0" wp14:anchorId="61510982" wp14:editId="7CE6AC0C">
+          <wp:inline distT="0" distB="0" distL="0" distR="0" wp14:anchorId="04C741D9" wp14:editId="6B35C259">
             <wp:extent cx="5940000" cy="1881121"/>
             <wp:effectExtent l="0" t="0" r="0" b="0"/>
             <wp:docPr id="4" name="Picture 4"/>
@@ -8191,7 +8194,7 @@
       <w:pPr>
         <w:pStyle w:val="Heading2"/>
       </w:pPr>
-      <w:bookmarkStart w:id="23" w:name="_Toc242804693"/>
+      <w:bookmarkStart w:id="23" w:name="_Toc242856712"/>
       <w:r>
         <w:t>6.5 Cross-corpus transfer (RQ3)</w:t>
       </w:r>
@@ -8245,7 +8248,7 @@
         </w:rPr>
         <w:lastRenderedPageBreak/>
         <w:drawing>
-          <wp:inline distT="0" distB="0" distL="0" distR="0" wp14:anchorId="386330CF" wp14:editId="50545721">
+          <wp:inline distT="0" distB="0" distL="0" distR="0" wp14:anchorId="086DCA18" wp14:editId="76EEB4A3">
             <wp:extent cx="5400000" cy="3246835"/>
             <wp:effectExtent l="0" t="0" r="0" b="0"/>
             <wp:docPr id="5" name="Picture 5"/>
@@ -8301,7 +8304,7 @@
       <w:pPr>
         <w:pStyle w:val="Heading2"/>
       </w:pPr>
-      <w:bookmarkStart w:id="24" w:name="_Toc242804694"/>
+      <w:bookmarkStart w:id="24" w:name="_Toc242856713"/>
       <w:r>
         <w:t>6.6 Is it style, topic or the classifier? (RQ4)</w:t>
       </w:r>
@@ -8331,7 +8334,7 @@
           <w:noProof/>
         </w:rPr>
         <w:drawing>
-          <wp:inline distT="0" distB="0" distL="0" distR="0" wp14:anchorId="4E9F7656" wp14:editId="568BA9EA">
+          <wp:inline distT="0" distB="0" distL="0" distR="0" wp14:anchorId="3E94BAB7" wp14:editId="6ACBCEBA">
             <wp:extent cx="5580000" cy="2400428"/>
             <wp:effectExtent l="0" t="0" r="0" b="0"/>
             <wp:docPr id="6" name="Picture 6"/>
@@ -8423,7 +8426,7 @@
           <w:noProof/>
         </w:rPr>
         <w:drawing>
-          <wp:inline distT="0" distB="0" distL="0" distR="0" wp14:anchorId="47026CB2" wp14:editId="4310B7B7">
+          <wp:inline distT="0" distB="0" distL="0" distR="0" wp14:anchorId="27C6A404" wp14:editId="0A8EFD68">
             <wp:extent cx="5040000" cy="2697081"/>
             <wp:effectExtent l="0" t="0" r="0" b="0"/>
             <wp:docPr id="7" name="Picture 7"/>
@@ -8479,7 +8482,7 @@
       <w:pPr>
         <w:pStyle w:val="Heading2"/>
       </w:pPr>
-      <w:bookmarkStart w:id="25" w:name="_Toc242804695"/>
+      <w:bookmarkStart w:id="25" w:name="_Toc242856714"/>
       <w:r>
         <w:t>6.7 Accuracy as information is removed</w:t>
       </w:r>
@@ -8504,7 +8507,7 @@
         </w:rPr>
         <w:lastRenderedPageBreak/>
         <w:drawing>
-          <wp:inline distT="0" distB="0" distL="0" distR="0" wp14:anchorId="7364B328" wp14:editId="7939F0E6">
+          <wp:inline distT="0" distB="0" distL="0" distR="0" wp14:anchorId="2A9C2AFE" wp14:editId="442A0C31">
             <wp:extent cx="5040000" cy="3178836"/>
             <wp:effectExtent l="0" t="0" r="0" b="0"/>
             <wp:docPr id="8" name="Picture 8"/>
@@ -8552,7 +8555,7 @@
       <w:pPr>
         <w:pStyle w:val="Heading2"/>
       </w:pPr>
-      <w:bookmarkStart w:id="26" w:name="_Toc242804696"/>
+      <w:bookmarkStart w:id="26" w:name="_Toc242856715"/>
       <w:r>
         <w:t>6.8 Threats to validity</w:t>
       </w:r>
@@ -8621,7 +8624,7 @@
       <w:pPr>
         <w:pStyle w:val="Heading1"/>
       </w:pPr>
-      <w:bookmarkStart w:id="27" w:name="_Toc242804697"/>
+      <w:bookmarkStart w:id="27" w:name="_Toc242856716"/>
       <w:r>
         <w:t>7. Conclusion</w:t>
       </w:r>
@@ -8668,7 +8671,7 @@
       <w:pPr>
         <w:pStyle w:val="Heading1"/>
       </w:pPr>
-      <w:bookmarkStart w:id="28" w:name="_Toc242804698"/>
+      <w:bookmarkStart w:id="28" w:name="_Toc242856717"/>
       <w:r>
         <w:t>8. Future Work</w:t>
       </w:r>
@@ -8748,7 +8751,7 @@
       <w:pPr>
         <w:pStyle w:val="Heading1"/>
       </w:pPr>
-      <w:bookmarkStart w:id="29" w:name="_Toc242804699"/>
+      <w:bookmarkStart w:id="29" w:name="_Toc242856718"/>
       <w:r>
         <w:t>References</w:t>
       </w:r>
@@ -9239,31 +9242,31 @@
       </w:rPr>
     </w:lvl>
   </w:abstractNum>
-  <w:num w:numId="1" w16cid:durableId="2106536104">
+  <w:num w:numId="1" w16cid:durableId="1686861451">
     <w:abstractNumId w:val="8"/>
   </w:num>
-  <w:num w:numId="2" w16cid:durableId="1427191799">
+  <w:num w:numId="2" w16cid:durableId="1772583625">
     <w:abstractNumId w:val="6"/>
   </w:num>
-  <w:num w:numId="3" w16cid:durableId="1590430343">
+  <w:num w:numId="3" w16cid:durableId="1725255917">
     <w:abstractNumId w:val="5"/>
   </w:num>
-  <w:num w:numId="4" w16cid:durableId="756487988">
+  <w:num w:numId="4" w16cid:durableId="784154758">
     <w:abstractNumId w:val="4"/>
   </w:num>
-  <w:num w:numId="5" w16cid:durableId="1558585243">
+  <w:num w:numId="5" w16cid:durableId="939994763">
     <w:abstractNumId w:val="7"/>
   </w:num>
-  <w:num w:numId="6" w16cid:durableId="850995703">
+  <w:num w:numId="6" w16cid:durableId="1263025007">
     <w:abstractNumId w:val="3"/>
   </w:num>
-  <w:num w:numId="7" w16cid:durableId="1542204518">
+  <w:num w:numId="7" w16cid:durableId="2119055498">
     <w:abstractNumId w:val="2"/>
   </w:num>
-  <w:num w:numId="8" w16cid:durableId="1509445511">
+  <w:num w:numId="8" w16cid:durableId="1751072732">
     <w:abstractNumId w:val="1"/>
   </w:num>
-  <w:num w:numId="9" w16cid:durableId="1906643174">
+  <w:num w:numId="9" w16cid:durableId="1664594">
     <w:abstractNumId w:val="0"/>
   </w:num>
 </w:numbering>
@@ -20662,7 +20665,7 @@
     <w:autoRedefine/>
     <w:uiPriority w:val="39"/>
     <w:unhideWhenUsed/>
-    <w:rsid w:val="008B4689"/>
+    <w:rsid w:val="000B761F"/>
     <w:pPr>
       <w:spacing w:after="100"/>
     </w:pPr>
@@ -20674,7 +20677,7 @@
     <w:autoRedefine/>
     <w:uiPriority w:val="39"/>
     <w:unhideWhenUsed/>
-    <w:rsid w:val="008B4689"/>
+    <w:rsid w:val="000B761F"/>
     <w:pPr>
       <w:spacing w:after="100"/>
       <w:ind w:left="240"/>
@@ -20685,7 +20688,7 @@
     <w:basedOn w:val="DefaultParagraphFont"/>
     <w:uiPriority w:val="99"/>
     <w:unhideWhenUsed/>
-    <w:rsid w:val="008B4689"/>
+    <w:rsid w:val="000B761F"/>
     <w:rPr>
       <w:color w:val="0000FF" w:themeColor="hyperlink"/>
       <w:u w:val="single"/>

</xml_diff>

<commit_message>
Fill in report title page details
</commit_message>
<xml_diff>
--- a/report/WSMA_Report.docx
+++ b/report/WSMA_Report.docx
@@ -44,10 +44,7 @@
         <w:jc w:val="center"/>
       </w:pPr>
       <w:r>
-        <w:rPr>
-          <w:highlight w:val="yellow"/>
-        </w:rPr>
-        <w:t>[Course code]</w:t>
+        <w:t>CSE_3132</w:t>
       </w:r>
     </w:p>
     <w:p/>
@@ -69,19 +66,13 @@
         <w:jc w:val="center"/>
       </w:pPr>
       <w:r>
-        <w:rPr>
-          <w:highlight w:val="yellow"/>
-        </w:rPr>
-        <w:t>[Your full name]</w:t>
-      </w:r>
-      <w:r>
-        <w:t xml:space="preserve">  —  </w:t>
-      </w:r>
-      <w:r>
-        <w:rPr>
-          <w:highlight w:val="yellow"/>
-        </w:rPr>
-        <w:t>[Roll number]</w:t>
+        <w:t>Abhishek Ghosh</w:t>
+      </w:r>
+      <w:r>
+        <w:t xml:space="preserve"> </w:t>
+      </w:r>
+      <w:r>
+        <w:t>– 245816186</w:t>
       </w:r>
     </w:p>
     <w:p>
@@ -89,19 +80,7 @@
         <w:jc w:val="center"/>
       </w:pPr>
       <w:r>
-        <w:rPr>
-          <w:highlight w:val="yellow"/>
-        </w:rPr>
-        <w:t>[Teammate's full name]</w:t>
-      </w:r>
-      <w:r>
-        <w:t xml:space="preserve">  —  </w:t>
-      </w:r>
-      <w:r>
-        <w:rPr>
-          <w:highlight w:val="yellow"/>
-        </w:rPr>
-        <w:t>[Roll number]</w:t>
+        <w:t>Yuvika Dosapati – 245816298</w:t>
       </w:r>
     </w:p>
     <w:p/>
@@ -121,10 +100,13 @@
         <w:jc w:val="center"/>
       </w:pPr>
       <w:r>
+        <w:t>Dr. Yashaswini K A</w:t>
+      </w:r>
+      <w:r>
         <w:rPr>
           <w:highlight w:val="yellow"/>
         </w:rPr>
-        <w:t>[Instructor's name and title]</w:t>
+        <w:t xml:space="preserve"> </w:t>
       </w:r>
     </w:p>
     <w:p/>
@@ -133,19 +115,13 @@
         <w:jc w:val="center"/>
       </w:pPr>
       <w:r>
-        <w:rPr>
-          <w:highlight w:val="yellow"/>
-        </w:rPr>
-        <w:t>[Department]</w:t>
-      </w:r>
-      <w:r>
-        <w:t xml:space="preserve">, </w:t>
-      </w:r>
-      <w:r>
-        <w:rPr>
-          <w:highlight w:val="yellow"/>
-        </w:rPr>
-        <w:t>[Institution]</w:t>
+        <w:t>CSE – Data Science</w:t>
+      </w:r>
+      <w:r>
+        <w:t>,</w:t>
+      </w:r>
+      <w:r>
+        <w:t xml:space="preserve"> Manipal Institute of Technology, Bengaluru</w:t>
       </w:r>
     </w:p>
     <w:p>
@@ -153,10 +129,16 @@
         <w:jc w:val="center"/>
       </w:pPr>
       <w:r>
+        <w:t>19</w:t>
+      </w:r>
+      <w:r>
         <w:rPr>
-          <w:highlight w:val="yellow"/>
+          <w:vertAlign w:val="superscript"/>
         </w:rPr>
-        <w:t>[Submission date]</w:t>
+        <w:t>th</w:t>
+      </w:r>
+      <w:r>
+        <w:t xml:space="preserve"> October, 2026</w:t>
       </w:r>
     </w:p>
     <w:p>
@@ -2249,16 +2231,13 @@
         <w:jc w:val="both"/>
       </w:pPr>
       <w:r>
-        <w:t xml:space="preserve">Fake news classifiers trained on the ISOT benchmark routinely report accuracies near 99%. This project asks what that number measures. ISOT's real articles were collected from a single news agency (Reuters) and its fake articles from a set of websites flagged as unreliable, so a classifier could separate the two classes by recognising the publisher rather than by detecting deception. We test this with partial-input baselines: models deliberately denied the information that genuine veracity assessment would </w:t>
-      </w:r>
-      <w:r>
-        <w:t>require. On a cleaned, deduplicated version of ISOT (38,644 articles), a TF-IDF and logistic regression baseline reaches 98.4% accuracy. A model shown only the first sentence of each article reaches 99.1%; a model shown only function words and punctuation reaches 96.8%; and a random forest given eight surface statistics and no words at all reaches 86.2%, against a majority-class baseline of 54.8%. Removing source markers from both classes lowers accuracy only to 97.3%, because the remaining signal is the wr</w:t>
-      </w:r>
-      <w:r>
-        <w:t xml:space="preserve">iting register of the two publishing pipelines. The signal is not topic: restricted to US politics in both classes, with every marker stripped, function words alone still give 90.3% against a chance level of 60.9%, and a linear SVM reproduces every result. Finally, a headline model that scores 94.6% within ISOT falls to 45.5% on the LIAR fact-checking corpus, below that corpus's majority-class rate of 55.8%, and the full-text detector falls from 98.4% to 61.2% on a second corpus of full articles whose real </w:t>
-      </w:r>
-      <w:r>
-        <w:t>news does not come from Reuters. We conclude that high accuracy on ISOT reflects source and genre separability rather than any ability to detect false content.</w:t>
+        <w:t xml:space="preserve">Fake news classifiers trained on the ISOT benchmark routinely report accuracies near 99%. This project asks what that number measures. ISOT's real articles were collected from a single news agency (Reuters) and its fake articles from a set of websites flagged as unreliable, so a classifier could separate the two classes by </w:t>
+      </w:r>
+      <w:r>
+        <w:t>recognizing</w:t>
+      </w:r>
+      <w:r>
+        <w:t xml:space="preserve"> the publisher rather than by detecting deception. We test this with partial-input baselines: models deliberately denied the information that genuine veracity assessment would require. On a cleaned, deduplicated version of ISOT (38,644 articles), a TF-IDF and logistic regression baseline reaches 98.4% accuracy. A model shown only the first sentence of each article reaches 99.1%; a model shown only function words and punctuation reaches 96.8%; and a random forest given eight surface statistics and no words at all reaches 86.2%, against a majority-class baseline of 54.8%. Removing source markers from both classes lowers accuracy only to 97.3%, because the remaining signal is the writing register of the two publishing pipelines. The signal is not topic: restricted to US politics in both classes, with every marker stripped, function words alone still give 90.3% against a chance level of 60.9%, and a linear SVM reproduces every result. Finally, a headline model that scores 94.6% within ISOT falls to 45.5% on the LIAR fact-checking corpus, below that corpus's majority-class rate of 55.8%, and the full-text detector falls from 98.4% to 61.2% on a second corpus of full articles whose real news does not come from Reuters. We conclude that high accuracy on ISOT reflects source and genre separability rather than any ability to detect false content.</w:t>
       </w:r>
     </w:p>
     <w:p>
@@ -2298,10 +2277,25 @@
         <w:jc w:val="both"/>
       </w:pPr>
       <w:r>
-        <w:t xml:space="preserve">There is reason to doubt that reading. ISOT was assembled from two different sources: its real articles come from Reuters, and its fake articles come from websites flagged by fact-checking organisations as unreliable. The two classes therefore differ not only in truthfulness but in everything else that distinguishes a wire agency from a partisan website: datelines, attribution conventions, formatting, typography, page layout and tone. A classifier optimised for accuracy has no reason to learn the hard task </w:t>
-      </w:r>
-      <w:r>
-        <w:t>(judging whether claims are true) when an easy one (recognising which publisher wrote the text) gives the same labels.</w:t>
+        <w:t xml:space="preserve">There is reason to doubt that reading. ISOT was assembled from two different sources: its real articles come from Reuters, and its fake articles come from websites flagged by fact-checking </w:t>
+      </w:r>
+      <w:r>
+        <w:t>organizations</w:t>
+      </w:r>
+      <w:r>
+        <w:t xml:space="preserve"> as unreliable. The two classes therefore differ not only in truthfulness but in everything else that distinguishes a wire agency from a partisan website: datelines, attribution conventions, formatting, typography, page layout and tone. A classifier </w:t>
+      </w:r>
+      <w:r>
+        <w:t>optimized</w:t>
+      </w:r>
+      <w:r>
+        <w:t xml:space="preserve"> for accuracy has no reason to learn the hard task (judging whether claims are true) when an easy one (</w:t>
+      </w:r>
+      <w:r>
+        <w:t>recognizing</w:t>
+      </w:r>
+      <w:r>
+        <w:t xml:space="preserve"> which publisher wrote the text) gives the same labels.</w:t>
       </w:r>
     </w:p>
     <w:p>
@@ -2318,10 +2312,7 @@
       </w:pPr>
       <w:r>
         <w:lastRenderedPageBreak/>
-        <w:t xml:space="preserve">This project builds a standard fake news detector, obtains the familiar 98% accuracy, and then tests whether that accuracy is real. The detector is the object under test. The approach is to build deliberately handicapped versions of it, each denied the information that real veracity assessment would need, and to measure how well they still perform. If a model that cannot see an article's content still separates real from fake, the labels are recoverable from something other than content, and the detector's </w:t>
-      </w:r>
-      <w:r>
-        <w:t>accuracy is not measuring deception detection.</w:t>
+        <w:t>This project builds a standard fake news detector, obtains the familiar 98% accuracy, and then tests whether that accuracy is real. The detector is the object under test. The approach is to build deliberately handicapped versions of it, each denied the information that real veracity assessment would need, and to measure how well they still perform. If a model that cannot see an article's content still separates real from fake, the labels are recoverable from something other than content, and the detector's accuracy is not measuring deception detection.</w:t>
       </w:r>
     </w:p>
     <w:p>
@@ -2345,7 +2336,13 @@
         <w:pStyle w:val="ListBullet"/>
       </w:pPr>
       <w:r>
-        <w:t>five content-free partial-input probes (first sentence, function words, eight surface statistics, sentiment scores and named-entity counts) applied to the same fixed train/test split;</w:t>
+        <w:t xml:space="preserve">five content-free partial-input probes (first sentence, function words, eight surface statistics, sentiment scores and named-entity </w:t>
+      </w:r>
+      <w:r>
+        <w:t>count</w:t>
+      </w:r>
+      <w:r>
+        <w:t>) applied to the same fixed train/test split;</w:t>
       </w:r>
     </w:p>
     <w:p>
@@ -2413,13 +2410,7 @@
         <w:jc w:val="both"/>
       </w:pPr>
       <w:r>
-        <w:t xml:space="preserve">Shu et al. (2017) survey fake news detection on social media from a data mining perspective. They separate content-based approaches, which use the text of an article, from context-based approaches, which use social signals such as who shares it, and they argue that fake news is written deliberately to mislead, so content alone is often insufficient. Ahmed, Traore and Saad (2017) introduced the ISOT dataset used here, pairing Reuters articles with articles from sites flagged by PolitiFact and Wikipedia, and </w:t>
-      </w:r>
-      <w:r>
-        <w:t xml:space="preserve">reported high accuracy with n-gram features and linear classifiers. Wang (2017) introduced LIAR, about 12,800 short political statements labelled on a six-point truthfulness scale by PolitiFact editors. Because LIAR labels individual claims by fact-checking rather than by publisher, it provides a useful external test of whether a model trained on ISOT has learned anything about truthfulness. McIntire's (2017) fake-or-real news corpus pairs fake articles from flagged websites with real articles from a range </w:t>
-      </w:r>
-      <w:r>
-        <w:t>of mainstream outlets, which makes it a natural full-article counterpart.</w:t>
+        <w:t>Shu et al. (2017) survey fake news detection on social media from a data mining perspective. They separate content-based approaches, which use the text of an article, from context-based approaches, which use social signals such as who shares it, and they argue that fake news is written deliberately to mislead, so content alone is often insufficient. Ahmed, Traore and Saad (2017) introduced the ISOT dataset used here, pairing Reuters articles with articles from sites flagged by PolitiFact and Wikipedia, and reported high accuracy with n-gram features and linear classifiers. Wang (2017) introduced LIAR, about 12,800 short political statements labelled on a six-point truthfulness scale by PolitiFact editors. Because LIAR labels individual claims by fact-checking rather than by publisher, it provides a useful external test of whether a model trained on ISOT has learned anything about truthfulness. McIntire's (2017) fake-or-real news corpus pairs fake articles from flagged websites with real articles from a range of mainstream outlets, which makes it a natural full-article counterpart.</w:t>
       </w:r>
     </w:p>
     <w:p>
@@ -2438,10 +2429,13 @@
         <w:jc w:val="both"/>
       </w:pPr>
       <w:r>
-        <w:t>Gururangan et al. (2018) showed that natural language inference (NLI) datasets contain annotation artifacts: a classifier that sees only the hypothesis, never the premise it should be compared against, reaches about 67% accuracy on SNLI and 53% on MultiNLI, well above chance for three classes. This partial-input method is the core technique of the present project. Poliak et al. (2018) generalised it to ten NLI datasets and found hypothesis-only baselines beating the majority class on many of them. McCoy, Pa</w:t>
-      </w:r>
-      <w:r>
-        <w:t>vlick and Linzen (2019) built the HANS evaluation set and showed that strong NLI models rely on shallow syntactic heuristics such as lexical overlap. Niven and Kao (2019) showed that BERT's high score on an argument reasoning task came from spurious statistical cues; on an adversarial version that removed them, performance fell to chance. Schuster et al. (2019) applied the same reasoning to fact verification, showing that claim-only models perform well on the FEVER dataset without consulting any evidence.</w:t>
+        <w:t xml:space="preserve">Gururangan et al. (2018) showed that natural language inference (NLI) datasets contain annotation artifacts: a classifier that sees only the hypothesis, never the premise it should be compared against, reaches about 67% accuracy on SNLI and 53% on MultiNLI, well above chance for three classes. This partial-input method is the core technique of the present project. Poliak et al. (2018) </w:t>
+      </w:r>
+      <w:r>
+        <w:t>generalized</w:t>
+      </w:r>
+      <w:r>
+        <w:t xml:space="preserve"> it to ten NLI datasets and found hypothesis-only baselines beating the majority class on many of them. McCoy, Pavlick and Linzen (2019) built the HANS evaluation set and showed that strong NLI models rely on shallow syntactic heuristics such as lexical overlap. Niven and Kao (2019) showed that BERT's high score on an argument reasoning task came from spurious statistical cues; on an adversarial version that removed them, performance fell to chance. Schuster et al. (2019) applied the same reasoning to fact verification, showing that claim-only models perform well on the FEVER dataset without consulting any evidence.</w:t>
       </w:r>
     </w:p>
     <w:p>
@@ -2477,10 +2471,13 @@
         <w:jc w:val="both"/>
       </w:pPr>
       <w:r>
-        <w:t xml:space="preserve">Zhou et al. (2021) examined large unreliable-news datasets and found that when the same websites appear in both training and test data, models can perform well simply by memorising the mapping from site to label; with site-disjoint splits, accuracy fell by more than ten points. They recommend using simple models as bias probes during dataset construction. Most directly, Verma (2026) audits the same ISOT/Kaggle corpus used here. That preprint reports that a classifier given only the subject field reaches an </w:t>
-      </w:r>
-      <w:r>
-        <w:t>F1 of 1.000, that removing the newswire tag, metadata and duplicates lowers F1 only from 0.994 to 0.981, and that transfer to LIAR does not beat the majority class.</w:t>
+        <w:t xml:space="preserve">Zhou et al. (2021) examined large unreliable-news datasets and found that when the same websites appear in both training and test data, models can perform well simply by </w:t>
+      </w:r>
+      <w:r>
+        <w:t>memorizing</w:t>
+      </w:r>
+      <w:r>
+        <w:t xml:space="preserve"> the mapping from site to label; with site-disjoint splits, accuracy fell by more than ten points. They recommend using simple models as bias probes during dataset construction. Most directly, Verma (2026) audits the same ISOT/Kaggle corpus used here. That preprint reports that a classifier given only the subject field reaches an F1 of 1.000, that removing the newswire tag, metadata and duplicates lowers F1 only from 0.994 to 0.981, and that transfer to LIAR does not beat the majority class.</w:t>
       </w:r>
     </w:p>
     <w:p>
@@ -2537,7 +2534,7 @@
           <w:p>
             <w:pPr>
               <w:keepNext/>
-              <w:spacing w:before="20" w:after="20" w:line="240" w:lineRule="auto"/>
+              <w:spacing w:before="20" w:after="20"/>
             </w:pPr>
             <w:r>
               <w:rPr>
@@ -2556,7 +2553,7 @@
           <w:p>
             <w:pPr>
               <w:keepNext/>
-              <w:spacing w:before="20" w:after="20" w:line="240" w:lineRule="auto"/>
+              <w:spacing w:before="20" w:after="20"/>
             </w:pPr>
             <w:r>
               <w:rPr>
@@ -2575,7 +2572,7 @@
           <w:p>
             <w:pPr>
               <w:keepNext/>
-              <w:spacing w:before="20" w:after="20" w:line="240" w:lineRule="auto"/>
+              <w:spacing w:before="20" w:after="20"/>
             </w:pPr>
             <w:r>
               <w:rPr>
@@ -2594,7 +2591,7 @@
           <w:p>
             <w:pPr>
               <w:keepNext/>
-              <w:spacing w:before="20" w:after="20" w:line="240" w:lineRule="auto"/>
+              <w:spacing w:before="20" w:after="20"/>
             </w:pPr>
             <w:r>
               <w:rPr>
@@ -2618,7 +2615,7 @@
           <w:p>
             <w:pPr>
               <w:keepNext/>
-              <w:spacing w:before="20" w:after="20" w:line="240" w:lineRule="auto"/>
+              <w:spacing w:before="20" w:after="20"/>
             </w:pPr>
             <w:r>
               <w:rPr>
@@ -2635,7 +2632,7 @@
           <w:p>
             <w:pPr>
               <w:keepNext/>
-              <w:spacing w:before="20" w:after="20" w:line="240" w:lineRule="auto"/>
+              <w:spacing w:before="20" w:after="20"/>
             </w:pPr>
             <w:r>
               <w:rPr>
@@ -2652,7 +2649,7 @@
           <w:p>
             <w:pPr>
               <w:keepNext/>
-              <w:spacing w:before="20" w:after="20" w:line="240" w:lineRule="auto"/>
+              <w:spacing w:before="20" w:after="20"/>
             </w:pPr>
             <w:r>
               <w:rPr>
@@ -2669,7 +2666,7 @@
           <w:p>
             <w:pPr>
               <w:keepNext/>
-              <w:spacing w:before="20" w:after="20" w:line="240" w:lineRule="auto"/>
+              <w:spacing w:before="20" w:after="20"/>
             </w:pPr>
             <w:r>
               <w:rPr>
@@ -2692,7 +2689,7 @@
           <w:p>
             <w:pPr>
               <w:keepNext/>
-              <w:spacing w:before="20" w:after="20" w:line="240" w:lineRule="auto"/>
+              <w:spacing w:before="20" w:after="20"/>
             </w:pPr>
             <w:r>
               <w:rPr>
@@ -2709,7 +2706,7 @@
           <w:p>
             <w:pPr>
               <w:keepNext/>
-              <w:spacing w:before="20" w:after="20" w:line="240" w:lineRule="auto"/>
+              <w:spacing w:before="20" w:after="20"/>
             </w:pPr>
             <w:r>
               <w:rPr>
@@ -2726,7 +2723,7 @@
           <w:p>
             <w:pPr>
               <w:keepNext/>
-              <w:spacing w:before="20" w:after="20" w:line="240" w:lineRule="auto"/>
+              <w:spacing w:before="20" w:after="20"/>
             </w:pPr>
             <w:r>
               <w:rPr>
@@ -2743,13 +2740,25 @@
           <w:p>
             <w:pPr>
               <w:keepNext/>
-              <w:spacing w:before="20" w:after="20" w:line="240" w:lineRule="auto"/>
-            </w:pPr>
-            <w:r>
-              <w:rPr>
-                <w:sz w:val="20"/>
-              </w:rPr>
-              <w:t>Method generalises across datasets</w:t>
+              <w:spacing w:before="20" w:after="20"/>
+            </w:pPr>
+            <w:r>
+              <w:rPr>
+                <w:sz w:val="20"/>
+              </w:rPr>
+              <w:t xml:space="preserve">Method </w:t>
+            </w:r>
+            <w:r>
+              <w:rPr>
+                <w:sz w:val="20"/>
+              </w:rPr>
+              <w:t>generalizes</w:t>
+            </w:r>
+            <w:r>
+              <w:rPr>
+                <w:sz w:val="20"/>
+              </w:rPr>
+              <w:t xml:space="preserve"> across datasets</w:t>
             </w:r>
           </w:p>
         </w:tc>
@@ -2766,7 +2775,7 @@
           <w:p>
             <w:pPr>
               <w:keepNext/>
-              <w:spacing w:before="20" w:after="20" w:line="240" w:lineRule="auto"/>
+              <w:spacing w:before="20" w:after="20"/>
             </w:pPr>
             <w:r>
               <w:rPr>
@@ -2783,7 +2792,7 @@
           <w:p>
             <w:pPr>
               <w:keepNext/>
-              <w:spacing w:before="20" w:after="20" w:line="240" w:lineRule="auto"/>
+              <w:spacing w:before="20" w:after="20"/>
             </w:pPr>
             <w:r>
               <w:rPr>
@@ -2800,7 +2809,7 @@
           <w:p>
             <w:pPr>
               <w:keepNext/>
-              <w:spacing w:before="20" w:after="20" w:line="240" w:lineRule="auto"/>
+              <w:spacing w:before="20" w:after="20"/>
             </w:pPr>
             <w:r>
               <w:rPr>
@@ -2817,7 +2826,7 @@
           <w:p>
             <w:pPr>
               <w:keepNext/>
-              <w:spacing w:before="20" w:after="20" w:line="240" w:lineRule="auto"/>
+              <w:spacing w:before="20" w:after="20"/>
             </w:pPr>
             <w:r>
               <w:rPr>
@@ -2840,7 +2849,7 @@
           <w:p>
             <w:pPr>
               <w:keepNext/>
-              <w:spacing w:before="20" w:after="20" w:line="240" w:lineRule="auto"/>
+              <w:spacing w:before="20" w:after="20"/>
             </w:pPr>
             <w:r>
               <w:rPr>
@@ -2857,7 +2866,7 @@
           <w:p>
             <w:pPr>
               <w:keepNext/>
-              <w:spacing w:before="20" w:after="20" w:line="240" w:lineRule="auto"/>
+              <w:spacing w:before="20" w:after="20"/>
             </w:pPr>
             <w:r>
               <w:rPr>
@@ -2874,7 +2883,7 @@
           <w:p>
             <w:pPr>
               <w:keepNext/>
-              <w:spacing w:before="20" w:after="20" w:line="240" w:lineRule="auto"/>
+              <w:spacing w:before="20" w:after="20"/>
             </w:pPr>
             <w:r>
               <w:rPr>
@@ -2891,7 +2900,7 @@
           <w:p>
             <w:pPr>
               <w:keepNext/>
-              <w:spacing w:before="20" w:after="20" w:line="240" w:lineRule="auto"/>
+              <w:spacing w:before="20" w:after="20"/>
             </w:pPr>
             <w:r>
               <w:rPr>
@@ -2914,7 +2923,7 @@
           <w:p>
             <w:pPr>
               <w:keepNext/>
-              <w:spacing w:before="20" w:after="20" w:line="240" w:lineRule="auto"/>
+              <w:spacing w:before="20" w:after="20"/>
             </w:pPr>
             <w:r>
               <w:rPr>
@@ -2931,7 +2940,7 @@
           <w:p>
             <w:pPr>
               <w:keepNext/>
-              <w:spacing w:before="20" w:after="20" w:line="240" w:lineRule="auto"/>
+              <w:spacing w:before="20" w:after="20"/>
             </w:pPr>
             <w:r>
               <w:rPr>
@@ -2948,7 +2957,7 @@
           <w:p>
             <w:pPr>
               <w:keepNext/>
-              <w:spacing w:before="20" w:after="20" w:line="240" w:lineRule="auto"/>
+              <w:spacing w:before="20" w:after="20"/>
             </w:pPr>
             <w:r>
               <w:rPr>
@@ -2965,7 +2974,7 @@
           <w:p>
             <w:pPr>
               <w:keepNext/>
-              <w:spacing w:before="20" w:after="20" w:line="240" w:lineRule="auto"/>
+              <w:spacing w:before="20" w:after="20"/>
             </w:pPr>
             <w:r>
               <w:rPr>
@@ -2988,7 +2997,7 @@
           <w:p>
             <w:pPr>
               <w:keepNext/>
-              <w:spacing w:before="20" w:after="20" w:line="240" w:lineRule="auto"/>
+              <w:spacing w:before="20" w:after="20"/>
             </w:pPr>
             <w:r>
               <w:rPr>
@@ -3005,7 +3014,7 @@
           <w:p>
             <w:pPr>
               <w:keepNext/>
-              <w:spacing w:before="20" w:after="20" w:line="240" w:lineRule="auto"/>
+              <w:spacing w:before="20" w:after="20"/>
             </w:pPr>
             <w:r>
               <w:rPr>
@@ -3022,7 +3031,7 @@
           <w:p>
             <w:pPr>
               <w:keepNext/>
-              <w:spacing w:before="20" w:after="20" w:line="240" w:lineRule="auto"/>
+              <w:spacing w:before="20" w:after="20"/>
             </w:pPr>
             <w:r>
               <w:rPr>
@@ -3039,7 +3048,7 @@
           <w:p>
             <w:pPr>
               <w:keepNext/>
-              <w:spacing w:before="20" w:after="20" w:line="240" w:lineRule="auto"/>
+              <w:spacing w:before="20" w:after="20"/>
             </w:pPr>
             <w:r>
               <w:rPr>
@@ -3062,7 +3071,7 @@
           <w:p>
             <w:pPr>
               <w:keepNext/>
-              <w:spacing w:before="20" w:after="20" w:line="240" w:lineRule="auto"/>
+              <w:spacing w:before="20" w:after="20"/>
             </w:pPr>
             <w:r>
               <w:rPr>
@@ -3079,7 +3088,7 @@
           <w:p>
             <w:pPr>
               <w:keepNext/>
-              <w:spacing w:before="20" w:after="20" w:line="240" w:lineRule="auto"/>
+              <w:spacing w:before="20" w:after="20"/>
             </w:pPr>
             <w:r>
               <w:rPr>
@@ -3096,13 +3105,25 @@
           <w:p>
             <w:pPr>
               <w:keepNext/>
-              <w:spacing w:before="20" w:after="20" w:line="240" w:lineRule="auto"/>
-            </w:pPr>
-            <w:r>
-              <w:rPr>
-                <w:sz w:val="20"/>
-              </w:rPr>
-              <w:t>Site memorisation; &gt;10-point drop on clean split</w:t>
+              <w:spacing w:before="20" w:after="20"/>
+            </w:pPr>
+            <w:r>
+              <w:rPr>
+                <w:sz w:val="20"/>
+              </w:rPr>
+              <w:t xml:space="preserve">Site </w:t>
+            </w:r>
+            <w:r>
+              <w:rPr>
+                <w:sz w:val="20"/>
+              </w:rPr>
+              <w:t>memorization</w:t>
+            </w:r>
+            <w:r>
+              <w:rPr>
+                <w:sz w:val="20"/>
+              </w:rPr>
+              <w:t>; &gt;10-point drop on clean split</w:t>
             </w:r>
           </w:p>
         </w:tc>
@@ -3113,7 +3134,7 @@
           <w:p>
             <w:pPr>
               <w:keepNext/>
-              <w:spacing w:before="20" w:after="20" w:line="240" w:lineRule="auto"/>
+              <w:spacing w:before="20" w:after="20"/>
             </w:pPr>
             <w:r>
               <w:rPr>
@@ -3135,7 +3156,7 @@
           </w:tcPr>
           <w:p>
             <w:pPr>
-              <w:spacing w:before="20" w:after="20" w:line="240" w:lineRule="auto"/>
+              <w:spacing w:before="20" w:after="20"/>
             </w:pPr>
             <w:r>
               <w:rPr>
@@ -3151,7 +3172,7 @@
           </w:tcPr>
           <w:p>
             <w:pPr>
-              <w:spacing w:before="20" w:after="20" w:line="240" w:lineRule="auto"/>
+              <w:spacing w:before="20" w:after="20"/>
             </w:pPr>
             <w:r>
               <w:rPr>
@@ -3167,7 +3188,7 @@
           </w:tcPr>
           <w:p>
             <w:pPr>
-              <w:spacing w:before="20" w:after="20" w:line="240" w:lineRule="auto"/>
+              <w:spacing w:before="20" w:after="20"/>
             </w:pPr>
             <w:r>
               <w:rPr>
@@ -3183,7 +3204,7 @@
           </w:tcPr>
           <w:p>
             <w:pPr>
-              <w:spacing w:before="20" w:after="20" w:line="240" w:lineRule="auto"/>
+              <w:spacing w:before="20" w:after="20"/>
             </w:pPr>
             <w:r>
               <w:rPr>
@@ -3211,7 +3232,19 @@
         <w:jc w:val="both"/>
       </w:pPr>
       <w:r>
-        <w:t>ISOT is widely used to train and compare fake news classifiers, and published results on it cluster around 98–99% accuracy. Because its two classes were collected from different publishers, that accuracy may reflect the ability to recognise the publisher rather than the ability to detect false content. Prior work has established that fake news datasets leak source identity (Zhou et al., 2021) and, for ISOT specifically, that metadata fields and newswire tags give the labels away (Verma, 2026).</w:t>
+        <w:t xml:space="preserve">ISOT is widely used to train and compare fake news classifiers, and published results on </w:t>
+      </w:r>
+      <w:r>
+        <w:t>its</w:t>
+      </w:r>
+      <w:r>
+        <w:t xml:space="preserve"> cluster around 98–99% accuracy. Because its two classes were collected from different publishers, that accuracy may reflect the ability to </w:t>
+      </w:r>
+      <w:r>
+        <w:t>recognize</w:t>
+      </w:r>
+      <w:r>
+        <w:t xml:space="preserve"> the publisher rather than the ability to detect false content. Prior work has established that fake news datasets leak source identity (Zhou et al., 2021) and, for ISOT specifically, that metadata fields and newswire tags give the labels away (Verma, 2026).</w:t>
       </w:r>
     </w:p>
     <w:p>
@@ -3453,10 +3486,7 @@
         <w:jc w:val="both"/>
       </w:pPr>
       <w:r>
-        <w:t>Figure 1 shows the pipeline. Both ISOT files are loaded and cleaned once. Each experimental condition then transforms the cleaned articles into a different input — full text, a fragment of the text, a stylistic reduction of the text, or a vector of numbers — and passes it to one shared evaluation function. That function applies the same stratified train/test split, the same classifier and the same metrics to every condition, so differences in accuracy can be attributed to the input alone. LIAR and the McInt</w:t>
-      </w:r>
-      <w:r>
-        <w:t>ire corpus are used as external test sets. All metrics are written to disk, and the figures and tables in this report are generated from those files.</w:t>
+        <w:t>Figure 1 shows the pipeline. Both ISOT files are loaded and cleaned once. Each experimental condition then transforms the cleaned articles into a different input — full text, a fragment of the text, a stylistic reduction of the text, or a vector of numbers — and passes it to one shared evaluation function. That function applies the same stratified train/test split, the same classifier and the same metrics to every condition, so differences in accuracy can be attributed to the input alone. LIAR and the McIntire corpus are used as external test sets. All metrics are written to disk, and the figures and tables in this report are generated from those files.</w:t>
       </w:r>
     </w:p>
     <w:p>
@@ -3539,10 +3569,7 @@
         <w:jc w:val="both"/>
       </w:pPr>
       <w:r>
-        <w:t>The ISOT dataset contains 44,898 articles: 21,417 labelled real and 23,481 labelled fake, each with a title, body text, subject and date. Real articles were labelled 0 and fake articles 1. Two cleaning steps were applied before any experiment. First, 631 articles with an empty body were removed; 630 of them were fake, so an empty body would itself have revealed the label. Second, 5,623 articles whose body duplicated another article's body were removed, keeping the first copy. All duplicates fell within a si</w:t>
-      </w:r>
-      <w:r>
-        <w:t xml:space="preserve">ngle class. Duplicates matter because a copy in the training set and another in the test set would let the model be tested on an article it had already seen. The cleaned dataset has </w:t>
+        <w:t xml:space="preserve">The ISOT dataset contains 44,898 articles: 21,417 labelled real and 23,481 labelled fake, each with a title, body text, subject and date. Real articles were labelled 0 and fake articles 1. Two cleaning steps were applied before any experiment. First, 631 articles with an empty body were removed; 630 of them were fake, so an empty body would itself have revealed the label. Second, 5,623 articles whose body duplicated another article's body were removed, keeping the first copy. All duplicates fell within a single class. Duplicates matter because a copy in the training set and another in the test set would let the model be tested on an article it had already seen. The cleaned dataset has </w:t>
       </w:r>
       <w:r>
         <w:rPr>
@@ -3666,10 +3693,19 @@
         <w:jc w:val="both"/>
       </w:pPr>
       <w:r>
-        <w:t>Every condition is evaluated by the same function. The data is split 80/20 into training and test sets, stratified by label so that both sets keep the overall class proportions (54.8% real). The random seed is fixed, and every condition loads the articles in the same order, so all conditions are tested on exactly the same 7,729 articles. Text inputs are converted to TF-IDF vectors (unigrams, default settings) and classified with L2-regularised logistic regression. The vectoriser is fitted on the training se</w:t>
-      </w:r>
-      <w:r>
-        <w:t>t only, so no information from the test set influences the features. No hyperparameters were tuned: the aim is to measure the dataset, not to maximise accuracy.</w:t>
+        <w:t xml:space="preserve">Every condition is evaluated by the same function. The data is split 80/20 into training and test sets, stratified by label so that both sets keep the overall class proportions (54.8% real). The random seed is fixed, and every condition loads the articles in the same order, so all conditions are tested on exactly the same 7,729 articles. Text inputs are converted to TF-IDF vectors (unigrams, default settings) and classified with L2-regularised logistic regression. The </w:t>
+      </w:r>
+      <w:r>
+        <w:t>vectorizer</w:t>
+      </w:r>
+      <w:r>
+        <w:t xml:space="preserve"> is fitted on the training set only, so no information from the test set influences the features. No hyperparameters were tuned: the aim is to measure the dataset, not to </w:t>
+      </w:r>
+      <w:r>
+        <w:t>maximize</w:t>
+      </w:r>
+      <w:r>
+        <w:t xml:space="preserve"> accuracy.</w:t>
       </w:r>
     </w:p>
     <w:p>
@@ -3741,7 +3777,13 @@
         <w:t>E2b — Function words only.</w:t>
       </w:r>
       <w:r>
-        <w:t xml:space="preserve"> Every article is part-of-speech tagged with spaCy (en_core_web_sm), and only tokens tagged as determiners, pronouns, adpositions, auxiliaries, coordinating and subordinating conjunctions, particles and punctuation are kept. The result contains no nouns, verbs, adjectives, names or numbers — for example "the of a and to , the -". Because these strings consist of single-character tokens, the TF-IDF tokeniser was set to split on whitespace so that tokens such as "a" and "," are kept.</w:t>
+        <w:t xml:space="preserve"> Every article is part-of-speech tagged with spaCy (en_core_web_sm), and only tokens tagged as determiners, pronouns, adpositions, auxiliaries, coordinating and subordinating conjunctions, particles and punctuation are kept. The result contains no nouns, verbs, adjectives, names or numbers — for example "the of a and to , the -". Because these strings consist of single-character tokens, the TF-IDF </w:t>
+      </w:r>
+      <w:r>
+        <w:t>tokenizer</w:t>
+      </w:r>
+      <w:r>
+        <w:t xml:space="preserve"> was set to split on whitespace so that tokens such as "a" and "," are kept.</w:t>
       </w:r>
     </w:p>
     <w:p>
@@ -3755,7 +3797,13 @@
         <w:t>E2c — Metadata only.</w:t>
       </w:r>
       <w:r>
-        <w:t xml:space="preserve"> Each article is reduced to eight numbers: character count, word count, sentence count, exclamation marks, question marks, the proportion of words in capitals, average word length and the proportion of digits. These are standardised and classified with a random forest of 100 trees. No words reach the model.</w:t>
+        <w:t xml:space="preserve"> Each article is reduced to eight numbers: character count, word count, sentence count, exclamation marks, question marks, the proportion of words in capitals, average word length and the proportion of digits. These are </w:t>
+      </w:r>
+      <w:r>
+        <w:t>standardized</w:t>
+      </w:r>
+      <w:r>
+        <w:t xml:space="preserve"> and classified with a random forest of 100 trees. No words reach the model.</w:t>
       </w:r>
     </w:p>
     <w:p>
@@ -3783,7 +3831,19 @@
         <w:t>E2e — Named entities only.</w:t>
       </w:r>
       <w:r>
-        <w:t xml:space="preserve"> spaCy's named-entity recogniser is run on each article after E3b stripping and the count of each entity type (people, places, organisations, dates and so on) per 100 words is kept, classified with a random forest. No entity names reach the model, only how many of each type occur.</w:t>
+        <w:t xml:space="preserve"> spaCy's named-entity </w:t>
+      </w:r>
+      <w:r>
+        <w:t>recognizer</w:t>
+      </w:r>
+      <w:r>
+        <w:t xml:space="preserve"> is run on each article after E3b stripping and the count of each entity type (people, places, </w:t>
+      </w:r>
+      <w:r>
+        <w:t>organizations</w:t>
+      </w:r>
+      <w:r>
+        <w:t>, dates and so on) per 100 words is kept, classified with a random forest. No entity names reach the model, only how many of each type occur.</w:t>
       </w:r>
     </w:p>
     <w:p>
@@ -3811,10 +3871,7 @@
         <w:t>E3b — Page clutter stripped from both classes.</w:t>
       </w:r>
       <w:r>
-        <w:t xml:space="preserve"> In addition to E3, text that is not article prose is removed from both classes: image and media credits (for example "Featured image via … Getty Images" or "Video via YouTube"), URLs, Twitter handles and media tags such as "[Video]" and "WATCH:". Every apostrophe and quotation mark, curly or straight, is replaced by a space, and ellipsis characters and dashes are converted to plain forms. This last rule exists because the fake articles lost these characters during scraping: "Trump's" appears as "Trump s" a</w:t>
-      </w:r>
-      <w:r>
-        <w:t xml:space="preserve">nd "couldn't" as "couldn t" (a word followed by a lone </w:t>
+        <w:t xml:space="preserve"> In addition to E3, text that is not article prose is removed from both classes: image and media credits (for example "Featured image via … Getty Images" or "Video via YouTube"), URLs, Twitter handles and media tags such as "[Video]" and "WATCH:". Every apostrophe and quotation mark, curly or straight, is replaced by a space, and ellipsis characters and dashes are converted to plain forms. This last rule exists because the fake articles lost these characters during scraping: "Trump's" appears as "Trump s" and "couldn't" as "couldn t" (a word followed by a lone </w:t>
       </w:r>
       <w:r>
         <w:rPr>
@@ -3933,10 +3990,7 @@
         <w:jc w:val="both"/>
       </w:pPr>
       <w:r>
-        <w:t>The system is implemented in Python 3.10 with pandas 2.3, scikit-learn 1.7, spaCy 3.8, NLTK 3.10 (VADER) and matplotlib 3.10. Part-of-speech and entity tagging of the corpora take about 1.5 hours and are cached to disk. The repeated splits of each experiment are fitted in parallel, and independent experiments run concurrently. The datasets and cached tagging output are distributed with the code, so all experiments, figures and tables are reproduced by a single command in about five minutes, and a checksum t</w:t>
-      </w:r>
-      <w:r>
-        <w:t>est confirms that the data is identical to the copy used here.</w:t>
+        <w:t>The system is implemented in Python 3.10 with pandas 2.3, scikit-learn 1.7, spaCy 3.8, NLTK 3.10 (VADER) and matplotlib 3.10. Part-of-speech and entity tagging of the corpora take about 1.5 hours and are cached to disk. The repeated splits of each experiment are fitted in parallel, and independent experiments run concurrently. The datasets and cached tagging output are distributed with the code, so all experiments, figures and tables are reproduced by a single command in about five minutes, and a checksum test confirms that the data is identical to the copy used here.</w:t>
       </w:r>
     </w:p>
     <w:p>
@@ -3996,7 +4050,7 @@
           <w:p>
             <w:pPr>
               <w:keepNext/>
-              <w:spacing w:before="20" w:after="20" w:line="240" w:lineRule="auto"/>
+              <w:spacing w:before="20" w:after="20"/>
             </w:pPr>
             <w:r>
               <w:rPr>
@@ -4015,7 +4069,7 @@
           <w:p>
             <w:pPr>
               <w:keepNext/>
-              <w:spacing w:before="20" w:after="20" w:line="240" w:lineRule="auto"/>
+              <w:spacing w:before="20" w:after="20"/>
             </w:pPr>
             <w:r>
               <w:rPr>
@@ -4034,7 +4088,7 @@
           <w:p>
             <w:pPr>
               <w:keepNext/>
-              <w:spacing w:before="20" w:after="20" w:line="240" w:lineRule="auto"/>
+              <w:spacing w:before="20" w:after="20"/>
             </w:pPr>
             <w:r>
               <w:rPr>
@@ -4053,7 +4107,7 @@
           <w:p>
             <w:pPr>
               <w:keepNext/>
-              <w:spacing w:before="20" w:after="20" w:line="240" w:lineRule="auto"/>
+              <w:spacing w:before="20" w:after="20"/>
             </w:pPr>
             <w:r>
               <w:rPr>
@@ -4072,7 +4126,7 @@
           <w:p>
             <w:pPr>
               <w:keepNext/>
-              <w:spacing w:before="20" w:after="20" w:line="240" w:lineRule="auto"/>
+              <w:spacing w:before="20" w:after="20"/>
             </w:pPr>
             <w:r>
               <w:rPr>
@@ -4096,7 +4150,7 @@
           <w:p>
             <w:pPr>
               <w:keepNext/>
-              <w:spacing w:before="20" w:after="20" w:line="240" w:lineRule="auto"/>
+              <w:spacing w:before="20" w:after="20"/>
             </w:pPr>
             <w:r>
               <w:rPr>
@@ -4113,7 +4167,7 @@
           <w:p>
             <w:pPr>
               <w:keepNext/>
-              <w:spacing w:before="20" w:after="20" w:line="240" w:lineRule="auto"/>
+              <w:spacing w:before="20" w:after="20"/>
             </w:pPr>
             <w:r>
               <w:rPr>
@@ -4130,7 +4184,7 @@
           <w:p>
             <w:pPr>
               <w:keepNext/>
-              <w:spacing w:before="20" w:after="20" w:line="240" w:lineRule="auto"/>
+              <w:spacing w:before="20" w:after="20"/>
             </w:pPr>
             <w:r>
               <w:rPr>
@@ -4147,7 +4201,7 @@
           <w:p>
             <w:pPr>
               <w:keepNext/>
-              <w:spacing w:before="20" w:after="20" w:line="240" w:lineRule="auto"/>
+              <w:spacing w:before="20" w:after="20"/>
             </w:pPr>
             <w:r>
               <w:rPr>
@@ -4164,7 +4218,7 @@
           <w:p>
             <w:pPr>
               <w:keepNext/>
-              <w:spacing w:before="20" w:after="20" w:line="240" w:lineRule="auto"/>
+              <w:spacing w:before="20" w:after="20"/>
             </w:pPr>
             <w:r>
               <w:rPr>
@@ -4187,7 +4241,7 @@
           <w:p>
             <w:pPr>
               <w:keepNext/>
-              <w:spacing w:before="20" w:after="20" w:line="240" w:lineRule="auto"/>
+              <w:spacing w:before="20" w:after="20"/>
             </w:pPr>
             <w:r>
               <w:rPr>
@@ -4204,7 +4258,7 @@
           <w:p>
             <w:pPr>
               <w:keepNext/>
-              <w:spacing w:before="20" w:after="20" w:line="240" w:lineRule="auto"/>
+              <w:spacing w:before="20" w:after="20"/>
             </w:pPr>
             <w:r>
               <w:rPr>
@@ -4221,7 +4275,7 @@
           <w:p>
             <w:pPr>
               <w:keepNext/>
-              <w:spacing w:before="20" w:after="20" w:line="240" w:lineRule="auto"/>
+              <w:spacing w:before="20" w:after="20"/>
             </w:pPr>
             <w:r>
               <w:rPr>
@@ -4238,7 +4292,7 @@
           <w:p>
             <w:pPr>
               <w:keepNext/>
-              <w:spacing w:before="20" w:after="20" w:line="240" w:lineRule="auto"/>
+              <w:spacing w:before="20" w:after="20"/>
             </w:pPr>
             <w:r>
               <w:rPr>
@@ -4255,7 +4309,7 @@
           <w:p>
             <w:pPr>
               <w:keepNext/>
-              <w:spacing w:before="20" w:after="20" w:line="240" w:lineRule="auto"/>
+              <w:spacing w:before="20" w:after="20"/>
             </w:pPr>
             <w:r>
               <w:rPr>
@@ -4278,7 +4332,7 @@
           <w:p>
             <w:pPr>
               <w:keepNext/>
-              <w:spacing w:before="20" w:after="20" w:line="240" w:lineRule="auto"/>
+              <w:spacing w:before="20" w:after="20"/>
             </w:pPr>
             <w:r>
               <w:rPr>
@@ -4295,7 +4349,7 @@
           <w:p>
             <w:pPr>
               <w:keepNext/>
-              <w:spacing w:before="20" w:after="20" w:line="240" w:lineRule="auto"/>
+              <w:spacing w:before="20" w:after="20"/>
             </w:pPr>
             <w:r>
               <w:rPr>
@@ -4312,7 +4366,7 @@
           <w:p>
             <w:pPr>
               <w:keepNext/>
-              <w:spacing w:before="20" w:after="20" w:line="240" w:lineRule="auto"/>
+              <w:spacing w:before="20" w:after="20"/>
             </w:pPr>
             <w:r>
               <w:rPr>
@@ -4329,7 +4383,7 @@
           <w:p>
             <w:pPr>
               <w:keepNext/>
-              <w:spacing w:before="20" w:after="20" w:line="240" w:lineRule="auto"/>
+              <w:spacing w:before="20" w:after="20"/>
             </w:pPr>
             <w:r>
               <w:rPr>
@@ -4346,7 +4400,7 @@
           <w:p>
             <w:pPr>
               <w:keepNext/>
-              <w:spacing w:before="20" w:after="20" w:line="240" w:lineRule="auto"/>
+              <w:spacing w:before="20" w:after="20"/>
             </w:pPr>
             <w:r>
               <w:rPr>
@@ -4369,7 +4423,7 @@
           <w:p>
             <w:pPr>
               <w:keepNext/>
-              <w:spacing w:before="20" w:after="20" w:line="240" w:lineRule="auto"/>
+              <w:spacing w:before="20" w:after="20"/>
             </w:pPr>
             <w:r>
               <w:rPr>
@@ -4386,7 +4440,7 @@
           <w:p>
             <w:pPr>
               <w:keepNext/>
-              <w:spacing w:before="20" w:after="20" w:line="240" w:lineRule="auto"/>
+              <w:spacing w:before="20" w:after="20"/>
             </w:pPr>
             <w:r>
               <w:rPr>
@@ -4403,7 +4457,7 @@
           <w:p>
             <w:pPr>
               <w:keepNext/>
-              <w:spacing w:before="20" w:after="20" w:line="240" w:lineRule="auto"/>
+              <w:spacing w:before="20" w:after="20"/>
             </w:pPr>
             <w:r>
               <w:rPr>
@@ -4420,7 +4474,7 @@
           <w:p>
             <w:pPr>
               <w:keepNext/>
-              <w:spacing w:before="20" w:after="20" w:line="240" w:lineRule="auto"/>
+              <w:spacing w:before="20" w:after="20"/>
             </w:pPr>
             <w:r>
               <w:rPr>
@@ -4437,7 +4491,7 @@
           <w:p>
             <w:pPr>
               <w:keepNext/>
-              <w:spacing w:before="20" w:after="20" w:line="240" w:lineRule="auto"/>
+              <w:spacing w:before="20" w:after="20"/>
             </w:pPr>
             <w:r>
               <w:rPr>
@@ -4460,7 +4514,7 @@
           <w:p>
             <w:pPr>
               <w:keepNext/>
-              <w:spacing w:before="20" w:after="20" w:line="240" w:lineRule="auto"/>
+              <w:spacing w:before="20" w:after="20"/>
             </w:pPr>
             <w:r>
               <w:rPr>
@@ -4477,7 +4531,7 @@
           <w:p>
             <w:pPr>
               <w:keepNext/>
-              <w:spacing w:before="20" w:after="20" w:line="240" w:lineRule="auto"/>
+              <w:spacing w:before="20" w:after="20"/>
             </w:pPr>
             <w:r>
               <w:rPr>
@@ -4494,7 +4548,7 @@
           <w:p>
             <w:pPr>
               <w:keepNext/>
-              <w:spacing w:before="20" w:after="20" w:line="240" w:lineRule="auto"/>
+              <w:spacing w:before="20" w:after="20"/>
             </w:pPr>
             <w:r>
               <w:rPr>
@@ -4511,7 +4565,7 @@
           <w:p>
             <w:pPr>
               <w:keepNext/>
-              <w:spacing w:before="20" w:after="20" w:line="240" w:lineRule="auto"/>
+              <w:spacing w:before="20" w:after="20"/>
             </w:pPr>
             <w:r>
               <w:rPr>
@@ -4528,7 +4582,7 @@
           <w:p>
             <w:pPr>
               <w:keepNext/>
-              <w:spacing w:before="20" w:after="20" w:line="240" w:lineRule="auto"/>
+              <w:spacing w:before="20" w:after="20"/>
             </w:pPr>
             <w:r>
               <w:rPr>
@@ -4551,7 +4605,7 @@
           <w:p>
             <w:pPr>
               <w:keepNext/>
-              <w:spacing w:before="20" w:after="20" w:line="240" w:lineRule="auto"/>
+              <w:spacing w:before="20" w:after="20"/>
             </w:pPr>
             <w:r>
               <w:rPr>
@@ -4568,7 +4622,7 @@
           <w:p>
             <w:pPr>
               <w:keepNext/>
-              <w:spacing w:before="20" w:after="20" w:line="240" w:lineRule="auto"/>
+              <w:spacing w:before="20" w:after="20"/>
             </w:pPr>
             <w:r>
               <w:rPr>
@@ -4585,7 +4639,7 @@
           <w:p>
             <w:pPr>
               <w:keepNext/>
-              <w:spacing w:before="20" w:after="20" w:line="240" w:lineRule="auto"/>
+              <w:spacing w:before="20" w:after="20"/>
             </w:pPr>
             <w:r>
               <w:rPr>
@@ -4602,7 +4656,7 @@
           <w:p>
             <w:pPr>
               <w:keepNext/>
-              <w:spacing w:before="20" w:after="20" w:line="240" w:lineRule="auto"/>
+              <w:spacing w:before="20" w:after="20"/>
             </w:pPr>
             <w:r>
               <w:rPr>
@@ -4619,7 +4673,7 @@
           <w:p>
             <w:pPr>
               <w:keepNext/>
-              <w:spacing w:before="20" w:after="20" w:line="240" w:lineRule="auto"/>
+              <w:spacing w:before="20" w:after="20"/>
             </w:pPr>
             <w:r>
               <w:rPr>
@@ -4642,7 +4696,7 @@
           <w:p>
             <w:pPr>
               <w:keepNext/>
-              <w:spacing w:before="20" w:after="20" w:line="240" w:lineRule="auto"/>
+              <w:spacing w:before="20" w:after="20"/>
             </w:pPr>
             <w:r>
               <w:rPr>
@@ -4659,7 +4713,7 @@
           <w:p>
             <w:pPr>
               <w:keepNext/>
-              <w:spacing w:before="20" w:after="20" w:line="240" w:lineRule="auto"/>
+              <w:spacing w:before="20" w:after="20"/>
             </w:pPr>
             <w:r>
               <w:rPr>
@@ -4676,7 +4730,7 @@
           <w:p>
             <w:pPr>
               <w:keepNext/>
-              <w:spacing w:before="20" w:after="20" w:line="240" w:lineRule="auto"/>
+              <w:spacing w:before="20" w:after="20"/>
             </w:pPr>
             <w:r>
               <w:rPr>
@@ -4693,7 +4747,7 @@
           <w:p>
             <w:pPr>
               <w:keepNext/>
-              <w:spacing w:before="20" w:after="20" w:line="240" w:lineRule="auto"/>
+              <w:spacing w:before="20" w:after="20"/>
             </w:pPr>
             <w:r>
               <w:rPr>
@@ -4710,7 +4764,7 @@
           <w:p>
             <w:pPr>
               <w:keepNext/>
-              <w:spacing w:before="20" w:after="20" w:line="240" w:lineRule="auto"/>
+              <w:spacing w:before="20" w:after="20"/>
             </w:pPr>
             <w:r>
               <w:rPr>
@@ -4733,7 +4787,7 @@
           <w:p>
             <w:pPr>
               <w:keepNext/>
-              <w:spacing w:before="20" w:after="20" w:line="240" w:lineRule="auto"/>
+              <w:spacing w:before="20" w:after="20"/>
             </w:pPr>
             <w:r>
               <w:rPr>
@@ -4750,7 +4804,7 @@
           <w:p>
             <w:pPr>
               <w:keepNext/>
-              <w:spacing w:before="20" w:after="20" w:line="240" w:lineRule="auto"/>
+              <w:spacing w:before="20" w:after="20"/>
             </w:pPr>
             <w:r>
               <w:rPr>
@@ -4767,7 +4821,7 @@
           <w:p>
             <w:pPr>
               <w:keepNext/>
-              <w:spacing w:before="20" w:after="20" w:line="240" w:lineRule="auto"/>
+              <w:spacing w:before="20" w:after="20"/>
             </w:pPr>
             <w:r>
               <w:rPr>
@@ -4784,7 +4838,7 @@
           <w:p>
             <w:pPr>
               <w:keepNext/>
-              <w:spacing w:before="20" w:after="20" w:line="240" w:lineRule="auto"/>
+              <w:spacing w:before="20" w:after="20"/>
             </w:pPr>
             <w:r>
               <w:rPr>
@@ -4801,7 +4855,7 @@
           <w:p>
             <w:pPr>
               <w:keepNext/>
-              <w:spacing w:before="20" w:after="20" w:line="240" w:lineRule="auto"/>
+              <w:spacing w:before="20" w:after="20"/>
             </w:pPr>
             <w:r>
               <w:rPr>
@@ -4824,7 +4878,7 @@
           <w:p>
             <w:pPr>
               <w:keepNext/>
-              <w:spacing w:before="20" w:after="20" w:line="240" w:lineRule="auto"/>
+              <w:spacing w:before="20" w:after="20"/>
             </w:pPr>
             <w:r>
               <w:rPr>
@@ -4841,7 +4895,7 @@
           <w:p>
             <w:pPr>
               <w:keepNext/>
-              <w:spacing w:before="20" w:after="20" w:line="240" w:lineRule="auto"/>
+              <w:spacing w:before="20" w:after="20"/>
             </w:pPr>
             <w:r>
               <w:rPr>
@@ -4858,7 +4912,7 @@
           <w:p>
             <w:pPr>
               <w:keepNext/>
-              <w:spacing w:before="20" w:after="20" w:line="240" w:lineRule="auto"/>
+              <w:spacing w:before="20" w:after="20"/>
             </w:pPr>
             <w:r>
               <w:rPr>
@@ -4875,7 +4929,7 @@
           <w:p>
             <w:pPr>
               <w:keepNext/>
-              <w:spacing w:before="20" w:after="20" w:line="240" w:lineRule="auto"/>
+              <w:spacing w:before="20" w:after="20"/>
             </w:pPr>
             <w:r>
               <w:rPr>
@@ -4892,7 +4946,7 @@
           <w:p>
             <w:pPr>
               <w:keepNext/>
-              <w:spacing w:before="20" w:after="20" w:line="240" w:lineRule="auto"/>
+              <w:spacing w:before="20" w:after="20"/>
             </w:pPr>
             <w:r>
               <w:rPr>
@@ -4915,7 +4969,7 @@
           <w:p>
             <w:pPr>
               <w:keepNext/>
-              <w:spacing w:before="20" w:after="20" w:line="240" w:lineRule="auto"/>
+              <w:spacing w:before="20" w:after="20"/>
             </w:pPr>
             <w:r>
               <w:rPr>
@@ -4932,7 +4986,7 @@
           <w:p>
             <w:pPr>
               <w:keepNext/>
-              <w:spacing w:before="20" w:after="20" w:line="240" w:lineRule="auto"/>
+              <w:spacing w:before="20" w:after="20"/>
             </w:pPr>
             <w:r>
               <w:rPr>
@@ -4949,7 +5003,7 @@
           <w:p>
             <w:pPr>
               <w:keepNext/>
-              <w:spacing w:before="20" w:after="20" w:line="240" w:lineRule="auto"/>
+              <w:spacing w:before="20" w:after="20"/>
             </w:pPr>
             <w:r>
               <w:rPr>
@@ -4966,7 +5020,7 @@
           <w:p>
             <w:pPr>
               <w:keepNext/>
-              <w:spacing w:before="20" w:after="20" w:line="240" w:lineRule="auto"/>
+              <w:spacing w:before="20" w:after="20"/>
             </w:pPr>
             <w:r>
               <w:rPr>
@@ -4983,7 +5037,7 @@
           <w:p>
             <w:pPr>
               <w:keepNext/>
-              <w:spacing w:before="20" w:after="20" w:line="240" w:lineRule="auto"/>
+              <w:spacing w:before="20" w:after="20"/>
             </w:pPr>
             <w:r>
               <w:rPr>
@@ -5006,7 +5060,7 @@
           <w:p>
             <w:pPr>
               <w:keepNext/>
-              <w:spacing w:before="20" w:after="20" w:line="240" w:lineRule="auto"/>
+              <w:spacing w:before="20" w:after="20"/>
             </w:pPr>
             <w:r>
               <w:rPr>
@@ -5023,7 +5077,7 @@
           <w:p>
             <w:pPr>
               <w:keepNext/>
-              <w:spacing w:before="20" w:after="20" w:line="240" w:lineRule="auto"/>
+              <w:spacing w:before="20" w:after="20"/>
             </w:pPr>
             <w:r>
               <w:rPr>
@@ -5040,7 +5094,7 @@
           <w:p>
             <w:pPr>
               <w:keepNext/>
-              <w:spacing w:before="20" w:after="20" w:line="240" w:lineRule="auto"/>
+              <w:spacing w:before="20" w:after="20"/>
             </w:pPr>
             <w:r>
               <w:rPr>
@@ -5057,7 +5111,7 @@
           <w:p>
             <w:pPr>
               <w:keepNext/>
-              <w:spacing w:before="20" w:after="20" w:line="240" w:lineRule="auto"/>
+              <w:spacing w:before="20" w:after="20"/>
             </w:pPr>
             <w:r>
               <w:rPr>
@@ -5074,7 +5128,7 @@
           <w:p>
             <w:pPr>
               <w:keepNext/>
-              <w:spacing w:before="20" w:after="20" w:line="240" w:lineRule="auto"/>
+              <w:spacing w:before="20" w:after="20"/>
             </w:pPr>
             <w:r>
               <w:rPr>
@@ -5097,7 +5151,7 @@
           <w:p>
             <w:pPr>
               <w:keepNext/>
-              <w:spacing w:before="20" w:after="20" w:line="240" w:lineRule="auto"/>
+              <w:spacing w:before="20" w:after="20"/>
             </w:pPr>
             <w:r>
               <w:rPr>
@@ -5114,7 +5168,7 @@
           <w:p>
             <w:pPr>
               <w:keepNext/>
-              <w:spacing w:before="20" w:after="20" w:line="240" w:lineRule="auto"/>
+              <w:spacing w:before="20" w:after="20"/>
             </w:pPr>
             <w:r>
               <w:rPr>
@@ -5131,7 +5185,7 @@
           <w:p>
             <w:pPr>
               <w:keepNext/>
-              <w:spacing w:before="20" w:after="20" w:line="240" w:lineRule="auto"/>
+              <w:spacing w:before="20" w:after="20"/>
             </w:pPr>
             <w:r>
               <w:rPr>
@@ -5148,7 +5202,7 @@
           <w:p>
             <w:pPr>
               <w:keepNext/>
-              <w:spacing w:before="20" w:after="20" w:line="240" w:lineRule="auto"/>
+              <w:spacing w:before="20" w:after="20"/>
             </w:pPr>
             <w:r>
               <w:rPr>
@@ -5165,7 +5219,7 @@
           <w:p>
             <w:pPr>
               <w:keepNext/>
-              <w:spacing w:before="20" w:after="20" w:line="240" w:lineRule="auto"/>
+              <w:spacing w:before="20" w:after="20"/>
             </w:pPr>
             <w:r>
               <w:rPr>
@@ -5188,7 +5242,7 @@
           <w:p>
             <w:pPr>
               <w:keepNext/>
-              <w:spacing w:before="20" w:after="20" w:line="240" w:lineRule="auto"/>
+              <w:spacing w:before="20" w:after="20"/>
             </w:pPr>
             <w:r>
               <w:rPr>
@@ -5205,7 +5259,7 @@
           <w:p>
             <w:pPr>
               <w:keepNext/>
-              <w:spacing w:before="20" w:after="20" w:line="240" w:lineRule="auto"/>
+              <w:spacing w:before="20" w:after="20"/>
             </w:pPr>
             <w:r>
               <w:rPr>
@@ -5222,7 +5276,7 @@
           <w:p>
             <w:pPr>
               <w:keepNext/>
-              <w:spacing w:before="20" w:after="20" w:line="240" w:lineRule="auto"/>
+              <w:spacing w:before="20" w:after="20"/>
             </w:pPr>
             <w:r>
               <w:rPr>
@@ -5239,7 +5293,7 @@
           <w:p>
             <w:pPr>
               <w:keepNext/>
-              <w:spacing w:before="20" w:after="20" w:line="240" w:lineRule="auto"/>
+              <w:spacing w:before="20" w:after="20"/>
             </w:pPr>
             <w:r>
               <w:rPr>
@@ -5256,7 +5310,7 @@
           <w:p>
             <w:pPr>
               <w:keepNext/>
-              <w:spacing w:before="20" w:after="20" w:line="240" w:lineRule="auto"/>
+              <w:spacing w:before="20" w:after="20"/>
             </w:pPr>
             <w:r>
               <w:rPr>
@@ -5279,7 +5333,7 @@
           <w:p>
             <w:pPr>
               <w:keepNext/>
-              <w:spacing w:before="20" w:after="20" w:line="240" w:lineRule="auto"/>
+              <w:spacing w:before="20" w:after="20"/>
             </w:pPr>
             <w:r>
               <w:rPr>
@@ -5296,7 +5350,7 @@
           <w:p>
             <w:pPr>
               <w:keepNext/>
-              <w:spacing w:before="20" w:after="20" w:line="240" w:lineRule="auto"/>
+              <w:spacing w:before="20" w:after="20"/>
             </w:pPr>
             <w:r>
               <w:rPr>
@@ -5313,7 +5367,7 @@
           <w:p>
             <w:pPr>
               <w:keepNext/>
-              <w:spacing w:before="20" w:after="20" w:line="240" w:lineRule="auto"/>
+              <w:spacing w:before="20" w:after="20"/>
             </w:pPr>
             <w:r>
               <w:rPr>
@@ -5330,7 +5384,7 @@
           <w:p>
             <w:pPr>
               <w:keepNext/>
-              <w:spacing w:before="20" w:after="20" w:line="240" w:lineRule="auto"/>
+              <w:spacing w:before="20" w:after="20"/>
             </w:pPr>
             <w:r>
               <w:rPr>
@@ -5347,7 +5401,7 @@
           <w:p>
             <w:pPr>
               <w:keepNext/>
-              <w:spacing w:before="20" w:after="20" w:line="240" w:lineRule="auto"/>
+              <w:spacing w:before="20" w:after="20"/>
             </w:pPr>
             <w:r>
               <w:rPr>
@@ -5370,7 +5424,7 @@
           <w:p>
             <w:pPr>
               <w:keepNext/>
-              <w:spacing w:before="20" w:after="20" w:line="240" w:lineRule="auto"/>
+              <w:spacing w:before="20" w:after="20"/>
             </w:pPr>
             <w:r>
               <w:rPr>
@@ -5387,7 +5441,7 @@
           <w:p>
             <w:pPr>
               <w:keepNext/>
-              <w:spacing w:before="20" w:after="20" w:line="240" w:lineRule="auto"/>
+              <w:spacing w:before="20" w:after="20"/>
             </w:pPr>
             <w:r>
               <w:rPr>
@@ -5404,7 +5458,7 @@
           <w:p>
             <w:pPr>
               <w:keepNext/>
-              <w:spacing w:before="20" w:after="20" w:line="240" w:lineRule="auto"/>
+              <w:spacing w:before="20" w:after="20"/>
             </w:pPr>
             <w:r>
               <w:rPr>
@@ -5421,7 +5475,7 @@
           <w:p>
             <w:pPr>
               <w:keepNext/>
-              <w:spacing w:before="20" w:after="20" w:line="240" w:lineRule="auto"/>
+              <w:spacing w:before="20" w:after="20"/>
             </w:pPr>
             <w:r>
               <w:rPr>
@@ -5438,7 +5492,7 @@
           <w:p>
             <w:pPr>
               <w:keepNext/>
-              <w:spacing w:before="20" w:after="20" w:line="240" w:lineRule="auto"/>
+              <w:spacing w:before="20" w:after="20"/>
             </w:pPr>
             <w:r>
               <w:rPr>
@@ -5461,7 +5515,7 @@
           <w:p>
             <w:pPr>
               <w:keepNext/>
-              <w:spacing w:before="20" w:after="20" w:line="240" w:lineRule="auto"/>
+              <w:spacing w:before="20" w:after="20"/>
             </w:pPr>
             <w:r>
               <w:rPr>
@@ -5478,7 +5532,7 @@
           <w:p>
             <w:pPr>
               <w:keepNext/>
-              <w:spacing w:before="20" w:after="20" w:line="240" w:lineRule="auto"/>
+              <w:spacing w:before="20" w:after="20"/>
             </w:pPr>
             <w:r>
               <w:rPr>
@@ -5495,7 +5549,7 @@
           <w:p>
             <w:pPr>
               <w:keepNext/>
-              <w:spacing w:before="20" w:after="20" w:line="240" w:lineRule="auto"/>
+              <w:spacing w:before="20" w:after="20"/>
             </w:pPr>
             <w:r>
               <w:rPr>
@@ -5512,7 +5566,7 @@
           <w:p>
             <w:pPr>
               <w:keepNext/>
-              <w:spacing w:before="20" w:after="20" w:line="240" w:lineRule="auto"/>
+              <w:spacing w:before="20" w:after="20"/>
             </w:pPr>
             <w:r>
               <w:rPr>
@@ -5529,7 +5583,7 @@
           <w:p>
             <w:pPr>
               <w:keepNext/>
-              <w:spacing w:before="20" w:after="20" w:line="240" w:lineRule="auto"/>
+              <w:spacing w:before="20" w:after="20"/>
             </w:pPr>
             <w:r>
               <w:rPr>
@@ -5552,7 +5606,7 @@
           <w:p>
             <w:pPr>
               <w:keepNext/>
-              <w:spacing w:before="20" w:after="20" w:line="240" w:lineRule="auto"/>
+              <w:spacing w:before="20" w:after="20"/>
             </w:pPr>
             <w:r>
               <w:rPr>
@@ -5569,7 +5623,7 @@
           <w:p>
             <w:pPr>
               <w:keepNext/>
-              <w:spacing w:before="20" w:after="20" w:line="240" w:lineRule="auto"/>
+              <w:spacing w:before="20" w:after="20"/>
             </w:pPr>
             <w:r>
               <w:rPr>
@@ -5586,7 +5640,7 @@
           <w:p>
             <w:pPr>
               <w:keepNext/>
-              <w:spacing w:before="20" w:after="20" w:line="240" w:lineRule="auto"/>
+              <w:spacing w:before="20" w:after="20"/>
             </w:pPr>
             <w:r>
               <w:rPr>
@@ -5603,7 +5657,7 @@
           <w:p>
             <w:pPr>
               <w:keepNext/>
-              <w:spacing w:before="20" w:after="20" w:line="240" w:lineRule="auto"/>
+              <w:spacing w:before="20" w:after="20"/>
             </w:pPr>
             <w:r>
               <w:rPr>
@@ -5620,7 +5674,7 @@
           <w:p>
             <w:pPr>
               <w:keepNext/>
-              <w:spacing w:before="20" w:after="20" w:line="240" w:lineRule="auto"/>
+              <w:spacing w:before="20" w:after="20"/>
             </w:pPr>
             <w:r>
               <w:rPr>
@@ -5643,7 +5697,7 @@
           <w:p>
             <w:pPr>
               <w:keepNext/>
-              <w:spacing w:before="20" w:after="20" w:line="240" w:lineRule="auto"/>
+              <w:spacing w:before="20" w:after="20"/>
             </w:pPr>
             <w:r>
               <w:rPr>
@@ -5660,7 +5714,7 @@
           <w:p>
             <w:pPr>
               <w:keepNext/>
-              <w:spacing w:before="20" w:after="20" w:line="240" w:lineRule="auto"/>
+              <w:spacing w:before="20" w:after="20"/>
             </w:pPr>
             <w:r>
               <w:rPr>
@@ -5677,7 +5731,7 @@
           <w:p>
             <w:pPr>
               <w:keepNext/>
-              <w:spacing w:before="20" w:after="20" w:line="240" w:lineRule="auto"/>
+              <w:spacing w:before="20" w:after="20"/>
             </w:pPr>
             <w:r>
               <w:rPr>
@@ -5694,7 +5748,7 @@
           <w:p>
             <w:pPr>
               <w:keepNext/>
-              <w:spacing w:before="20" w:after="20" w:line="240" w:lineRule="auto"/>
+              <w:spacing w:before="20" w:after="20"/>
             </w:pPr>
             <w:r>
               <w:rPr>
@@ -5711,7 +5765,7 @@
           <w:p>
             <w:pPr>
               <w:keepNext/>
-              <w:spacing w:before="20" w:after="20" w:line="240" w:lineRule="auto"/>
+              <w:spacing w:before="20" w:after="20"/>
             </w:pPr>
             <w:r>
               <w:rPr>
@@ -5734,7 +5788,7 @@
           <w:p>
             <w:pPr>
               <w:keepNext/>
-              <w:spacing w:before="20" w:after="20" w:line="240" w:lineRule="auto"/>
+              <w:spacing w:before="20" w:after="20"/>
             </w:pPr>
             <w:r>
               <w:rPr>
@@ -5751,7 +5805,7 @@
           <w:p>
             <w:pPr>
               <w:keepNext/>
-              <w:spacing w:before="20" w:after="20" w:line="240" w:lineRule="auto"/>
+              <w:spacing w:before="20" w:after="20"/>
             </w:pPr>
             <w:r>
               <w:rPr>
@@ -5768,7 +5822,7 @@
           <w:p>
             <w:pPr>
               <w:keepNext/>
-              <w:spacing w:before="20" w:after="20" w:line="240" w:lineRule="auto"/>
+              <w:spacing w:before="20" w:after="20"/>
             </w:pPr>
             <w:r>
               <w:rPr>
@@ -5785,7 +5839,7 @@
           <w:p>
             <w:pPr>
               <w:keepNext/>
-              <w:spacing w:before="20" w:after="20" w:line="240" w:lineRule="auto"/>
+              <w:spacing w:before="20" w:after="20"/>
             </w:pPr>
             <w:r>
               <w:rPr>
@@ -5802,7 +5856,7 @@
           <w:p>
             <w:pPr>
               <w:keepNext/>
-              <w:spacing w:before="20" w:after="20" w:line="240" w:lineRule="auto"/>
+              <w:spacing w:before="20" w:after="20"/>
             </w:pPr>
             <w:r>
               <w:rPr>
@@ -5825,7 +5879,7 @@
           <w:p>
             <w:pPr>
               <w:keepNext/>
-              <w:spacing w:before="20" w:after="20" w:line="240" w:lineRule="auto"/>
+              <w:spacing w:before="20" w:after="20"/>
             </w:pPr>
             <w:r>
               <w:rPr>
@@ -5842,7 +5896,7 @@
           <w:p>
             <w:pPr>
               <w:keepNext/>
-              <w:spacing w:before="20" w:after="20" w:line="240" w:lineRule="auto"/>
+              <w:spacing w:before="20" w:after="20"/>
             </w:pPr>
             <w:r>
               <w:rPr>
@@ -5859,7 +5913,7 @@
           <w:p>
             <w:pPr>
               <w:keepNext/>
-              <w:spacing w:before="20" w:after="20" w:line="240" w:lineRule="auto"/>
+              <w:spacing w:before="20" w:after="20"/>
             </w:pPr>
             <w:r>
               <w:rPr>
@@ -5876,7 +5930,7 @@
           <w:p>
             <w:pPr>
               <w:keepNext/>
-              <w:spacing w:before="20" w:after="20" w:line="240" w:lineRule="auto"/>
+              <w:spacing w:before="20" w:after="20"/>
             </w:pPr>
             <w:r>
               <w:rPr>
@@ -5893,7 +5947,7 @@
           <w:p>
             <w:pPr>
               <w:keepNext/>
-              <w:spacing w:before="20" w:after="20" w:line="240" w:lineRule="auto"/>
+              <w:spacing w:before="20" w:after="20"/>
             </w:pPr>
             <w:r>
               <w:rPr>
@@ -5915,7 +5969,7 @@
           </w:tcPr>
           <w:p>
             <w:pPr>
-              <w:spacing w:before="20" w:after="20" w:line="240" w:lineRule="auto"/>
+              <w:spacing w:before="20" w:after="20"/>
             </w:pPr>
             <w:r>
               <w:rPr>
@@ -5931,7 +5985,7 @@
           </w:tcPr>
           <w:p>
             <w:pPr>
-              <w:spacing w:before="20" w:after="20" w:line="240" w:lineRule="auto"/>
+              <w:spacing w:before="20" w:after="20"/>
             </w:pPr>
             <w:r>
               <w:rPr>
@@ -5947,7 +6001,7 @@
           </w:tcPr>
           <w:p>
             <w:pPr>
-              <w:spacing w:before="20" w:after="20" w:line="240" w:lineRule="auto"/>
+              <w:spacing w:before="20" w:after="20"/>
             </w:pPr>
             <w:r>
               <w:rPr>
@@ -5963,7 +6017,7 @@
           </w:tcPr>
           <w:p>
             <w:pPr>
-              <w:spacing w:before="20" w:after="20" w:line="240" w:lineRule="auto"/>
+              <w:spacing w:before="20" w:after="20"/>
             </w:pPr>
             <w:r>
               <w:rPr>
@@ -5979,7 +6033,7 @@
           </w:tcPr>
           <w:p>
             <w:pPr>
-              <w:spacing w:before="20" w:after="20" w:line="240" w:lineRule="auto"/>
+              <w:spacing w:before="20" w:after="20"/>
             </w:pPr>
             <w:r>
               <w:rPr>
@@ -5997,7 +6051,13 @@
         <w:jc w:val="both"/>
       </w:pPr>
       <w:r>
-        <w:t>Table 2 and Figure 2 summarise the results. Every condition trained and tested on ISOT is far above chance, including those that never see an article's content. Results are stable across random splits: no standard deviation exceeds 0.5%, so differences of a few points between conditions are not split noise. The only conditions near or below chance are the cross-corpus tests.</w:t>
+        <w:t xml:space="preserve">Table 2 and Figure 2 </w:t>
+      </w:r>
+      <w:r>
+        <w:t>summarize</w:t>
+      </w:r>
+      <w:r>
+        <w:t xml:space="preserve"> the results. Every condition trained and tested on ISOT is far above chance, including those that never see an article's content. Results are stable across random splits: no standard deviation exceeds 0.5%, so differences of a few points between conditions are not split noise. The only conditions near or below chance are the cross-corpus tests.</w:t>
       </w:r>
     </w:p>
     <w:p>
@@ -6122,7 +6182,13 @@
         <w:t>Metadata.</w:t>
       </w:r>
       <w:r>
-        <w:t xml:space="preserve"> Eight numbers per article give 86.2% accuracy. The most important features are the number of question marks (importance 0.19), average word length (0.18), the proportion of capitalised words (0.13) and the number of exclamation marks (0.12). Fake articles contain </w:t>
+        <w:t xml:space="preserve"> Eight numbers per article give 86.2% accuracy. The most important features are the number of question marks (importance 0.19), average word length (0.18), the proportion of </w:t>
+      </w:r>
+      <w:r>
+        <w:t>capitalized</w:t>
+      </w:r>
+      <w:r>
+        <w:t xml:space="preserve"> words (0.13) and the number of exclamation marks (0.12). Fake articles contain </w:t>
       </w:r>
       <w:r>
         <w:lastRenderedPageBreak/>
@@ -6140,10 +6206,7 @@
         <w:t>Sentiment and named entities.</w:t>
       </w:r>
       <w:r>
-        <w:t xml:space="preserve"> Run on the stripped text, eight sentiment scores give 73.8% and entity-type counts give 81.1%. Fake articles are more negative: the average compound score of their titles is −0.17 against −0.07 for real titles, and of their bodies −0.08 against +0.06. Real articles mention almost three times as many places per 100 words (2.97 against 1.06) and more dates (1.85 against 1.08), which matches wire copy's habit of locating and dating every event; fake articles mention more people (3.08 against 2.46). Neither pr</w:t>
-      </w:r>
-      <w:r>
-        <w:t>obe sees a single word of the article, yet both are far above chance.</w:t>
+        <w:t xml:space="preserve"> Run on the stripped text, eight sentiment scores give 73.8% and entity-type counts give 81.1%. Fake articles are more negative: the average compound score of their titles is −0.17 against −0.07 for real titles, and of their bodies −0.08 against +0.06. Real articles mention almost three times as many places per 100 words (2.97 against 1.06) and more dates (1.85 against 1.08), which matches wire copy's habit of locating and dating every event; fake articles mention more people (3.08 against 2.46). Neither probe sees a single word of the article, yet both are far above chance.</w:t>
       </w:r>
     </w:p>
     <w:p>
@@ -6169,10 +6232,7 @@
         <w:jc w:val="both"/>
       </w:pPr>
       <w:r>
-        <w:t>Figure 3 shows the 15 strongest features of the E1 model for each class. The single strongest real feature is "reuters", followed closely by "said", the attribution verb of wire reporting. Other real features are a dateline city, weekday names and "told". On the fake side, seven of the 15 strongest features are page clutter rather than prose: "via", "video", "image", "featured", "read", "watch" and "com" come from image credits, embedded media and links. The phrase "Featured image via" alone appears in 46.8</w:t>
-      </w:r>
-      <w:r>
-        <w:t>% of fake articles and in no real article.</w:t>
+        <w:t>Figure 3 shows the 15 strongest features of the E1 model for each class. The single strongest real feature is "reuters", followed closely by "said", the attribution verb of wire reporting. Other real features are a dateline city, weekday names and "told". On the fake side, seven of the 15 strongest features are page clutter rather than prose: "via", "video", "image", "featured", "read", "watch" and "com" come from image credits, embedded media and links. The phrase "Featured image via" alone appears in 46.8% of fake articles and in no real article.</w:t>
       </w:r>
     </w:p>
     <w:p>
@@ -6274,7 +6334,7 @@
           <w:p>
             <w:pPr>
               <w:keepNext/>
-              <w:spacing w:before="20" w:after="20" w:line="240" w:lineRule="auto"/>
+              <w:spacing w:before="20" w:after="20"/>
             </w:pPr>
             <w:r>
               <w:rPr>
@@ -6293,7 +6353,7 @@
           <w:p>
             <w:pPr>
               <w:keepNext/>
-              <w:spacing w:before="20" w:after="20" w:line="240" w:lineRule="auto"/>
+              <w:spacing w:before="20" w:after="20"/>
             </w:pPr>
             <w:r>
               <w:rPr>
@@ -6312,7 +6372,7 @@
           <w:p>
             <w:pPr>
               <w:keepNext/>
-              <w:spacing w:before="20" w:after="20" w:line="240" w:lineRule="auto"/>
+              <w:spacing w:before="20" w:after="20"/>
             </w:pPr>
             <w:r>
               <w:rPr>
@@ -6331,7 +6391,7 @@
           <w:p>
             <w:pPr>
               <w:keepNext/>
-              <w:spacing w:before="20" w:after="20" w:line="240" w:lineRule="auto"/>
+              <w:spacing w:before="20" w:after="20"/>
             </w:pPr>
             <w:r>
               <w:rPr>
@@ -6350,7 +6410,7 @@
           <w:p>
             <w:pPr>
               <w:keepNext/>
-              <w:spacing w:before="20" w:after="20" w:line="240" w:lineRule="auto"/>
+              <w:spacing w:before="20" w:after="20"/>
             </w:pPr>
             <w:r>
               <w:rPr>
@@ -6374,7 +6434,7 @@
           <w:p>
             <w:pPr>
               <w:keepNext/>
-              <w:spacing w:before="20" w:after="20" w:line="240" w:lineRule="auto"/>
+              <w:spacing w:before="20" w:after="20"/>
             </w:pPr>
             <w:r>
               <w:rPr>
@@ -6391,7 +6451,7 @@
           <w:p>
             <w:pPr>
               <w:keepNext/>
-              <w:spacing w:before="20" w:after="20" w:line="240" w:lineRule="auto"/>
+              <w:spacing w:before="20" w:after="20"/>
             </w:pPr>
             <w:r>
               <w:rPr>
@@ -6408,7 +6468,7 @@
           <w:p>
             <w:pPr>
               <w:keepNext/>
-              <w:spacing w:before="20" w:after="20" w:line="240" w:lineRule="auto"/>
+              <w:spacing w:before="20" w:after="20"/>
             </w:pPr>
             <w:r>
               <w:rPr>
@@ -6425,7 +6485,7 @@
           <w:p>
             <w:pPr>
               <w:keepNext/>
-              <w:spacing w:before="20" w:after="20" w:line="240" w:lineRule="auto"/>
+              <w:spacing w:before="20" w:after="20"/>
             </w:pPr>
             <w:r>
               <w:rPr>
@@ -6442,7 +6502,7 @@
           <w:p>
             <w:pPr>
               <w:keepNext/>
-              <w:spacing w:before="20" w:after="20" w:line="240" w:lineRule="auto"/>
+              <w:spacing w:before="20" w:after="20"/>
             </w:pPr>
             <w:r>
               <w:rPr>
@@ -6465,7 +6525,7 @@
           <w:p>
             <w:pPr>
               <w:keepNext/>
-              <w:spacing w:before="20" w:after="20" w:line="240" w:lineRule="auto"/>
+              <w:spacing w:before="20" w:after="20"/>
             </w:pPr>
             <w:r>
               <w:rPr>
@@ -6482,7 +6542,7 @@
           <w:p>
             <w:pPr>
               <w:keepNext/>
-              <w:spacing w:before="20" w:after="20" w:line="240" w:lineRule="auto"/>
+              <w:spacing w:before="20" w:after="20"/>
             </w:pPr>
             <w:r>
               <w:rPr>
@@ -6499,7 +6559,7 @@
           <w:p>
             <w:pPr>
               <w:keepNext/>
-              <w:spacing w:before="20" w:after="20" w:line="240" w:lineRule="auto"/>
+              <w:spacing w:before="20" w:after="20"/>
             </w:pPr>
             <w:r>
               <w:rPr>
@@ -6516,7 +6576,7 @@
           <w:p>
             <w:pPr>
               <w:keepNext/>
-              <w:spacing w:before="20" w:after="20" w:line="240" w:lineRule="auto"/>
+              <w:spacing w:before="20" w:after="20"/>
             </w:pPr>
             <w:r>
               <w:rPr>
@@ -6533,7 +6593,7 @@
           <w:p>
             <w:pPr>
               <w:keepNext/>
-              <w:spacing w:before="20" w:after="20" w:line="240" w:lineRule="auto"/>
+              <w:spacing w:before="20" w:after="20"/>
             </w:pPr>
           </w:p>
         </w:tc>
@@ -6550,7 +6610,7 @@
           <w:p>
             <w:pPr>
               <w:keepNext/>
-              <w:spacing w:before="20" w:after="20" w:line="240" w:lineRule="auto"/>
+              <w:spacing w:before="20" w:after="20"/>
             </w:pPr>
             <w:r>
               <w:rPr>
@@ -6567,7 +6627,7 @@
           <w:p>
             <w:pPr>
               <w:keepNext/>
-              <w:spacing w:before="20" w:after="20" w:line="240" w:lineRule="auto"/>
+              <w:spacing w:before="20" w:after="20"/>
             </w:pPr>
             <w:r>
               <w:rPr>
@@ -6584,7 +6644,7 @@
           <w:p>
             <w:pPr>
               <w:keepNext/>
-              <w:spacing w:before="20" w:after="20" w:line="240" w:lineRule="auto"/>
+              <w:spacing w:before="20" w:after="20"/>
             </w:pPr>
             <w:r>
               <w:rPr>
@@ -6601,7 +6661,7 @@
           <w:p>
             <w:pPr>
               <w:keepNext/>
-              <w:spacing w:before="20" w:after="20" w:line="240" w:lineRule="auto"/>
+              <w:spacing w:before="20" w:after="20"/>
             </w:pPr>
             <w:r>
               <w:rPr>
@@ -6618,7 +6678,7 @@
           <w:p>
             <w:pPr>
               <w:keepNext/>
-              <w:spacing w:before="20" w:after="20" w:line="240" w:lineRule="auto"/>
+              <w:spacing w:before="20" w:after="20"/>
             </w:pPr>
           </w:p>
         </w:tc>
@@ -6635,7 +6695,7 @@
           <w:p>
             <w:pPr>
               <w:keepNext/>
-              <w:spacing w:before="20" w:after="20" w:line="240" w:lineRule="auto"/>
+              <w:spacing w:before="20" w:after="20"/>
             </w:pPr>
             <w:r>
               <w:rPr>
@@ -6652,7 +6712,7 @@
           <w:p>
             <w:pPr>
               <w:keepNext/>
-              <w:spacing w:before="20" w:after="20" w:line="240" w:lineRule="auto"/>
+              <w:spacing w:before="20" w:after="20"/>
             </w:pPr>
             <w:r>
               <w:rPr>
@@ -6669,7 +6729,7 @@
           <w:p>
             <w:pPr>
               <w:keepNext/>
-              <w:spacing w:before="20" w:after="20" w:line="240" w:lineRule="auto"/>
+              <w:spacing w:before="20" w:after="20"/>
             </w:pPr>
             <w:r>
               <w:rPr>
@@ -6686,7 +6746,7 @@
           <w:p>
             <w:pPr>
               <w:keepNext/>
-              <w:spacing w:before="20" w:after="20" w:line="240" w:lineRule="auto"/>
+              <w:spacing w:before="20" w:after="20"/>
             </w:pPr>
             <w:r>
               <w:rPr>
@@ -6703,7 +6763,7 @@
           <w:p>
             <w:pPr>
               <w:keepNext/>
-              <w:spacing w:before="20" w:after="20" w:line="240" w:lineRule="auto"/>
+              <w:spacing w:before="20" w:after="20"/>
             </w:pPr>
             <w:r>
               <w:rPr>
@@ -6726,7 +6786,7 @@
           <w:p>
             <w:pPr>
               <w:keepNext/>
-              <w:spacing w:before="20" w:after="20" w:line="240" w:lineRule="auto"/>
+              <w:spacing w:before="20" w:after="20"/>
             </w:pPr>
             <w:r>
               <w:rPr>
@@ -6743,7 +6803,7 @@
           <w:p>
             <w:pPr>
               <w:keepNext/>
-              <w:spacing w:before="20" w:after="20" w:line="240" w:lineRule="auto"/>
+              <w:spacing w:before="20" w:after="20"/>
             </w:pPr>
             <w:r>
               <w:rPr>
@@ -6760,7 +6820,7 @@
           <w:p>
             <w:pPr>
               <w:keepNext/>
-              <w:spacing w:before="20" w:after="20" w:line="240" w:lineRule="auto"/>
+              <w:spacing w:before="20" w:after="20"/>
             </w:pPr>
             <w:r>
               <w:rPr>
@@ -6777,7 +6837,7 @@
           <w:p>
             <w:pPr>
               <w:keepNext/>
-              <w:spacing w:before="20" w:after="20" w:line="240" w:lineRule="auto"/>
+              <w:spacing w:before="20" w:after="20"/>
             </w:pPr>
             <w:r>
               <w:rPr>
@@ -6794,7 +6854,7 @@
           <w:p>
             <w:pPr>
               <w:keepNext/>
-              <w:spacing w:before="20" w:after="20" w:line="240" w:lineRule="auto"/>
+              <w:spacing w:before="20" w:after="20"/>
             </w:pPr>
           </w:p>
         </w:tc>
@@ -6811,7 +6871,7 @@
           <w:p>
             <w:pPr>
               <w:keepNext/>
-              <w:spacing w:before="20" w:after="20" w:line="240" w:lineRule="auto"/>
+              <w:spacing w:before="20" w:after="20"/>
             </w:pPr>
             <w:r>
               <w:rPr>
@@ -6828,7 +6888,7 @@
           <w:p>
             <w:pPr>
               <w:keepNext/>
-              <w:spacing w:before="20" w:after="20" w:line="240" w:lineRule="auto"/>
+              <w:spacing w:before="20" w:after="20"/>
             </w:pPr>
             <w:r>
               <w:rPr>
@@ -6845,7 +6905,7 @@
           <w:p>
             <w:pPr>
               <w:keepNext/>
-              <w:spacing w:before="20" w:after="20" w:line="240" w:lineRule="auto"/>
+              <w:spacing w:before="20" w:after="20"/>
             </w:pPr>
             <w:r>
               <w:rPr>
@@ -6862,7 +6922,7 @@
           <w:p>
             <w:pPr>
               <w:keepNext/>
-              <w:spacing w:before="20" w:after="20" w:line="240" w:lineRule="auto"/>
+              <w:spacing w:before="20" w:after="20"/>
             </w:pPr>
             <w:r>
               <w:rPr>
@@ -6879,7 +6939,7 @@
           <w:p>
             <w:pPr>
               <w:keepNext/>
-              <w:spacing w:before="20" w:after="20" w:line="240" w:lineRule="auto"/>
+              <w:spacing w:before="20" w:after="20"/>
             </w:pPr>
           </w:p>
         </w:tc>
@@ -6896,7 +6956,7 @@
           <w:p>
             <w:pPr>
               <w:keepNext/>
-              <w:spacing w:before="20" w:after="20" w:line="240" w:lineRule="auto"/>
+              <w:spacing w:before="20" w:after="20"/>
             </w:pPr>
             <w:r>
               <w:rPr>
@@ -6913,7 +6973,7 @@
           <w:p>
             <w:pPr>
               <w:keepNext/>
-              <w:spacing w:before="20" w:after="20" w:line="240" w:lineRule="auto"/>
+              <w:spacing w:before="20" w:after="20"/>
             </w:pPr>
             <w:r>
               <w:rPr>
@@ -6930,7 +6990,7 @@
           <w:p>
             <w:pPr>
               <w:keepNext/>
-              <w:spacing w:before="20" w:after="20" w:line="240" w:lineRule="auto"/>
+              <w:spacing w:before="20" w:after="20"/>
             </w:pPr>
             <w:r>
               <w:rPr>
@@ -6947,7 +7007,7 @@
           <w:p>
             <w:pPr>
               <w:keepNext/>
-              <w:spacing w:before="20" w:after="20" w:line="240" w:lineRule="auto"/>
+              <w:spacing w:before="20" w:after="20"/>
             </w:pPr>
             <w:r>
               <w:rPr>
@@ -6964,7 +7024,7 @@
           <w:p>
             <w:pPr>
               <w:keepNext/>
-              <w:spacing w:before="20" w:after="20" w:line="240" w:lineRule="auto"/>
+              <w:spacing w:before="20" w:after="20"/>
             </w:pPr>
           </w:p>
         </w:tc>
@@ -6981,7 +7041,7 @@
           <w:p>
             <w:pPr>
               <w:keepNext/>
-              <w:spacing w:before="20" w:after="20" w:line="240" w:lineRule="auto"/>
+              <w:spacing w:before="20" w:after="20"/>
             </w:pPr>
             <w:r>
               <w:rPr>
@@ -6998,7 +7058,7 @@
           <w:p>
             <w:pPr>
               <w:keepNext/>
-              <w:spacing w:before="20" w:after="20" w:line="240" w:lineRule="auto"/>
+              <w:spacing w:before="20" w:after="20"/>
             </w:pPr>
             <w:r>
               <w:rPr>
@@ -7015,7 +7075,7 @@
           <w:p>
             <w:pPr>
               <w:keepNext/>
-              <w:spacing w:before="20" w:after="20" w:line="240" w:lineRule="auto"/>
+              <w:spacing w:before="20" w:after="20"/>
             </w:pPr>
             <w:r>
               <w:rPr>
@@ -7032,7 +7092,7 @@
           <w:p>
             <w:pPr>
               <w:keepNext/>
-              <w:spacing w:before="20" w:after="20" w:line="240" w:lineRule="auto"/>
+              <w:spacing w:before="20" w:after="20"/>
             </w:pPr>
             <w:r>
               <w:rPr>
@@ -7049,7 +7109,7 @@
           <w:p>
             <w:pPr>
               <w:keepNext/>
-              <w:spacing w:before="20" w:after="20" w:line="240" w:lineRule="auto"/>
+              <w:spacing w:before="20" w:after="20"/>
             </w:pPr>
           </w:p>
         </w:tc>
@@ -7066,7 +7126,7 @@
           <w:p>
             <w:pPr>
               <w:keepNext/>
-              <w:spacing w:before="20" w:after="20" w:line="240" w:lineRule="auto"/>
+              <w:spacing w:before="20" w:after="20"/>
             </w:pPr>
             <w:r>
               <w:rPr>
@@ -7083,7 +7143,7 @@
           <w:p>
             <w:pPr>
               <w:keepNext/>
-              <w:spacing w:before="20" w:after="20" w:line="240" w:lineRule="auto"/>
+              <w:spacing w:before="20" w:after="20"/>
             </w:pPr>
             <w:r>
               <w:rPr>
@@ -7100,7 +7160,7 @@
           <w:p>
             <w:pPr>
               <w:keepNext/>
-              <w:spacing w:before="20" w:after="20" w:line="240" w:lineRule="auto"/>
+              <w:spacing w:before="20" w:after="20"/>
             </w:pPr>
             <w:r>
               <w:rPr>
@@ -7117,7 +7177,7 @@
           <w:p>
             <w:pPr>
               <w:keepNext/>
-              <w:spacing w:before="20" w:after="20" w:line="240" w:lineRule="auto"/>
+              <w:spacing w:before="20" w:after="20"/>
             </w:pPr>
             <w:r>
               <w:rPr>
@@ -7134,7 +7194,7 @@
           <w:p>
             <w:pPr>
               <w:keepNext/>
-              <w:spacing w:before="20" w:after="20" w:line="240" w:lineRule="auto"/>
+              <w:spacing w:before="20" w:after="20"/>
             </w:pPr>
           </w:p>
         </w:tc>
@@ -7151,7 +7211,7 @@
           <w:p>
             <w:pPr>
               <w:keepNext/>
-              <w:spacing w:before="20" w:after="20" w:line="240" w:lineRule="auto"/>
+              <w:spacing w:before="20" w:after="20"/>
             </w:pPr>
             <w:r>
               <w:rPr>
@@ -7168,7 +7228,7 @@
           <w:p>
             <w:pPr>
               <w:keepNext/>
-              <w:spacing w:before="20" w:after="20" w:line="240" w:lineRule="auto"/>
+              <w:spacing w:before="20" w:after="20"/>
             </w:pPr>
             <w:r>
               <w:rPr>
@@ -7185,7 +7245,7 @@
           <w:p>
             <w:pPr>
               <w:keepNext/>
-              <w:spacing w:before="20" w:after="20" w:line="240" w:lineRule="auto"/>
+              <w:spacing w:before="20" w:after="20"/>
             </w:pPr>
             <w:r>
               <w:rPr>
@@ -7202,7 +7262,7 @@
           <w:p>
             <w:pPr>
               <w:keepNext/>
-              <w:spacing w:before="20" w:after="20" w:line="240" w:lineRule="auto"/>
+              <w:spacing w:before="20" w:after="20"/>
             </w:pPr>
             <w:r>
               <w:rPr>
@@ -7219,7 +7279,7 @@
           <w:p>
             <w:pPr>
               <w:keepNext/>
-              <w:spacing w:before="20" w:after="20" w:line="240" w:lineRule="auto"/>
+              <w:spacing w:before="20" w:after="20"/>
             </w:pPr>
           </w:p>
         </w:tc>
@@ -7236,7 +7296,7 @@
           <w:p>
             <w:pPr>
               <w:keepNext/>
-              <w:spacing w:before="20" w:after="20" w:line="240" w:lineRule="auto"/>
+              <w:spacing w:before="20" w:after="20"/>
             </w:pPr>
             <w:r>
               <w:rPr>
@@ -7253,7 +7313,7 @@
           <w:p>
             <w:pPr>
               <w:keepNext/>
-              <w:spacing w:before="20" w:after="20" w:line="240" w:lineRule="auto"/>
+              <w:spacing w:before="20" w:after="20"/>
             </w:pPr>
             <w:r>
               <w:rPr>
@@ -7270,7 +7330,7 @@
           <w:p>
             <w:pPr>
               <w:keepNext/>
-              <w:spacing w:before="20" w:after="20" w:line="240" w:lineRule="auto"/>
+              <w:spacing w:before="20" w:after="20"/>
             </w:pPr>
             <w:r>
               <w:rPr>
@@ -7287,7 +7347,7 @@
           <w:p>
             <w:pPr>
               <w:keepNext/>
-              <w:spacing w:before="20" w:after="20" w:line="240" w:lineRule="auto"/>
+              <w:spacing w:before="20" w:after="20"/>
             </w:pPr>
             <w:r>
               <w:rPr>
@@ -7304,7 +7364,7 @@
           <w:p>
             <w:pPr>
               <w:keepNext/>
-              <w:spacing w:before="20" w:after="20" w:line="240" w:lineRule="auto"/>
+              <w:spacing w:before="20" w:after="20"/>
             </w:pPr>
             <w:r>
               <w:rPr>
@@ -7327,7 +7387,7 @@
           <w:p>
             <w:pPr>
               <w:keepNext/>
-              <w:spacing w:before="20" w:after="20" w:line="240" w:lineRule="auto"/>
+              <w:spacing w:before="20" w:after="20"/>
             </w:pPr>
             <w:r>
               <w:rPr>
@@ -7344,7 +7404,7 @@
           <w:p>
             <w:pPr>
               <w:keepNext/>
-              <w:spacing w:before="20" w:after="20" w:line="240" w:lineRule="auto"/>
+              <w:spacing w:before="20" w:after="20"/>
             </w:pPr>
             <w:r>
               <w:rPr>
@@ -7361,7 +7421,7 @@
           <w:p>
             <w:pPr>
               <w:keepNext/>
-              <w:spacing w:before="20" w:after="20" w:line="240" w:lineRule="auto"/>
+              <w:spacing w:before="20" w:after="20"/>
             </w:pPr>
             <w:r>
               <w:rPr>
@@ -7378,7 +7438,7 @@
           <w:p>
             <w:pPr>
               <w:keepNext/>
-              <w:spacing w:before="20" w:after="20" w:line="240" w:lineRule="auto"/>
+              <w:spacing w:before="20" w:after="20"/>
             </w:pPr>
             <w:r>
               <w:rPr>
@@ -7395,7 +7455,7 @@
           <w:p>
             <w:pPr>
               <w:keepNext/>
-              <w:spacing w:before="20" w:after="20" w:line="240" w:lineRule="auto"/>
+              <w:spacing w:before="20" w:after="20"/>
             </w:pPr>
             <w:r>
               <w:rPr>
@@ -7418,7 +7478,7 @@
           <w:p>
             <w:pPr>
               <w:keepNext/>
-              <w:spacing w:before="20" w:after="20" w:line="240" w:lineRule="auto"/>
+              <w:spacing w:before="20" w:after="20"/>
             </w:pPr>
             <w:r>
               <w:rPr>
@@ -7435,7 +7495,7 @@
           <w:p>
             <w:pPr>
               <w:keepNext/>
-              <w:spacing w:before="20" w:after="20" w:line="240" w:lineRule="auto"/>
+              <w:spacing w:before="20" w:after="20"/>
             </w:pPr>
             <w:r>
               <w:rPr>
@@ -7452,7 +7512,7 @@
           <w:p>
             <w:pPr>
               <w:keepNext/>
-              <w:spacing w:before="20" w:after="20" w:line="240" w:lineRule="auto"/>
+              <w:spacing w:before="20" w:after="20"/>
             </w:pPr>
             <w:r>
               <w:rPr>
@@ -7469,7 +7529,7 @@
           <w:p>
             <w:pPr>
               <w:keepNext/>
-              <w:spacing w:before="20" w:after="20" w:line="240" w:lineRule="auto"/>
+              <w:spacing w:before="20" w:after="20"/>
             </w:pPr>
             <w:r>
               <w:rPr>
@@ -7486,7 +7546,7 @@
           <w:p>
             <w:pPr>
               <w:keepNext/>
-              <w:spacing w:before="20" w:after="20" w:line="240" w:lineRule="auto"/>
+              <w:spacing w:before="20" w:after="20"/>
             </w:pPr>
           </w:p>
         </w:tc>
@@ -7503,7 +7563,7 @@
           <w:p>
             <w:pPr>
               <w:keepNext/>
-              <w:spacing w:before="20" w:after="20" w:line="240" w:lineRule="auto"/>
+              <w:spacing w:before="20" w:after="20"/>
             </w:pPr>
             <w:r>
               <w:rPr>
@@ -7520,7 +7580,7 @@
           <w:p>
             <w:pPr>
               <w:keepNext/>
-              <w:spacing w:before="20" w:after="20" w:line="240" w:lineRule="auto"/>
+              <w:spacing w:before="20" w:after="20"/>
             </w:pPr>
             <w:r>
               <w:rPr>
@@ -7537,7 +7597,7 @@
           <w:p>
             <w:pPr>
               <w:keepNext/>
-              <w:spacing w:before="20" w:after="20" w:line="240" w:lineRule="auto"/>
+              <w:spacing w:before="20" w:after="20"/>
             </w:pPr>
             <w:r>
               <w:rPr>
@@ -7554,7 +7614,7 @@
           <w:p>
             <w:pPr>
               <w:keepNext/>
-              <w:spacing w:before="20" w:after="20" w:line="240" w:lineRule="auto"/>
+              <w:spacing w:before="20" w:after="20"/>
             </w:pPr>
             <w:r>
               <w:rPr>
@@ -7571,7 +7631,7 @@
           <w:p>
             <w:pPr>
               <w:keepNext/>
-              <w:spacing w:before="20" w:after="20" w:line="240" w:lineRule="auto"/>
+              <w:spacing w:before="20" w:after="20"/>
             </w:pPr>
           </w:p>
         </w:tc>
@@ -7588,7 +7648,7 @@
           <w:p>
             <w:pPr>
               <w:keepNext/>
-              <w:spacing w:before="20" w:after="20" w:line="240" w:lineRule="auto"/>
+              <w:spacing w:before="20" w:after="20"/>
             </w:pPr>
             <w:r>
               <w:rPr>
@@ -7605,7 +7665,7 @@
           <w:p>
             <w:pPr>
               <w:keepNext/>
-              <w:spacing w:before="20" w:after="20" w:line="240" w:lineRule="auto"/>
+              <w:spacing w:before="20" w:after="20"/>
             </w:pPr>
             <w:r>
               <w:rPr>
@@ -7622,7 +7682,7 @@
           <w:p>
             <w:pPr>
               <w:keepNext/>
-              <w:spacing w:before="20" w:after="20" w:line="240" w:lineRule="auto"/>
+              <w:spacing w:before="20" w:after="20"/>
             </w:pPr>
             <w:r>
               <w:rPr>
@@ -7639,7 +7699,7 @@
           <w:p>
             <w:pPr>
               <w:keepNext/>
-              <w:spacing w:before="20" w:after="20" w:line="240" w:lineRule="auto"/>
+              <w:spacing w:before="20" w:after="20"/>
             </w:pPr>
             <w:r>
               <w:rPr>
@@ -7656,7 +7716,7 @@
           <w:p>
             <w:pPr>
               <w:keepNext/>
-              <w:spacing w:before="20" w:after="20" w:line="240" w:lineRule="auto"/>
+              <w:spacing w:before="20" w:after="20"/>
             </w:pPr>
           </w:p>
         </w:tc>
@@ -7673,7 +7733,7 @@
           <w:p>
             <w:pPr>
               <w:keepNext/>
-              <w:spacing w:before="20" w:after="20" w:line="240" w:lineRule="auto"/>
+              <w:spacing w:before="20" w:after="20"/>
             </w:pPr>
             <w:r>
               <w:rPr>
@@ -7690,7 +7750,7 @@
           <w:p>
             <w:pPr>
               <w:keepNext/>
-              <w:spacing w:before="20" w:after="20" w:line="240" w:lineRule="auto"/>
+              <w:spacing w:before="20" w:after="20"/>
             </w:pPr>
             <w:r>
               <w:rPr>
@@ -7707,7 +7767,7 @@
           <w:p>
             <w:pPr>
               <w:keepNext/>
-              <w:spacing w:before="20" w:after="20" w:line="240" w:lineRule="auto"/>
+              <w:spacing w:before="20" w:after="20"/>
             </w:pPr>
             <w:r>
               <w:rPr>
@@ -7724,7 +7784,7 @@
           <w:p>
             <w:pPr>
               <w:keepNext/>
-              <w:spacing w:before="20" w:after="20" w:line="240" w:lineRule="auto"/>
+              <w:spacing w:before="20" w:after="20"/>
             </w:pPr>
             <w:r>
               <w:rPr>
@@ -7741,7 +7801,7 @@
           <w:p>
             <w:pPr>
               <w:keepNext/>
-              <w:spacing w:before="20" w:after="20" w:line="240" w:lineRule="auto"/>
+              <w:spacing w:before="20" w:after="20"/>
             </w:pPr>
             <w:r>
               <w:rPr>
@@ -7764,7 +7824,7 @@
           <w:p>
             <w:pPr>
               <w:keepNext/>
-              <w:spacing w:before="20" w:after="20" w:line="240" w:lineRule="auto"/>
+              <w:spacing w:before="20" w:after="20"/>
             </w:pPr>
             <w:r>
               <w:rPr>
@@ -7781,7 +7841,7 @@
           <w:p>
             <w:pPr>
               <w:keepNext/>
-              <w:spacing w:before="20" w:after="20" w:line="240" w:lineRule="auto"/>
+              <w:spacing w:before="20" w:after="20"/>
             </w:pPr>
             <w:r>
               <w:rPr>
@@ -7798,7 +7858,7 @@
           <w:p>
             <w:pPr>
               <w:keepNext/>
-              <w:spacing w:before="20" w:after="20" w:line="240" w:lineRule="auto"/>
+              <w:spacing w:before="20" w:after="20"/>
             </w:pPr>
             <w:r>
               <w:rPr>
@@ -7815,7 +7875,7 @@
           <w:p>
             <w:pPr>
               <w:keepNext/>
-              <w:spacing w:before="20" w:after="20" w:line="240" w:lineRule="auto"/>
+              <w:spacing w:before="20" w:after="20"/>
             </w:pPr>
             <w:r>
               <w:rPr>
@@ -7832,7 +7892,7 @@
           <w:p>
             <w:pPr>
               <w:keepNext/>
-              <w:spacing w:before="20" w:after="20" w:line="240" w:lineRule="auto"/>
+              <w:spacing w:before="20" w:after="20"/>
             </w:pPr>
           </w:p>
         </w:tc>
@@ -7849,7 +7909,7 @@
           <w:p>
             <w:pPr>
               <w:keepNext/>
-              <w:spacing w:before="20" w:after="20" w:line="240" w:lineRule="auto"/>
+              <w:spacing w:before="20" w:after="20"/>
             </w:pPr>
             <w:r>
               <w:rPr>
@@ -7866,7 +7926,7 @@
           <w:p>
             <w:pPr>
               <w:keepNext/>
-              <w:spacing w:before="20" w:after="20" w:line="240" w:lineRule="auto"/>
+              <w:spacing w:before="20" w:after="20"/>
             </w:pPr>
             <w:r>
               <w:rPr>
@@ -7883,7 +7943,7 @@
           <w:p>
             <w:pPr>
               <w:keepNext/>
-              <w:spacing w:before="20" w:after="20" w:line="240" w:lineRule="auto"/>
+              <w:spacing w:before="20" w:after="20"/>
             </w:pPr>
             <w:r>
               <w:rPr>
@@ -7900,7 +7960,7 @@
           <w:p>
             <w:pPr>
               <w:keepNext/>
-              <w:spacing w:before="20" w:after="20" w:line="240" w:lineRule="auto"/>
+              <w:spacing w:before="20" w:after="20"/>
             </w:pPr>
             <w:r>
               <w:rPr>
@@ -7917,7 +7977,7 @@
           <w:p>
             <w:pPr>
               <w:keepNext/>
-              <w:spacing w:before="20" w:after="20" w:line="240" w:lineRule="auto"/>
+              <w:spacing w:before="20" w:after="20"/>
             </w:pPr>
           </w:p>
         </w:tc>
@@ -7934,7 +7994,7 @@
           <w:p>
             <w:pPr>
               <w:keepNext/>
-              <w:spacing w:before="20" w:after="20" w:line="240" w:lineRule="auto"/>
+              <w:spacing w:before="20" w:after="20"/>
             </w:pPr>
             <w:r>
               <w:rPr>
@@ -7951,7 +8011,7 @@
           <w:p>
             <w:pPr>
               <w:keepNext/>
-              <w:spacing w:before="20" w:after="20" w:line="240" w:lineRule="auto"/>
+              <w:spacing w:before="20" w:after="20"/>
             </w:pPr>
             <w:r>
               <w:rPr>
@@ -7968,7 +8028,7 @@
           <w:p>
             <w:pPr>
               <w:keepNext/>
-              <w:spacing w:before="20" w:after="20" w:line="240" w:lineRule="auto"/>
+              <w:spacing w:before="20" w:after="20"/>
             </w:pPr>
             <w:r>
               <w:rPr>
@@ -7985,7 +8045,7 @@
           <w:p>
             <w:pPr>
               <w:keepNext/>
-              <w:spacing w:before="20" w:after="20" w:line="240" w:lineRule="auto"/>
+              <w:spacing w:before="20" w:after="20"/>
             </w:pPr>
             <w:r>
               <w:rPr>
@@ -8002,7 +8062,7 @@
           <w:p>
             <w:pPr>
               <w:keepNext/>
-              <w:spacing w:before="20" w:after="20" w:line="240" w:lineRule="auto"/>
+              <w:spacing w:before="20" w:after="20"/>
             </w:pPr>
           </w:p>
         </w:tc>
@@ -8018,7 +8078,7 @@
           </w:tcPr>
           <w:p>
             <w:pPr>
-              <w:spacing w:before="20" w:after="20" w:line="240" w:lineRule="auto"/>
+              <w:spacing w:before="20" w:after="20"/>
             </w:pPr>
             <w:r>
               <w:rPr>
@@ -8034,7 +8094,7 @@
           </w:tcPr>
           <w:p>
             <w:pPr>
-              <w:spacing w:before="20" w:after="20" w:line="240" w:lineRule="auto"/>
+              <w:spacing w:before="20" w:after="20"/>
             </w:pPr>
             <w:r>
               <w:rPr>
@@ -8050,7 +8110,7 @@
           </w:tcPr>
           <w:p>
             <w:pPr>
-              <w:spacing w:before="20" w:after="20" w:line="240" w:lineRule="auto"/>
+              <w:spacing w:before="20" w:after="20"/>
             </w:pPr>
             <w:r>
               <w:rPr>
@@ -8066,7 +8126,7 @@
           </w:tcPr>
           <w:p>
             <w:pPr>
-              <w:spacing w:before="20" w:after="20" w:line="240" w:lineRule="auto"/>
+              <w:spacing w:before="20" w:after="20"/>
             </w:pPr>
             <w:r>
               <w:rPr>
@@ -8082,7 +8142,7 @@
           </w:tcPr>
           <w:p>
             <w:pPr>
-              <w:spacing w:before="20" w:after="20" w:line="240" w:lineRule="auto"/>
+              <w:spacing w:before="20" w:after="20"/>
             </w:pPr>
             <w:r>
               <w:rPr>
@@ -8110,7 +8170,13 @@
         <w:jc w:val="both"/>
       </w:pPr>
       <w:r>
-        <w:t>Removing the Reuters dateline, the first sentence and every mention of Reuters lowers accuracy from 98.4% to 97.7%. Additionally removing the fake sites' page clutter and normalising typography lowers it only to 97.3%. Figure 4 shows that the errors grow, from 121 to 206 of 7,729, but remain rare in both classes.</w:t>
+        <w:t xml:space="preserve">Removing the Reuters dateline, the first sentence and every mention of Reuters lowers accuracy from 98.4% to 97.7%. Additionally removing the fake sites' page clutter and </w:t>
+      </w:r>
+      <w:r>
+        <w:t>normalizing</w:t>
+      </w:r>
+      <w:r>
+        <w:t xml:space="preserve"> typography lowers it only to 97.3%. Figure 4 shows that the errors grow, from 121 to 206 of 7,729, but remain rare in both classes.</w:t>
       </w:r>
     </w:p>
     <w:p>
@@ -8118,10 +8184,7 @@
         <w:jc w:val="both"/>
       </w:pPr>
       <w:r>
-        <w:t xml:space="preserve">The features that survive explain why. After stripping, the strongest real features are "said", "told", "says", "reporters" and "spokesman": the attribution conventions of wire journalism, in which every claim is assigned to a named source. The strongest fake features are "this", "just", "that", "you", "here" and "even", together with partisan terms such as "hillary" and "gop": the direct, opinionated voice of political blogs. "via" remains the strongest fake feature, now in prose such as "watch below, via </w:t>
-      </w:r>
-      <w:r>
-        <w:t>Raw Story": the blogs' habit of crediting other outlets. The source signal is not concentrated in a few removable markers. It runs through the register of the entire article. The answer to RQ2 is that marker removal barely matters, because ISOT's two classes are two different genres of writing.</w:t>
+        <w:t>The features that survive explain why. After stripping, the strongest real features are "said", "told", "says", "reporters" and "spokesman": the attribution conventions of wire journalism, in which every claim is assigned to a named source. The strongest fake features are "this", "just", "that", "you", "here" and "even", together with partisan terms such as "hillary" and "gop": the direct, opinionated voice of political blogs. "via" remains the strongest fake feature, now in prose such as "watch below, via Raw Story": the blogs' habit of crediting other outlets. The source signal is not concentrated in a few removable markers. It runs through the register of the entire article. The answer to RQ2 is that marker removal barely matters, because ISOT's two classes are two different genres of writing.</w:t>
       </w:r>
     </w:p>
     <w:p>
@@ -8205,10 +8268,13 @@
         <w:jc w:val="both"/>
       </w:pPr>
       <w:r>
-        <w:t>Within ISOT, a model trained on headlines alone reaches 94.6%, so headlines carry plenty of class signal. The same model applied to LIAR reaches 45.5%, below the majority-class rate of 55.8%. It labels 77% of LIAR statements as fake, although only 44% are. This is the behaviour expected of a model that has learned "not written like Reuters means fake": LIAR's statements, short claims quoted from politicians, are not written like wire copy, so most are labelled fake regardless of whether they are true. Remov</w:t>
-      </w:r>
-      <w:r>
-        <w:t xml:space="preserve">ing the </w:t>
+        <w:t xml:space="preserve">Within ISOT, a model trained on headlines alone reaches 94.6%, so headlines carry plenty of class signal. The same model applied to LIAR reaches 45.5%, below the majority-class rate of 55.8%. It labels 77% of LIAR statements as fake, although only 44% are. This is the </w:t>
+      </w:r>
+      <w:r>
+        <w:t>behavior</w:t>
+      </w:r>
+      <w:r>
+        <w:t xml:space="preserve"> expected of a model that has learned "not written like Reuters means fake": LIAR's statements, short claims quoted from politicians, are not written like wire copy, so most are labelled fake regardless of whether they are true. Removing the </w:t>
       </w:r>
       <w:r>
         <w:rPr>
@@ -8231,10 +8297,7 @@
         <w:t>Full articles.</w:t>
       </w:r>
       <w:r>
-        <w:t xml:space="preserve"> Because LIAR contains only short statements, the test was repeated on the McIntire corpus of full articles. McIntire itself is learnable: trained and tested on its own split, the same pipeline reaches 91.9%. The ISOT detector, however, reaches only 61.2% on it against a chance level of 50.7%. It labels 68% of McIntire's real articles — mainstream journalism that is not written in Reuters house style — as fake. Stripping both corpora does not help (59.8%), and stripped function words give 63.9%. The reverse</w:t>
-      </w:r>
-      <w:r>
-        <w:t xml:space="preserve"> direction fails in the same way: trained on McIntire, the model reaches 65.0% on ISOT against a chance level of 54.8%. Some signal does transfer, about ten points above chance, but almost all of the within-corpus accuracy is lost (Figure 5).</w:t>
+        <w:t xml:space="preserve"> Because LIAR contains only short statements, the test was repeated on the McIntire corpus of full articles. McIntire itself is learnable: trained and tested on its own split, the same pipeline reaches 91.9%. The ISOT detector, however, reaches only 61.2% on it against a chance level of 50.7%. It labels 68% of McIntire's real articles — mainstream journalism that is not written in Reuters house style — as fake. Stripping both corpora does not help (59.8%), and stripped function words give 63.9%. The reverse direction fails in the same way: trained on McIntire, the model reaches 65.0% on ISOT against a chance level of 54.8%. Some signal does transfer, about ten points above chance, but almost all of the within-corpus accuracy is lost (Figure 5).</w:t>
       </w:r>
     </w:p>
     <w:p>
@@ -8493,7 +8556,19 @@
         <w:jc w:val="both"/>
       </w:pPr>
       <w:r>
-        <w:t>Figure 8 orders the conditions by how much information they leave the model. Removing the title changes nothing, and removing every content word costs under two points. Only when the text is reduced to eight numbers does accuracy fall substantially, and even then it remains more than 30 points above chance.</w:t>
+        <w:t xml:space="preserve">Figure 8 orders the conditions by how much information they leave the model. Removing the title changes nothing, and removing every content word </w:t>
+      </w:r>
+      <w:r>
+        <w:t>cost</w:t>
+      </w:r>
+      <w:r>
+        <w:t xml:space="preserve"> under two points. Only when the text is reduced to eight numbers does accuracy fall substantially, and even </w:t>
+      </w:r>
+      <w:r>
+        <w:t>then,</w:t>
+      </w:r>
+      <w:r>
+        <w:t xml:space="preserve"> it remains more than 30 points above chance.</w:t>
       </w:r>
     </w:p>
     <w:p>
@@ -8589,7 +8664,13 @@
         <w:t>Corpus scope.</w:t>
       </w:r>
       <w:r>
-        <w:t xml:space="preserve"> The probes were applied in depth to ISOT only; McIntire was used for transfer. McIntire's labels, like ISOT's, are assigned by source rather than by fact-checking each article, so it shows that the detector does not generalise across sources, not what it would score on individually verified articles.</w:t>
+        <w:t xml:space="preserve"> The probes were applied in depth to ISOT only; McIntire was used for transfer. McIntire's labels, like ISOT's, are assigned by source rather than by fact-checking each article, so it shows that the detector does not </w:t>
+      </w:r>
+      <w:r>
+        <w:t>generalize</w:t>
+      </w:r>
+      <w:r>
+        <w:t xml:space="preserve"> across sources, not what it would score on individually verified articles.</w:t>
       </w:r>
     </w:p>
     <w:p>
@@ -8635,10 +8716,7 @@
         <w:jc w:val="both"/>
       </w:pPr>
       <w:r>
-        <w:t>This project built a standard fake news detector on the ISOT benchmark and tested it with partial-input baselines. The detector reaches 98.4% accuracy, but so do models that are denied the information needed to judge truthfulness: 99.1% from the first sentence, 96.8% from function words and punctuation, and 86.2% from eight surface statistics, against a chance level of 54.8%. Removing source markers from both classes leaves 97.3%; restricting both classes to US politics and keeping only function words still</w:t>
-      </w:r>
-      <w:r>
-        <w:t xml:space="preserve"> leaves 90.3% against a chance level of 60.9%; a model that scores 94.6% on ISOT headlines scores below chance on </w:t>
+        <w:t xml:space="preserve">This project built a standard fake news detector on the ISOT benchmark and tested it with partial-input baselines. The detector reaches 98.4% accuracy, but so do models that are denied the information needed to judge truthfulness: 99.1% from the first sentence, 96.8% from function words and punctuation, and 86.2% from eight surface statistics, against a chance level of 54.8%. Removing source markers from both classes leaves 97.3%; restricting both classes to US politics and keeping only function words still leaves 90.3% against a chance level of 60.9%; a model that scores 94.6% on ISOT headlines scores below chance on </w:t>
       </w:r>
       <w:r>
         <w:lastRenderedPageBreak/>
@@ -8650,10 +8728,19 @@
         <w:jc w:val="both"/>
       </w:pPr>
       <w:r>
-        <w:t>In short: we built a fake news detector, obtained 98% accuracy, and showed that the 98% does not measure fake news detection. The evidence points to one explanation. ISOT's labels coincide with two publishing pipelines, and models learn to recognise the pipeline. Because the difference is one of genre — wire reporting versus partisan commentary — it cannot be removed by deleting tags. Accuracy on ISOT should therefore be read as a measure of source and style separability, not of fake news detection. These f</w:t>
-      </w:r>
-      <w:r>
-        <w:t>indings agree with the source-memorisation results of Zhou et al. (2021) and with Verma's (2026) audit of the same corpus, and extend them by showing that the signal survives even when the model sees no content words at all. In the terms of Geirhos et al. (2020), ISOT rewards a shortcut, and published accuracies on it measure how well models take it.</w:t>
+        <w:t xml:space="preserve">In short: we built a fake news detector, obtained 98% accuracy, and showed that the 98% does not measure fake news detection. The evidence points to one explanation. ISOT's labels coincide with two publishing pipelines, and models learn to </w:t>
+      </w:r>
+      <w:r>
+        <w:t>recognize</w:t>
+      </w:r>
+      <w:r>
+        <w:t xml:space="preserve"> the pipeline. Because the difference is one of genre — wire reporting versus partisan commentary — it cannot be removed by deleting tags. Accuracy on ISOT should therefore be read as a measure of source and style separability, not of fake news detection. These findings agree with the source-</w:t>
+      </w:r>
+      <w:r>
+        <w:t>memorization</w:t>
+      </w:r>
+      <w:r>
+        <w:t xml:space="preserve"> results of Zhou et al. (2021) and with Verma's (2026) audit of the same corpus, and extend them by showing that the signal survives even when the model sees no content words at all. In the terms of Geirhos et al. (2020), ISOT rewards a shortcut, and published accuracies on it measure how well models take it.</w:t>
       </w:r>
     </w:p>
     <w:p>
@@ -8661,10 +8748,7 @@
         <w:jc w:val="both"/>
       </w:pPr>
       <w:r>
-        <w:t>Three recommendations for evaluation practice follow. First, any accuracy reported on a fake news benchmark should be accompanied by partial-input baselines; a result is only meaningful to the extent that it exceeds what a content-free model achieves. Second, models should be tested on at least one independently constructed corpus, because within-corpus accuracy cannot distinguish learning veracity from learning the corpus. Third, the chance level should be measured on the actual test set rather than assume</w:t>
-      </w:r>
-      <w:r>
-        <w:t>d, and the subject field and similar metadata should be checked for label leakage before use.</w:t>
+        <w:t>Three recommendations for evaluation practice follow. First, any accuracy reported on a fake news benchmark should be accompanied by partial-input baselines; a result is only meaningful to the extent that it exceeds what a content-free model achieves. Second, models should be tested on at least one independently constructed corpus, because within-corpus accuracy cannot distinguish learning veracity from learning the corpus. Third, the chance level should be measured on the actual test set rather than assumed, and the subject field and similar metadata should be checked for label leakage before use.</w:t>
       </w:r>
     </w:p>
     <w:p>
@@ -8688,7 +8772,13 @@
         <w:t>Source-disjoint evaluation.</w:t>
       </w:r>
       <w:r>
-        <w:t xml:space="preserve"> Build test sets from publishers never seen in training, so that recognising the publisher cannot help.</w:t>
+        <w:t xml:space="preserve"> Build test sets from publishers never seen in training, so that </w:t>
+      </w:r>
+      <w:r>
+        <w:t>recognizing</w:t>
+      </w:r>
+      <w:r>
+        <w:t xml:space="preserve"> the publisher cannot help.</w:t>
       </w:r>
     </w:p>
     <w:p>

</xml_diff>

<commit_message>
Make the project single-author
Remove the former teammate from the report title page and template, rewrite
the walkthrough's guide and presenter brief for a solo presenter, and add the
exported report PDF.
</commit_message>
<xml_diff>
--- a/report/WSMA_Report.docx
+++ b/report/WSMA_Report.docx
@@ -75,14 +75,6 @@
         <w:t>– 245816186</w:t>
       </w:r>
     </w:p>
-    <w:p>
-      <w:pPr>
-        <w:jc w:val="center"/>
-      </w:pPr>
-      <w:r>
-        <w:t>Yuvika Dosapati – 245816298</w:t>
-      </w:r>
-    </w:p>
     <w:p/>
     <w:p>
       <w:pPr>
@@ -103,9 +95,6 @@
         <w:t>Dr. Yashaswini K A</w:t>
       </w:r>
       <w:r>
-        <w:rPr>
-          <w:highlight w:val="yellow"/>
-        </w:rPr>
         <w:t xml:space="preserve"> </w:t>
       </w:r>
     </w:p>
@@ -163,7 +152,12 @@
           <w:tab w:val="right" w:leader="dot" w:pos="9016"/>
         </w:tabs>
         <w:rPr>
+          <w:rFonts w:asciiTheme="minorHAnsi" w:eastAsiaTheme="minorEastAsia" w:hAnsiTheme="minorHAnsi"/>
           <w:noProof/>
+          <w:kern w:val="2"/>
+          <w:szCs w:val="24"/>
+          <w:lang w:val="en-IN" w:eastAsia="en-IN"/>
+          <w14:ligatures w14:val="standardContextual"/>
         </w:rPr>
       </w:pPr>
       <w:r>
@@ -175,7 +169,7 @@
       <w:r>
         <w:fldChar w:fldCharType="separate"/>
       </w:r>
-      <w:hyperlink w:anchor="_Toc242856689" w:history="1">
+      <w:hyperlink w:anchor="_Toc242977273" w:history="1">
         <w:r>
           <w:rPr>
             <w:rStyle w:val="Hyperlink"/>
@@ -202,7 +196,7 @@
             <w:noProof/>
             <w:webHidden/>
           </w:rPr>
-          <w:instrText xml:space="preserve"> PAGEREF _Toc242856689 \h </w:instrText>
+          <w:instrText xml:space="preserve"> PAGEREF _Toc242977273 \h </w:instrText>
         </w:r>
         <w:r>
           <w:rPr>
@@ -240,10 +234,15 @@
           <w:tab w:val="right" w:leader="dot" w:pos="9016"/>
         </w:tabs>
         <w:rPr>
+          <w:rFonts w:asciiTheme="minorHAnsi" w:eastAsiaTheme="minorEastAsia" w:hAnsiTheme="minorHAnsi"/>
           <w:noProof/>
+          <w:kern w:val="2"/>
+          <w:szCs w:val="24"/>
+          <w:lang w:val="en-IN" w:eastAsia="en-IN"/>
+          <w14:ligatures w14:val="standardContextual"/>
         </w:rPr>
       </w:pPr>
-      <w:hyperlink w:anchor="_Toc242856690" w:history="1">
+      <w:hyperlink w:anchor="_Toc242977274" w:history="1">
         <w:r>
           <w:rPr>
             <w:rStyle w:val="Hyperlink"/>
@@ -270,7 +269,7 @@
             <w:noProof/>
             <w:webHidden/>
           </w:rPr>
-          <w:instrText xml:space="preserve"> PAGEREF _Toc242856690 \h </w:instrText>
+          <w:instrText xml:space="preserve"> PAGEREF _Toc242977274 \h </w:instrText>
         </w:r>
         <w:r>
           <w:rPr>
@@ -308,10 +307,15 @@
           <w:tab w:val="right" w:leader="dot" w:pos="9016"/>
         </w:tabs>
         <w:rPr>
+          <w:rFonts w:asciiTheme="minorHAnsi" w:eastAsiaTheme="minorEastAsia" w:hAnsiTheme="minorHAnsi"/>
           <w:noProof/>
+          <w:kern w:val="2"/>
+          <w:szCs w:val="24"/>
+          <w:lang w:val="en-IN" w:eastAsia="en-IN"/>
+          <w14:ligatures w14:val="standardContextual"/>
         </w:rPr>
       </w:pPr>
-      <w:hyperlink w:anchor="_Toc242856691" w:history="1">
+      <w:hyperlink w:anchor="_Toc242977275" w:history="1">
         <w:r>
           <w:rPr>
             <w:rStyle w:val="Hyperlink"/>
@@ -338,7 +342,7 @@
             <w:noProof/>
             <w:webHidden/>
           </w:rPr>
-          <w:instrText xml:space="preserve"> PAGEREF _Toc242856691 \h </w:instrText>
+          <w:instrText xml:space="preserve"> PAGEREF _Toc242977275 \h </w:instrText>
         </w:r>
         <w:r>
           <w:rPr>
@@ -376,10 +380,15 @@
           <w:tab w:val="right" w:leader="dot" w:pos="9016"/>
         </w:tabs>
         <w:rPr>
+          <w:rFonts w:asciiTheme="minorHAnsi" w:eastAsiaTheme="minorEastAsia" w:hAnsiTheme="minorHAnsi"/>
           <w:noProof/>
+          <w:kern w:val="2"/>
+          <w:szCs w:val="24"/>
+          <w:lang w:val="en-IN" w:eastAsia="en-IN"/>
+          <w14:ligatures w14:val="standardContextual"/>
         </w:rPr>
       </w:pPr>
-      <w:hyperlink w:anchor="_Toc242856692" w:history="1">
+      <w:hyperlink w:anchor="_Toc242977276" w:history="1">
         <w:r>
           <w:rPr>
             <w:rStyle w:val="Hyperlink"/>
@@ -406,7 +415,7 @@
             <w:noProof/>
             <w:webHidden/>
           </w:rPr>
-          <w:instrText xml:space="preserve"> PAGEREF _Toc242856692 \h </w:instrText>
+          <w:instrText xml:space="preserve"> PAGEREF _Toc242977276 \h </w:instrText>
         </w:r>
         <w:r>
           <w:rPr>
@@ -444,10 +453,15 @@
           <w:tab w:val="right" w:leader="dot" w:pos="9016"/>
         </w:tabs>
         <w:rPr>
+          <w:rFonts w:asciiTheme="minorHAnsi" w:eastAsiaTheme="minorEastAsia" w:hAnsiTheme="minorHAnsi"/>
           <w:noProof/>
+          <w:kern w:val="2"/>
+          <w:szCs w:val="24"/>
+          <w:lang w:val="en-IN" w:eastAsia="en-IN"/>
+          <w14:ligatures w14:val="standardContextual"/>
         </w:rPr>
       </w:pPr>
-      <w:hyperlink w:anchor="_Toc242856693" w:history="1">
+      <w:hyperlink w:anchor="_Toc242977277" w:history="1">
         <w:r>
           <w:rPr>
             <w:rStyle w:val="Hyperlink"/>
@@ -474,7 +488,7 @@
             <w:noProof/>
             <w:webHidden/>
           </w:rPr>
-          <w:instrText xml:space="preserve"> PAGEREF _Toc242856693 \h </w:instrText>
+          <w:instrText xml:space="preserve"> PAGEREF _Toc242977277 \h </w:instrText>
         </w:r>
         <w:r>
           <w:rPr>
@@ -512,10 +526,15 @@
           <w:tab w:val="right" w:leader="dot" w:pos="9016"/>
         </w:tabs>
         <w:rPr>
+          <w:rFonts w:asciiTheme="minorHAnsi" w:eastAsiaTheme="minorEastAsia" w:hAnsiTheme="minorHAnsi"/>
           <w:noProof/>
+          <w:kern w:val="2"/>
+          <w:szCs w:val="24"/>
+          <w:lang w:val="en-IN" w:eastAsia="en-IN"/>
+          <w14:ligatures w14:val="standardContextual"/>
         </w:rPr>
       </w:pPr>
-      <w:hyperlink w:anchor="_Toc242856694" w:history="1">
+      <w:hyperlink w:anchor="_Toc242977278" w:history="1">
         <w:r>
           <w:rPr>
             <w:rStyle w:val="Hyperlink"/>
@@ -542,7 +561,7 @@
             <w:noProof/>
             <w:webHidden/>
           </w:rPr>
-          <w:instrText xml:space="preserve"> PAGEREF _Toc242856694 \h </w:instrText>
+          <w:instrText xml:space="preserve"> PAGEREF _Toc242977278 \h </w:instrText>
         </w:r>
         <w:r>
           <w:rPr>
@@ -580,10 +599,15 @@
           <w:tab w:val="right" w:leader="dot" w:pos="9016"/>
         </w:tabs>
         <w:rPr>
+          <w:rFonts w:asciiTheme="minorHAnsi" w:eastAsiaTheme="minorEastAsia" w:hAnsiTheme="minorHAnsi"/>
           <w:noProof/>
+          <w:kern w:val="2"/>
+          <w:szCs w:val="24"/>
+          <w:lang w:val="en-IN" w:eastAsia="en-IN"/>
+          <w14:ligatures w14:val="standardContextual"/>
         </w:rPr>
       </w:pPr>
-      <w:hyperlink w:anchor="_Toc242856695" w:history="1">
+      <w:hyperlink w:anchor="_Toc242977279" w:history="1">
         <w:r>
           <w:rPr>
             <w:rStyle w:val="Hyperlink"/>
@@ -610,7 +634,7 @@
             <w:noProof/>
             <w:webHidden/>
           </w:rPr>
-          <w:instrText xml:space="preserve"> PAGEREF _Toc242856695 \h </w:instrText>
+          <w:instrText xml:space="preserve"> PAGEREF _Toc242977279 \h </w:instrText>
         </w:r>
         <w:r>
           <w:rPr>
@@ -648,10 +672,15 @@
           <w:tab w:val="right" w:leader="dot" w:pos="9016"/>
         </w:tabs>
         <w:rPr>
+          <w:rFonts w:asciiTheme="minorHAnsi" w:eastAsiaTheme="minorEastAsia" w:hAnsiTheme="minorHAnsi"/>
           <w:noProof/>
+          <w:kern w:val="2"/>
+          <w:szCs w:val="24"/>
+          <w:lang w:val="en-IN" w:eastAsia="en-IN"/>
+          <w14:ligatures w14:val="standardContextual"/>
         </w:rPr>
       </w:pPr>
-      <w:hyperlink w:anchor="_Toc242856696" w:history="1">
+      <w:hyperlink w:anchor="_Toc242977280" w:history="1">
         <w:r>
           <w:rPr>
             <w:rStyle w:val="Hyperlink"/>
@@ -678,7 +707,7 @@
             <w:noProof/>
             <w:webHidden/>
           </w:rPr>
-          <w:instrText xml:space="preserve"> PAGEREF _Toc242856696 \h </w:instrText>
+          <w:instrText xml:space="preserve"> PAGEREF _Toc242977280 \h </w:instrText>
         </w:r>
         <w:r>
           <w:rPr>
@@ -716,10 +745,15 @@
           <w:tab w:val="right" w:leader="dot" w:pos="9016"/>
         </w:tabs>
         <w:rPr>
+          <w:rFonts w:asciiTheme="minorHAnsi" w:eastAsiaTheme="minorEastAsia" w:hAnsiTheme="minorHAnsi"/>
           <w:noProof/>
+          <w:kern w:val="2"/>
+          <w:szCs w:val="24"/>
+          <w:lang w:val="en-IN" w:eastAsia="en-IN"/>
+          <w14:ligatures w14:val="standardContextual"/>
         </w:rPr>
       </w:pPr>
-      <w:hyperlink w:anchor="_Toc242856697" w:history="1">
+      <w:hyperlink w:anchor="_Toc242977281" w:history="1">
         <w:r>
           <w:rPr>
             <w:rStyle w:val="Hyperlink"/>
@@ -746,7 +780,7 @@
             <w:noProof/>
             <w:webHidden/>
           </w:rPr>
-          <w:instrText xml:space="preserve"> PAGEREF _Toc242856697 \h </w:instrText>
+          <w:instrText xml:space="preserve"> PAGEREF _Toc242977281 \h </w:instrText>
         </w:r>
         <w:r>
           <w:rPr>
@@ -784,10 +818,15 @@
           <w:tab w:val="right" w:leader="dot" w:pos="9016"/>
         </w:tabs>
         <w:rPr>
+          <w:rFonts w:asciiTheme="minorHAnsi" w:eastAsiaTheme="minorEastAsia" w:hAnsiTheme="minorHAnsi"/>
           <w:noProof/>
+          <w:kern w:val="2"/>
+          <w:szCs w:val="24"/>
+          <w:lang w:val="en-IN" w:eastAsia="en-IN"/>
+          <w14:ligatures w14:val="standardContextual"/>
         </w:rPr>
       </w:pPr>
-      <w:hyperlink w:anchor="_Toc242856698" w:history="1">
+      <w:hyperlink w:anchor="_Toc242977282" w:history="1">
         <w:r>
           <w:rPr>
             <w:rStyle w:val="Hyperlink"/>
@@ -814,7 +853,7 @@
             <w:noProof/>
             <w:webHidden/>
           </w:rPr>
-          <w:instrText xml:space="preserve"> PAGEREF _Toc242856698 \h </w:instrText>
+          <w:instrText xml:space="preserve"> PAGEREF _Toc242977282 \h </w:instrText>
         </w:r>
         <w:r>
           <w:rPr>
@@ -852,10 +891,15 @@
           <w:tab w:val="right" w:leader="dot" w:pos="9016"/>
         </w:tabs>
         <w:rPr>
+          <w:rFonts w:asciiTheme="minorHAnsi" w:eastAsiaTheme="minorEastAsia" w:hAnsiTheme="minorHAnsi"/>
           <w:noProof/>
+          <w:kern w:val="2"/>
+          <w:szCs w:val="24"/>
+          <w:lang w:val="en-IN" w:eastAsia="en-IN"/>
+          <w14:ligatures w14:val="standardContextual"/>
         </w:rPr>
       </w:pPr>
-      <w:hyperlink w:anchor="_Toc242856699" w:history="1">
+      <w:hyperlink w:anchor="_Toc242977283" w:history="1">
         <w:r>
           <w:rPr>
             <w:rStyle w:val="Hyperlink"/>
@@ -882,7 +926,7 @@
             <w:noProof/>
             <w:webHidden/>
           </w:rPr>
-          <w:instrText xml:space="preserve"> PAGEREF _Toc242856699 \h </w:instrText>
+          <w:instrText xml:space="preserve"> PAGEREF _Toc242977283 \h </w:instrText>
         </w:r>
         <w:r>
           <w:rPr>
@@ -920,10 +964,15 @@
           <w:tab w:val="right" w:leader="dot" w:pos="9016"/>
         </w:tabs>
         <w:rPr>
+          <w:rFonts w:asciiTheme="minorHAnsi" w:eastAsiaTheme="minorEastAsia" w:hAnsiTheme="minorHAnsi"/>
           <w:noProof/>
+          <w:kern w:val="2"/>
+          <w:szCs w:val="24"/>
+          <w:lang w:val="en-IN" w:eastAsia="en-IN"/>
+          <w14:ligatures w14:val="standardContextual"/>
         </w:rPr>
       </w:pPr>
-      <w:hyperlink w:anchor="_Toc242856700" w:history="1">
+      <w:hyperlink w:anchor="_Toc242977284" w:history="1">
         <w:r>
           <w:rPr>
             <w:rStyle w:val="Hyperlink"/>
@@ -950,7 +999,7 @@
             <w:noProof/>
             <w:webHidden/>
           </w:rPr>
-          <w:instrText xml:space="preserve"> PAGEREF _Toc242856700 \h </w:instrText>
+          <w:instrText xml:space="preserve"> PAGEREF _Toc242977284 \h </w:instrText>
         </w:r>
         <w:r>
           <w:rPr>
@@ -988,10 +1037,15 @@
           <w:tab w:val="right" w:leader="dot" w:pos="9016"/>
         </w:tabs>
         <w:rPr>
+          <w:rFonts w:asciiTheme="minorHAnsi" w:eastAsiaTheme="minorEastAsia" w:hAnsiTheme="minorHAnsi"/>
           <w:noProof/>
+          <w:kern w:val="2"/>
+          <w:szCs w:val="24"/>
+          <w:lang w:val="en-IN" w:eastAsia="en-IN"/>
+          <w14:ligatures w14:val="standardContextual"/>
         </w:rPr>
       </w:pPr>
-      <w:hyperlink w:anchor="_Toc242856701" w:history="1">
+      <w:hyperlink w:anchor="_Toc242977285" w:history="1">
         <w:r>
           <w:rPr>
             <w:rStyle w:val="Hyperlink"/>
@@ -1018,7 +1072,7 @@
             <w:noProof/>
             <w:webHidden/>
           </w:rPr>
-          <w:instrText xml:space="preserve"> PAGEREF _Toc242856701 \h </w:instrText>
+          <w:instrText xml:space="preserve"> PAGEREF _Toc242977285 \h </w:instrText>
         </w:r>
         <w:r>
           <w:rPr>
@@ -1056,10 +1110,15 @@
           <w:tab w:val="right" w:leader="dot" w:pos="9016"/>
         </w:tabs>
         <w:rPr>
+          <w:rFonts w:asciiTheme="minorHAnsi" w:eastAsiaTheme="minorEastAsia" w:hAnsiTheme="minorHAnsi"/>
           <w:noProof/>
+          <w:kern w:val="2"/>
+          <w:szCs w:val="24"/>
+          <w:lang w:val="en-IN" w:eastAsia="en-IN"/>
+          <w14:ligatures w14:val="standardContextual"/>
         </w:rPr>
       </w:pPr>
-      <w:hyperlink w:anchor="_Toc242856702" w:history="1">
+      <w:hyperlink w:anchor="_Toc242977286" w:history="1">
         <w:r>
           <w:rPr>
             <w:rStyle w:val="Hyperlink"/>
@@ -1086,7 +1145,7 @@
             <w:noProof/>
             <w:webHidden/>
           </w:rPr>
-          <w:instrText xml:space="preserve"> PAGEREF _Toc242856702 \h </w:instrText>
+          <w:instrText xml:space="preserve"> PAGEREF _Toc242977286 \h </w:instrText>
         </w:r>
         <w:r>
           <w:rPr>
@@ -1124,10 +1183,15 @@
           <w:tab w:val="right" w:leader="dot" w:pos="9016"/>
         </w:tabs>
         <w:rPr>
+          <w:rFonts w:asciiTheme="minorHAnsi" w:eastAsiaTheme="minorEastAsia" w:hAnsiTheme="minorHAnsi"/>
           <w:noProof/>
+          <w:kern w:val="2"/>
+          <w:szCs w:val="24"/>
+          <w:lang w:val="en-IN" w:eastAsia="en-IN"/>
+          <w14:ligatures w14:val="standardContextual"/>
         </w:rPr>
       </w:pPr>
-      <w:hyperlink w:anchor="_Toc242856703" w:history="1">
+      <w:hyperlink w:anchor="_Toc242977287" w:history="1">
         <w:r>
           <w:rPr>
             <w:rStyle w:val="Hyperlink"/>
@@ -1154,7 +1218,7 @@
             <w:noProof/>
             <w:webHidden/>
           </w:rPr>
-          <w:instrText xml:space="preserve"> PAGEREF _Toc242856703 \h </w:instrText>
+          <w:instrText xml:space="preserve"> PAGEREF _Toc242977287 \h </w:instrText>
         </w:r>
         <w:r>
           <w:rPr>
@@ -1192,10 +1256,15 @@
           <w:tab w:val="right" w:leader="dot" w:pos="9016"/>
         </w:tabs>
         <w:rPr>
+          <w:rFonts w:asciiTheme="minorHAnsi" w:eastAsiaTheme="minorEastAsia" w:hAnsiTheme="minorHAnsi"/>
           <w:noProof/>
+          <w:kern w:val="2"/>
+          <w:szCs w:val="24"/>
+          <w:lang w:val="en-IN" w:eastAsia="en-IN"/>
+          <w14:ligatures w14:val="standardContextual"/>
         </w:rPr>
       </w:pPr>
-      <w:hyperlink w:anchor="_Toc242856704" w:history="1">
+      <w:hyperlink w:anchor="_Toc242977288" w:history="1">
         <w:r>
           <w:rPr>
             <w:rStyle w:val="Hyperlink"/>
@@ -1222,7 +1291,7 @@
             <w:noProof/>
             <w:webHidden/>
           </w:rPr>
-          <w:instrText xml:space="preserve"> PAGEREF _Toc242856704 \h </w:instrText>
+          <w:instrText xml:space="preserve"> PAGEREF _Toc242977288 \h </w:instrText>
         </w:r>
         <w:r>
           <w:rPr>
@@ -1260,10 +1329,15 @@
           <w:tab w:val="right" w:leader="dot" w:pos="9016"/>
         </w:tabs>
         <w:rPr>
+          <w:rFonts w:asciiTheme="minorHAnsi" w:eastAsiaTheme="minorEastAsia" w:hAnsiTheme="minorHAnsi"/>
           <w:noProof/>
+          <w:kern w:val="2"/>
+          <w:szCs w:val="24"/>
+          <w:lang w:val="en-IN" w:eastAsia="en-IN"/>
+          <w14:ligatures w14:val="standardContextual"/>
         </w:rPr>
       </w:pPr>
-      <w:hyperlink w:anchor="_Toc242856705" w:history="1">
+      <w:hyperlink w:anchor="_Toc242977289" w:history="1">
         <w:r>
           <w:rPr>
             <w:rStyle w:val="Hyperlink"/>
@@ -1290,7 +1364,7 @@
             <w:noProof/>
             <w:webHidden/>
           </w:rPr>
-          <w:instrText xml:space="preserve"> PAGEREF _Toc242856705 \h </w:instrText>
+          <w:instrText xml:space="preserve"> PAGEREF _Toc242977289 \h </w:instrText>
         </w:r>
         <w:r>
           <w:rPr>
@@ -1328,10 +1402,15 @@
           <w:tab w:val="right" w:leader="dot" w:pos="9016"/>
         </w:tabs>
         <w:rPr>
+          <w:rFonts w:asciiTheme="minorHAnsi" w:eastAsiaTheme="minorEastAsia" w:hAnsiTheme="minorHAnsi"/>
           <w:noProof/>
+          <w:kern w:val="2"/>
+          <w:szCs w:val="24"/>
+          <w:lang w:val="en-IN" w:eastAsia="en-IN"/>
+          <w14:ligatures w14:val="standardContextual"/>
         </w:rPr>
       </w:pPr>
-      <w:hyperlink w:anchor="_Toc242856706" w:history="1">
+      <w:hyperlink w:anchor="_Toc242977290" w:history="1">
         <w:r>
           <w:rPr>
             <w:rStyle w:val="Hyperlink"/>
@@ -1358,7 +1437,7 @@
             <w:noProof/>
             <w:webHidden/>
           </w:rPr>
-          <w:instrText xml:space="preserve"> PAGEREF _Toc242856706 \h </w:instrText>
+          <w:instrText xml:space="preserve"> PAGEREF _Toc242977290 \h </w:instrText>
         </w:r>
         <w:r>
           <w:rPr>
@@ -1396,10 +1475,15 @@
           <w:tab w:val="right" w:leader="dot" w:pos="9016"/>
         </w:tabs>
         <w:rPr>
+          <w:rFonts w:asciiTheme="minorHAnsi" w:eastAsiaTheme="minorEastAsia" w:hAnsiTheme="minorHAnsi"/>
           <w:noProof/>
+          <w:kern w:val="2"/>
+          <w:szCs w:val="24"/>
+          <w:lang w:val="en-IN" w:eastAsia="en-IN"/>
+          <w14:ligatures w14:val="standardContextual"/>
         </w:rPr>
       </w:pPr>
-      <w:hyperlink w:anchor="_Toc242856707" w:history="1">
+      <w:hyperlink w:anchor="_Toc242977291" w:history="1">
         <w:r>
           <w:rPr>
             <w:rStyle w:val="Hyperlink"/>
@@ -1426,7 +1510,7 @@
             <w:noProof/>
             <w:webHidden/>
           </w:rPr>
-          <w:instrText xml:space="preserve"> PAGEREF _Toc242856707 \h </w:instrText>
+          <w:instrText xml:space="preserve"> PAGEREF _Toc242977291 \h </w:instrText>
         </w:r>
         <w:r>
           <w:rPr>
@@ -1464,10 +1548,15 @@
           <w:tab w:val="right" w:leader="dot" w:pos="9016"/>
         </w:tabs>
         <w:rPr>
+          <w:rFonts w:asciiTheme="minorHAnsi" w:eastAsiaTheme="minorEastAsia" w:hAnsiTheme="minorHAnsi"/>
           <w:noProof/>
+          <w:kern w:val="2"/>
+          <w:szCs w:val="24"/>
+          <w:lang w:val="en-IN" w:eastAsia="en-IN"/>
+          <w14:ligatures w14:val="standardContextual"/>
         </w:rPr>
       </w:pPr>
-      <w:hyperlink w:anchor="_Toc242856708" w:history="1">
+      <w:hyperlink w:anchor="_Toc242977292" w:history="1">
         <w:r>
           <w:rPr>
             <w:rStyle w:val="Hyperlink"/>
@@ -1494,7 +1583,7 @@
             <w:noProof/>
             <w:webHidden/>
           </w:rPr>
-          <w:instrText xml:space="preserve"> PAGEREF _Toc242856708 \h </w:instrText>
+          <w:instrText xml:space="preserve"> PAGEREF _Toc242977292 \h </w:instrText>
         </w:r>
         <w:r>
           <w:rPr>
@@ -1532,10 +1621,15 @@
           <w:tab w:val="right" w:leader="dot" w:pos="9016"/>
         </w:tabs>
         <w:rPr>
+          <w:rFonts w:asciiTheme="minorHAnsi" w:eastAsiaTheme="minorEastAsia" w:hAnsiTheme="minorHAnsi"/>
           <w:noProof/>
+          <w:kern w:val="2"/>
+          <w:szCs w:val="24"/>
+          <w:lang w:val="en-IN" w:eastAsia="en-IN"/>
+          <w14:ligatures w14:val="standardContextual"/>
         </w:rPr>
       </w:pPr>
-      <w:hyperlink w:anchor="_Toc242856709" w:history="1">
+      <w:hyperlink w:anchor="_Toc242977293" w:history="1">
         <w:r>
           <w:rPr>
             <w:rStyle w:val="Hyperlink"/>
@@ -1562,7 +1656,7 @@
             <w:noProof/>
             <w:webHidden/>
           </w:rPr>
-          <w:instrText xml:space="preserve"> PAGEREF _Toc242856709 \h </w:instrText>
+          <w:instrText xml:space="preserve"> PAGEREF _Toc242977293 \h </w:instrText>
         </w:r>
         <w:r>
           <w:rPr>
@@ -1600,10 +1694,15 @@
           <w:tab w:val="right" w:leader="dot" w:pos="9016"/>
         </w:tabs>
         <w:rPr>
+          <w:rFonts w:asciiTheme="minorHAnsi" w:eastAsiaTheme="minorEastAsia" w:hAnsiTheme="minorHAnsi"/>
           <w:noProof/>
+          <w:kern w:val="2"/>
+          <w:szCs w:val="24"/>
+          <w:lang w:val="en-IN" w:eastAsia="en-IN"/>
+          <w14:ligatures w14:val="standardContextual"/>
         </w:rPr>
       </w:pPr>
-      <w:hyperlink w:anchor="_Toc242856710" w:history="1">
+      <w:hyperlink w:anchor="_Toc242977294" w:history="1">
         <w:r>
           <w:rPr>
             <w:rStyle w:val="Hyperlink"/>
@@ -1630,7 +1729,7 @@
             <w:noProof/>
             <w:webHidden/>
           </w:rPr>
-          <w:instrText xml:space="preserve"> PAGEREF _Toc242856710 \h </w:instrText>
+          <w:instrText xml:space="preserve"> PAGEREF _Toc242977294 \h </w:instrText>
         </w:r>
         <w:r>
           <w:rPr>
@@ -1668,10 +1767,15 @@
           <w:tab w:val="right" w:leader="dot" w:pos="9016"/>
         </w:tabs>
         <w:rPr>
+          <w:rFonts w:asciiTheme="minorHAnsi" w:eastAsiaTheme="minorEastAsia" w:hAnsiTheme="minorHAnsi"/>
           <w:noProof/>
+          <w:kern w:val="2"/>
+          <w:szCs w:val="24"/>
+          <w:lang w:val="en-IN" w:eastAsia="en-IN"/>
+          <w14:ligatures w14:val="standardContextual"/>
         </w:rPr>
       </w:pPr>
-      <w:hyperlink w:anchor="_Toc242856711" w:history="1">
+      <w:hyperlink w:anchor="_Toc242977295" w:history="1">
         <w:r>
           <w:rPr>
             <w:rStyle w:val="Hyperlink"/>
@@ -1698,7 +1802,7 @@
             <w:noProof/>
             <w:webHidden/>
           </w:rPr>
-          <w:instrText xml:space="preserve"> PAGEREF _Toc242856711 \h </w:instrText>
+          <w:instrText xml:space="preserve"> PAGEREF _Toc242977295 \h </w:instrText>
         </w:r>
         <w:r>
           <w:rPr>
@@ -1736,10 +1840,15 @@
           <w:tab w:val="right" w:leader="dot" w:pos="9016"/>
         </w:tabs>
         <w:rPr>
+          <w:rFonts w:asciiTheme="minorHAnsi" w:eastAsiaTheme="minorEastAsia" w:hAnsiTheme="minorHAnsi"/>
           <w:noProof/>
+          <w:kern w:val="2"/>
+          <w:szCs w:val="24"/>
+          <w:lang w:val="en-IN" w:eastAsia="en-IN"/>
+          <w14:ligatures w14:val="standardContextual"/>
         </w:rPr>
       </w:pPr>
-      <w:hyperlink w:anchor="_Toc242856712" w:history="1">
+      <w:hyperlink w:anchor="_Toc242977296" w:history="1">
         <w:r>
           <w:rPr>
             <w:rStyle w:val="Hyperlink"/>
@@ -1766,7 +1875,7 @@
             <w:noProof/>
             <w:webHidden/>
           </w:rPr>
-          <w:instrText xml:space="preserve"> PAGEREF _Toc242856712 \h </w:instrText>
+          <w:instrText xml:space="preserve"> PAGEREF _Toc242977296 \h </w:instrText>
         </w:r>
         <w:r>
           <w:rPr>
@@ -1804,10 +1913,15 @@
           <w:tab w:val="right" w:leader="dot" w:pos="9016"/>
         </w:tabs>
         <w:rPr>
+          <w:rFonts w:asciiTheme="minorHAnsi" w:eastAsiaTheme="minorEastAsia" w:hAnsiTheme="minorHAnsi"/>
           <w:noProof/>
+          <w:kern w:val="2"/>
+          <w:szCs w:val="24"/>
+          <w:lang w:val="en-IN" w:eastAsia="en-IN"/>
+          <w14:ligatures w14:val="standardContextual"/>
         </w:rPr>
       </w:pPr>
-      <w:hyperlink w:anchor="_Toc242856713" w:history="1">
+      <w:hyperlink w:anchor="_Toc242977297" w:history="1">
         <w:r>
           <w:rPr>
             <w:rStyle w:val="Hyperlink"/>
@@ -1834,7 +1948,7 @@
             <w:noProof/>
             <w:webHidden/>
           </w:rPr>
-          <w:instrText xml:space="preserve"> PAGEREF _Toc242856713 \h </w:instrText>
+          <w:instrText xml:space="preserve"> PAGEREF _Toc242977297 \h </w:instrText>
         </w:r>
         <w:r>
           <w:rPr>
@@ -1872,10 +1986,15 @@
           <w:tab w:val="right" w:leader="dot" w:pos="9016"/>
         </w:tabs>
         <w:rPr>
+          <w:rFonts w:asciiTheme="minorHAnsi" w:eastAsiaTheme="minorEastAsia" w:hAnsiTheme="minorHAnsi"/>
           <w:noProof/>
+          <w:kern w:val="2"/>
+          <w:szCs w:val="24"/>
+          <w:lang w:val="en-IN" w:eastAsia="en-IN"/>
+          <w14:ligatures w14:val="standardContextual"/>
         </w:rPr>
       </w:pPr>
-      <w:hyperlink w:anchor="_Toc242856714" w:history="1">
+      <w:hyperlink w:anchor="_Toc242977298" w:history="1">
         <w:r>
           <w:rPr>
             <w:rStyle w:val="Hyperlink"/>
@@ -1902,7 +2021,7 @@
             <w:noProof/>
             <w:webHidden/>
           </w:rPr>
-          <w:instrText xml:space="preserve"> PAGEREF _Toc242856714 \h </w:instrText>
+          <w:instrText xml:space="preserve"> PAGEREF _Toc242977298 \h </w:instrText>
         </w:r>
         <w:r>
           <w:rPr>
@@ -1940,10 +2059,15 @@
           <w:tab w:val="right" w:leader="dot" w:pos="9016"/>
         </w:tabs>
         <w:rPr>
+          <w:rFonts w:asciiTheme="minorHAnsi" w:eastAsiaTheme="minorEastAsia" w:hAnsiTheme="minorHAnsi"/>
           <w:noProof/>
+          <w:kern w:val="2"/>
+          <w:szCs w:val="24"/>
+          <w:lang w:val="en-IN" w:eastAsia="en-IN"/>
+          <w14:ligatures w14:val="standardContextual"/>
         </w:rPr>
       </w:pPr>
-      <w:hyperlink w:anchor="_Toc242856715" w:history="1">
+      <w:hyperlink w:anchor="_Toc242977299" w:history="1">
         <w:r>
           <w:rPr>
             <w:rStyle w:val="Hyperlink"/>
@@ -1970,7 +2094,7 @@
             <w:noProof/>
             <w:webHidden/>
           </w:rPr>
-          <w:instrText xml:space="preserve"> PAGEREF _Toc242856715 \h </w:instrText>
+          <w:instrText xml:space="preserve"> PAGEREF _Toc242977299 \h </w:instrText>
         </w:r>
         <w:r>
           <w:rPr>
@@ -2008,10 +2132,15 @@
           <w:tab w:val="right" w:leader="dot" w:pos="9016"/>
         </w:tabs>
         <w:rPr>
+          <w:rFonts w:asciiTheme="minorHAnsi" w:eastAsiaTheme="minorEastAsia" w:hAnsiTheme="minorHAnsi"/>
           <w:noProof/>
+          <w:kern w:val="2"/>
+          <w:szCs w:val="24"/>
+          <w:lang w:val="en-IN" w:eastAsia="en-IN"/>
+          <w14:ligatures w14:val="standardContextual"/>
         </w:rPr>
       </w:pPr>
-      <w:hyperlink w:anchor="_Toc242856716" w:history="1">
+      <w:hyperlink w:anchor="_Toc242977300" w:history="1">
         <w:r>
           <w:rPr>
             <w:rStyle w:val="Hyperlink"/>
@@ -2038,7 +2167,7 @@
             <w:noProof/>
             <w:webHidden/>
           </w:rPr>
-          <w:instrText xml:space="preserve"> PAGEREF _Toc242856716 \h </w:instrText>
+          <w:instrText xml:space="preserve"> PAGEREF _Toc242977300 \h </w:instrText>
         </w:r>
         <w:r>
           <w:rPr>
@@ -2076,10 +2205,15 @@
           <w:tab w:val="right" w:leader="dot" w:pos="9016"/>
         </w:tabs>
         <w:rPr>
+          <w:rFonts w:asciiTheme="minorHAnsi" w:eastAsiaTheme="minorEastAsia" w:hAnsiTheme="minorHAnsi"/>
           <w:noProof/>
+          <w:kern w:val="2"/>
+          <w:szCs w:val="24"/>
+          <w:lang w:val="en-IN" w:eastAsia="en-IN"/>
+          <w14:ligatures w14:val="standardContextual"/>
         </w:rPr>
       </w:pPr>
-      <w:hyperlink w:anchor="_Toc242856717" w:history="1">
+      <w:hyperlink w:anchor="_Toc242977301" w:history="1">
         <w:r>
           <w:rPr>
             <w:rStyle w:val="Hyperlink"/>
@@ -2106,7 +2240,7 @@
             <w:noProof/>
             <w:webHidden/>
           </w:rPr>
-          <w:instrText xml:space="preserve"> PAGEREF _Toc242856717 \h </w:instrText>
+          <w:instrText xml:space="preserve"> PAGEREF _Toc242977301 \h </w:instrText>
         </w:r>
         <w:r>
           <w:rPr>
@@ -2144,10 +2278,15 @@
           <w:tab w:val="right" w:leader="dot" w:pos="9016"/>
         </w:tabs>
         <w:rPr>
+          <w:rFonts w:asciiTheme="minorHAnsi" w:eastAsiaTheme="minorEastAsia" w:hAnsiTheme="minorHAnsi"/>
           <w:noProof/>
+          <w:kern w:val="2"/>
+          <w:szCs w:val="24"/>
+          <w:lang w:val="en-IN" w:eastAsia="en-IN"/>
+          <w14:ligatures w14:val="standardContextual"/>
         </w:rPr>
       </w:pPr>
-      <w:hyperlink w:anchor="_Toc242856718" w:history="1">
+      <w:hyperlink w:anchor="_Toc242977302" w:history="1">
         <w:r>
           <w:rPr>
             <w:rStyle w:val="Hyperlink"/>
@@ -2174,7 +2313,7 @@
             <w:noProof/>
             <w:webHidden/>
           </w:rPr>
-          <w:instrText xml:space="preserve"> PAGEREF _Toc242856718 \h </w:instrText>
+          <w:instrText xml:space="preserve"> PAGEREF _Toc242977302 \h </w:instrText>
         </w:r>
         <w:r>
           <w:rPr>
@@ -2219,7 +2358,7 @@
       <w:pPr>
         <w:pStyle w:val="Heading1"/>
       </w:pPr>
-      <w:bookmarkStart w:id="0" w:name="_Toc242856689"/>
+      <w:bookmarkStart w:id="0" w:name="_Toc242977273"/>
       <w:r>
         <w:lastRenderedPageBreak/>
         <w:t>Abstract</w:t>
@@ -2258,7 +2397,7 @@
       <w:pPr>
         <w:pStyle w:val="Heading1"/>
       </w:pPr>
-      <w:bookmarkStart w:id="1" w:name="_Toc242856690"/>
+      <w:bookmarkStart w:id="1" w:name="_Toc242977274"/>
       <w:r>
         <w:t>1. Introduction</w:t>
       </w:r>
@@ -2389,7 +2528,7 @@
       <w:pPr>
         <w:pStyle w:val="Heading1"/>
       </w:pPr>
-      <w:bookmarkStart w:id="2" w:name="_Toc242856691"/>
+      <w:bookmarkStart w:id="2" w:name="_Toc242977275"/>
       <w:r>
         <w:t>2. Literature Survey</w:t>
       </w:r>
@@ -2399,7 +2538,7 @@
       <w:pPr>
         <w:pStyle w:val="Heading2"/>
       </w:pPr>
-      <w:bookmarkStart w:id="3" w:name="_Toc242856692"/>
+      <w:bookmarkStart w:id="3" w:name="_Toc242977276"/>
       <w:r>
         <w:t>2.1 Fake news detection and its benchmarks</w:t>
       </w:r>
@@ -2417,7 +2556,7 @@
       <w:pPr>
         <w:pStyle w:val="Heading2"/>
       </w:pPr>
-      <w:bookmarkStart w:id="4" w:name="_Toc242856693"/>
+      <w:bookmarkStart w:id="4" w:name="_Toc242977277"/>
       <w:r>
         <w:lastRenderedPageBreak/>
         <w:t>2.2 Dataset artifacts and partial-input baselines</w:t>
@@ -2442,7 +2581,7 @@
       <w:pPr>
         <w:pStyle w:val="Heading2"/>
       </w:pPr>
-      <w:bookmarkStart w:id="5" w:name="_Toc242856694"/>
+      <w:bookmarkStart w:id="5" w:name="_Toc242977278"/>
       <w:r>
         <w:t>2.3 Shortcut learning</w:t>
       </w:r>
@@ -2460,7 +2599,7 @@
       <w:pPr>
         <w:pStyle w:val="Heading2"/>
       </w:pPr>
-      <w:bookmarkStart w:id="6" w:name="_Toc242856695"/>
+      <w:bookmarkStart w:id="6" w:name="_Toc242977279"/>
       <w:r>
         <w:t>2.4 Artifacts in fake news datasets</w:t>
       </w:r>
@@ -2484,7 +2623,7 @@
       <w:pPr>
         <w:pStyle w:val="Heading2"/>
       </w:pPr>
-      <w:bookmarkStart w:id="7" w:name="_Toc242856696"/>
+      <w:bookmarkStart w:id="7" w:name="_Toc242977280"/>
       <w:r>
         <w:t>2.5 Remedies</w:t>
       </w:r>
@@ -3221,7 +3360,7 @@
       <w:pPr>
         <w:pStyle w:val="Heading1"/>
       </w:pPr>
-      <w:bookmarkStart w:id="8" w:name="_Toc242856697"/>
+      <w:bookmarkStart w:id="8" w:name="_Toc242977281"/>
       <w:r>
         <w:t>3. Problem Statement</w:t>
       </w:r>
@@ -3356,7 +3495,7 @@
       <w:pPr>
         <w:pStyle w:val="Heading1"/>
       </w:pPr>
-      <w:bookmarkStart w:id="9" w:name="_Toc242856698"/>
+      <w:bookmarkStart w:id="9" w:name="_Toc242977282"/>
       <w:r>
         <w:lastRenderedPageBreak/>
         <w:t>4. Proposed System</w:t>
@@ -3367,7 +3506,7 @@
       <w:pPr>
         <w:pStyle w:val="Heading2"/>
       </w:pPr>
-      <w:bookmarkStart w:id="10" w:name="_Toc242856699"/>
+      <w:bookmarkStart w:id="10" w:name="_Toc242977283"/>
       <w:r>
         <w:t>4.1 Objectives</w:t>
       </w:r>
@@ -3475,7 +3614,7 @@
       <w:pPr>
         <w:pStyle w:val="Heading2"/>
       </w:pPr>
-      <w:bookmarkStart w:id="11" w:name="_Toc242856700"/>
+      <w:bookmarkStart w:id="11" w:name="_Toc242977284"/>
       <w:r>
         <w:t>4.2 System architecture</w:t>
       </w:r>
@@ -3547,7 +3686,7 @@
       <w:pPr>
         <w:pStyle w:val="Heading1"/>
       </w:pPr>
-      <w:bookmarkStart w:id="12" w:name="_Toc242856701"/>
+      <w:bookmarkStart w:id="12" w:name="_Toc242977285"/>
       <w:r>
         <w:lastRenderedPageBreak/>
         <w:t>5. Methodology</w:t>
@@ -3558,7 +3697,7 @@
       <w:pPr>
         <w:pStyle w:val="Heading2"/>
       </w:pPr>
-      <w:bookmarkStart w:id="13" w:name="_Toc242856702"/>
+      <w:bookmarkStart w:id="13" w:name="_Toc242977286"/>
       <w:r>
         <w:t>5.1 Data and cleaning</w:t>
       </w:r>
@@ -3682,7 +3821,7 @@
       <w:pPr>
         <w:pStyle w:val="Heading2"/>
       </w:pPr>
-      <w:bookmarkStart w:id="14" w:name="_Toc242856703"/>
+      <w:bookmarkStart w:id="14" w:name="_Toc242977287"/>
       <w:r>
         <w:t>5.2 Shared evaluation protocol</w:t>
       </w:r>
@@ -3732,7 +3871,7 @@
       <w:pPr>
         <w:pStyle w:val="Heading2"/>
       </w:pPr>
-      <w:bookmarkStart w:id="15" w:name="_Toc242856704"/>
+      <w:bookmarkStart w:id="15" w:name="_Toc242977288"/>
       <w:r>
         <w:t>5.3 Experimental conditions</w:t>
       </w:r>
@@ -3961,7 +4100,7 @@
       <w:pPr>
         <w:pStyle w:val="Heading2"/>
       </w:pPr>
-      <w:bookmarkStart w:id="16" w:name="_Toc242856705"/>
+      <w:bookmarkStart w:id="16" w:name="_Toc242977289"/>
       <w:r>
         <w:t>5.4 Leakage-token analysis</w:t>
       </w:r>
@@ -3979,7 +4118,7 @@
       <w:pPr>
         <w:pStyle w:val="Heading2"/>
       </w:pPr>
-      <w:bookmarkStart w:id="17" w:name="_Toc242856706"/>
+      <w:bookmarkStart w:id="17" w:name="_Toc242977290"/>
       <w:r>
         <w:t>5.5 Implementation</w:t>
       </w:r>
@@ -3997,7 +4136,7 @@
       <w:pPr>
         <w:pStyle w:val="Heading1"/>
       </w:pPr>
-      <w:bookmarkStart w:id="18" w:name="_Toc242856707"/>
+      <w:bookmarkStart w:id="18" w:name="_Toc242977291"/>
       <w:r>
         <w:lastRenderedPageBreak/>
         <w:t>6. Results and Discussion</w:t>
@@ -4008,7 +4147,7 @@
       <w:pPr>
         <w:pStyle w:val="Heading2"/>
       </w:pPr>
-      <w:bookmarkStart w:id="19" w:name="_Toc242856708"/>
+      <w:bookmarkStart w:id="19" w:name="_Toc242977292"/>
       <w:r>
         <w:t>6.1 Overview</w:t>
       </w:r>
@@ -6119,7 +6258,7 @@
       <w:pPr>
         <w:pStyle w:val="Heading2"/>
       </w:pPr>
-      <w:bookmarkStart w:id="20" w:name="_Toc242856709"/>
+      <w:bookmarkStart w:id="20" w:name="_Toc242977293"/>
       <w:r>
         <w:t>6.2 Partial-input probes (RQ1)</w:t>
       </w:r>
@@ -6221,7 +6360,7 @@
       <w:pPr>
         <w:pStyle w:val="Heading2"/>
       </w:pPr>
-      <w:bookmarkStart w:id="21" w:name="_Toc242856710"/>
+      <w:bookmarkStart w:id="21" w:name="_Toc242977294"/>
       <w:r>
         <w:t>6.3 What the full-text model learns</w:t>
       </w:r>
@@ -8159,7 +8298,7 @@
       <w:pPr>
         <w:pStyle w:val="Heading2"/>
       </w:pPr>
-      <w:bookmarkStart w:id="22" w:name="_Toc242856711"/>
+      <w:bookmarkStart w:id="22" w:name="_Toc242977295"/>
       <w:r>
         <w:t>6.4 Artifact removal (RQ2)</w:t>
       </w:r>
@@ -8257,7 +8396,7 @@
       <w:pPr>
         <w:pStyle w:val="Heading2"/>
       </w:pPr>
-      <w:bookmarkStart w:id="23" w:name="_Toc242856712"/>
+      <w:bookmarkStart w:id="23" w:name="_Toc242977296"/>
       <w:r>
         <w:t>6.5 Cross-corpus transfer (RQ3)</w:t>
       </w:r>
@@ -8367,7 +8506,7 @@
       <w:pPr>
         <w:pStyle w:val="Heading2"/>
       </w:pPr>
-      <w:bookmarkStart w:id="24" w:name="_Toc242856713"/>
+      <w:bookmarkStart w:id="24" w:name="_Toc242977297"/>
       <w:r>
         <w:t>6.6 Is it style, topic or the classifier? (RQ4)</w:t>
       </w:r>
@@ -8545,7 +8684,7 @@
       <w:pPr>
         <w:pStyle w:val="Heading2"/>
       </w:pPr>
-      <w:bookmarkStart w:id="25" w:name="_Toc242856714"/>
+      <w:bookmarkStart w:id="25" w:name="_Toc242977298"/>
       <w:r>
         <w:t>6.7 Accuracy as information is removed</w:t>
       </w:r>
@@ -8630,7 +8769,7 @@
       <w:pPr>
         <w:pStyle w:val="Heading2"/>
       </w:pPr>
-      <w:bookmarkStart w:id="26" w:name="_Toc242856715"/>
+      <w:bookmarkStart w:id="26" w:name="_Toc242977299"/>
       <w:r>
         <w:t>6.8 Threats to validity</w:t>
       </w:r>
@@ -8705,7 +8844,7 @@
       <w:pPr>
         <w:pStyle w:val="Heading1"/>
       </w:pPr>
-      <w:bookmarkStart w:id="27" w:name="_Toc242856716"/>
+      <w:bookmarkStart w:id="27" w:name="_Toc242977300"/>
       <w:r>
         <w:t>7. Conclusion</w:t>
       </w:r>
@@ -8755,7 +8894,7 @@
       <w:pPr>
         <w:pStyle w:val="Heading1"/>
       </w:pPr>
-      <w:bookmarkStart w:id="28" w:name="_Toc242856717"/>
+      <w:bookmarkStart w:id="28" w:name="_Toc242977301"/>
       <w:r>
         <w:t>8. Future Work</w:t>
       </w:r>
@@ -8841,7 +8980,7 @@
       <w:pPr>
         <w:pStyle w:val="Heading1"/>
       </w:pPr>
-      <w:bookmarkStart w:id="29" w:name="_Toc242856718"/>
+      <w:bookmarkStart w:id="29" w:name="_Toc242977302"/>
       <w:r>
         <w:t>References</w:t>
       </w:r>

</xml_diff>

<commit_message>
Final check: fix two report figures, shorten context, tidy docs
- Correct 'Featured image via' share (34.9% of fake articles, not 46.8%)
  and the 'reuters' weight claim (about four times, not more than four)
- Rewrite PROJECT_CONTEXT.md as a short current reference (545 -> 184 lines)
- Remove the superseded REPORT_TEMPLATE.md
- README points to the report and walkthrough PDFs; warn against rebuilding
  the hand-edited report
- Fix lint warnings in the document generators
</commit_message>
<xml_diff>
--- a/report/WSMA_Report.docx
+++ b/report/WSMA_Report.docx
@@ -169,7 +169,7 @@
       <w:r>
         <w:fldChar w:fldCharType="separate"/>
       </w:r>
-      <w:hyperlink w:anchor="_Toc242977273" w:history="1">
+      <w:hyperlink w:anchor="_Toc242978167" w:history="1">
         <w:r>
           <w:rPr>
             <w:rStyle w:val="Hyperlink"/>
@@ -196,7 +196,7 @@
             <w:noProof/>
             <w:webHidden/>
           </w:rPr>
-          <w:instrText xml:space="preserve"> PAGEREF _Toc242977273 \h </w:instrText>
+          <w:instrText xml:space="preserve"> PAGEREF _Toc242978167 \h </w:instrText>
         </w:r>
         <w:r>
           <w:rPr>
@@ -242,7 +242,7 @@
           <w14:ligatures w14:val="standardContextual"/>
         </w:rPr>
       </w:pPr>
-      <w:hyperlink w:anchor="_Toc242977274" w:history="1">
+      <w:hyperlink w:anchor="_Toc242978168" w:history="1">
         <w:r>
           <w:rPr>
             <w:rStyle w:val="Hyperlink"/>
@@ -269,7 +269,7 @@
             <w:noProof/>
             <w:webHidden/>
           </w:rPr>
-          <w:instrText xml:space="preserve"> PAGEREF _Toc242977274 \h </w:instrText>
+          <w:instrText xml:space="preserve"> PAGEREF _Toc242978168 \h </w:instrText>
         </w:r>
         <w:r>
           <w:rPr>
@@ -315,7 +315,7 @@
           <w14:ligatures w14:val="standardContextual"/>
         </w:rPr>
       </w:pPr>
-      <w:hyperlink w:anchor="_Toc242977275" w:history="1">
+      <w:hyperlink w:anchor="_Toc242978169" w:history="1">
         <w:r>
           <w:rPr>
             <w:rStyle w:val="Hyperlink"/>
@@ -342,7 +342,7 @@
             <w:noProof/>
             <w:webHidden/>
           </w:rPr>
-          <w:instrText xml:space="preserve"> PAGEREF _Toc242977275 \h </w:instrText>
+          <w:instrText xml:space="preserve"> PAGEREF _Toc242978169 \h </w:instrText>
         </w:r>
         <w:r>
           <w:rPr>
@@ -388,7 +388,7 @@
           <w14:ligatures w14:val="standardContextual"/>
         </w:rPr>
       </w:pPr>
-      <w:hyperlink w:anchor="_Toc242977276" w:history="1">
+      <w:hyperlink w:anchor="_Toc242978170" w:history="1">
         <w:r>
           <w:rPr>
             <w:rStyle w:val="Hyperlink"/>
@@ -415,7 +415,7 @@
             <w:noProof/>
             <w:webHidden/>
           </w:rPr>
-          <w:instrText xml:space="preserve"> PAGEREF _Toc242977276 \h </w:instrText>
+          <w:instrText xml:space="preserve"> PAGEREF _Toc242978170 \h </w:instrText>
         </w:r>
         <w:r>
           <w:rPr>
@@ -461,7 +461,7 @@
           <w14:ligatures w14:val="standardContextual"/>
         </w:rPr>
       </w:pPr>
-      <w:hyperlink w:anchor="_Toc242977277" w:history="1">
+      <w:hyperlink w:anchor="_Toc242978171" w:history="1">
         <w:r>
           <w:rPr>
             <w:rStyle w:val="Hyperlink"/>
@@ -488,7 +488,7 @@
             <w:noProof/>
             <w:webHidden/>
           </w:rPr>
-          <w:instrText xml:space="preserve"> PAGEREF _Toc242977277 \h </w:instrText>
+          <w:instrText xml:space="preserve"> PAGEREF _Toc242978171 \h </w:instrText>
         </w:r>
         <w:r>
           <w:rPr>
@@ -534,7 +534,7 @@
           <w14:ligatures w14:val="standardContextual"/>
         </w:rPr>
       </w:pPr>
-      <w:hyperlink w:anchor="_Toc242977278" w:history="1">
+      <w:hyperlink w:anchor="_Toc242978172" w:history="1">
         <w:r>
           <w:rPr>
             <w:rStyle w:val="Hyperlink"/>
@@ -561,7 +561,7 @@
             <w:noProof/>
             <w:webHidden/>
           </w:rPr>
-          <w:instrText xml:space="preserve"> PAGEREF _Toc242977278 \h </w:instrText>
+          <w:instrText xml:space="preserve"> PAGEREF _Toc242978172 \h </w:instrText>
         </w:r>
         <w:r>
           <w:rPr>
@@ -607,7 +607,7 @@
           <w14:ligatures w14:val="standardContextual"/>
         </w:rPr>
       </w:pPr>
-      <w:hyperlink w:anchor="_Toc242977279" w:history="1">
+      <w:hyperlink w:anchor="_Toc242978173" w:history="1">
         <w:r>
           <w:rPr>
             <w:rStyle w:val="Hyperlink"/>
@@ -634,7 +634,7 @@
             <w:noProof/>
             <w:webHidden/>
           </w:rPr>
-          <w:instrText xml:space="preserve"> PAGEREF _Toc242977279 \h </w:instrText>
+          <w:instrText xml:space="preserve"> PAGEREF _Toc242978173 \h </w:instrText>
         </w:r>
         <w:r>
           <w:rPr>
@@ -680,7 +680,7 @@
           <w14:ligatures w14:val="standardContextual"/>
         </w:rPr>
       </w:pPr>
-      <w:hyperlink w:anchor="_Toc242977280" w:history="1">
+      <w:hyperlink w:anchor="_Toc242978174" w:history="1">
         <w:r>
           <w:rPr>
             <w:rStyle w:val="Hyperlink"/>
@@ -707,7 +707,7 @@
             <w:noProof/>
             <w:webHidden/>
           </w:rPr>
-          <w:instrText xml:space="preserve"> PAGEREF _Toc242977280 \h </w:instrText>
+          <w:instrText xml:space="preserve"> PAGEREF _Toc242978174 \h </w:instrText>
         </w:r>
         <w:r>
           <w:rPr>
@@ -753,7 +753,7 @@
           <w14:ligatures w14:val="standardContextual"/>
         </w:rPr>
       </w:pPr>
-      <w:hyperlink w:anchor="_Toc242977281" w:history="1">
+      <w:hyperlink w:anchor="_Toc242978175" w:history="1">
         <w:r>
           <w:rPr>
             <w:rStyle w:val="Hyperlink"/>
@@ -780,7 +780,7 @@
             <w:noProof/>
             <w:webHidden/>
           </w:rPr>
-          <w:instrText xml:space="preserve"> PAGEREF _Toc242977281 \h </w:instrText>
+          <w:instrText xml:space="preserve"> PAGEREF _Toc242978175 \h </w:instrText>
         </w:r>
         <w:r>
           <w:rPr>
@@ -826,7 +826,7 @@
           <w14:ligatures w14:val="standardContextual"/>
         </w:rPr>
       </w:pPr>
-      <w:hyperlink w:anchor="_Toc242977282" w:history="1">
+      <w:hyperlink w:anchor="_Toc242978176" w:history="1">
         <w:r>
           <w:rPr>
             <w:rStyle w:val="Hyperlink"/>
@@ -853,7 +853,7 @@
             <w:noProof/>
             <w:webHidden/>
           </w:rPr>
-          <w:instrText xml:space="preserve"> PAGEREF _Toc242977282 \h </w:instrText>
+          <w:instrText xml:space="preserve"> PAGEREF _Toc242978176 \h </w:instrText>
         </w:r>
         <w:r>
           <w:rPr>
@@ -899,7 +899,7 @@
           <w14:ligatures w14:val="standardContextual"/>
         </w:rPr>
       </w:pPr>
-      <w:hyperlink w:anchor="_Toc242977283" w:history="1">
+      <w:hyperlink w:anchor="_Toc242978177" w:history="1">
         <w:r>
           <w:rPr>
             <w:rStyle w:val="Hyperlink"/>
@@ -926,7 +926,7 @@
             <w:noProof/>
             <w:webHidden/>
           </w:rPr>
-          <w:instrText xml:space="preserve"> PAGEREF _Toc242977283 \h </w:instrText>
+          <w:instrText xml:space="preserve"> PAGEREF _Toc242978177 \h </w:instrText>
         </w:r>
         <w:r>
           <w:rPr>
@@ -972,7 +972,7 @@
           <w14:ligatures w14:val="standardContextual"/>
         </w:rPr>
       </w:pPr>
-      <w:hyperlink w:anchor="_Toc242977284" w:history="1">
+      <w:hyperlink w:anchor="_Toc242978178" w:history="1">
         <w:r>
           <w:rPr>
             <w:rStyle w:val="Hyperlink"/>
@@ -999,7 +999,7 @@
             <w:noProof/>
             <w:webHidden/>
           </w:rPr>
-          <w:instrText xml:space="preserve"> PAGEREF _Toc242977284 \h </w:instrText>
+          <w:instrText xml:space="preserve"> PAGEREF _Toc242978178 \h </w:instrText>
         </w:r>
         <w:r>
           <w:rPr>
@@ -1045,7 +1045,7 @@
           <w14:ligatures w14:val="standardContextual"/>
         </w:rPr>
       </w:pPr>
-      <w:hyperlink w:anchor="_Toc242977285" w:history="1">
+      <w:hyperlink w:anchor="_Toc242978179" w:history="1">
         <w:r>
           <w:rPr>
             <w:rStyle w:val="Hyperlink"/>
@@ -1072,7 +1072,7 @@
             <w:noProof/>
             <w:webHidden/>
           </w:rPr>
-          <w:instrText xml:space="preserve"> PAGEREF _Toc242977285 \h </w:instrText>
+          <w:instrText xml:space="preserve"> PAGEREF _Toc242978179 \h </w:instrText>
         </w:r>
         <w:r>
           <w:rPr>
@@ -1118,7 +1118,7 @@
           <w14:ligatures w14:val="standardContextual"/>
         </w:rPr>
       </w:pPr>
-      <w:hyperlink w:anchor="_Toc242977286" w:history="1">
+      <w:hyperlink w:anchor="_Toc242978180" w:history="1">
         <w:r>
           <w:rPr>
             <w:rStyle w:val="Hyperlink"/>
@@ -1145,7 +1145,7 @@
             <w:noProof/>
             <w:webHidden/>
           </w:rPr>
-          <w:instrText xml:space="preserve"> PAGEREF _Toc242977286 \h </w:instrText>
+          <w:instrText xml:space="preserve"> PAGEREF _Toc242978180 \h </w:instrText>
         </w:r>
         <w:r>
           <w:rPr>
@@ -1191,7 +1191,7 @@
           <w14:ligatures w14:val="standardContextual"/>
         </w:rPr>
       </w:pPr>
-      <w:hyperlink w:anchor="_Toc242977287" w:history="1">
+      <w:hyperlink w:anchor="_Toc242978181" w:history="1">
         <w:r>
           <w:rPr>
             <w:rStyle w:val="Hyperlink"/>
@@ -1218,7 +1218,7 @@
             <w:noProof/>
             <w:webHidden/>
           </w:rPr>
-          <w:instrText xml:space="preserve"> PAGEREF _Toc242977287 \h </w:instrText>
+          <w:instrText xml:space="preserve"> PAGEREF _Toc242978181 \h </w:instrText>
         </w:r>
         <w:r>
           <w:rPr>
@@ -1264,7 +1264,7 @@
           <w14:ligatures w14:val="standardContextual"/>
         </w:rPr>
       </w:pPr>
-      <w:hyperlink w:anchor="_Toc242977288" w:history="1">
+      <w:hyperlink w:anchor="_Toc242978182" w:history="1">
         <w:r>
           <w:rPr>
             <w:rStyle w:val="Hyperlink"/>
@@ -1291,7 +1291,7 @@
             <w:noProof/>
             <w:webHidden/>
           </w:rPr>
-          <w:instrText xml:space="preserve"> PAGEREF _Toc242977288 \h </w:instrText>
+          <w:instrText xml:space="preserve"> PAGEREF _Toc242978182 \h </w:instrText>
         </w:r>
         <w:r>
           <w:rPr>
@@ -1337,7 +1337,7 @@
           <w14:ligatures w14:val="standardContextual"/>
         </w:rPr>
       </w:pPr>
-      <w:hyperlink w:anchor="_Toc242977289" w:history="1">
+      <w:hyperlink w:anchor="_Toc242978183" w:history="1">
         <w:r>
           <w:rPr>
             <w:rStyle w:val="Hyperlink"/>
@@ -1364,7 +1364,7 @@
             <w:noProof/>
             <w:webHidden/>
           </w:rPr>
-          <w:instrText xml:space="preserve"> PAGEREF _Toc242977289 \h </w:instrText>
+          <w:instrText xml:space="preserve"> PAGEREF _Toc242978183 \h </w:instrText>
         </w:r>
         <w:r>
           <w:rPr>
@@ -1410,7 +1410,7 @@
           <w14:ligatures w14:val="standardContextual"/>
         </w:rPr>
       </w:pPr>
-      <w:hyperlink w:anchor="_Toc242977290" w:history="1">
+      <w:hyperlink w:anchor="_Toc242978184" w:history="1">
         <w:r>
           <w:rPr>
             <w:rStyle w:val="Hyperlink"/>
@@ -1437,7 +1437,7 @@
             <w:noProof/>
             <w:webHidden/>
           </w:rPr>
-          <w:instrText xml:space="preserve"> PAGEREF _Toc242977290 \h </w:instrText>
+          <w:instrText xml:space="preserve"> PAGEREF _Toc242978184 \h </w:instrText>
         </w:r>
         <w:r>
           <w:rPr>
@@ -1483,7 +1483,7 @@
           <w14:ligatures w14:val="standardContextual"/>
         </w:rPr>
       </w:pPr>
-      <w:hyperlink w:anchor="_Toc242977291" w:history="1">
+      <w:hyperlink w:anchor="_Toc242978185" w:history="1">
         <w:r>
           <w:rPr>
             <w:rStyle w:val="Hyperlink"/>
@@ -1510,7 +1510,7 @@
             <w:noProof/>
             <w:webHidden/>
           </w:rPr>
-          <w:instrText xml:space="preserve"> PAGEREF _Toc242977291 \h </w:instrText>
+          <w:instrText xml:space="preserve"> PAGEREF _Toc242978185 \h </w:instrText>
         </w:r>
         <w:r>
           <w:rPr>
@@ -1556,7 +1556,7 @@
           <w14:ligatures w14:val="standardContextual"/>
         </w:rPr>
       </w:pPr>
-      <w:hyperlink w:anchor="_Toc242977292" w:history="1">
+      <w:hyperlink w:anchor="_Toc242978186" w:history="1">
         <w:r>
           <w:rPr>
             <w:rStyle w:val="Hyperlink"/>
@@ -1583,7 +1583,7 @@
             <w:noProof/>
             <w:webHidden/>
           </w:rPr>
-          <w:instrText xml:space="preserve"> PAGEREF _Toc242977292 \h </w:instrText>
+          <w:instrText xml:space="preserve"> PAGEREF _Toc242978186 \h </w:instrText>
         </w:r>
         <w:r>
           <w:rPr>
@@ -1629,7 +1629,7 @@
           <w14:ligatures w14:val="standardContextual"/>
         </w:rPr>
       </w:pPr>
-      <w:hyperlink w:anchor="_Toc242977293" w:history="1">
+      <w:hyperlink w:anchor="_Toc242978187" w:history="1">
         <w:r>
           <w:rPr>
             <w:rStyle w:val="Hyperlink"/>
@@ -1656,7 +1656,7 @@
             <w:noProof/>
             <w:webHidden/>
           </w:rPr>
-          <w:instrText xml:space="preserve"> PAGEREF _Toc242977293 \h </w:instrText>
+          <w:instrText xml:space="preserve"> PAGEREF _Toc242978187 \h </w:instrText>
         </w:r>
         <w:r>
           <w:rPr>
@@ -1702,7 +1702,7 @@
           <w14:ligatures w14:val="standardContextual"/>
         </w:rPr>
       </w:pPr>
-      <w:hyperlink w:anchor="_Toc242977294" w:history="1">
+      <w:hyperlink w:anchor="_Toc242978188" w:history="1">
         <w:r>
           <w:rPr>
             <w:rStyle w:val="Hyperlink"/>
@@ -1729,7 +1729,7 @@
             <w:noProof/>
             <w:webHidden/>
           </w:rPr>
-          <w:instrText xml:space="preserve"> PAGEREF _Toc242977294 \h </w:instrText>
+          <w:instrText xml:space="preserve"> PAGEREF _Toc242978188 \h </w:instrText>
         </w:r>
         <w:r>
           <w:rPr>
@@ -1775,7 +1775,7 @@
           <w14:ligatures w14:val="standardContextual"/>
         </w:rPr>
       </w:pPr>
-      <w:hyperlink w:anchor="_Toc242977295" w:history="1">
+      <w:hyperlink w:anchor="_Toc242978189" w:history="1">
         <w:r>
           <w:rPr>
             <w:rStyle w:val="Hyperlink"/>
@@ -1802,7 +1802,7 @@
             <w:noProof/>
             <w:webHidden/>
           </w:rPr>
-          <w:instrText xml:space="preserve"> PAGEREF _Toc242977295 \h </w:instrText>
+          <w:instrText xml:space="preserve"> PAGEREF _Toc242978189 \h </w:instrText>
         </w:r>
         <w:r>
           <w:rPr>
@@ -1848,7 +1848,7 @@
           <w14:ligatures w14:val="standardContextual"/>
         </w:rPr>
       </w:pPr>
-      <w:hyperlink w:anchor="_Toc242977296" w:history="1">
+      <w:hyperlink w:anchor="_Toc242978190" w:history="1">
         <w:r>
           <w:rPr>
             <w:rStyle w:val="Hyperlink"/>
@@ -1875,7 +1875,7 @@
             <w:noProof/>
             <w:webHidden/>
           </w:rPr>
-          <w:instrText xml:space="preserve"> PAGEREF _Toc242977296 \h </w:instrText>
+          <w:instrText xml:space="preserve"> PAGEREF _Toc242978190 \h </w:instrText>
         </w:r>
         <w:r>
           <w:rPr>
@@ -1921,7 +1921,7 @@
           <w14:ligatures w14:val="standardContextual"/>
         </w:rPr>
       </w:pPr>
-      <w:hyperlink w:anchor="_Toc242977297" w:history="1">
+      <w:hyperlink w:anchor="_Toc242978191" w:history="1">
         <w:r>
           <w:rPr>
             <w:rStyle w:val="Hyperlink"/>
@@ -1948,7 +1948,7 @@
             <w:noProof/>
             <w:webHidden/>
           </w:rPr>
-          <w:instrText xml:space="preserve"> PAGEREF _Toc242977297 \h </w:instrText>
+          <w:instrText xml:space="preserve"> PAGEREF _Toc242978191 \h </w:instrText>
         </w:r>
         <w:r>
           <w:rPr>
@@ -1994,7 +1994,7 @@
           <w14:ligatures w14:val="standardContextual"/>
         </w:rPr>
       </w:pPr>
-      <w:hyperlink w:anchor="_Toc242977298" w:history="1">
+      <w:hyperlink w:anchor="_Toc242978192" w:history="1">
         <w:r>
           <w:rPr>
             <w:rStyle w:val="Hyperlink"/>
@@ -2021,7 +2021,7 @@
             <w:noProof/>
             <w:webHidden/>
           </w:rPr>
-          <w:instrText xml:space="preserve"> PAGEREF _Toc242977298 \h </w:instrText>
+          <w:instrText xml:space="preserve"> PAGEREF _Toc242978192 \h </w:instrText>
         </w:r>
         <w:r>
           <w:rPr>
@@ -2067,7 +2067,7 @@
           <w14:ligatures w14:val="standardContextual"/>
         </w:rPr>
       </w:pPr>
-      <w:hyperlink w:anchor="_Toc242977299" w:history="1">
+      <w:hyperlink w:anchor="_Toc242978193" w:history="1">
         <w:r>
           <w:rPr>
             <w:rStyle w:val="Hyperlink"/>
@@ -2094,7 +2094,7 @@
             <w:noProof/>
             <w:webHidden/>
           </w:rPr>
-          <w:instrText xml:space="preserve"> PAGEREF _Toc242977299 \h </w:instrText>
+          <w:instrText xml:space="preserve"> PAGEREF _Toc242978193 \h </w:instrText>
         </w:r>
         <w:r>
           <w:rPr>
@@ -2140,7 +2140,7 @@
           <w14:ligatures w14:val="standardContextual"/>
         </w:rPr>
       </w:pPr>
-      <w:hyperlink w:anchor="_Toc242977300" w:history="1">
+      <w:hyperlink w:anchor="_Toc242978194" w:history="1">
         <w:r>
           <w:rPr>
             <w:rStyle w:val="Hyperlink"/>
@@ -2167,7 +2167,7 @@
             <w:noProof/>
             <w:webHidden/>
           </w:rPr>
-          <w:instrText xml:space="preserve"> PAGEREF _Toc242977300 \h </w:instrText>
+          <w:instrText xml:space="preserve"> PAGEREF _Toc242978194 \h </w:instrText>
         </w:r>
         <w:r>
           <w:rPr>
@@ -2213,7 +2213,7 @@
           <w14:ligatures w14:val="standardContextual"/>
         </w:rPr>
       </w:pPr>
-      <w:hyperlink w:anchor="_Toc242977301" w:history="1">
+      <w:hyperlink w:anchor="_Toc242978195" w:history="1">
         <w:r>
           <w:rPr>
             <w:rStyle w:val="Hyperlink"/>
@@ -2240,7 +2240,7 @@
             <w:noProof/>
             <w:webHidden/>
           </w:rPr>
-          <w:instrText xml:space="preserve"> PAGEREF _Toc242977301 \h </w:instrText>
+          <w:instrText xml:space="preserve"> PAGEREF _Toc242978195 \h </w:instrText>
         </w:r>
         <w:r>
           <w:rPr>
@@ -2286,7 +2286,7 @@
           <w14:ligatures w14:val="standardContextual"/>
         </w:rPr>
       </w:pPr>
-      <w:hyperlink w:anchor="_Toc242977302" w:history="1">
+      <w:hyperlink w:anchor="_Toc242978196" w:history="1">
         <w:r>
           <w:rPr>
             <w:rStyle w:val="Hyperlink"/>
@@ -2313,7 +2313,7 @@
             <w:noProof/>
             <w:webHidden/>
           </w:rPr>
-          <w:instrText xml:space="preserve"> PAGEREF _Toc242977302 \h </w:instrText>
+          <w:instrText xml:space="preserve"> PAGEREF _Toc242978196 \h </w:instrText>
         </w:r>
         <w:r>
           <w:rPr>
@@ -2358,7 +2358,7 @@
       <w:pPr>
         <w:pStyle w:val="Heading1"/>
       </w:pPr>
-      <w:bookmarkStart w:id="0" w:name="_Toc242977273"/>
+      <w:bookmarkStart w:id="0" w:name="_Toc242978167"/>
       <w:r>
         <w:lastRenderedPageBreak/>
         <w:t>Abstract</w:t>
@@ -2397,7 +2397,7 @@
       <w:pPr>
         <w:pStyle w:val="Heading1"/>
       </w:pPr>
-      <w:bookmarkStart w:id="1" w:name="_Toc242977274"/>
+      <w:bookmarkStart w:id="1" w:name="_Toc242978168"/>
       <w:r>
         <w:t>1. Introduction</w:t>
       </w:r>
@@ -2528,7 +2528,7 @@
       <w:pPr>
         <w:pStyle w:val="Heading1"/>
       </w:pPr>
-      <w:bookmarkStart w:id="2" w:name="_Toc242977275"/>
+      <w:bookmarkStart w:id="2" w:name="_Toc242978169"/>
       <w:r>
         <w:t>2. Literature Survey</w:t>
       </w:r>
@@ -2538,7 +2538,7 @@
       <w:pPr>
         <w:pStyle w:val="Heading2"/>
       </w:pPr>
-      <w:bookmarkStart w:id="3" w:name="_Toc242977276"/>
+      <w:bookmarkStart w:id="3" w:name="_Toc242978170"/>
       <w:r>
         <w:t>2.1 Fake news detection and its benchmarks</w:t>
       </w:r>
@@ -2556,7 +2556,7 @@
       <w:pPr>
         <w:pStyle w:val="Heading2"/>
       </w:pPr>
-      <w:bookmarkStart w:id="4" w:name="_Toc242977277"/>
+      <w:bookmarkStart w:id="4" w:name="_Toc242978171"/>
       <w:r>
         <w:lastRenderedPageBreak/>
         <w:t>2.2 Dataset artifacts and partial-input baselines</w:t>
@@ -2581,7 +2581,7 @@
       <w:pPr>
         <w:pStyle w:val="Heading2"/>
       </w:pPr>
-      <w:bookmarkStart w:id="5" w:name="_Toc242977278"/>
+      <w:bookmarkStart w:id="5" w:name="_Toc242978172"/>
       <w:r>
         <w:t>2.3 Shortcut learning</w:t>
       </w:r>
@@ -2599,7 +2599,7 @@
       <w:pPr>
         <w:pStyle w:val="Heading2"/>
       </w:pPr>
-      <w:bookmarkStart w:id="6" w:name="_Toc242977279"/>
+      <w:bookmarkStart w:id="6" w:name="_Toc242978173"/>
       <w:r>
         <w:t>2.4 Artifacts in fake news datasets</w:t>
       </w:r>
@@ -2623,7 +2623,7 @@
       <w:pPr>
         <w:pStyle w:val="Heading2"/>
       </w:pPr>
-      <w:bookmarkStart w:id="7" w:name="_Toc242977280"/>
+      <w:bookmarkStart w:id="7" w:name="_Toc242978174"/>
       <w:r>
         <w:t>2.5 Remedies</w:t>
       </w:r>
@@ -3360,7 +3360,7 @@
       <w:pPr>
         <w:pStyle w:val="Heading1"/>
       </w:pPr>
-      <w:bookmarkStart w:id="8" w:name="_Toc242977281"/>
+      <w:bookmarkStart w:id="8" w:name="_Toc242978175"/>
       <w:r>
         <w:t>3. Problem Statement</w:t>
       </w:r>
@@ -3495,7 +3495,7 @@
       <w:pPr>
         <w:pStyle w:val="Heading1"/>
       </w:pPr>
-      <w:bookmarkStart w:id="9" w:name="_Toc242977282"/>
+      <w:bookmarkStart w:id="9" w:name="_Toc242978176"/>
       <w:r>
         <w:lastRenderedPageBreak/>
         <w:t>4. Proposed System</w:t>
@@ -3506,7 +3506,7 @@
       <w:pPr>
         <w:pStyle w:val="Heading2"/>
       </w:pPr>
-      <w:bookmarkStart w:id="10" w:name="_Toc242977283"/>
+      <w:bookmarkStart w:id="10" w:name="_Toc242978177"/>
       <w:r>
         <w:t>4.1 Objectives</w:t>
       </w:r>
@@ -3614,7 +3614,7 @@
       <w:pPr>
         <w:pStyle w:val="Heading2"/>
       </w:pPr>
-      <w:bookmarkStart w:id="11" w:name="_Toc242977284"/>
+      <w:bookmarkStart w:id="11" w:name="_Toc242978178"/>
       <w:r>
         <w:t>4.2 System architecture</w:t>
       </w:r>
@@ -3686,7 +3686,7 @@
       <w:pPr>
         <w:pStyle w:val="Heading1"/>
       </w:pPr>
-      <w:bookmarkStart w:id="12" w:name="_Toc242977285"/>
+      <w:bookmarkStart w:id="12" w:name="_Toc242978179"/>
       <w:r>
         <w:lastRenderedPageBreak/>
         <w:t>5. Methodology</w:t>
@@ -3697,7 +3697,7 @@
       <w:pPr>
         <w:pStyle w:val="Heading2"/>
       </w:pPr>
-      <w:bookmarkStart w:id="13" w:name="_Toc242977286"/>
+      <w:bookmarkStart w:id="13" w:name="_Toc242978180"/>
       <w:r>
         <w:t>5.1 Data and cleaning</w:t>
       </w:r>
@@ -3821,7 +3821,7 @@
       <w:pPr>
         <w:pStyle w:val="Heading2"/>
       </w:pPr>
-      <w:bookmarkStart w:id="14" w:name="_Toc242977287"/>
+      <w:bookmarkStart w:id="14" w:name="_Toc242978181"/>
       <w:r>
         <w:t>5.2 Shared evaluation protocol</w:t>
       </w:r>
@@ -3871,7 +3871,7 @@
       <w:pPr>
         <w:pStyle w:val="Heading2"/>
       </w:pPr>
-      <w:bookmarkStart w:id="15" w:name="_Toc242977288"/>
+      <w:bookmarkStart w:id="15" w:name="_Toc242978182"/>
       <w:r>
         <w:t>5.3 Experimental conditions</w:t>
       </w:r>
@@ -4100,7 +4100,7 @@
       <w:pPr>
         <w:pStyle w:val="Heading2"/>
       </w:pPr>
-      <w:bookmarkStart w:id="16" w:name="_Toc242977289"/>
+      <w:bookmarkStart w:id="16" w:name="_Toc242978183"/>
       <w:r>
         <w:t>5.4 Leakage-token analysis</w:t>
       </w:r>
@@ -4118,7 +4118,7 @@
       <w:pPr>
         <w:pStyle w:val="Heading2"/>
       </w:pPr>
-      <w:bookmarkStart w:id="17" w:name="_Toc242977290"/>
+      <w:bookmarkStart w:id="17" w:name="_Toc242978184"/>
       <w:r>
         <w:t>5.5 Implementation</w:t>
       </w:r>
@@ -4136,7 +4136,7 @@
       <w:pPr>
         <w:pStyle w:val="Heading1"/>
       </w:pPr>
-      <w:bookmarkStart w:id="18" w:name="_Toc242977291"/>
+      <w:bookmarkStart w:id="18" w:name="_Toc242978185"/>
       <w:r>
         <w:lastRenderedPageBreak/>
         <w:t>6. Results and Discussion</w:t>
@@ -4147,7 +4147,7 @@
       <w:pPr>
         <w:pStyle w:val="Heading2"/>
       </w:pPr>
-      <w:bookmarkStart w:id="19" w:name="_Toc242977292"/>
+      <w:bookmarkStart w:id="19" w:name="_Toc242978186"/>
       <w:r>
         <w:t>6.1 Overview</w:t>
       </w:r>
@@ -6258,7 +6258,7 @@
       <w:pPr>
         <w:pStyle w:val="Heading2"/>
       </w:pPr>
-      <w:bookmarkStart w:id="20" w:name="_Toc242977293"/>
+      <w:bookmarkStart w:id="20" w:name="_Toc242978187"/>
       <w:r>
         <w:t>6.2 Partial-input probes (RQ1)</w:t>
       </w:r>
@@ -6284,7 +6284,7 @@
         <w:t>higher</w:t>
       </w:r>
       <w:r>
-        <w:t xml:space="preserve"> than the full article (98.4%). The strongest feature is the word "reuters" (weight -41.3), more than four times the weight of any other. The next real-class features are dateline fragments: "washington", "fla", "calif", "pa", "london", "york" and the names of weekdays. The dateline appears in 99.2% of real articles and in fewer than 0.1% of fake ones. On the fake side, the opening line is identified by words such as "just", "we", "our" and "you", which reflect a conversational, opinionated register.</w:t>
+        <w:t xml:space="preserve"> than the full article (98.4%). The strongest feature is the word "reuters" (weight -41.3), about four times the weight of any other. The next real-class features are dateline fragments: "washington", "fla", "calif", "pa", "london", "york" and the names of weekdays. The dateline appears in 99.2% of real articles and in fewer than 0.1% of fake ones. On the fake side, the opening line is identified by words such as "just", "we", "our" and "you", which reflect a conversational, opinionated register.</w:t>
       </w:r>
     </w:p>
     <w:p>
@@ -6360,7 +6360,7 @@
       <w:pPr>
         <w:pStyle w:val="Heading2"/>
       </w:pPr>
-      <w:bookmarkStart w:id="21" w:name="_Toc242977294"/>
+      <w:bookmarkStart w:id="21" w:name="_Toc242978188"/>
       <w:r>
         <w:t>6.3 What the full-text model learns</w:t>
       </w:r>
@@ -6371,7 +6371,7 @@
         <w:jc w:val="both"/>
       </w:pPr>
       <w:r>
-        <w:t>Figure 3 shows the 15 strongest features of the E1 model for each class. The single strongest real feature is "reuters", followed closely by "said", the attribution verb of wire reporting. Other real features are a dateline city, weekday names and "told". On the fake side, seven of the 15 strongest features are page clutter rather than prose: "via", "video", "image", "featured", "read", "watch" and "com" come from image credits, embedded media and links. The phrase "Featured image via" alone appears in 46.8% of fake articles and in no real article.</w:t>
+        <w:t>Figure 3 shows the 15 strongest features of the E1 model for each class. The single strongest real feature is "reuters", followed closely by "said", the attribution verb of wire reporting. Other real features are a dateline city, weekday names and "told". On the fake side, seven of the 15 strongest features are page clutter rather than prose: "via", "video", "image", "featured", "read", "watch" and "com" come from image credits, embedded media and links. The phrase "Featured image via" alone appears in 34.9% of fake articles and in no real article.</w:t>
       </w:r>
     </w:p>
     <w:p>
@@ -8298,7 +8298,7 @@
       <w:pPr>
         <w:pStyle w:val="Heading2"/>
       </w:pPr>
-      <w:bookmarkStart w:id="22" w:name="_Toc242977295"/>
+      <w:bookmarkStart w:id="22" w:name="_Toc242978189"/>
       <w:r>
         <w:t>6.4 Artifact removal (RQ2)</w:t>
       </w:r>
@@ -8396,7 +8396,7 @@
       <w:pPr>
         <w:pStyle w:val="Heading2"/>
       </w:pPr>
-      <w:bookmarkStart w:id="23" w:name="_Toc242977296"/>
+      <w:bookmarkStart w:id="23" w:name="_Toc242978190"/>
       <w:r>
         <w:t>6.5 Cross-corpus transfer (RQ3)</w:t>
       </w:r>
@@ -8506,7 +8506,7 @@
       <w:pPr>
         <w:pStyle w:val="Heading2"/>
       </w:pPr>
-      <w:bookmarkStart w:id="24" w:name="_Toc242977297"/>
+      <w:bookmarkStart w:id="24" w:name="_Toc242978191"/>
       <w:r>
         <w:t>6.6 Is it style, topic or the classifier? (RQ4)</w:t>
       </w:r>
@@ -8684,7 +8684,7 @@
       <w:pPr>
         <w:pStyle w:val="Heading2"/>
       </w:pPr>
-      <w:bookmarkStart w:id="25" w:name="_Toc242977298"/>
+      <w:bookmarkStart w:id="25" w:name="_Toc242978192"/>
       <w:r>
         <w:t>6.7 Accuracy as information is removed</w:t>
       </w:r>
@@ -8769,7 +8769,7 @@
       <w:pPr>
         <w:pStyle w:val="Heading2"/>
       </w:pPr>
-      <w:bookmarkStart w:id="26" w:name="_Toc242977299"/>
+      <w:bookmarkStart w:id="26" w:name="_Toc242978193"/>
       <w:r>
         <w:t>6.8 Threats to validity</w:t>
       </w:r>
@@ -8844,7 +8844,7 @@
       <w:pPr>
         <w:pStyle w:val="Heading1"/>
       </w:pPr>
-      <w:bookmarkStart w:id="27" w:name="_Toc242977300"/>
+      <w:bookmarkStart w:id="27" w:name="_Toc242978194"/>
       <w:r>
         <w:t>7. Conclusion</w:t>
       </w:r>
@@ -8894,7 +8894,7 @@
       <w:pPr>
         <w:pStyle w:val="Heading1"/>
       </w:pPr>
-      <w:bookmarkStart w:id="28" w:name="_Toc242977301"/>
+      <w:bookmarkStart w:id="28" w:name="_Toc242978195"/>
       <w:r>
         <w:t>8. Future Work</w:t>
       </w:r>
@@ -8980,7 +8980,7 @@
       <w:pPr>
         <w:pStyle w:val="Heading1"/>
       </w:pPr>
-      <w:bookmarkStart w:id="29" w:name="_Toc242977302"/>
+      <w:bookmarkStart w:id="29" w:name="_Toc242978196"/>
       <w:r>
         <w:t>References</w:t>
       </w:r>

</xml_diff>